<commit_message>
fix: repara templates docx com tags quebradas em multiplos runs
</commit_message>
<xml_diff>
--- a/backend/templates/contrato_venda.docx
+++ b/backend/templates/contrato_venda.docx
@@ -477,7 +477,7 @@
           <w:szCs w:val="20"/>
           <w:lang w:val="pt-BR"/>
         </w:rPr>
-        <w:t>{{CPF}}</w:t>
+        <w:t>{{{CPF}}}</w:t>
       </w:r>
     </w:p>
     <w:p>
@@ -4148,7 +4148,7 @@
         <w:rPr>
           <w:lang w:val="pt-BR"/>
         </w:rPr>
-        <w:t>{{CPF}}</w:t>
+        <w:t>{{{CPF}}}</w:t>
       </w:r>
     </w:p>
     <w:p>

</xml_diff>

<commit_message>
fix: repara templates docx juntando tags quebradas em multiplos runs
</commit_message>
<xml_diff>
--- a/backend/templates/contrato_venda.docx
+++ b/backend/templates/contrato_venda.docx
@@ -335,14 +335,23 @@
       <w:r>
         <w:rPr>
           <w:rFonts w:asciiTheme="majorHAnsi" w:hAnsiTheme="majorHAnsi" w:cstheme="majorHAnsi"/>
-          <w:b/>
-          <w:bCs/>
           <w:sz w:val="20"/>
           <w:szCs w:val="20"/>
           <w:lang w:val="pt-BR"/>
         </w:rPr>
-        <w:t>Nome:</w:t>
+        <w:t xml:space="preserve">Nome: {{Nome do Cliente}}</w:t>
       </w:r>
+    </w:p>
+    <w:p>
+      <w:pPr>
+        <w:pStyle w:val="SemEspaamento"/>
+        <w:rPr>
+          <w:rFonts w:asciiTheme="majorHAnsi" w:hAnsiTheme="majorHAnsi" w:cstheme="majorHAnsi"/>
+          <w:sz w:val="20"/>
+          <w:szCs w:val="20"/>
+          <w:lang w:val="pt-BR"/>
+        </w:rPr>
+      </w:pPr>
       <w:r>
         <w:rPr>
           <w:rFonts w:asciiTheme="majorHAnsi" w:hAnsiTheme="majorHAnsi" w:cstheme="majorHAnsi"/>
@@ -350,8 +359,19 @@
           <w:szCs w:val="20"/>
           <w:lang w:val="pt-BR"/>
         </w:rPr>
-        <w:t xml:space="preserve"> </w:t>
+        <w:t xml:space="preserve">RG n.: {{RG}}                                                                    CPF/MF n.: {{{CPF}}}</w:t>
       </w:r>
+    </w:p>
+    <w:p>
+      <w:pPr>
+        <w:pStyle w:val="SemEspaamento"/>
+        <w:rPr>
+          <w:rFonts w:asciiTheme="majorHAnsi" w:hAnsiTheme="majorHAnsi" w:cstheme="majorHAnsi"/>
+          <w:sz w:val="20"/>
+          <w:szCs w:val="20"/>
+          <w:lang w:val="pt-BR"/>
+        </w:rPr>
+      </w:pPr>
       <w:r>
         <w:rPr>
           <w:rFonts w:asciiTheme="majorHAnsi" w:hAnsiTheme="majorHAnsi" w:cstheme="majorHAnsi"/>
@@ -359,7 +379,7 @@
           <w:szCs w:val="20"/>
           <w:lang w:val="pt-BR"/>
         </w:rPr>
-        <w:t>{{Nome do Cliente}}</w:t>
+        <w:t xml:space="preserve">Endereco: {{Rua/Av}}, {{Número}}                               Bairro: {{Bairro}}</w:t>
       </w:r>
     </w:p>
     <w:p>
@@ -375,25 +395,23 @@
       <w:r>
         <w:rPr>
           <w:rFonts w:asciiTheme="majorHAnsi" w:hAnsiTheme="majorHAnsi" w:cstheme="majorHAnsi"/>
-          <w:b/>
-          <w:bCs/>
           <w:sz w:val="20"/>
           <w:szCs w:val="20"/>
           <w:lang w:val="pt-BR"/>
         </w:rPr>
-        <w:t>RG n.</w:t>
+        <w:t xml:space="preserve">Cidade/Municipio: {{Cidade}}                                      Estado: {{Estado}}                        Cep:{{Cep}}.</w:t>
       </w:r>
-      <w:r>
+    </w:p>
+    <w:p>
+      <w:pPr>
+        <w:pStyle w:val="SemEspaamento"/>
         <w:rPr>
           <w:rFonts w:asciiTheme="majorHAnsi" w:hAnsiTheme="majorHAnsi" w:cstheme="majorHAnsi"/>
-          <w:b/>
-          <w:bCs/>
           <w:sz w:val="20"/>
           <w:szCs w:val="20"/>
           <w:lang w:val="pt-BR"/>
         </w:rPr>
-        <w:t>:</w:t>
-      </w:r>
+      </w:pPr>
       <w:r>
         <w:rPr>
           <w:rFonts w:asciiTheme="majorHAnsi" w:hAnsiTheme="majorHAnsi" w:cstheme="majorHAnsi"/>
@@ -401,382 +419,7 @@
           <w:szCs w:val="20"/>
           <w:lang w:val="pt-BR"/>
         </w:rPr>
-        <w:t xml:space="preserve"> </w:t>
-      </w:r>
-      <w:r>
-        <w:rPr>
-          <w:rFonts w:asciiTheme="majorHAnsi" w:hAnsiTheme="majorHAnsi" w:cstheme="majorHAnsi"/>
-          <w:sz w:val="20"/>
-          <w:szCs w:val="20"/>
-          <w:lang w:val="pt-BR"/>
-        </w:rPr>
-        <w:t>{{RG}}</w:t>
-      </w:r>
-      <w:r>
-        <w:rPr>
-          <w:rFonts w:asciiTheme="majorHAnsi" w:hAnsiTheme="majorHAnsi" w:cstheme="majorHAnsi"/>
-          <w:sz w:val="20"/>
-          <w:szCs w:val="20"/>
-          <w:lang w:val="pt-BR"/>
-        </w:rPr>
-        <w:t xml:space="preserve"> </w:t>
-      </w:r>
-      <w:r>
-        <w:rPr>
-          <w:rFonts w:asciiTheme="majorHAnsi" w:hAnsiTheme="majorHAnsi" w:cstheme="majorHAnsi"/>
-          <w:sz w:val="20"/>
-          <w:szCs w:val="20"/>
-          <w:lang w:val="pt-BR"/>
-        </w:rPr>
-        <w:t xml:space="preserve">                            </w:t>
-      </w:r>
-      <w:r>
-        <w:rPr>
-          <w:rFonts w:asciiTheme="majorHAnsi" w:hAnsiTheme="majorHAnsi" w:cstheme="majorHAnsi"/>
-          <w:sz w:val="20"/>
-          <w:szCs w:val="20"/>
-          <w:lang w:val="pt-BR"/>
-        </w:rPr>
-        <w:t xml:space="preserve">                                       </w:t>
-      </w:r>
-      <w:r>
-        <w:rPr>
-          <w:rFonts w:asciiTheme="majorHAnsi" w:hAnsiTheme="majorHAnsi" w:cstheme="majorHAnsi"/>
-          <w:b/>
-          <w:bCs/>
-          <w:sz w:val="20"/>
-          <w:szCs w:val="20"/>
-          <w:lang w:val="pt-BR"/>
-        </w:rPr>
-        <w:t>CPF/MF n.</w:t>
-      </w:r>
-      <w:r>
-        <w:rPr>
-          <w:rFonts w:asciiTheme="majorHAnsi" w:hAnsiTheme="majorHAnsi" w:cstheme="majorHAnsi"/>
-          <w:b/>
-          <w:bCs/>
-          <w:sz w:val="20"/>
-          <w:szCs w:val="20"/>
-          <w:lang w:val="pt-BR"/>
-        </w:rPr>
-        <w:t>:</w:t>
-      </w:r>
-      <w:r>
-        <w:rPr>
-          <w:rFonts w:asciiTheme="majorHAnsi" w:hAnsiTheme="majorHAnsi" w:cstheme="majorHAnsi"/>
-          <w:sz w:val="20"/>
-          <w:szCs w:val="20"/>
-          <w:lang w:val="pt-BR"/>
-        </w:rPr>
-        <w:t xml:space="preserve"> </w:t>
-      </w:r>
-      <w:r>
-        <w:rPr>
-          <w:rFonts w:asciiTheme="majorHAnsi" w:hAnsiTheme="majorHAnsi" w:cstheme="majorHAnsi"/>
-          <w:sz w:val="20"/>
-          <w:szCs w:val="20"/>
-          <w:lang w:val="pt-BR"/>
-        </w:rPr>
-        <w:t>{{{CPF}}}</w:t>
-      </w:r>
-    </w:p>
-    <w:p>
-      <w:pPr>
-        <w:pStyle w:val="SemEspaamento"/>
-        <w:rPr>
-          <w:rFonts w:asciiTheme="majorHAnsi" w:hAnsiTheme="majorHAnsi" w:cstheme="majorHAnsi"/>
-          <w:sz w:val="20"/>
-          <w:szCs w:val="20"/>
-          <w:lang w:val="pt-BR"/>
-        </w:rPr>
-      </w:pPr>
-      <w:r>
-        <w:rPr>
-          <w:rFonts w:asciiTheme="majorHAnsi" w:hAnsiTheme="majorHAnsi" w:cstheme="majorHAnsi"/>
-          <w:b/>
-          <w:bCs/>
-          <w:sz w:val="20"/>
-          <w:szCs w:val="20"/>
-          <w:lang w:val="pt-BR"/>
-        </w:rPr>
-        <w:t>Endereco:</w:t>
-      </w:r>
-      <w:r>
-        <w:rPr>
-          <w:rFonts w:asciiTheme="majorHAnsi" w:hAnsiTheme="majorHAnsi" w:cstheme="majorHAnsi"/>
-          <w:sz w:val="20"/>
-          <w:szCs w:val="20"/>
-          <w:lang w:val="pt-BR"/>
-        </w:rPr>
-        <w:t xml:space="preserve"> </w:t>
-      </w:r>
-      <w:r>
-        <w:rPr>
-          <w:rFonts w:asciiTheme="majorHAnsi" w:hAnsiTheme="majorHAnsi" w:cstheme="majorHAnsi"/>
-          <w:sz w:val="20"/>
-          <w:szCs w:val="20"/>
-          <w:lang w:val="pt-BR"/>
-        </w:rPr>
-        <w:t xml:space="preserve">{{Rua/Av}}, {{Número}} </w:t>
-      </w:r>
-      <w:r>
-        <w:rPr>
-          <w:rFonts w:asciiTheme="majorHAnsi" w:hAnsiTheme="majorHAnsi" w:cstheme="majorHAnsi"/>
-          <w:sz w:val="20"/>
-          <w:szCs w:val="20"/>
-          <w:lang w:val="pt-BR"/>
-        </w:rPr>
-        <w:t xml:space="preserve">                             </w:t>
-      </w:r>
-      <w:r>
-        <w:rPr>
-          <w:rFonts w:asciiTheme="majorHAnsi" w:hAnsiTheme="majorHAnsi" w:cstheme="majorHAnsi"/>
-          <w:sz w:val="20"/>
-          <w:szCs w:val="20"/>
-          <w:lang w:val="pt-BR"/>
-        </w:rPr>
-        <w:t xml:space="preserve"> </w:t>
-      </w:r>
-      <w:r>
-        <w:rPr>
-          <w:rFonts w:asciiTheme="majorHAnsi" w:hAnsiTheme="majorHAnsi" w:cstheme="majorHAnsi"/>
-          <w:b/>
-          <w:bCs/>
-          <w:sz w:val="20"/>
-          <w:szCs w:val="20"/>
-          <w:lang w:val="pt-BR"/>
-        </w:rPr>
-        <w:t>Bairro:</w:t>
-      </w:r>
-      <w:r>
-        <w:rPr>
-          <w:rFonts w:asciiTheme="majorHAnsi" w:hAnsiTheme="majorHAnsi" w:cstheme="majorHAnsi"/>
-          <w:sz w:val="20"/>
-          <w:szCs w:val="20"/>
-          <w:lang w:val="pt-BR"/>
-        </w:rPr>
-        <w:t xml:space="preserve"> </w:t>
-      </w:r>
-      <w:r>
-        <w:rPr>
-          <w:rFonts w:asciiTheme="majorHAnsi" w:hAnsiTheme="majorHAnsi" w:cstheme="majorHAnsi"/>
-          <w:sz w:val="20"/>
-          <w:szCs w:val="20"/>
-          <w:lang w:val="pt-BR"/>
-        </w:rPr>
-        <w:t>{{Bairro}}</w:t>
-      </w:r>
-    </w:p>
-    <w:p>
-      <w:pPr>
-        <w:pStyle w:val="SemEspaamento"/>
-        <w:rPr>
-          <w:rFonts w:asciiTheme="majorHAnsi" w:hAnsiTheme="majorHAnsi" w:cstheme="majorHAnsi"/>
-          <w:sz w:val="20"/>
-          <w:szCs w:val="20"/>
-          <w:lang w:val="pt-BR"/>
-        </w:rPr>
-      </w:pPr>
-      <w:r>
-        <w:rPr>
-          <w:rFonts w:asciiTheme="majorHAnsi" w:hAnsiTheme="majorHAnsi" w:cstheme="majorHAnsi"/>
-          <w:b/>
-          <w:bCs/>
-          <w:sz w:val="20"/>
-          <w:szCs w:val="20"/>
-          <w:lang w:val="pt-BR"/>
-        </w:rPr>
-        <w:t>Cidade/Municipio:</w:t>
-      </w:r>
-      <w:r>
-        <w:rPr>
-          <w:rFonts w:asciiTheme="majorHAnsi" w:hAnsiTheme="majorHAnsi" w:cstheme="majorHAnsi"/>
-          <w:sz w:val="20"/>
-          <w:szCs w:val="20"/>
-          <w:lang w:val="pt-BR"/>
-        </w:rPr>
-        <w:t xml:space="preserve"> {{Cidade}}</w:t>
-      </w:r>
-      <w:r>
-        <w:rPr>
-          <w:rFonts w:asciiTheme="majorHAnsi" w:hAnsiTheme="majorHAnsi" w:cstheme="majorHAnsi"/>
-          <w:sz w:val="20"/>
-          <w:szCs w:val="20"/>
-          <w:lang w:val="pt-BR"/>
-        </w:rPr>
-        <w:t xml:space="preserve">                                      </w:t>
-      </w:r>
-      <w:r>
-        <w:rPr>
-          <w:rFonts w:asciiTheme="majorHAnsi" w:hAnsiTheme="majorHAnsi" w:cstheme="majorHAnsi"/>
-          <w:b/>
-          <w:bCs/>
-          <w:sz w:val="20"/>
-          <w:szCs w:val="20"/>
-          <w:lang w:val="pt-BR"/>
-        </w:rPr>
-        <w:t>Estado:</w:t>
-      </w:r>
-      <w:r>
-        <w:rPr>
-          <w:rFonts w:asciiTheme="majorHAnsi" w:hAnsiTheme="majorHAnsi" w:cstheme="majorHAnsi"/>
-          <w:sz w:val="20"/>
-          <w:szCs w:val="20"/>
-          <w:lang w:val="pt-BR"/>
-        </w:rPr>
-        <w:t xml:space="preserve"> </w:t>
-      </w:r>
-      <w:r>
-        <w:rPr>
-          <w:rFonts w:asciiTheme="majorHAnsi" w:hAnsiTheme="majorHAnsi" w:cstheme="majorHAnsi"/>
-          <w:sz w:val="20"/>
-          <w:szCs w:val="20"/>
-          <w:lang w:val="pt-BR"/>
-        </w:rPr>
-        <w:t xml:space="preserve">{{Estado}} </w:t>
-      </w:r>
-      <w:r>
-        <w:rPr>
-          <w:rFonts w:asciiTheme="majorHAnsi" w:hAnsiTheme="majorHAnsi" w:cstheme="majorHAnsi"/>
-          <w:sz w:val="20"/>
-          <w:szCs w:val="20"/>
-          <w:lang w:val="pt-BR"/>
-        </w:rPr>
-        <w:t xml:space="preserve">                       </w:t>
-      </w:r>
-      <w:r>
-        <w:rPr>
-          <w:rFonts w:asciiTheme="majorHAnsi" w:hAnsiTheme="majorHAnsi" w:cstheme="majorHAnsi"/>
-          <w:b/>
-          <w:bCs/>
-          <w:sz w:val="20"/>
-          <w:szCs w:val="20"/>
-          <w:lang w:val="pt-BR"/>
-        </w:rPr>
-        <w:t>Cep:</w:t>
-      </w:r>
-      <w:r>
-        <w:rPr>
-          <w:rFonts w:asciiTheme="majorHAnsi" w:hAnsiTheme="majorHAnsi" w:cstheme="majorHAnsi"/>
-          <w:sz w:val="20"/>
-          <w:szCs w:val="20"/>
-          <w:lang w:val="pt-BR"/>
-        </w:rPr>
-        <w:t>{{Cep}}</w:t>
-      </w:r>
-      <w:r>
-        <w:rPr>
-          <w:rFonts w:asciiTheme="majorHAnsi" w:hAnsiTheme="majorHAnsi" w:cstheme="majorHAnsi"/>
-          <w:sz w:val="20"/>
-          <w:szCs w:val="20"/>
-          <w:lang w:val="pt-BR"/>
-        </w:rPr>
-        <w:t>.</w:t>
-      </w:r>
-    </w:p>
-    <w:p>
-      <w:pPr>
-        <w:pStyle w:val="SemEspaamento"/>
-        <w:rPr>
-          <w:rFonts w:asciiTheme="majorHAnsi" w:hAnsiTheme="majorHAnsi" w:cstheme="majorHAnsi"/>
-          <w:sz w:val="20"/>
-          <w:szCs w:val="20"/>
-          <w:lang w:val="pt-BR"/>
-        </w:rPr>
-      </w:pPr>
-      <w:r>
-        <w:rPr>
-          <w:rFonts w:asciiTheme="majorHAnsi" w:hAnsiTheme="majorHAnsi" w:cstheme="majorHAnsi"/>
-          <w:b/>
-          <w:bCs/>
-          <w:sz w:val="20"/>
-          <w:szCs w:val="20"/>
-          <w:lang w:val="pt-BR"/>
-        </w:rPr>
-        <w:t>Cel:</w:t>
-      </w:r>
-      <w:r>
-        <w:rPr>
-          <w:rFonts w:asciiTheme="majorHAnsi" w:hAnsiTheme="majorHAnsi" w:cstheme="majorHAnsi"/>
-          <w:sz w:val="20"/>
-          <w:szCs w:val="20"/>
-          <w:lang w:val="pt-BR"/>
-        </w:rPr>
-        <w:t xml:space="preserve"> </w:t>
-      </w:r>
-      <w:r>
-        <w:rPr>
-          <w:rFonts w:asciiTheme="majorHAnsi" w:hAnsiTheme="majorHAnsi" w:cstheme="majorHAnsi"/>
-          <w:sz w:val="20"/>
-          <w:szCs w:val="20"/>
-          <w:lang w:val="pt-BR"/>
-        </w:rPr>
-        <w:t>{{Celu</w:t>
-      </w:r>
-      <w:r>
-        <w:rPr>
-          <w:rFonts w:asciiTheme="majorHAnsi" w:hAnsiTheme="majorHAnsi" w:cstheme="majorHAnsi"/>
-          <w:sz w:val="20"/>
-          <w:szCs w:val="20"/>
-          <w:lang w:val="pt-BR"/>
-        </w:rPr>
-        <w:t>lar}}</w:t>
-      </w:r>
-      <w:r>
-        <w:rPr>
-          <w:rFonts w:asciiTheme="majorHAnsi" w:hAnsiTheme="majorHAnsi" w:cstheme="majorHAnsi"/>
-          <w:sz w:val="20"/>
-          <w:szCs w:val="20"/>
-          <w:lang w:val="pt-BR"/>
-        </w:rPr>
-        <w:t>.</w:t>
-      </w:r>
-      <w:r>
-        <w:rPr>
-          <w:rFonts w:asciiTheme="majorHAnsi" w:hAnsiTheme="majorHAnsi" w:cstheme="majorHAnsi"/>
-          <w:sz w:val="20"/>
-          <w:szCs w:val="20"/>
-          <w:lang w:val="pt-BR"/>
-        </w:rPr>
-        <w:t xml:space="preserve">                                                              </w:t>
-      </w:r>
-      <w:r>
-        <w:rPr>
-          <w:rFonts w:asciiTheme="majorHAnsi" w:hAnsiTheme="majorHAnsi" w:cstheme="majorHAnsi"/>
-          <w:sz w:val="20"/>
-          <w:szCs w:val="20"/>
-          <w:lang w:val="pt-BR"/>
-        </w:rPr>
-        <w:t xml:space="preserve">  </w:t>
-      </w:r>
-      <w:r>
-        <w:rPr>
-          <w:rFonts w:asciiTheme="majorHAnsi" w:hAnsiTheme="majorHAnsi" w:cstheme="majorHAnsi"/>
-          <w:b/>
-          <w:bCs/>
-          <w:sz w:val="20"/>
-          <w:szCs w:val="20"/>
-          <w:lang w:val="pt-BR"/>
-        </w:rPr>
-        <w:t>E-mail</w:t>
-      </w:r>
-      <w:r>
-        <w:rPr>
-          <w:rFonts w:asciiTheme="majorHAnsi" w:hAnsiTheme="majorHAnsi" w:cstheme="majorHAnsi"/>
-          <w:sz w:val="20"/>
-          <w:szCs w:val="20"/>
-          <w:lang w:val="pt-BR"/>
-        </w:rPr>
-        <w:t>: {{</w:t>
-      </w:r>
-      <w:r>
-        <w:rPr>
-          <w:rFonts w:asciiTheme="majorHAnsi" w:hAnsiTheme="majorHAnsi" w:cstheme="majorHAnsi"/>
-          <w:sz w:val="20"/>
-          <w:szCs w:val="20"/>
-          <w:lang w:val="pt-BR"/>
-        </w:rPr>
-        <w:t>Email}}</w:t>
+        <w:t xml:space="preserve">Cel: {{Celular}}.                                                                E-mail: {{Email}}</w:t>
       </w:r>
     </w:p>
     <w:p>
@@ -1005,25 +648,41 @@
       <w:r>
         <w:rPr>
           <w:rFonts w:asciiTheme="majorHAnsi" w:hAnsiTheme="majorHAnsi" w:cstheme="majorHAnsi"/>
-          <w:b/>
-          <w:bCs/>
           <w:lang w:val="pt-BR"/>
         </w:rPr>
-        <w:t>Marca:</w:t>
+        <w:t xml:space="preserve">Marca: {{Marca}}</w:t>
       </w:r>
+    </w:p>
+    <w:p>
+      <w:pPr>
+        <w:spacing w:after="0" w:line="240" w:lineRule="auto"/>
+        <w:rPr>
+          <w:rFonts w:asciiTheme="majorHAnsi" w:hAnsiTheme="majorHAnsi" w:cstheme="majorHAnsi"/>
+          <w:lang w:val="pt-BR"/>
+        </w:rPr>
+      </w:pPr>
       <w:r>
         <w:rPr>
           <w:rFonts w:asciiTheme="majorHAnsi" w:hAnsiTheme="majorHAnsi" w:cstheme="majorHAnsi"/>
           <w:lang w:val="pt-BR"/>
         </w:rPr>
-        <w:t xml:space="preserve"> </w:t>
+        <w:t xml:space="preserve">Modelo: {{Modelo}}             Versão: {{Versão}}</w:t>
       </w:r>
+    </w:p>
+    <w:p>
+      <w:pPr>
+        <w:spacing w:after="0" w:line="240" w:lineRule="auto"/>
+        <w:rPr>
+          <w:rFonts w:asciiTheme="majorHAnsi" w:hAnsiTheme="majorHAnsi" w:cstheme="majorHAnsi"/>
+          <w:lang w:val="pt-BR"/>
+        </w:rPr>
+      </w:pPr>
       <w:r>
         <w:rPr>
           <w:rFonts w:asciiTheme="majorHAnsi" w:hAnsiTheme="majorHAnsi" w:cstheme="majorHAnsi"/>
           <w:lang w:val="pt-BR"/>
         </w:rPr>
-        <w:t>{{Marca}}</w:t>
+        <w:t xml:space="preserve">Ano Fabricação: {{Ano Fabricação}}      Ano Modelo: {{Ano Modelo}}     Cor: {{Cor}}</w:t>
       </w:r>
     </w:p>
     <w:p>
@@ -1037,382 +696,41 @@
       <w:r>
         <w:rPr>
           <w:rFonts w:asciiTheme="majorHAnsi" w:hAnsiTheme="majorHAnsi" w:cstheme="majorHAnsi"/>
-          <w:b/>
-          <w:bCs/>
           <w:lang w:val="pt-BR"/>
         </w:rPr>
-        <w:t>Modelo:</w:t>
+        <w:t xml:space="preserve">Placa: {{Placa}}                      Chassi: {{Chassi}}                           Renavan: {{Renavam}} </w:t>
       </w:r>
+    </w:p>
+    <w:p>
+      <w:pPr>
+        <w:spacing w:after="0" w:line="240" w:lineRule="auto"/>
+        <w:rPr>
+          <w:rFonts w:asciiTheme="majorHAnsi" w:hAnsiTheme="majorHAnsi" w:cstheme="majorHAnsi"/>
+          <w:lang w:val="pt-BR"/>
+        </w:rPr>
+      </w:pPr>
       <w:r>
         <w:rPr>
           <w:rFonts w:asciiTheme="majorHAnsi" w:hAnsiTheme="majorHAnsi" w:cstheme="majorHAnsi"/>
           <w:lang w:val="pt-BR"/>
         </w:rPr>
-        <w:t xml:space="preserve"> </w:t>
+        <w:t xml:space="preserve">Combustível: {{Combustível}}                                                     Km Atual: {{KM}}</w:t>
       </w:r>
+    </w:p>
+    <w:p>
+      <w:pPr>
+        <w:spacing w:after="0" w:line="240" w:lineRule="auto"/>
+        <w:rPr>
+          <w:rFonts w:asciiTheme="majorHAnsi" w:hAnsiTheme="majorHAnsi" w:cstheme="majorHAnsi"/>
+          <w:lang w:val="pt-BR"/>
+        </w:rPr>
+      </w:pPr>
       <w:r>
         <w:rPr>
           <w:rFonts w:asciiTheme="majorHAnsi" w:hAnsiTheme="majorHAnsi" w:cstheme="majorHAnsi"/>
           <w:lang w:val="pt-BR"/>
         </w:rPr>
-        <w:t xml:space="preserve">{{Modelo}}             </w:t>
-      </w:r>
-      <w:r>
-        <w:rPr>
-          <w:rFonts w:asciiTheme="majorHAnsi" w:hAnsiTheme="majorHAnsi" w:cstheme="majorHAnsi"/>
-          <w:b/>
-          <w:bCs/>
-          <w:lang w:val="pt-BR"/>
-        </w:rPr>
-        <w:t>Versão</w:t>
-      </w:r>
-      <w:r>
-        <w:rPr>
-          <w:rFonts w:asciiTheme="majorHAnsi" w:hAnsiTheme="majorHAnsi" w:cstheme="majorHAnsi"/>
-          <w:lang w:val="pt-BR"/>
-        </w:rPr>
-        <w:t xml:space="preserve">: </w:t>
-      </w:r>
-      <w:r>
-        <w:rPr>
-          <w:rFonts w:asciiTheme="majorHAnsi" w:hAnsiTheme="majorHAnsi" w:cstheme="majorHAnsi"/>
-          <w:lang w:val="pt-BR"/>
-        </w:rPr>
-        <w:t>{{</w:t>
-      </w:r>
-      <w:r>
-        <w:rPr>
-          <w:rFonts w:asciiTheme="majorHAnsi" w:hAnsiTheme="majorHAnsi" w:cstheme="majorHAnsi"/>
-          <w:lang w:val="pt-BR"/>
-        </w:rPr>
-        <w:t>Versão</w:t>
-      </w:r>
-      <w:r>
-        <w:rPr>
-          <w:rFonts w:asciiTheme="majorHAnsi" w:hAnsiTheme="majorHAnsi" w:cstheme="majorHAnsi"/>
-          <w:lang w:val="pt-BR"/>
-        </w:rPr>
-        <w:t>}}</w:t>
-      </w:r>
-    </w:p>
-    <w:p>
-      <w:pPr>
-        <w:spacing w:after="0" w:line="240" w:lineRule="auto"/>
-        <w:rPr>
-          <w:rFonts w:asciiTheme="majorHAnsi" w:hAnsiTheme="majorHAnsi" w:cstheme="majorHAnsi"/>
-          <w:lang w:val="pt-BR"/>
-        </w:rPr>
-      </w:pPr>
-      <w:r>
-        <w:rPr>
-          <w:rFonts w:asciiTheme="majorHAnsi" w:hAnsiTheme="majorHAnsi" w:cstheme="majorHAnsi"/>
-          <w:b/>
-          <w:bCs/>
-          <w:lang w:val="pt-BR"/>
-        </w:rPr>
-        <w:t>Ano</w:t>
-      </w:r>
-      <w:r>
-        <w:rPr>
-          <w:rFonts w:asciiTheme="majorHAnsi" w:hAnsiTheme="majorHAnsi" w:cstheme="majorHAnsi"/>
-          <w:b/>
-          <w:bCs/>
-          <w:lang w:val="pt-BR"/>
-        </w:rPr>
-        <w:t xml:space="preserve"> Fabricação</w:t>
-      </w:r>
-      <w:r>
-        <w:rPr>
-          <w:rFonts w:asciiTheme="majorHAnsi" w:hAnsiTheme="majorHAnsi" w:cstheme="majorHAnsi"/>
-          <w:b/>
-          <w:bCs/>
-          <w:lang w:val="pt-BR"/>
-        </w:rPr>
-        <w:t>:</w:t>
-      </w:r>
-      <w:r>
-        <w:rPr>
-          <w:rFonts w:asciiTheme="majorHAnsi" w:hAnsiTheme="majorHAnsi" w:cstheme="majorHAnsi"/>
-          <w:lang w:val="pt-BR"/>
-        </w:rPr>
-        <w:t xml:space="preserve"> </w:t>
-      </w:r>
-      <w:r>
-        <w:rPr>
-          <w:rFonts w:asciiTheme="majorHAnsi" w:hAnsiTheme="majorHAnsi" w:cstheme="majorHAnsi"/>
-          <w:lang w:val="pt-BR"/>
-        </w:rPr>
-        <w:t>{{Ano</w:t>
-      </w:r>
-      <w:r>
-        <w:rPr>
-          <w:rFonts w:asciiTheme="majorHAnsi" w:hAnsiTheme="majorHAnsi" w:cstheme="majorHAnsi"/>
-          <w:lang w:val="pt-BR"/>
-        </w:rPr>
-        <w:t xml:space="preserve"> Fabricação</w:t>
-      </w:r>
-      <w:r>
-        <w:rPr>
-          <w:rFonts w:asciiTheme="majorHAnsi" w:hAnsiTheme="majorHAnsi" w:cstheme="majorHAnsi"/>
-          <w:lang w:val="pt-BR"/>
-        </w:rPr>
-        <w:t xml:space="preserve">}}      </w:t>
-      </w:r>
-      <w:r>
-        <w:rPr>
-          <w:rFonts w:asciiTheme="majorHAnsi" w:hAnsiTheme="majorHAnsi" w:cstheme="majorHAnsi"/>
-          <w:b/>
-          <w:bCs/>
-          <w:lang w:val="pt-BR"/>
-        </w:rPr>
-        <w:t>Ano Modelo:</w:t>
-      </w:r>
-      <w:r>
-        <w:rPr>
-          <w:rFonts w:asciiTheme="majorHAnsi" w:hAnsiTheme="majorHAnsi" w:cstheme="majorHAnsi"/>
-          <w:lang w:val="pt-BR"/>
-        </w:rPr>
-        <w:t xml:space="preserve"> {{Ano Modelo}}     </w:t>
-      </w:r>
-      <w:r>
-        <w:rPr>
-          <w:rFonts w:asciiTheme="majorHAnsi" w:hAnsiTheme="majorHAnsi" w:cstheme="majorHAnsi"/>
-          <w:b/>
-          <w:bCs/>
-          <w:lang w:val="pt-BR"/>
-        </w:rPr>
-        <w:t>Cor:</w:t>
-      </w:r>
-      <w:r>
-        <w:rPr>
-          <w:rFonts w:asciiTheme="majorHAnsi" w:hAnsiTheme="majorHAnsi" w:cstheme="majorHAnsi"/>
-          <w:b/>
-          <w:bCs/>
-          <w:lang w:val="pt-BR"/>
-        </w:rPr>
-        <w:t xml:space="preserve"> </w:t>
-      </w:r>
-      <w:r>
-        <w:rPr>
-          <w:rFonts w:asciiTheme="majorHAnsi" w:hAnsiTheme="majorHAnsi" w:cstheme="majorHAnsi"/>
-          <w:lang w:val="pt-BR"/>
-        </w:rPr>
-        <w:t>{{Cor}}</w:t>
-      </w:r>
-    </w:p>
-    <w:p>
-      <w:pPr>
-        <w:spacing w:after="0" w:line="240" w:lineRule="auto"/>
-        <w:rPr>
-          <w:rFonts w:asciiTheme="majorHAnsi" w:hAnsiTheme="majorHAnsi" w:cstheme="majorHAnsi"/>
-          <w:lang w:val="pt-BR"/>
-        </w:rPr>
-      </w:pPr>
-      <w:r>
-        <w:rPr>
-          <w:rFonts w:asciiTheme="majorHAnsi" w:hAnsiTheme="majorHAnsi" w:cstheme="majorHAnsi"/>
-          <w:b/>
-          <w:bCs/>
-          <w:lang w:val="pt-BR"/>
-        </w:rPr>
-        <w:t>Placa:</w:t>
-      </w:r>
-      <w:r>
-        <w:rPr>
-          <w:rFonts w:asciiTheme="majorHAnsi" w:hAnsiTheme="majorHAnsi" w:cstheme="majorHAnsi"/>
-          <w:lang w:val="pt-BR"/>
-        </w:rPr>
-        <w:t xml:space="preserve"> </w:t>
-      </w:r>
-      <w:r>
-        <w:rPr>
-          <w:rFonts w:asciiTheme="majorHAnsi" w:hAnsiTheme="majorHAnsi" w:cstheme="majorHAnsi"/>
-          <w:lang w:val="pt-BR"/>
-        </w:rPr>
-        <w:t xml:space="preserve">{{Placa}}     </w:t>
-      </w:r>
-      <w:r>
-        <w:rPr>
-          <w:rFonts w:asciiTheme="majorHAnsi" w:hAnsiTheme="majorHAnsi" w:cstheme="majorHAnsi"/>
-          <w:lang w:val="pt-BR"/>
-        </w:rPr>
-        <w:t xml:space="preserve"> </w:t>
-      </w:r>
-      <w:r>
-        <w:rPr>
-          <w:rFonts w:asciiTheme="majorHAnsi" w:hAnsiTheme="majorHAnsi" w:cstheme="majorHAnsi"/>
-          <w:lang w:val="pt-BR"/>
-        </w:rPr>
-        <w:t xml:space="preserve">  </w:t>
-      </w:r>
-      <w:r>
-        <w:rPr>
-          <w:rFonts w:asciiTheme="majorHAnsi" w:hAnsiTheme="majorHAnsi" w:cstheme="majorHAnsi"/>
-          <w:lang w:val="pt-BR"/>
-        </w:rPr>
-        <w:t xml:space="preserve">              </w:t>
-      </w:r>
-      <w:r>
-        <w:rPr>
-          <w:rFonts w:asciiTheme="majorHAnsi" w:hAnsiTheme="majorHAnsi" w:cstheme="majorHAnsi"/>
-          <w:b/>
-          <w:bCs/>
-          <w:lang w:val="pt-BR"/>
-        </w:rPr>
-        <w:t>Chassi:</w:t>
-      </w:r>
-      <w:r>
-        <w:rPr>
-          <w:rFonts w:asciiTheme="majorHAnsi" w:hAnsiTheme="majorHAnsi" w:cstheme="majorHAnsi"/>
-          <w:lang w:val="pt-BR"/>
-        </w:rPr>
-        <w:t xml:space="preserve"> </w:t>
-      </w:r>
-      <w:r>
-        <w:rPr>
-          <w:rFonts w:asciiTheme="majorHAnsi" w:hAnsiTheme="majorHAnsi" w:cstheme="majorHAnsi"/>
-          <w:lang w:val="pt-BR"/>
-        </w:rPr>
-        <w:t xml:space="preserve">{{Chassi}}                           </w:t>
-      </w:r>
-      <w:r>
-        <w:rPr>
-          <w:rFonts w:asciiTheme="majorHAnsi" w:hAnsiTheme="majorHAnsi" w:cstheme="majorHAnsi"/>
-          <w:b/>
-          <w:bCs/>
-          <w:lang w:val="pt-BR"/>
-        </w:rPr>
-        <w:t>Renavan:</w:t>
-      </w:r>
-      <w:r>
-        <w:rPr>
-          <w:rFonts w:asciiTheme="majorHAnsi" w:hAnsiTheme="majorHAnsi" w:cstheme="majorHAnsi"/>
-          <w:lang w:val="pt-BR"/>
-        </w:rPr>
-        <w:t xml:space="preserve"> </w:t>
-      </w:r>
-      <w:r>
-        <w:rPr>
-          <w:rFonts w:asciiTheme="majorHAnsi" w:hAnsiTheme="majorHAnsi" w:cstheme="majorHAnsi"/>
-          <w:lang w:val="pt-BR"/>
-        </w:rPr>
-        <w:t>{{Renavam}}</w:t>
-      </w:r>
-      <w:r>
-        <w:rPr>
-          <w:rFonts w:asciiTheme="majorHAnsi" w:hAnsiTheme="majorHAnsi" w:cstheme="majorHAnsi"/>
-          <w:lang w:val="pt-BR"/>
-        </w:rPr>
-        <w:t xml:space="preserve"> </w:t>
-      </w:r>
-    </w:p>
-    <w:p>
-      <w:pPr>
-        <w:spacing w:after="0" w:line="240" w:lineRule="auto"/>
-        <w:rPr>
-          <w:rFonts w:asciiTheme="majorHAnsi" w:hAnsiTheme="majorHAnsi" w:cstheme="majorHAnsi"/>
-          <w:lang w:val="pt-BR"/>
-        </w:rPr>
-      </w:pPr>
-      <w:r>
-        <w:rPr>
-          <w:rFonts w:asciiTheme="majorHAnsi" w:hAnsiTheme="majorHAnsi" w:cstheme="majorHAnsi"/>
-          <w:b/>
-          <w:bCs/>
-          <w:lang w:val="pt-BR"/>
-        </w:rPr>
-        <w:t>Combustível</w:t>
-      </w:r>
-      <w:r>
-        <w:rPr>
-          <w:rFonts w:asciiTheme="majorHAnsi" w:hAnsiTheme="majorHAnsi" w:cstheme="majorHAnsi"/>
-          <w:b/>
-          <w:bCs/>
-          <w:lang w:val="pt-BR"/>
-        </w:rPr>
-        <w:t>:</w:t>
-      </w:r>
-      <w:r>
-        <w:rPr>
-          <w:rFonts w:asciiTheme="majorHAnsi" w:hAnsiTheme="majorHAnsi" w:cstheme="majorHAnsi"/>
-          <w:b/>
-          <w:bCs/>
-          <w:lang w:val="pt-BR"/>
-        </w:rPr>
-        <w:t xml:space="preserve"> </w:t>
-      </w:r>
-      <w:r>
-        <w:rPr>
-          <w:rFonts w:asciiTheme="majorHAnsi" w:hAnsiTheme="majorHAnsi" w:cstheme="majorHAnsi"/>
-          <w:lang w:val="pt-BR"/>
-        </w:rPr>
-        <w:t>{{Combustível}}</w:t>
-      </w:r>
-      <w:r>
-        <w:rPr>
-          <w:rFonts w:asciiTheme="majorHAnsi" w:hAnsiTheme="majorHAnsi" w:cstheme="majorHAnsi"/>
-          <w:b/>
-          <w:bCs/>
-          <w:lang w:val="pt-BR"/>
-        </w:rPr>
-        <w:t xml:space="preserve">                                     </w:t>
-      </w:r>
-      <w:r>
-        <w:rPr>
-          <w:rFonts w:asciiTheme="majorHAnsi" w:hAnsiTheme="majorHAnsi" w:cstheme="majorHAnsi"/>
-          <w:b/>
-          <w:bCs/>
-          <w:lang w:val="pt-BR"/>
-        </w:rPr>
-        <w:t xml:space="preserve">                </w:t>
-      </w:r>
-      <w:r>
-        <w:rPr>
-          <w:rFonts w:asciiTheme="majorHAnsi" w:hAnsiTheme="majorHAnsi" w:cstheme="majorHAnsi"/>
-          <w:b/>
-          <w:bCs/>
-          <w:lang w:val="pt-BR"/>
-        </w:rPr>
-        <w:t>Km Atual:</w:t>
-      </w:r>
-      <w:r>
-        <w:rPr>
-          <w:rFonts w:asciiTheme="majorHAnsi" w:hAnsiTheme="majorHAnsi" w:cstheme="majorHAnsi"/>
-          <w:lang w:val="pt-BR"/>
-        </w:rPr>
-        <w:t xml:space="preserve"> {{KM}}</w:t>
-      </w:r>
-    </w:p>
-    <w:p>
-      <w:pPr>
-        <w:spacing w:after="0" w:line="240" w:lineRule="auto"/>
-        <w:rPr>
-          <w:rFonts w:asciiTheme="majorHAnsi" w:hAnsiTheme="majorHAnsi" w:cstheme="majorHAnsi"/>
-          <w:lang w:val="pt-BR"/>
-        </w:rPr>
-      </w:pPr>
-      <w:r>
-        <w:rPr>
-          <w:rFonts w:asciiTheme="majorHAnsi" w:hAnsiTheme="majorHAnsi" w:cstheme="majorHAnsi"/>
-          <w:b/>
-          <w:bCs/>
-          <w:lang w:val="pt-BR"/>
-        </w:rPr>
-        <w:t>Valor da Venda:</w:t>
-      </w:r>
-      <w:r>
-        <w:rPr>
-          <w:rFonts w:asciiTheme="majorHAnsi" w:hAnsiTheme="majorHAnsi" w:cstheme="majorHAnsi"/>
-          <w:lang w:val="pt-BR"/>
-        </w:rPr>
-        <w:t xml:space="preserve"> {{</w:t>
-      </w:r>
-      <w:r>
-        <w:rPr>
-          <w:rFonts w:asciiTheme="majorHAnsi" w:hAnsiTheme="majorHAnsi" w:cstheme="majorHAnsi"/>
-          <w:lang w:val="pt-BR"/>
-        </w:rPr>
-        <w:t>Valor da Venda}}</w:t>
+        <w:t xml:space="preserve">Valor da Venda: {{Valor da Venda}}</w:t>
       </w:r>
     </w:p>
     <w:p>
@@ -1719,71 +1037,7 @@
           <w:szCs w:val="20"/>
           <w:lang w:val="pt-BR"/>
         </w:rPr>
-        <w:t>Eu, {{</w:t>
-      </w:r>
-      <w:r>
-        <w:rPr>
-          <w:rFonts w:asciiTheme="majorHAnsi" w:hAnsiTheme="majorHAnsi" w:cstheme="majorHAnsi"/>
-          <w:szCs w:val="20"/>
-          <w:lang w:val="pt-BR"/>
-        </w:rPr>
-        <w:t>Nome do Cliente}}</w:t>
-      </w:r>
-      <w:r>
-        <w:rPr>
-          <w:rFonts w:asciiTheme="majorHAnsi" w:hAnsiTheme="majorHAnsi" w:cstheme="majorHAnsi"/>
-          <w:szCs w:val="20"/>
-          <w:lang w:val="pt-BR"/>
-        </w:rPr>
-        <w:t>, afirmo ter pago a JTS INTERMEDIAÇÕES E NEGOCIOS LTDA pela compra do veiculo citado, a quantia de</w:t>
-      </w:r>
-      <w:r>
-        <w:rPr>
-          <w:rFonts w:asciiTheme="majorHAnsi" w:hAnsiTheme="majorHAnsi" w:cstheme="majorHAnsi"/>
-          <w:szCs w:val="20"/>
-          <w:lang w:val="pt-BR"/>
-        </w:rPr>
-        <w:t>: {{Valor da Venda}}</w:t>
-      </w:r>
-      <w:r>
-        <w:rPr>
-          <w:rFonts w:asciiTheme="majorHAnsi" w:hAnsiTheme="majorHAnsi" w:cstheme="majorHAnsi"/>
-          <w:szCs w:val="20"/>
-          <w:lang w:val="pt-BR"/>
-        </w:rPr>
-        <w:t xml:space="preserve"> ( </w:t>
-      </w:r>
-      <w:r>
-        <w:rPr>
-          <w:rFonts w:asciiTheme="majorHAnsi" w:hAnsiTheme="majorHAnsi" w:cstheme="majorHAnsi"/>
-          <w:szCs w:val="20"/>
-          <w:lang w:val="pt-BR"/>
-        </w:rPr>
-        <w:t>Valor por extenso</w:t>
-      </w:r>
-      <w:r>
-        <w:rPr>
-          <w:rFonts w:asciiTheme="majorHAnsi" w:hAnsiTheme="majorHAnsi" w:cstheme="majorHAnsi"/>
-          <w:szCs w:val="20"/>
-          <w:lang w:val="pt-BR"/>
-        </w:rPr>
-        <w:t>),</w:t>
-      </w:r>
-      <w:r>
-        <w:rPr>
-          <w:rFonts w:asciiTheme="majorHAnsi" w:hAnsiTheme="majorHAnsi" w:cstheme="majorHAnsi"/>
-          <w:szCs w:val="20"/>
-          <w:lang w:val="pt-BR"/>
-        </w:rPr>
-        <w:t xml:space="preserve"> a ser pago da forma</w:t>
-      </w:r>
-      <w:r>
-        <w:rPr>
-          <w:rFonts w:asciiTheme="majorHAnsi" w:hAnsiTheme="majorHAnsi" w:cstheme="majorHAnsi"/>
-          <w:szCs w:val="20"/>
-          <w:lang w:val="pt-BR"/>
-        </w:rPr>
-        <w:t xml:space="preserve"> descrita abaixo:</w:t>
+        <w:t xml:space="preserve">Eu, {{Nome do Cliente}}, afirmo ter pago a JTS INTERMEDIAÇÕES E NEGOCIOS LTDA pela compra do veiculo citado, a quantia de: {{Valor da Venda}} ( Valor por extenso), a ser pago da forma descrita abaixo:</w:t>
       </w:r>
     </w:p>
     <w:p>
@@ -2128,99 +1382,7 @@
           <w:szCs w:val="20"/>
           <w:lang w:val="pt-BR"/>
         </w:rPr>
-        <w:t xml:space="preserve">Data da </w:t>
-      </w:r>
-      <w:r>
-        <w:rPr>
-          <w:rFonts w:asciiTheme="majorHAnsi" w:hAnsiTheme="majorHAnsi" w:cstheme="majorHAnsi"/>
-          <w:b/>
-          <w:bCs/>
-          <w:szCs w:val="20"/>
-          <w:lang w:val="pt-BR"/>
-        </w:rPr>
-        <w:t xml:space="preserve">Venda: </w:t>
-      </w:r>
-      <w:r>
-        <w:rPr>
-          <w:rFonts w:asciiTheme="majorHAnsi" w:hAnsiTheme="majorHAnsi" w:cstheme="majorHAnsi"/>
-          <w:szCs w:val="20"/>
-          <w:lang w:val="pt-BR"/>
-        </w:rPr>
-        <w:t>{{Data da Venda</w:t>
-      </w:r>
-      <w:r>
-        <w:rPr>
-          <w:rFonts w:asciiTheme="majorHAnsi" w:hAnsiTheme="majorHAnsi" w:cstheme="majorHAnsi"/>
-          <w:szCs w:val="20"/>
-          <w:lang w:val="pt-BR"/>
-        </w:rPr>
-        <w:t>}}</w:t>
-      </w:r>
-      <w:r>
-        <w:rPr>
-          <w:rFonts w:asciiTheme="majorHAnsi" w:hAnsiTheme="majorHAnsi" w:cstheme="majorHAnsi"/>
-          <w:b/>
-          <w:bCs/>
-          <w:szCs w:val="20"/>
-          <w:lang w:val="pt-BR"/>
-        </w:rPr>
-        <w:t xml:space="preserve"> </w:t>
-      </w:r>
-      <w:r>
-        <w:rPr>
-          <w:rFonts w:asciiTheme="majorHAnsi" w:hAnsiTheme="majorHAnsi" w:cstheme="majorHAnsi"/>
-          <w:b/>
-          <w:bCs/>
-          <w:szCs w:val="20"/>
-          <w:lang w:val="pt-BR"/>
-        </w:rPr>
-        <w:t xml:space="preserve">                Valor d</w:t>
-      </w:r>
-      <w:r>
-        <w:rPr>
-          <w:rFonts w:asciiTheme="majorHAnsi" w:hAnsiTheme="majorHAnsi" w:cstheme="majorHAnsi"/>
-          <w:b/>
-          <w:bCs/>
-          <w:szCs w:val="20"/>
-          <w:lang w:val="pt-BR"/>
-        </w:rPr>
-        <w:t>e Venda</w:t>
-      </w:r>
-      <w:r>
-        <w:rPr>
-          <w:rFonts w:asciiTheme="majorHAnsi" w:hAnsiTheme="majorHAnsi" w:cstheme="majorHAnsi"/>
-          <w:b/>
-          <w:bCs/>
-          <w:szCs w:val="20"/>
-          <w:lang w:val="pt-BR"/>
-        </w:rPr>
-        <w:t>:</w:t>
-      </w:r>
-      <w:r>
-        <w:rPr>
-          <w:rFonts w:asciiTheme="majorHAnsi" w:hAnsiTheme="majorHAnsi" w:cstheme="majorHAnsi"/>
-          <w:b/>
-          <w:bCs/>
-          <w:szCs w:val="20"/>
-          <w:lang w:val="pt-BR"/>
-        </w:rPr>
-        <w:t xml:space="preserve"> </w:t>
-      </w:r>
-      <w:r>
-        <w:rPr>
-          <w:rFonts w:asciiTheme="majorHAnsi" w:hAnsiTheme="majorHAnsi" w:cstheme="majorHAnsi"/>
-          <w:szCs w:val="20"/>
-          <w:lang w:val="pt-BR"/>
-        </w:rPr>
-        <w:t>{{Valor da Venda}}</w:t>
-      </w:r>
-      <w:r>
-        <w:rPr>
-          <w:rFonts w:asciiTheme="majorHAnsi" w:hAnsiTheme="majorHAnsi" w:cstheme="majorHAnsi"/>
-          <w:szCs w:val="20"/>
-          <w:lang w:val="pt-BR"/>
-        </w:rPr>
-        <w:t xml:space="preserve"> </w:t>
+        <w:t xml:space="preserve">Data da Venda: {{Data da Venda}}                 Valor de Venda: {{Valor da Venda}} </w:t>
       </w:r>
     </w:p>
     <w:p>
@@ -2240,6 +1402,28 @@
         <w:spacing w:after="0" w:line="240" w:lineRule="auto"/>
         <w:rPr>
           <w:rFonts w:asciiTheme="majorHAnsi" w:hAnsiTheme="majorHAnsi" w:cstheme="majorHAnsi"/>
+          <w:color w:val="auto"/>
+          <w:szCs w:val="20"/>
+          <w:lang w:val="pt-BR"/>
+        </w:rPr>
+      </w:pPr>
+      <w:r>
+        <w:rPr>
+          <w:rFonts w:asciiTheme="majorHAnsi" w:hAnsiTheme="majorHAnsi" w:cstheme="majorHAnsi"/>
+          <w:color w:val="auto"/>
+          <w:szCs w:val="20"/>
+          <w:lang w:val="pt-BR"/>
+        </w:rPr>
+        <w:t xml:space="preserve">Forma de Pagamento: {{Forma de Pagamento}}</w:t>
+      </w:r>
+    </w:p>
+    <w:p>
+      <w:pPr>
+        <w:spacing w:after="0" w:line="240" w:lineRule="auto"/>
+        <w:rPr>
+          <w:rFonts w:asciiTheme="majorHAnsi" w:hAnsiTheme="majorHAnsi" w:cstheme="majorHAnsi"/>
+          <w:b/>
+          <w:bCs/>
           <w:color w:val="auto"/>
           <w:szCs w:val="20"/>
           <w:lang w:val="pt-BR"/>
@@ -2254,25 +1438,7 @@
           <w:szCs w:val="20"/>
           <w:lang w:val="pt-BR"/>
         </w:rPr>
-        <w:t xml:space="preserve">Forma de Pagamento: </w:t>
-      </w:r>
-      <w:r>
-        <w:rPr>
-          <w:rFonts w:asciiTheme="majorHAnsi" w:hAnsiTheme="majorHAnsi" w:cstheme="majorHAnsi"/>
-          <w:color w:val="auto"/>
-          <w:szCs w:val="20"/>
-          <w:lang w:val="pt-BR"/>
-        </w:rPr>
-        <w:t>{{Forma de Pagamento</w:t>
-      </w:r>
-      <w:r>
-        <w:rPr>
-          <w:rFonts w:asciiTheme="majorHAnsi" w:hAnsiTheme="majorHAnsi" w:cstheme="majorHAnsi"/>
-          <w:color w:val="auto"/>
-          <w:szCs w:val="20"/>
-          <w:lang w:val="pt-BR"/>
-        </w:rPr>
-        <w:t>}}</w:t>
+        <w:t xml:space="preserve">Entrada: {{Valor da Entrada Financiamento}}</w:t>
       </w:r>
     </w:p>
     <w:p>
@@ -2296,54 +1462,7 @@
           <w:szCs w:val="20"/>
           <w:lang w:val="pt-BR"/>
         </w:rPr>
-        <w:t>Entrada:</w:t>
-      </w:r>
-      <w:r>
-        <w:rPr>
-          <w:rFonts w:asciiTheme="majorHAnsi" w:hAnsiTheme="majorHAnsi" w:cstheme="majorHAnsi"/>
-          <w:b/>
-          <w:bCs/>
-          <w:color w:val="EE0000"/>
-          <w:szCs w:val="20"/>
-          <w:lang w:val="pt-BR"/>
-        </w:rPr>
-        <w:t xml:space="preserve"> </w:t>
-      </w:r>
-      <w:r>
-        <w:rPr>
-          <w:rFonts w:asciiTheme="majorHAnsi" w:hAnsiTheme="majorHAnsi" w:cstheme="majorHAnsi"/>
-          <w:color w:val="auto"/>
-          <w:szCs w:val="20"/>
-          <w:lang w:val="pt-BR"/>
-        </w:rPr>
-        <w:t>{{</w:t>
-      </w:r>
-      <w:r>
-        <w:rPr>
-          <w:rFonts w:asciiTheme="majorHAnsi" w:hAnsiTheme="majorHAnsi" w:cstheme="majorHAnsi"/>
-          <w:color w:val="auto"/>
-          <w:szCs w:val="20"/>
-          <w:lang w:val="pt-BR"/>
-        </w:rPr>
-        <w:t xml:space="preserve">Valor da Entrada </w:t>
-      </w:r>
-      <w:r>
-        <w:rPr>
-          <w:rFonts w:asciiTheme="majorHAnsi" w:hAnsiTheme="majorHAnsi" w:cstheme="majorHAnsi"/>
-          <w:color w:val="auto"/>
-          <w:szCs w:val="20"/>
-          <w:lang w:val="pt-BR"/>
-        </w:rPr>
-        <w:t>Financiamento</w:t>
-      </w:r>
-      <w:r>
-        <w:rPr>
-          <w:rFonts w:asciiTheme="majorHAnsi" w:hAnsiTheme="majorHAnsi" w:cstheme="majorHAnsi"/>
-          <w:color w:val="auto"/>
-          <w:szCs w:val="20"/>
-          <w:lang w:val="pt-BR"/>
-        </w:rPr>
-        <w:t>}}</w:t>
+        <w:t xml:space="preserve">Financeira: {{Financeira}}                          Data do Financiamento: {{Data do Financiamento}}</w:t>
       </w:r>
     </w:p>
     <w:p>
@@ -2367,35 +1486,34 @@
           <w:szCs w:val="20"/>
           <w:lang w:val="pt-BR"/>
         </w:rPr>
-        <w:t xml:space="preserve">Financeira: </w:t>
+        <w:t xml:space="preserve">Valor Financiado: {{Valor Financiado}}   Nº de Parcelas: {{N° de Parcelas}}   Valor das Parcelas: {{Valor das Parcelas}}</w:t>
       </w:r>
-      <w:r>
+    </w:p>
+    <w:p>
+      <w:pPr>
+        <w:spacing w:after="0" w:line="240" w:lineRule="auto"/>
         <w:rPr>
           <w:rFonts w:asciiTheme="majorHAnsi" w:hAnsiTheme="majorHAnsi" w:cstheme="majorHAnsi"/>
+          <w:b/>
+          <w:bCs/>
           <w:color w:val="auto"/>
           <w:szCs w:val="20"/>
           <w:lang w:val="pt-BR"/>
         </w:rPr>
-        <w:t>{{Financeira}}</w:t>
-      </w:r>
-      <w:r>
+      </w:pPr>
+    </w:p>
+    <w:p>
+      <w:pPr>
+        <w:spacing w:after="0" w:line="240" w:lineRule="auto"/>
         <w:rPr>
           <w:rFonts w:asciiTheme="majorHAnsi" w:hAnsiTheme="majorHAnsi" w:cstheme="majorHAnsi"/>
+          <w:b/>
+          <w:bCs/>
           <w:color w:val="auto"/>
           <w:szCs w:val="20"/>
           <w:lang w:val="pt-BR"/>
         </w:rPr>
-        <w:t xml:space="preserve">     </w:t>
-      </w:r>
-      <w:r>
-        <w:rPr>
-          <w:rFonts w:asciiTheme="majorHAnsi" w:hAnsiTheme="majorHAnsi" w:cstheme="majorHAnsi"/>
-          <w:color w:val="auto"/>
-          <w:szCs w:val="20"/>
-          <w:lang w:val="pt-BR"/>
-        </w:rPr>
-        <w:t xml:space="preserve">                     </w:t>
-      </w:r>
+      </w:pPr>
       <w:r>
         <w:rPr>
           <w:rFonts w:asciiTheme="majorHAnsi" w:hAnsiTheme="majorHAnsi" w:cstheme="majorHAnsi"/>
@@ -2405,246 +1523,7 @@
           <w:szCs w:val="20"/>
           <w:lang w:val="pt-BR"/>
         </w:rPr>
-        <w:t>Data do Financiamento:</w:t>
-      </w:r>
-      <w:r>
-        <w:rPr>
-          <w:rFonts w:asciiTheme="majorHAnsi" w:hAnsiTheme="majorHAnsi" w:cstheme="majorHAnsi"/>
-          <w:color w:val="auto"/>
-          <w:szCs w:val="20"/>
-          <w:lang w:val="pt-BR"/>
-        </w:rPr>
-        <w:t xml:space="preserve"> </w:t>
-      </w:r>
-      <w:r>
-        <w:rPr>
-          <w:rFonts w:asciiTheme="majorHAnsi" w:hAnsiTheme="majorHAnsi" w:cstheme="majorHAnsi"/>
-          <w:color w:val="auto"/>
-          <w:szCs w:val="20"/>
-          <w:lang w:val="pt-BR"/>
-        </w:rPr>
-        <w:t>{{</w:t>
-      </w:r>
-      <w:r>
-        <w:rPr>
-          <w:rFonts w:asciiTheme="majorHAnsi" w:hAnsiTheme="majorHAnsi" w:cstheme="majorHAnsi"/>
-          <w:color w:val="auto"/>
-          <w:szCs w:val="20"/>
-          <w:lang w:val="pt-BR"/>
-        </w:rPr>
-        <w:t>Data do Finan</w:t>
-      </w:r>
-      <w:r>
-        <w:rPr>
-          <w:rFonts w:asciiTheme="majorHAnsi" w:hAnsiTheme="majorHAnsi" w:cstheme="majorHAnsi"/>
-          <w:color w:val="auto"/>
-          <w:szCs w:val="20"/>
-          <w:lang w:val="pt-BR"/>
-        </w:rPr>
-        <w:t>ciamento</w:t>
-      </w:r>
-      <w:r>
-        <w:rPr>
-          <w:rFonts w:asciiTheme="majorHAnsi" w:hAnsiTheme="majorHAnsi" w:cstheme="majorHAnsi"/>
-          <w:color w:val="auto"/>
-          <w:szCs w:val="20"/>
-          <w:lang w:val="pt-BR"/>
-        </w:rPr>
-        <w:t>}}</w:t>
-      </w:r>
-    </w:p>
-    <w:p>
-      <w:pPr>
-        <w:spacing w:after="0" w:line="240" w:lineRule="auto"/>
-        <w:rPr>
-          <w:rFonts w:asciiTheme="majorHAnsi" w:hAnsiTheme="majorHAnsi" w:cstheme="majorHAnsi"/>
-          <w:b/>
-          <w:bCs/>
-          <w:color w:val="auto"/>
-          <w:szCs w:val="20"/>
-          <w:lang w:val="pt-BR"/>
-        </w:rPr>
-      </w:pPr>
-      <w:r>
-        <w:rPr>
-          <w:rFonts w:asciiTheme="majorHAnsi" w:hAnsiTheme="majorHAnsi" w:cstheme="majorHAnsi"/>
-          <w:b/>
-          <w:bCs/>
-          <w:color w:val="auto"/>
-          <w:szCs w:val="20"/>
-          <w:lang w:val="pt-BR"/>
-        </w:rPr>
-        <w:t>Valor Financiado:</w:t>
-      </w:r>
-      <w:r>
-        <w:rPr>
-          <w:rFonts w:asciiTheme="majorHAnsi" w:hAnsiTheme="majorHAnsi" w:cstheme="majorHAnsi"/>
-          <w:b/>
-          <w:bCs/>
-          <w:color w:val="auto"/>
-          <w:szCs w:val="20"/>
-          <w:lang w:val="pt-BR"/>
-        </w:rPr>
-        <w:t xml:space="preserve"> </w:t>
-      </w:r>
-      <w:r>
-        <w:rPr>
-          <w:rFonts w:asciiTheme="majorHAnsi" w:hAnsiTheme="majorHAnsi" w:cstheme="majorHAnsi"/>
-          <w:color w:val="auto"/>
-          <w:szCs w:val="20"/>
-          <w:lang w:val="pt-BR"/>
-        </w:rPr>
-        <w:t>{{Valor Financiado}}</w:t>
-      </w:r>
-      <w:r>
-        <w:rPr>
-          <w:rFonts w:asciiTheme="majorHAnsi" w:hAnsiTheme="majorHAnsi" w:cstheme="majorHAnsi"/>
-          <w:b/>
-          <w:bCs/>
-          <w:color w:val="auto"/>
-          <w:szCs w:val="20"/>
-          <w:lang w:val="pt-BR"/>
-        </w:rPr>
-        <w:t xml:space="preserve"> </w:t>
-      </w:r>
-      <w:r>
-        <w:rPr>
-          <w:rFonts w:asciiTheme="majorHAnsi" w:hAnsiTheme="majorHAnsi" w:cstheme="majorHAnsi"/>
-          <w:b/>
-          <w:bCs/>
-          <w:color w:val="auto"/>
-          <w:szCs w:val="20"/>
-          <w:lang w:val="pt-BR"/>
-        </w:rPr>
-        <w:t xml:space="preserve">  </w:t>
-      </w:r>
-      <w:r>
-        <w:rPr>
-          <w:rFonts w:asciiTheme="majorHAnsi" w:hAnsiTheme="majorHAnsi" w:cstheme="majorHAnsi"/>
-          <w:b/>
-          <w:bCs/>
-          <w:color w:val="auto"/>
-          <w:szCs w:val="20"/>
-          <w:lang w:val="pt-BR"/>
-        </w:rPr>
-        <w:t xml:space="preserve">Nº de Parcelas: </w:t>
-      </w:r>
-      <w:r>
-        <w:rPr>
-          <w:rFonts w:asciiTheme="majorHAnsi" w:hAnsiTheme="majorHAnsi" w:cstheme="majorHAnsi"/>
-          <w:color w:val="auto"/>
-          <w:szCs w:val="20"/>
-          <w:lang w:val="pt-BR"/>
-        </w:rPr>
-        <w:t>{{N</w:t>
-      </w:r>
-      <w:r>
-        <w:rPr>
-          <w:rFonts w:asciiTheme="majorHAnsi" w:hAnsiTheme="majorHAnsi" w:cstheme="majorHAnsi"/>
-          <w:color w:val="auto"/>
-          <w:szCs w:val="20"/>
-          <w:lang w:val="pt-BR"/>
-        </w:rPr>
-        <w:t xml:space="preserve">° de Parcelas}} </w:t>
-      </w:r>
-      <w:r>
-        <w:rPr>
-          <w:rFonts w:asciiTheme="majorHAnsi" w:hAnsiTheme="majorHAnsi" w:cstheme="majorHAnsi"/>
-          <w:b/>
-          <w:bCs/>
-          <w:color w:val="auto"/>
-          <w:szCs w:val="20"/>
-          <w:lang w:val="pt-BR"/>
-        </w:rPr>
-        <w:t xml:space="preserve">  Valor das Parcelas</w:t>
-      </w:r>
-      <w:r>
-        <w:rPr>
-          <w:rFonts w:asciiTheme="majorHAnsi" w:hAnsiTheme="majorHAnsi" w:cstheme="majorHAnsi"/>
-          <w:b/>
-          <w:bCs/>
-          <w:color w:val="auto"/>
-          <w:szCs w:val="20"/>
-          <w:lang w:val="pt-BR"/>
-        </w:rPr>
-        <w:t xml:space="preserve">: </w:t>
-      </w:r>
-      <w:r>
-        <w:rPr>
-          <w:rFonts w:asciiTheme="majorHAnsi" w:hAnsiTheme="majorHAnsi" w:cstheme="majorHAnsi"/>
-          <w:color w:val="auto"/>
-          <w:szCs w:val="20"/>
-          <w:lang w:val="pt-BR"/>
-        </w:rPr>
-        <w:t>{{Valor das Parcelas</w:t>
-      </w:r>
-      <w:r>
-        <w:rPr>
-          <w:rFonts w:asciiTheme="majorHAnsi" w:hAnsiTheme="majorHAnsi" w:cstheme="majorHAnsi"/>
-          <w:color w:val="auto"/>
-          <w:szCs w:val="20"/>
-          <w:lang w:val="pt-BR"/>
-        </w:rPr>
-        <w:t>}}</w:t>
-      </w:r>
-    </w:p>
-    <w:p>
-      <w:pPr>
-        <w:spacing w:after="0" w:line="240" w:lineRule="auto"/>
-        <w:rPr>
-          <w:rFonts w:asciiTheme="majorHAnsi" w:hAnsiTheme="majorHAnsi" w:cstheme="majorHAnsi"/>
-          <w:b/>
-          <w:bCs/>
-          <w:color w:val="auto"/>
-          <w:szCs w:val="20"/>
-          <w:lang w:val="pt-BR"/>
-        </w:rPr>
-      </w:pPr>
-    </w:p>
-    <w:p>
-      <w:pPr>
-        <w:spacing w:after="0" w:line="240" w:lineRule="auto"/>
-        <w:rPr>
-          <w:rFonts w:asciiTheme="majorHAnsi" w:hAnsiTheme="majorHAnsi" w:cstheme="majorHAnsi"/>
-          <w:b/>
-          <w:bCs/>
-          <w:color w:val="auto"/>
-          <w:szCs w:val="20"/>
-          <w:lang w:val="pt-BR"/>
-        </w:rPr>
-      </w:pPr>
-      <w:r>
-        <w:rPr>
-          <w:rFonts w:asciiTheme="majorHAnsi" w:hAnsiTheme="majorHAnsi" w:cstheme="majorHAnsi"/>
-          <w:b/>
-          <w:bCs/>
-          <w:color w:val="auto"/>
-          <w:szCs w:val="20"/>
-          <w:lang w:val="pt-BR"/>
-        </w:rPr>
-        <w:t xml:space="preserve">Veiculo na Troca: </w:t>
-      </w:r>
-      <w:r>
-        <w:rPr>
-          <w:rFonts w:asciiTheme="majorHAnsi" w:hAnsiTheme="majorHAnsi" w:cstheme="majorHAnsi"/>
-          <w:b/>
-          <w:bCs/>
-          <w:color w:val="auto"/>
-          <w:szCs w:val="20"/>
-          <w:lang w:val="pt-BR"/>
-        </w:rPr>
-        <w:t>{{Veículo na Troca</w:t>
-      </w:r>
-      <w:r>
-        <w:rPr>
-          <w:rFonts w:asciiTheme="majorHAnsi" w:hAnsiTheme="majorHAnsi" w:cstheme="majorHAnsi"/>
-          <w:b/>
-          <w:bCs/>
-          <w:color w:val="auto"/>
-          <w:szCs w:val="20"/>
-          <w:lang w:val="pt-BR"/>
-        </w:rPr>
-        <w:t>}}</w:t>
+        <w:t xml:space="preserve">Veiculo na Troca: {{Veículo na Troca}}</w:t>
       </w:r>
     </w:p>
     <w:p>
@@ -2658,39 +1537,73 @@
       <w:r>
         <w:rPr>
           <w:rFonts w:asciiTheme="majorHAnsi" w:hAnsiTheme="majorHAnsi" w:cstheme="majorHAnsi"/>
-          <w:b/>
-          <w:bCs/>
           <w:lang w:val="pt-BR"/>
         </w:rPr>
-        <w:t>Marca:</w:t>
+        <w:t xml:space="preserve">Marca: {{Marca Troca}}</w:t>
       </w:r>
+    </w:p>
+    <w:p>
+      <w:pPr>
+        <w:spacing w:after="0" w:line="240" w:lineRule="auto"/>
+        <w:rPr>
+          <w:rFonts w:asciiTheme="majorHAnsi" w:hAnsiTheme="majorHAnsi" w:cstheme="majorHAnsi"/>
+          <w:lang w:val="pt-BR"/>
+        </w:rPr>
+      </w:pPr>
       <w:r>
         <w:rPr>
           <w:rFonts w:asciiTheme="majorHAnsi" w:hAnsiTheme="majorHAnsi" w:cstheme="majorHAnsi"/>
           <w:lang w:val="pt-BR"/>
         </w:rPr>
-        <w:t xml:space="preserve"> </w:t>
+        <w:t xml:space="preserve">Modelo: {{Modelo Troca}}             Versão: {{Versão Troca}}</w:t>
       </w:r>
+    </w:p>
+    <w:p>
+      <w:pPr>
+        <w:spacing w:after="0" w:line="240" w:lineRule="auto"/>
+        <w:rPr>
+          <w:rFonts w:asciiTheme="majorHAnsi" w:hAnsiTheme="majorHAnsi" w:cstheme="majorHAnsi"/>
+          <w:lang w:val="pt-BR"/>
+        </w:rPr>
+      </w:pPr>
       <w:r>
         <w:rPr>
           <w:rFonts w:asciiTheme="majorHAnsi" w:hAnsiTheme="majorHAnsi" w:cstheme="majorHAnsi"/>
           <w:lang w:val="pt-BR"/>
         </w:rPr>
-        <w:t>{{Marca</w:t>
+        <w:t xml:space="preserve">Ano Fabricação: {{Ano Troca}}      Cor: {{Cor Troca}}</w:t>
       </w:r>
+    </w:p>
+    <w:p>
+      <w:pPr>
+        <w:spacing w:after="0" w:line="240" w:lineRule="auto"/>
+        <w:rPr>
+          <w:rFonts w:asciiTheme="majorHAnsi" w:hAnsiTheme="majorHAnsi" w:cstheme="majorHAnsi"/>
+          <w:lang w:val="pt-BR"/>
+        </w:rPr>
+      </w:pPr>
       <w:r>
         <w:rPr>
           <w:rFonts w:asciiTheme="majorHAnsi" w:hAnsiTheme="majorHAnsi" w:cstheme="majorHAnsi"/>
           <w:lang w:val="pt-BR"/>
         </w:rPr>
-        <w:t xml:space="preserve"> Troca</w:t>
+        <w:t xml:space="preserve">Placa: {{Placa Troca}}                      Renavan: {{Renavam Troca}} </w:t>
       </w:r>
+    </w:p>
+    <w:p>
+      <w:pPr>
+        <w:spacing w:after="0" w:line="240" w:lineRule="auto"/>
+        <w:rPr>
+          <w:rFonts w:asciiTheme="majorHAnsi" w:hAnsiTheme="majorHAnsi" w:cstheme="majorHAnsi"/>
+          <w:lang w:val="pt-BR"/>
+        </w:rPr>
+      </w:pPr>
       <w:r>
         <w:rPr>
           <w:rFonts w:asciiTheme="majorHAnsi" w:hAnsiTheme="majorHAnsi" w:cstheme="majorHAnsi"/>
           <w:lang w:val="pt-BR"/>
         </w:rPr>
-        <w:t>}}</w:t>
+        <w:t xml:space="preserve">Combustível: {{Combustível Troca}}                                                     Km Atual: {{KM Troca}}</w:t>
       </w:r>
     </w:p>
     <w:p>
@@ -2704,554 +1617,57 @@
       <w:r>
         <w:rPr>
           <w:rFonts w:asciiTheme="majorHAnsi" w:hAnsiTheme="majorHAnsi" w:cstheme="majorHAnsi"/>
-          <w:b/>
-          <w:bCs/>
           <w:lang w:val="pt-BR"/>
         </w:rPr>
-        <w:t>Modelo:</w:t>
+        <w:t xml:space="preserve">Valor da Compra: {{Valor da Compra}}</w:t>
       </w:r>
+    </w:p>
+    <w:p>
+      <w:pPr>
+        <w:spacing w:after="0" w:line="240" w:lineRule="auto"/>
+        <w:rPr>
+          <w:rFonts w:asciiTheme="majorHAnsi" w:hAnsiTheme="majorHAnsi" w:cstheme="majorHAnsi"/>
+          <w:lang w:val="pt-BR"/>
+        </w:rPr>
+      </w:pPr>
       <w:r>
         <w:rPr>
           <w:rFonts w:asciiTheme="majorHAnsi" w:hAnsiTheme="majorHAnsi" w:cstheme="majorHAnsi"/>
           <w:lang w:val="pt-BR"/>
         </w:rPr>
-        <w:t xml:space="preserve"> </w:t>
+        <w:t xml:space="preserve">Débitos: {{Débitos}}</w:t>
       </w:r>
+    </w:p>
+    <w:p>
+      <w:pPr>
+        <w:spacing w:after="0" w:line="240" w:lineRule="auto"/>
+        <w:rPr>
+          <w:rFonts w:asciiTheme="majorHAnsi" w:hAnsiTheme="majorHAnsi" w:cstheme="majorHAnsi"/>
+          <w:lang w:val="pt-BR"/>
+        </w:rPr>
+      </w:pPr>
       <w:r>
         <w:rPr>
           <w:rFonts w:asciiTheme="majorHAnsi" w:hAnsiTheme="majorHAnsi" w:cstheme="majorHAnsi"/>
           <w:lang w:val="pt-BR"/>
         </w:rPr>
-        <w:t>{{Modelo</w:t>
+        <w:t xml:space="preserve">Detalhe dos débitos: {{Observação sobre Débitos}}</w:t>
       </w:r>
+    </w:p>
+    <w:p>
+      <w:pPr>
+        <w:spacing w:after="0" w:line="240" w:lineRule="auto"/>
+        <w:rPr>
+          <w:rFonts w:asciiTheme="majorHAnsi" w:hAnsiTheme="majorHAnsi" w:cstheme="majorHAnsi"/>
+          <w:lang w:val="pt-BR"/>
+        </w:rPr>
+      </w:pPr>
       <w:r>
         <w:rPr>
           <w:rFonts w:asciiTheme="majorHAnsi" w:hAnsiTheme="majorHAnsi" w:cstheme="majorHAnsi"/>
           <w:lang w:val="pt-BR"/>
         </w:rPr>
-        <w:t xml:space="preserve"> </w:t>
-      </w:r>
-      <w:r>
-        <w:rPr>
-          <w:rFonts w:asciiTheme="majorHAnsi" w:hAnsiTheme="majorHAnsi" w:cstheme="majorHAnsi"/>
-          <w:lang w:val="pt-BR"/>
-        </w:rPr>
-        <w:t>Troca</w:t>
-      </w:r>
-      <w:r>
-        <w:rPr>
-          <w:rFonts w:asciiTheme="majorHAnsi" w:hAnsiTheme="majorHAnsi" w:cstheme="majorHAnsi"/>
-          <w:lang w:val="pt-BR"/>
-        </w:rPr>
-        <w:t xml:space="preserve">}}             </w:t>
-      </w:r>
-      <w:r>
-        <w:rPr>
-          <w:rFonts w:asciiTheme="majorHAnsi" w:hAnsiTheme="majorHAnsi" w:cstheme="majorHAnsi"/>
-          <w:b/>
-          <w:bCs/>
-          <w:lang w:val="pt-BR"/>
-        </w:rPr>
-        <w:t>Versão</w:t>
-      </w:r>
-      <w:r>
-        <w:rPr>
-          <w:rFonts w:asciiTheme="majorHAnsi" w:hAnsiTheme="majorHAnsi" w:cstheme="majorHAnsi"/>
-          <w:lang w:val="pt-BR"/>
-        </w:rPr>
-        <w:t xml:space="preserve">: </w:t>
-      </w:r>
-      <w:r>
-        <w:rPr>
-          <w:rFonts w:asciiTheme="majorHAnsi" w:hAnsiTheme="majorHAnsi" w:cstheme="majorHAnsi"/>
-          <w:lang w:val="pt-BR"/>
-        </w:rPr>
-        <w:t>{{</w:t>
-      </w:r>
-      <w:r>
-        <w:rPr>
-          <w:rFonts w:asciiTheme="majorHAnsi" w:hAnsiTheme="majorHAnsi" w:cstheme="majorHAnsi"/>
-          <w:lang w:val="pt-BR"/>
-        </w:rPr>
-        <w:t>Versão</w:t>
-      </w:r>
-      <w:r>
-        <w:rPr>
-          <w:rFonts w:asciiTheme="majorHAnsi" w:hAnsiTheme="majorHAnsi" w:cstheme="majorHAnsi"/>
-          <w:lang w:val="pt-BR"/>
-        </w:rPr>
-        <w:t xml:space="preserve"> </w:t>
-      </w:r>
-      <w:r>
-        <w:rPr>
-          <w:rFonts w:asciiTheme="majorHAnsi" w:hAnsiTheme="majorHAnsi" w:cstheme="majorHAnsi"/>
-          <w:lang w:val="pt-BR"/>
-        </w:rPr>
-        <w:t>Troca</w:t>
-      </w:r>
-      <w:r>
-        <w:rPr>
-          <w:rFonts w:asciiTheme="majorHAnsi" w:hAnsiTheme="majorHAnsi" w:cstheme="majorHAnsi"/>
-          <w:lang w:val="pt-BR"/>
-        </w:rPr>
-        <w:t>}}</w:t>
-      </w:r>
-    </w:p>
-    <w:p>
-      <w:pPr>
-        <w:spacing w:after="0" w:line="240" w:lineRule="auto"/>
-        <w:rPr>
-          <w:rFonts w:asciiTheme="majorHAnsi" w:hAnsiTheme="majorHAnsi" w:cstheme="majorHAnsi"/>
-          <w:lang w:val="pt-BR"/>
-        </w:rPr>
-      </w:pPr>
-      <w:r>
-        <w:rPr>
-          <w:rFonts w:asciiTheme="majorHAnsi" w:hAnsiTheme="majorHAnsi" w:cstheme="majorHAnsi"/>
-          <w:b/>
-          <w:bCs/>
-          <w:lang w:val="pt-BR"/>
-        </w:rPr>
-        <w:t>Ano</w:t>
-      </w:r>
-      <w:r>
-        <w:rPr>
-          <w:rFonts w:asciiTheme="majorHAnsi" w:hAnsiTheme="majorHAnsi" w:cstheme="majorHAnsi"/>
-          <w:b/>
-          <w:bCs/>
-          <w:lang w:val="pt-BR"/>
-        </w:rPr>
-        <w:t xml:space="preserve"> Fabricação</w:t>
-      </w:r>
-      <w:r>
-        <w:rPr>
-          <w:rFonts w:asciiTheme="majorHAnsi" w:hAnsiTheme="majorHAnsi" w:cstheme="majorHAnsi"/>
-          <w:b/>
-          <w:bCs/>
-          <w:lang w:val="pt-BR"/>
-        </w:rPr>
-        <w:t>:</w:t>
-      </w:r>
-      <w:r>
-        <w:rPr>
-          <w:rFonts w:asciiTheme="majorHAnsi" w:hAnsiTheme="majorHAnsi" w:cstheme="majorHAnsi"/>
-          <w:lang w:val="pt-BR"/>
-        </w:rPr>
-        <w:t xml:space="preserve"> </w:t>
-      </w:r>
-      <w:r>
-        <w:rPr>
-          <w:rFonts w:asciiTheme="majorHAnsi" w:hAnsiTheme="majorHAnsi" w:cstheme="majorHAnsi"/>
-          <w:lang w:val="pt-BR"/>
-        </w:rPr>
-        <w:t>{{Ano</w:t>
-      </w:r>
-      <w:r>
-        <w:rPr>
-          <w:rFonts w:asciiTheme="majorHAnsi" w:hAnsiTheme="majorHAnsi" w:cstheme="majorHAnsi"/>
-          <w:lang w:val="pt-BR"/>
-        </w:rPr>
-        <w:t xml:space="preserve"> </w:t>
-      </w:r>
-      <w:r>
-        <w:rPr>
-          <w:rFonts w:asciiTheme="majorHAnsi" w:hAnsiTheme="majorHAnsi" w:cstheme="majorHAnsi"/>
-          <w:lang w:val="pt-BR"/>
-        </w:rPr>
-        <w:t>Troca</w:t>
-      </w:r>
-      <w:r>
-        <w:rPr>
-          <w:rFonts w:asciiTheme="majorHAnsi" w:hAnsiTheme="majorHAnsi" w:cstheme="majorHAnsi"/>
-          <w:lang w:val="pt-BR"/>
-        </w:rPr>
-        <w:t xml:space="preserve">}}      </w:t>
-      </w:r>
-      <w:r>
-        <w:rPr>
-          <w:rFonts w:asciiTheme="majorHAnsi" w:hAnsiTheme="majorHAnsi" w:cstheme="majorHAnsi"/>
-          <w:b/>
-          <w:bCs/>
-          <w:lang w:val="pt-BR"/>
-        </w:rPr>
-        <w:t>Cor:</w:t>
-      </w:r>
-      <w:r>
-        <w:rPr>
-          <w:rFonts w:asciiTheme="majorHAnsi" w:hAnsiTheme="majorHAnsi" w:cstheme="majorHAnsi"/>
-          <w:b/>
-          <w:bCs/>
-          <w:lang w:val="pt-BR"/>
-        </w:rPr>
-        <w:t xml:space="preserve"> </w:t>
-      </w:r>
-      <w:r>
-        <w:rPr>
-          <w:rFonts w:asciiTheme="majorHAnsi" w:hAnsiTheme="majorHAnsi" w:cstheme="majorHAnsi"/>
-          <w:lang w:val="pt-BR"/>
-        </w:rPr>
-        <w:t>{{Cor</w:t>
-      </w:r>
-      <w:r>
-        <w:rPr>
-          <w:rFonts w:asciiTheme="majorHAnsi" w:hAnsiTheme="majorHAnsi" w:cstheme="majorHAnsi"/>
-          <w:lang w:val="pt-BR"/>
-        </w:rPr>
-        <w:t xml:space="preserve"> Troca</w:t>
-      </w:r>
-      <w:r>
-        <w:rPr>
-          <w:rFonts w:asciiTheme="majorHAnsi" w:hAnsiTheme="majorHAnsi" w:cstheme="majorHAnsi"/>
-          <w:lang w:val="pt-BR"/>
-        </w:rPr>
-        <w:t>}}</w:t>
-      </w:r>
-    </w:p>
-    <w:p>
-      <w:pPr>
-        <w:spacing w:after="0" w:line="240" w:lineRule="auto"/>
-        <w:rPr>
-          <w:rFonts w:asciiTheme="majorHAnsi" w:hAnsiTheme="majorHAnsi" w:cstheme="majorHAnsi"/>
-          <w:lang w:val="pt-BR"/>
-        </w:rPr>
-      </w:pPr>
-      <w:r>
-        <w:rPr>
-          <w:rFonts w:asciiTheme="majorHAnsi" w:hAnsiTheme="majorHAnsi" w:cstheme="majorHAnsi"/>
-          <w:b/>
-          <w:bCs/>
-          <w:lang w:val="pt-BR"/>
-        </w:rPr>
-        <w:t>Placa:</w:t>
-      </w:r>
-      <w:r>
-        <w:rPr>
-          <w:rFonts w:asciiTheme="majorHAnsi" w:hAnsiTheme="majorHAnsi" w:cstheme="majorHAnsi"/>
-          <w:lang w:val="pt-BR"/>
-        </w:rPr>
-        <w:t xml:space="preserve"> </w:t>
-      </w:r>
-      <w:r>
-        <w:rPr>
-          <w:rFonts w:asciiTheme="majorHAnsi" w:hAnsiTheme="majorHAnsi" w:cstheme="majorHAnsi"/>
-          <w:lang w:val="pt-BR"/>
-        </w:rPr>
-        <w:t>{{Placa</w:t>
-      </w:r>
-      <w:r>
-        <w:rPr>
-          <w:rFonts w:asciiTheme="majorHAnsi" w:hAnsiTheme="majorHAnsi" w:cstheme="majorHAnsi"/>
-          <w:lang w:val="pt-BR"/>
-        </w:rPr>
-        <w:t xml:space="preserve"> </w:t>
-      </w:r>
-      <w:r>
-        <w:rPr>
-          <w:rFonts w:asciiTheme="majorHAnsi" w:hAnsiTheme="majorHAnsi" w:cstheme="majorHAnsi"/>
-          <w:lang w:val="pt-BR"/>
-        </w:rPr>
-        <w:t>Troca</w:t>
-      </w:r>
-      <w:r>
-        <w:rPr>
-          <w:rFonts w:asciiTheme="majorHAnsi" w:hAnsiTheme="majorHAnsi" w:cstheme="majorHAnsi"/>
-          <w:lang w:val="pt-BR"/>
-        </w:rPr>
-        <w:t xml:space="preserve">}}     </w:t>
-      </w:r>
-      <w:r>
-        <w:rPr>
-          <w:rFonts w:asciiTheme="majorHAnsi" w:hAnsiTheme="majorHAnsi" w:cstheme="majorHAnsi"/>
-          <w:lang w:val="pt-BR"/>
-        </w:rPr>
-        <w:t xml:space="preserve"> </w:t>
-      </w:r>
-      <w:r>
-        <w:rPr>
-          <w:rFonts w:asciiTheme="majorHAnsi" w:hAnsiTheme="majorHAnsi" w:cstheme="majorHAnsi"/>
-          <w:lang w:val="pt-BR"/>
-        </w:rPr>
-        <w:t xml:space="preserve">                </w:t>
-      </w:r>
-      <w:r>
-        <w:rPr>
-          <w:rFonts w:asciiTheme="majorHAnsi" w:hAnsiTheme="majorHAnsi" w:cstheme="majorHAnsi"/>
-          <w:b/>
-          <w:bCs/>
-          <w:lang w:val="pt-BR"/>
-        </w:rPr>
-        <w:t>Renavan:</w:t>
-      </w:r>
-      <w:r>
-        <w:rPr>
-          <w:rFonts w:asciiTheme="majorHAnsi" w:hAnsiTheme="majorHAnsi" w:cstheme="majorHAnsi"/>
-          <w:lang w:val="pt-BR"/>
-        </w:rPr>
-        <w:t xml:space="preserve"> </w:t>
-      </w:r>
-      <w:r>
-        <w:rPr>
-          <w:rFonts w:asciiTheme="majorHAnsi" w:hAnsiTheme="majorHAnsi" w:cstheme="majorHAnsi"/>
-          <w:lang w:val="pt-BR"/>
-        </w:rPr>
-        <w:t>{{Renavam</w:t>
-      </w:r>
-      <w:r>
-        <w:rPr>
-          <w:rFonts w:asciiTheme="majorHAnsi" w:hAnsiTheme="majorHAnsi" w:cstheme="majorHAnsi"/>
-          <w:lang w:val="pt-BR"/>
-        </w:rPr>
-        <w:t xml:space="preserve"> </w:t>
-      </w:r>
-      <w:r>
-        <w:rPr>
-          <w:rFonts w:asciiTheme="majorHAnsi" w:hAnsiTheme="majorHAnsi" w:cstheme="majorHAnsi"/>
-          <w:lang w:val="pt-BR"/>
-        </w:rPr>
-        <w:t>Troca</w:t>
-      </w:r>
-      <w:r>
-        <w:rPr>
-          <w:rFonts w:asciiTheme="majorHAnsi" w:hAnsiTheme="majorHAnsi" w:cstheme="majorHAnsi"/>
-          <w:lang w:val="pt-BR"/>
-        </w:rPr>
-        <w:t>}}</w:t>
-      </w:r>
-      <w:r>
-        <w:rPr>
-          <w:rFonts w:asciiTheme="majorHAnsi" w:hAnsiTheme="majorHAnsi" w:cstheme="majorHAnsi"/>
-          <w:lang w:val="pt-BR"/>
-        </w:rPr>
-        <w:t xml:space="preserve"> </w:t>
-      </w:r>
-    </w:p>
-    <w:p>
-      <w:pPr>
-        <w:spacing w:after="0" w:line="240" w:lineRule="auto"/>
-        <w:rPr>
-          <w:rFonts w:asciiTheme="majorHAnsi" w:hAnsiTheme="majorHAnsi" w:cstheme="majorHAnsi"/>
-          <w:lang w:val="pt-BR"/>
-        </w:rPr>
-      </w:pPr>
-      <w:r>
-        <w:rPr>
-          <w:rFonts w:asciiTheme="majorHAnsi" w:hAnsiTheme="majorHAnsi" w:cstheme="majorHAnsi"/>
-          <w:b/>
-          <w:bCs/>
-          <w:lang w:val="pt-BR"/>
-        </w:rPr>
-        <w:t xml:space="preserve">Combustível: </w:t>
-      </w:r>
-      <w:r>
-        <w:rPr>
-          <w:rFonts w:asciiTheme="majorHAnsi" w:hAnsiTheme="majorHAnsi" w:cstheme="majorHAnsi"/>
-          <w:lang w:val="pt-BR"/>
-        </w:rPr>
-        <w:t>{{Combustível</w:t>
-      </w:r>
-      <w:r>
-        <w:rPr>
-          <w:rFonts w:asciiTheme="majorHAnsi" w:hAnsiTheme="majorHAnsi" w:cstheme="majorHAnsi"/>
-          <w:lang w:val="pt-BR"/>
-        </w:rPr>
-        <w:t xml:space="preserve"> </w:t>
-      </w:r>
-      <w:r>
-        <w:rPr>
-          <w:rFonts w:asciiTheme="majorHAnsi" w:hAnsiTheme="majorHAnsi" w:cstheme="majorHAnsi"/>
-          <w:lang w:val="pt-BR"/>
-        </w:rPr>
-        <w:t>Troca</w:t>
-      </w:r>
-      <w:r>
-        <w:rPr>
-          <w:rFonts w:asciiTheme="majorHAnsi" w:hAnsiTheme="majorHAnsi" w:cstheme="majorHAnsi"/>
-          <w:lang w:val="pt-BR"/>
-        </w:rPr>
-        <w:t>}}</w:t>
-      </w:r>
-      <w:r>
-        <w:rPr>
-          <w:rFonts w:asciiTheme="majorHAnsi" w:hAnsiTheme="majorHAnsi" w:cstheme="majorHAnsi"/>
-          <w:b/>
-          <w:bCs/>
-          <w:lang w:val="pt-BR"/>
-        </w:rPr>
-        <w:t xml:space="preserve">                                                     </w:t>
-      </w:r>
-      <w:r>
-        <w:rPr>
-          <w:rFonts w:asciiTheme="majorHAnsi" w:hAnsiTheme="majorHAnsi" w:cstheme="majorHAnsi"/>
-          <w:b/>
-          <w:bCs/>
-          <w:lang w:val="pt-BR"/>
-        </w:rPr>
-        <w:t>Km Atual:</w:t>
-      </w:r>
-      <w:r>
-        <w:rPr>
-          <w:rFonts w:asciiTheme="majorHAnsi" w:hAnsiTheme="majorHAnsi" w:cstheme="majorHAnsi"/>
-          <w:lang w:val="pt-BR"/>
-        </w:rPr>
-        <w:t xml:space="preserve"> {{KM</w:t>
-      </w:r>
-      <w:r>
-        <w:rPr>
-          <w:rFonts w:asciiTheme="majorHAnsi" w:hAnsiTheme="majorHAnsi" w:cstheme="majorHAnsi"/>
-          <w:lang w:val="pt-BR"/>
-        </w:rPr>
-        <w:t xml:space="preserve"> Troca</w:t>
-      </w:r>
-      <w:r>
-        <w:rPr>
-          <w:rFonts w:asciiTheme="majorHAnsi" w:hAnsiTheme="majorHAnsi" w:cstheme="majorHAnsi"/>
-          <w:lang w:val="pt-BR"/>
-        </w:rPr>
-        <w:t>}}</w:t>
-      </w:r>
-    </w:p>
-    <w:p>
-      <w:pPr>
-        <w:spacing w:after="0" w:line="240" w:lineRule="auto"/>
-        <w:rPr>
-          <w:rFonts w:asciiTheme="majorHAnsi" w:hAnsiTheme="majorHAnsi" w:cstheme="majorHAnsi"/>
-          <w:lang w:val="pt-BR"/>
-        </w:rPr>
-      </w:pPr>
-      <w:r>
-        <w:rPr>
-          <w:rFonts w:asciiTheme="majorHAnsi" w:hAnsiTheme="majorHAnsi" w:cstheme="majorHAnsi"/>
-          <w:b/>
-          <w:bCs/>
-          <w:lang w:val="pt-BR"/>
-        </w:rPr>
-        <w:t xml:space="preserve">Valor da </w:t>
-      </w:r>
-      <w:r>
-        <w:rPr>
-          <w:rFonts w:asciiTheme="majorHAnsi" w:hAnsiTheme="majorHAnsi" w:cstheme="majorHAnsi"/>
-          <w:b/>
-          <w:bCs/>
-          <w:lang w:val="pt-BR"/>
-        </w:rPr>
-        <w:t>Compra:</w:t>
-      </w:r>
-      <w:r>
-        <w:rPr>
-          <w:rFonts w:asciiTheme="majorHAnsi" w:hAnsiTheme="majorHAnsi" w:cstheme="majorHAnsi"/>
-          <w:lang w:val="pt-BR"/>
-        </w:rPr>
-        <w:t xml:space="preserve"> {{Valor da </w:t>
-      </w:r>
-      <w:r>
-        <w:rPr>
-          <w:rFonts w:asciiTheme="majorHAnsi" w:hAnsiTheme="majorHAnsi" w:cstheme="majorHAnsi"/>
-          <w:lang w:val="pt-BR"/>
-        </w:rPr>
-        <w:t>Compra</w:t>
-      </w:r>
-      <w:r>
-        <w:rPr>
-          <w:rFonts w:asciiTheme="majorHAnsi" w:hAnsiTheme="majorHAnsi" w:cstheme="majorHAnsi"/>
-          <w:lang w:val="pt-BR"/>
-        </w:rPr>
-        <w:t>}}</w:t>
-      </w:r>
-    </w:p>
-    <w:p>
-      <w:pPr>
-        <w:spacing w:after="0" w:line="240" w:lineRule="auto"/>
-        <w:rPr>
-          <w:rFonts w:asciiTheme="majorHAnsi" w:hAnsiTheme="majorHAnsi" w:cstheme="majorHAnsi"/>
-          <w:lang w:val="pt-BR"/>
-        </w:rPr>
-      </w:pPr>
-      <w:r>
-        <w:rPr>
-          <w:rFonts w:asciiTheme="majorHAnsi" w:hAnsiTheme="majorHAnsi" w:cstheme="majorHAnsi"/>
-          <w:b/>
-          <w:bCs/>
-          <w:lang w:val="pt-BR"/>
-        </w:rPr>
-        <w:t>Débitos:</w:t>
-      </w:r>
-      <w:r>
-        <w:rPr>
-          <w:rFonts w:asciiTheme="majorHAnsi" w:hAnsiTheme="majorHAnsi" w:cstheme="majorHAnsi"/>
-          <w:lang w:val="pt-BR"/>
-        </w:rPr>
-        <w:t xml:space="preserve"> {{Débitos}}</w:t>
-      </w:r>
-    </w:p>
-    <w:p>
-      <w:pPr>
-        <w:spacing w:after="0" w:line="240" w:lineRule="auto"/>
-        <w:rPr>
-          <w:rFonts w:asciiTheme="majorHAnsi" w:hAnsiTheme="majorHAnsi" w:cstheme="majorHAnsi"/>
-          <w:lang w:val="pt-BR"/>
-        </w:rPr>
-      </w:pPr>
-      <w:r>
-        <w:rPr>
-          <w:rFonts w:asciiTheme="majorHAnsi" w:hAnsiTheme="majorHAnsi" w:cstheme="majorHAnsi"/>
-          <w:b/>
-          <w:bCs/>
-          <w:lang w:val="pt-BR"/>
-        </w:rPr>
-        <w:t>Detalhe dos débitos:</w:t>
-      </w:r>
-      <w:r>
-        <w:rPr>
-          <w:rFonts w:asciiTheme="majorHAnsi" w:hAnsiTheme="majorHAnsi" w:cstheme="majorHAnsi"/>
-          <w:lang w:val="pt-BR"/>
-        </w:rPr>
-        <w:t xml:space="preserve"> {{Observação </w:t>
-      </w:r>
-      <w:r>
-        <w:rPr>
-          <w:rFonts w:asciiTheme="majorHAnsi" w:hAnsiTheme="majorHAnsi" w:cstheme="majorHAnsi"/>
-          <w:lang w:val="pt-BR"/>
-        </w:rPr>
-        <w:t>sobre Débitos}}</w:t>
-      </w:r>
-    </w:p>
-    <w:p>
-      <w:pPr>
-        <w:spacing w:after="0" w:line="240" w:lineRule="auto"/>
-        <w:rPr>
-          <w:rFonts w:asciiTheme="majorHAnsi" w:hAnsiTheme="majorHAnsi" w:cstheme="majorHAnsi"/>
-          <w:lang w:val="pt-BR"/>
-        </w:rPr>
-      </w:pPr>
-      <w:r>
-        <w:rPr>
-          <w:rFonts w:asciiTheme="majorHAnsi" w:hAnsiTheme="majorHAnsi" w:cstheme="majorHAnsi"/>
-          <w:b/>
-          <w:bCs/>
-          <w:lang w:val="pt-BR"/>
-        </w:rPr>
-        <w:t>Valor de Entrada (Valor da Compra – Débitos):</w:t>
-      </w:r>
-      <w:r>
-        <w:rPr>
-          <w:rFonts w:asciiTheme="majorHAnsi" w:hAnsiTheme="majorHAnsi" w:cstheme="majorHAnsi"/>
-          <w:lang w:val="pt-BR"/>
-        </w:rPr>
-        <w:t xml:space="preserve"> {{Valor da Entrada</w:t>
-      </w:r>
-      <w:r>
-        <w:rPr>
-          <w:rFonts w:asciiTheme="majorHAnsi" w:hAnsiTheme="majorHAnsi" w:cstheme="majorHAnsi"/>
-          <w:lang w:val="pt-BR"/>
-        </w:rPr>
-        <w:t xml:space="preserve"> Veículo Troca</w:t>
-      </w:r>
-      <w:r>
-        <w:rPr>
-          <w:rFonts w:asciiTheme="majorHAnsi" w:hAnsiTheme="majorHAnsi" w:cstheme="majorHAnsi"/>
-          <w:lang w:val="pt-BR"/>
-        </w:rPr>
-        <w:t>}}</w:t>
+        <w:t xml:space="preserve">Valor de Entrada (Valor da Compra – Débitos): {{Valor da Entrada Veículo Troca}}</w:t>
       </w:r>
     </w:p>
     <w:p>
@@ -3506,15 +1922,7 @@
           <w:color w:val="auto"/>
           <w:lang w:val="pt-BR"/>
         </w:rPr>
-        <w:t>{{Documentação Veículo</w:t>
-      </w:r>
-      <w:r>
-        <w:rPr>
-          <w:rFonts w:asciiTheme="majorHAnsi" w:hAnsiTheme="majorHAnsi" w:cstheme="majorHAnsi"/>
-          <w:color w:val="auto"/>
-          <w:lang w:val="pt-BR"/>
-        </w:rPr>
-        <w:t>}}</w:t>
+        <w:t xml:space="preserve">{{Documentação Veículo}}</w:t>
       </w:r>
     </w:p>
     <w:p>
@@ -4042,27 +2450,9 @@
       </w:pPr>
       <w:r>
         <w:rPr>
-          <w:b/>
-          <w:bCs/>
           <w:lang w:val="pt-BR"/>
         </w:rPr>
-        <w:t xml:space="preserve">Guarulhos, </w:t>
-      </w:r>
-      <w:r>
-        <w:rPr>
-          <w:b/>
-          <w:bCs/>
-          <w:lang w:val="pt-BR"/>
-        </w:rPr>
-        <w:t>{{Data da Venda}}</w:t>
-      </w:r>
-      <w:r>
-        <w:rPr>
-          <w:b/>
-          <w:bCs/>
-          <w:lang w:val="pt-BR"/>
-        </w:rPr>
-        <w:t>.</w:t>
+        <w:t xml:space="preserve">Guarulhos, {{Data da Venda}}.</w:t>
       </w:r>
     </w:p>
     <w:p>
@@ -4112,43 +2502,9 @@
       </w:pPr>
       <w:r>
         <w:rPr>
-          <w:b/>
-          <w:bCs/>
           <w:lang w:val="pt-BR"/>
         </w:rPr>
-        <w:t>Cliente:</w:t>
-      </w:r>
-      <w:r>
-        <w:rPr>
-          <w:lang w:val="pt-BR"/>
-        </w:rPr>
-        <w:t> </w:t>
-      </w:r>
-      <w:r>
-        <w:rPr>
-          <w:lang w:val="pt-BR"/>
-        </w:rPr>
-        <w:t>{{Nome do Cliente}}</w:t>
-      </w:r>
-      <w:r>
-        <w:rPr>
-          <w:lang w:val="pt-BR"/>
-        </w:rPr>
-        <w:br/>
-      </w:r>
-      <w:r>
-        <w:rPr>
-          <w:b/>
-          <w:bCs/>
-          <w:lang w:val="pt-BR"/>
-        </w:rPr>
-        <w:t xml:space="preserve">CPF: </w:t>
-      </w:r>
-      <w:r>
-        <w:rPr>
-          <w:lang w:val="pt-BR"/>
-        </w:rPr>
-        <w:t>{{{CPF}}}</w:t>
+        <w:t xml:space="preserve">Cliente: {{Nome do Cliente}}CPF: {{{CPF}}}</w:t>
       </w:r>
     </w:p>
     <w:p>
@@ -4296,15 +2652,7 @@
           <w:bCs/>
           <w:lang w:val="pt-BR"/>
         </w:rPr>
-        <w:t>V</w:t>
-      </w:r>
-      <w:r>
-        <w:rPr>
-          <w:b/>
-          <w:bCs/>
-          <w:lang w:val="pt-BR"/>
-        </w:rPr>
-        <w:t>endedor: {{Vendedor}}</w:t>
+        <w:t xml:space="preserve">Vendedor: {{Vendedor}}</w:t>
       </w:r>
     </w:p>
     <w:p>

</xml_diff>

<commit_message>
fix: repara templates docx juntando runs consecutivos corretamente
</commit_message>
<xml_diff>
--- a/backend/templates/contrato_venda.docx
+++ b/backend/templates/contrato_venda.docx
@@ -1,2826 +1,6 @@
 
-<file path=word/document.xml><?xml version="1.0" encoding="utf-8"?>
-<w:document xmlns:wpc="http://schemas.microsoft.com/office/word/2010/wordprocessingCanvas" xmlns:cx="http://schemas.microsoft.com/office/drawing/2014/chartex" xmlns:cx1="http://schemas.microsoft.com/office/drawing/2015/9/8/chartex" xmlns:cx2="http://schemas.microsoft.com/office/drawing/2015/10/21/chartex" xmlns:cx3="http://schemas.microsoft.com/office/drawing/2016/5/9/chartex" xmlns:cx4="http://schemas.microsoft.com/office/drawing/2016/5/10/chartex" xmlns:cx5="http://schemas.microsoft.com/office/drawing/2016/5/11/chartex" xmlns:cx6="http://schemas.microsoft.com/office/drawing/2016/5/12/chartex" xmlns:cx7="http://schemas.microsoft.com/office/drawing/2016/5/13/chartex" xmlns:cx8="http://schemas.microsoft.com/office/drawing/2016/5/14/chartex" xmlns:mc="http://schemas.openxmlformats.org/markup-compatibility/2006" xmlns:aink="http://schemas.microsoft.com/office/drawing/2016/ink" xmlns:am3d="http://schemas.microsoft.com/office/drawing/2017/model3d" xmlns:o="urn:schemas-microsoft-com:office:office" xmlns:oel="http://schemas.microsoft.com/office/2019/extlst" xmlns:r="http://schemas.openxmlformats.org/officeDocument/2006/relationships" xmlns:m="http://schemas.openxmlformats.org/officeDocument/2006/math" xmlns:v="urn:schemas-microsoft-com:vml" xmlns:wp14="http://schemas.microsoft.com/office/word/2010/wordprocessingDrawing" xmlns:wp="http://schemas.openxmlformats.org/drawingml/2006/wordprocessingDrawing" xmlns:w10="urn:schemas-microsoft-com:office:word" xmlns:w="http://schemas.openxmlformats.org/wordprocessingml/2006/main" xmlns:w14="http://schemas.microsoft.com/office/word/2010/wordml" xmlns:w15="http://schemas.microsoft.com/office/word/2012/wordml" xmlns:w16cex="http://schemas.microsoft.com/office/word/2018/wordml/cex" xmlns:w16cid="http://schemas.microsoft.com/office/word/2016/wordml/cid" xmlns:w16="http://schemas.microsoft.com/office/word/2018/wordml" xmlns:w16du="http://schemas.microsoft.com/office/word/2023/wordml/word16du" xmlns:w16sdtdh="http://schemas.microsoft.com/office/word/2020/wordml/sdtdatahash" xmlns:w16sdtfl="http://schemas.microsoft.com/office/word/2024/wordml/sdtformatlock" xmlns:w16se="http://schemas.microsoft.com/office/word/2015/wordml/symex" xmlns:wpg="http://schemas.microsoft.com/office/word/2010/wordprocessingGroup" xmlns:wpi="http://schemas.microsoft.com/office/word/2010/wordprocessingInk" xmlns:wne="http://schemas.microsoft.com/office/word/2006/wordml" xmlns:wps="http://schemas.microsoft.com/office/word/2010/wordprocessingShape" mc:Ignorable="w14 w15 w16se w16cid w16 w16cex w16sdtdh w16sdtfl w16du wp14">
-  <w:body>
-    <w:p>
-      <w:pPr>
-        <w:spacing w:after="40"/>
-        <w:jc w:val="center"/>
-        <w:rPr>
-          <w:color w:val="808080" w:themeColor="background1" w:themeShade="80"/>
-          <w:sz w:val="24"/>
-          <w:szCs w:val="24"/>
-          <w:lang w:val="pt-BR"/>
-        </w:rPr>
-      </w:pPr>
-      <w:r>
-        <w:rPr>
-          <w:b/>
-          <w:color w:val="808080" w:themeColor="background1" w:themeShade="80"/>
-          <w:sz w:val="24"/>
-          <w:szCs w:val="24"/>
-          <w:lang w:val="pt-BR"/>
-        </w:rPr>
-        <w:t>JTS INTERMEDIAÇÕES E NEGÓCIOS LTDA</w:t>
-      </w:r>
-    </w:p>
-    <w:p>
-      <w:pPr>
-        <w:spacing w:after="280"/>
-        <w:jc w:val="center"/>
-        <w:rPr>
-          <w:color w:val="555555"/>
-          <w:sz w:val="18"/>
-          <w:szCs w:val="18"/>
-          <w:lang w:val="pt-BR"/>
-        </w:rPr>
-      </w:pPr>
-      <w:r>
-        <w:rPr>
-          <w:color w:val="555555"/>
-          <w:sz w:val="18"/>
-          <w:szCs w:val="18"/>
-          <w:lang w:val="pt-BR"/>
-        </w:rPr>
-        <w:t>CNPJ: 48.573.595/0001-09</w:t>
-      </w:r>
-      <w:r>
-        <w:rPr>
-          <w:color w:val="555555"/>
-          <w:sz w:val="18"/>
-          <w:szCs w:val="18"/>
-          <w:lang w:val="pt-BR"/>
-        </w:rPr>
-        <w:br/>
-        <w:t>Av. Anton Philips, 186, Vila Hermínia - Guarulhos - SP</w:t>
-      </w:r>
-      <w:r>
-        <w:rPr>
-          <w:color w:val="555555"/>
-          <w:sz w:val="18"/>
-          <w:szCs w:val="18"/>
-          <w:lang w:val="pt-BR"/>
-        </w:rPr>
-        <w:br/>
-        <w:t>Tel: (11) 9588-15059</w:t>
-      </w:r>
-    </w:p>
-    <w:p>
-      <w:pPr>
-        <w:pStyle w:val="Ttulo1"/>
-        <w:pBdr>
-          <w:bottom w:val="single" w:sz="6" w:space="4" w:color="1B365D"/>
-        </w:pBdr>
-        <w:spacing w:before="240" w:after="240"/>
-        <w:jc w:val="center"/>
-        <w:rPr>
-          <w:color w:val="808080" w:themeColor="background1" w:themeShade="80"/>
-          <w:sz w:val="24"/>
-          <w:szCs w:val="24"/>
-          <w:lang w:val="pt-BR"/>
-        </w:rPr>
-      </w:pPr>
-      <w:r>
-        <w:rPr>
-          <w:noProof/>
-          <w:color w:val="555555"/>
-          <w:sz w:val="18"/>
-          <w:szCs w:val="18"/>
-          <w:lang w:val="pt-BR"/>
-        </w:rPr>
-        <mc:AlternateContent>
-          <mc:Choice Requires="wps">
-            <w:drawing>
-              <wp:anchor distT="0" distB="0" distL="114300" distR="114300" simplePos="0" relativeHeight="251659264" behindDoc="0" locked="0" layoutInCell="1" allowOverlap="1" wp14:anchorId="678F545F" wp14:editId="6D877F71">
-                <wp:simplePos x="0" y="0"/>
-                <wp:positionH relativeFrom="column">
-                  <wp:posOffset>131674</wp:posOffset>
-                </wp:positionH>
-                <wp:positionV relativeFrom="paragraph">
-                  <wp:posOffset>334493</wp:posOffset>
-                </wp:positionV>
-                <wp:extent cx="1499616" cy="226771"/>
-                <wp:effectExtent l="0" t="0" r="5715" b="1905"/>
-                <wp:wrapNone/>
-                <wp:docPr id="415614360" name="Caixa de Texto 3"/>
-                <wp:cNvGraphicFramePr/>
-                <a:graphic xmlns:a="http://schemas.openxmlformats.org/drawingml/2006/main">
-                  <a:graphicData uri="http://schemas.microsoft.com/office/word/2010/wordprocessingShape">
-                    <wps:wsp>
-                      <wps:cNvSpPr txBox="1"/>
-                      <wps:spPr>
-                        <a:xfrm>
-                          <a:off x="0" y="0"/>
-                          <a:ext cx="1499616" cy="226771"/>
-                        </a:xfrm>
-                        <a:prstGeom prst="rect">
-                          <a:avLst/>
-                        </a:prstGeom>
-                        <a:solidFill>
-                          <a:schemeClr val="lt1"/>
-                        </a:solidFill>
-                        <a:ln w="6350">
-                          <a:noFill/>
-                        </a:ln>
-                      </wps:spPr>
-                      <wps:txbx>
-                        <w:txbxContent>
-                          <w:p>
-                            <w:pPr>
-                              <w:rPr>
-                                <w:b/>
-                                <w:bCs/>
-                                <w:color w:val="808080" w:themeColor="background1" w:themeShade="80"/>
-                              </w:rPr>
-                            </w:pPr>
-                            <w:r>
-                              <w:rPr>
-                                <w:b/>
-                                <w:bCs/>
-                                <w:color w:val="808080" w:themeColor="background1" w:themeShade="80"/>
-                              </w:rPr>
-                              <w:t xml:space="preserve">Informações </w:t>
-                            </w:r>
-                            <w:r>
-                              <w:rPr>
-                                <w:b/>
-                                <w:bCs/>
-                                <w:color w:val="808080" w:themeColor="background1" w:themeShade="80"/>
-                              </w:rPr>
-                              <w:t>Cliente</w:t>
-                            </w:r>
-                          </w:p>
-                        </w:txbxContent>
-                      </wps:txbx>
-                      <wps:bodyPr rot="0" spcFirstLastPara="0" vertOverflow="overflow" horzOverflow="overflow" vert="horz" wrap="square" lIns="91440" tIns="45720" rIns="91440" bIns="45720" numCol="1" spcCol="0" rtlCol="0" fromWordArt="0" anchor="t" anchorCtr="0" forceAA="0" compatLnSpc="1">
-                        <a:prstTxWarp prst="textNoShape">
-                          <a:avLst/>
-                        </a:prstTxWarp>
-                        <a:noAutofit/>
-                      </wps:bodyPr>
-                    </wps:wsp>
-                  </a:graphicData>
-                </a:graphic>
-                <wp14:sizeRelH relativeFrom="margin">
-                  <wp14:pctWidth>0</wp14:pctWidth>
-                </wp14:sizeRelH>
-                <wp14:sizeRelV relativeFrom="margin">
-                  <wp14:pctHeight>0</wp14:pctHeight>
-                </wp14:sizeRelV>
-              </wp:anchor>
-            </w:drawing>
-          </mc:Choice>
-          <mc:Fallback>
-            <w:pict>
-              <v:shapetype w14:anchorId="678F545F" id="_x0000_t202" coordsize="21600,21600" o:spt="202" path="m,l,21600r21600,l21600,xe">
-                <v:stroke joinstyle="miter"/>
-                <v:path gradientshapeok="t" o:connecttype="rect"/>
-              </v:shapetype>
-              <v:shape id="Caixa de Texto 3" o:spid="_x0000_s1026" type="#_x0000_t202" style="position:absolute;left:0;text-align:left;margin-left:10.35pt;margin-top:26.35pt;width:118.1pt;height:17.85pt;z-index:251659264;visibility:visible;mso-wrap-style:square;mso-width-percent:0;mso-height-percent:0;mso-wrap-distance-left:9pt;mso-wrap-distance-top:0;mso-wrap-distance-right:9pt;mso-wrap-distance-bottom:0;mso-position-horizontal:absolute;mso-position-horizontal-relative:text;mso-position-vertical:absolute;mso-position-vertical-relative:text;mso-width-percent:0;mso-height-percent:0;mso-width-relative:margin;mso-height-relative:margin;v-text-anchor:top" o:gfxdata="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" fillcolor="white [3201]" stroked="f" strokeweight=".5pt">
-                <v:textbox>
-                  <w:txbxContent>
-                    <w:p>
-                      <w:pPr>
-                        <w:rPr>
-                          <w:b/>
-                          <w:bCs/>
-                          <w:color w:val="808080" w:themeColor="background1" w:themeShade="80"/>
-                        </w:rPr>
-                      </w:pPr>
-                      <w:r>
-                        <w:rPr>
-                          <w:b/>
-                          <w:bCs/>
-                          <w:color w:val="808080" w:themeColor="background1" w:themeShade="80"/>
-                        </w:rPr>
-                        <w:t xml:space="preserve">Informações </w:t>
-                      </w:r>
-                      <w:r>
-                        <w:rPr>
-                          <w:b/>
-                          <w:bCs/>
-                          <w:color w:val="808080" w:themeColor="background1" w:themeShade="80"/>
-                        </w:rPr>
-                        <w:t>Cliente</w:t>
-                      </w:r>
-                    </w:p>
-                  </w:txbxContent>
-                </v:textbox>
-              </v:shape>
-            </w:pict>
-          </mc:Fallback>
-        </mc:AlternateContent>
-      </w:r>
-      <w:r>
-        <w:rPr>
-          <w:rFonts w:ascii="Arial" w:hAnsi="Arial"/>
-          <w:color w:val="808080" w:themeColor="background1" w:themeShade="80"/>
-          <w:sz w:val="24"/>
-          <w:szCs w:val="24"/>
-          <w:lang w:val="pt-BR"/>
-        </w:rPr>
-        <w:t>CONTRATO DE VENDA</w:t>
-      </w:r>
-    </w:p>
-    <w:p>
-      <w:pPr>
-        <w:pStyle w:val="SemEspaamento"/>
-        <w:rPr>
-          <w:rFonts w:asciiTheme="majorHAnsi" w:hAnsiTheme="majorHAnsi" w:cstheme="majorHAnsi"/>
-          <w:sz w:val="20"/>
-          <w:szCs w:val="20"/>
-          <w:lang w:val="pt-BR"/>
-        </w:rPr>
-      </w:pPr>
-      <w:r>
-        <w:rPr>
-          <w:rFonts w:ascii="Arial" w:hAnsi="Arial"/>
-          <w:noProof/>
-          <w:color w:val="FFFFFF" w:themeColor="background1"/>
-          <w:sz w:val="24"/>
-          <w:szCs w:val="24"/>
-          <w:lang w:val="pt-BR"/>
-        </w:rPr>
-        <mc:AlternateContent>
-          <mc:Choice Requires="wps">
-            <w:drawing>
-              <wp:anchor distT="0" distB="0" distL="114300" distR="114300" simplePos="0" relativeHeight="251658240" behindDoc="0" locked="0" layoutInCell="1" allowOverlap="1" wp14:anchorId="11820F6D" wp14:editId="7AA75AAD">
-                <wp:simplePos x="0" y="0"/>
-                <wp:positionH relativeFrom="column">
-                  <wp:posOffset>-58522</wp:posOffset>
-                </wp:positionH>
-                <wp:positionV relativeFrom="paragraph">
-                  <wp:posOffset>36881</wp:posOffset>
-                </wp:positionV>
-                <wp:extent cx="6371540" cy="1041121"/>
-                <wp:effectExtent l="0" t="0" r="10795" b="26035"/>
-                <wp:wrapNone/>
-                <wp:docPr id="783150584" name="Retângulo 1"/>
-                <wp:cNvGraphicFramePr/>
-                <a:graphic xmlns:a="http://schemas.openxmlformats.org/drawingml/2006/main">
-                  <a:graphicData uri="http://schemas.microsoft.com/office/word/2010/wordprocessingShape">
-                    <wps:wsp>
-                      <wps:cNvSpPr/>
-                      <wps:spPr>
-                        <a:xfrm>
-                          <a:off x="0" y="0"/>
-                          <a:ext cx="6371540" cy="1041121"/>
-                        </a:xfrm>
-                        <a:prstGeom prst="rect">
-                          <a:avLst/>
-                        </a:prstGeom>
-                        <a:noFill/>
-                        <a:ln w="9525" cap="flat" cmpd="sng" algn="ctr">
-                          <a:solidFill>
-                            <a:schemeClr val="dk1"/>
-                          </a:solidFill>
-                          <a:prstDash val="solid"/>
-                          <a:round/>
-                          <a:headEnd type="none" w="med" len="med"/>
-                          <a:tailEnd type="none" w="med" len="med"/>
-                        </a:ln>
-                      </wps:spPr>
-                      <wps:style>
-                        <a:lnRef idx="0">
-                          <a:scrgbClr r="0" g="0" b="0"/>
-                        </a:lnRef>
-                        <a:fillRef idx="0">
-                          <a:scrgbClr r="0" g="0" b="0"/>
-                        </a:fillRef>
-                        <a:effectRef idx="0">
-                          <a:scrgbClr r="0" g="0" b="0"/>
-                        </a:effectRef>
-                        <a:fontRef idx="minor">
-                          <a:schemeClr val="dk1"/>
-                        </a:fontRef>
-                      </wps:style>
-                      <wps:bodyPr rot="0" spcFirstLastPara="0" vertOverflow="overflow" horzOverflow="overflow" vert="horz" wrap="square" lIns="91440" tIns="45720" rIns="91440" bIns="45720" numCol="1" spcCol="0" rtlCol="0" fromWordArt="0" anchor="ctr" anchorCtr="0" forceAA="0" compatLnSpc="1">
-                        <a:prstTxWarp prst="textNoShape">
-                          <a:avLst/>
-                        </a:prstTxWarp>
-                        <a:noAutofit/>
-                      </wps:bodyPr>
-                    </wps:wsp>
-                  </a:graphicData>
-                </a:graphic>
-                <wp14:sizeRelH relativeFrom="margin">
-                  <wp14:pctWidth>0</wp14:pctWidth>
-                </wp14:sizeRelH>
-                <wp14:sizeRelV relativeFrom="margin">
-                  <wp14:pctHeight>0</wp14:pctHeight>
-                </wp14:sizeRelV>
-              </wp:anchor>
-            </w:drawing>
-          </mc:Choice>
-          <mc:Fallback>
-            <w:pict>
-              <v:rect w14:anchorId="056EE728" id="Retângulo 1" o:spid="_x0000_s1026" style="position:absolute;margin-left:-4.6pt;margin-top:2.9pt;width:501.7pt;height:82pt;z-index:251658240;visibility:visible;mso-wrap-style:square;mso-width-percent:0;mso-height-percent:0;mso-wrap-distance-left:9pt;mso-wrap-distance-top:0;mso-wrap-distance-right:9pt;mso-wrap-distance-bottom:0;mso-position-horizontal:absolute;mso-position-horizontal-relative:text;mso-position-vertical:absolute;mso-position-vertical-relative:text;mso-width-percent:0;mso-height-percent:0;mso-width-relative:margin;mso-height-relative:margin;v-text-anchor:middle" o:gfxdata="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" filled="f" strokecolor="black [3200]">
-                <v:stroke joinstyle="round"/>
-              </v:rect>
-            </w:pict>
-          </mc:Fallback>
-        </mc:AlternateContent>
-      </w:r>
-    </w:p>
-    <w:p>
-      <w:pPr>
-        <w:pStyle w:val="SemEspaamento"/>
-        <w:rPr>
-          <w:rFonts w:asciiTheme="majorHAnsi" w:hAnsiTheme="majorHAnsi" w:cstheme="majorHAnsi"/>
-          <w:sz w:val="20"/>
-          <w:szCs w:val="20"/>
-          <w:lang w:val="pt-BR"/>
-        </w:rPr>
-      </w:pPr>
-      <w:r>
-        <w:rPr>
-          <w:rFonts w:asciiTheme="majorHAnsi" w:hAnsiTheme="majorHAnsi" w:cstheme="majorHAnsi"/>
-          <w:sz w:val="20"/>
-          <w:szCs w:val="20"/>
-          <w:lang w:val="pt-BR"/>
-        </w:rPr>
-        <w:t xml:space="preserve">Nome: {{Nome do Cliente}}</w:t>
-      </w:r>
-    </w:p>
-    <w:p>
-      <w:pPr>
-        <w:pStyle w:val="SemEspaamento"/>
-        <w:rPr>
-          <w:rFonts w:asciiTheme="majorHAnsi" w:hAnsiTheme="majorHAnsi" w:cstheme="majorHAnsi"/>
-          <w:sz w:val="20"/>
-          <w:szCs w:val="20"/>
-          <w:lang w:val="pt-BR"/>
-        </w:rPr>
-      </w:pPr>
-      <w:r>
-        <w:rPr>
-          <w:rFonts w:asciiTheme="majorHAnsi" w:hAnsiTheme="majorHAnsi" w:cstheme="majorHAnsi"/>
-          <w:sz w:val="20"/>
-          <w:szCs w:val="20"/>
-          <w:lang w:val="pt-BR"/>
-        </w:rPr>
-        <w:t xml:space="preserve">RG n.: {{RG}}                                                                    CPF/MF n.: {{{CPF}}}</w:t>
-      </w:r>
-    </w:p>
-    <w:p>
-      <w:pPr>
-        <w:pStyle w:val="SemEspaamento"/>
-        <w:rPr>
-          <w:rFonts w:asciiTheme="majorHAnsi" w:hAnsiTheme="majorHAnsi" w:cstheme="majorHAnsi"/>
-          <w:sz w:val="20"/>
-          <w:szCs w:val="20"/>
-          <w:lang w:val="pt-BR"/>
-        </w:rPr>
-      </w:pPr>
-      <w:r>
-        <w:rPr>
-          <w:rFonts w:asciiTheme="majorHAnsi" w:hAnsiTheme="majorHAnsi" w:cstheme="majorHAnsi"/>
-          <w:sz w:val="20"/>
-          <w:szCs w:val="20"/>
-          <w:lang w:val="pt-BR"/>
-        </w:rPr>
-        <w:t xml:space="preserve">Endereco: {{Rua/Av}}, {{Número}}                               Bairro: {{Bairro}}</w:t>
-      </w:r>
-    </w:p>
-    <w:p>
-      <w:pPr>
-        <w:pStyle w:val="SemEspaamento"/>
-        <w:rPr>
-          <w:rFonts w:asciiTheme="majorHAnsi" w:hAnsiTheme="majorHAnsi" w:cstheme="majorHAnsi"/>
-          <w:sz w:val="20"/>
-          <w:szCs w:val="20"/>
-          <w:lang w:val="pt-BR"/>
-        </w:rPr>
-      </w:pPr>
-      <w:r>
-        <w:rPr>
-          <w:rFonts w:asciiTheme="majorHAnsi" w:hAnsiTheme="majorHAnsi" w:cstheme="majorHAnsi"/>
-          <w:sz w:val="20"/>
-          <w:szCs w:val="20"/>
-          <w:lang w:val="pt-BR"/>
-        </w:rPr>
-        <w:t xml:space="preserve">Cidade/Municipio: {{Cidade}}                                      Estado: {{Estado}}                        Cep:{{Cep}}.</w:t>
-      </w:r>
-    </w:p>
-    <w:p>
-      <w:pPr>
-        <w:pStyle w:val="SemEspaamento"/>
-        <w:rPr>
-          <w:rFonts w:asciiTheme="majorHAnsi" w:hAnsiTheme="majorHAnsi" w:cstheme="majorHAnsi"/>
-          <w:sz w:val="20"/>
-          <w:szCs w:val="20"/>
-          <w:lang w:val="pt-BR"/>
-        </w:rPr>
-      </w:pPr>
-      <w:r>
-        <w:rPr>
-          <w:rFonts w:asciiTheme="majorHAnsi" w:hAnsiTheme="majorHAnsi" w:cstheme="majorHAnsi"/>
-          <w:sz w:val="20"/>
-          <w:szCs w:val="20"/>
-          <w:lang w:val="pt-BR"/>
-        </w:rPr>
-        <w:t xml:space="preserve">Cel: {{Celular}}.                                                                E-mail: {{Email}}</w:t>
-      </w:r>
-    </w:p>
-    <w:p>
-      <w:pPr>
-        <w:rPr>
-          <w:rFonts w:asciiTheme="majorHAnsi" w:hAnsiTheme="majorHAnsi" w:cstheme="majorHAnsi"/>
-          <w:lang w:val="pt-BR"/>
-        </w:rPr>
-      </w:pPr>
-      <w:r>
-        <w:rPr>
-          <w:noProof/>
-          <w:color w:val="555555"/>
-          <w:sz w:val="18"/>
-          <w:szCs w:val="18"/>
-          <w:lang w:val="pt-BR"/>
-        </w:rPr>
-        <mc:AlternateContent>
-          <mc:Choice Requires="wps">
-            <w:drawing>
-              <wp:anchor distT="0" distB="0" distL="114300" distR="114300" simplePos="0" relativeHeight="251665408" behindDoc="0" locked="0" layoutInCell="1" allowOverlap="1" wp14:anchorId="44729B3B" wp14:editId="13676B9F">
-                <wp:simplePos x="0" y="0"/>
-                <wp:positionH relativeFrom="column">
-                  <wp:posOffset>51207</wp:posOffset>
-                </wp:positionH>
-                <wp:positionV relativeFrom="paragraph">
-                  <wp:posOffset>269723</wp:posOffset>
-                </wp:positionV>
-                <wp:extent cx="1324052" cy="248285"/>
-                <wp:effectExtent l="0" t="0" r="9525" b="0"/>
-                <wp:wrapNone/>
-                <wp:docPr id="952711642" name="Caixa de Texto 3"/>
-                <wp:cNvGraphicFramePr/>
-                <a:graphic xmlns:a="http://schemas.openxmlformats.org/drawingml/2006/main">
-                  <a:graphicData uri="http://schemas.microsoft.com/office/word/2010/wordprocessingShape">
-                    <wps:wsp>
-                      <wps:cNvSpPr txBox="1"/>
-                      <wps:spPr>
-                        <a:xfrm>
-                          <a:off x="0" y="0"/>
-                          <a:ext cx="1324052" cy="248285"/>
-                        </a:xfrm>
-                        <a:prstGeom prst="rect">
-                          <a:avLst/>
-                        </a:prstGeom>
-                        <a:solidFill>
-                          <a:schemeClr val="lt1"/>
-                        </a:solidFill>
-                        <a:ln w="6350">
-                          <a:noFill/>
-                        </a:ln>
-                      </wps:spPr>
-                      <wps:txbx>
-                        <w:txbxContent>
-                          <w:p>
-                            <w:pPr>
-                              <w:rPr>
-                                <w:b/>
-                                <w:bCs/>
-                                <w:color w:val="808080" w:themeColor="background1" w:themeShade="80"/>
-                              </w:rPr>
-                            </w:pPr>
-                            <w:r>
-                              <w:rPr>
-                                <w:b/>
-                                <w:bCs/>
-                                <w:color w:val="808080" w:themeColor="background1" w:themeShade="80"/>
-                              </w:rPr>
-                              <w:t>Dados do Veículo</w:t>
-                            </w:r>
-                          </w:p>
-                        </w:txbxContent>
-                      </wps:txbx>
-                      <wps:bodyPr rot="0" spcFirstLastPara="0" vertOverflow="overflow" horzOverflow="overflow" vert="horz" wrap="square" lIns="91440" tIns="45720" rIns="91440" bIns="45720" numCol="1" spcCol="0" rtlCol="0" fromWordArt="0" anchor="t" anchorCtr="0" forceAA="0" compatLnSpc="1">
-                        <a:prstTxWarp prst="textNoShape">
-                          <a:avLst/>
-                        </a:prstTxWarp>
-                        <a:noAutofit/>
-                      </wps:bodyPr>
-                    </wps:wsp>
-                  </a:graphicData>
-                </a:graphic>
-                <wp14:sizeRelH relativeFrom="margin">
-                  <wp14:pctWidth>0</wp14:pctWidth>
-                </wp14:sizeRelH>
-                <wp14:sizeRelV relativeFrom="margin">
-                  <wp14:pctHeight>0</wp14:pctHeight>
-                </wp14:sizeRelV>
-              </wp:anchor>
-            </w:drawing>
-          </mc:Choice>
-          <mc:Fallback>
-            <w:pict>
-              <v:shape w14:anchorId="44729B3B" id="_x0000_s1027" type="#_x0000_t202" style="position:absolute;margin-left:4.05pt;margin-top:21.25pt;width:104.25pt;height:19.55pt;z-index:251665408;visibility:visible;mso-wrap-style:square;mso-width-percent:0;mso-height-percent:0;mso-wrap-distance-left:9pt;mso-wrap-distance-top:0;mso-wrap-distance-right:9pt;mso-wrap-distance-bottom:0;mso-position-horizontal:absolute;mso-position-horizontal-relative:text;mso-position-vertical:absolute;mso-position-vertical-relative:text;mso-width-percent:0;mso-height-percent:0;mso-width-relative:margin;mso-height-relative:margin;v-text-anchor:top" o:gfxdata="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" fillcolor="white [3201]" stroked="f" strokeweight=".5pt">
-                <v:textbox>
-                  <w:txbxContent>
-                    <w:p>
-                      <w:pPr>
-                        <w:rPr>
-                          <w:b/>
-                          <w:bCs/>
-                          <w:color w:val="808080" w:themeColor="background1" w:themeShade="80"/>
-                        </w:rPr>
-                      </w:pPr>
-                      <w:r>
-                        <w:rPr>
-                          <w:b/>
-                          <w:bCs/>
-                          <w:color w:val="808080" w:themeColor="background1" w:themeShade="80"/>
-                        </w:rPr>
-                        <w:t>Dados do Veículo</w:t>
-                      </w:r>
-                    </w:p>
-                  </w:txbxContent>
-                </v:textbox>
-              </v:shape>
-            </w:pict>
-          </mc:Fallback>
-        </mc:AlternateContent>
-      </w:r>
-    </w:p>
-    <w:p>
-      <w:pPr>
-        <w:rPr>
-          <w:rFonts w:asciiTheme="majorHAnsi" w:hAnsiTheme="majorHAnsi" w:cstheme="majorHAnsi"/>
-          <w:lang w:val="pt-BR"/>
-        </w:rPr>
-      </w:pPr>
-      <w:r>
-        <w:rPr>
-          <w:noProof/>
-          <w:color w:val="FFFFFF" w:themeColor="background1"/>
-          <w:sz w:val="24"/>
-          <w:szCs w:val="24"/>
-          <w:lang w:val="pt-BR"/>
-        </w:rPr>
-        <mc:AlternateContent>
-          <mc:Choice Requires="wps">
-            <w:drawing>
-              <wp:anchor distT="0" distB="0" distL="114300" distR="114300" simplePos="0" relativeHeight="251664384" behindDoc="0" locked="0" layoutInCell="1" allowOverlap="1" wp14:anchorId="50CA5240" wp14:editId="6F754A48">
-                <wp:simplePos x="0" y="0"/>
-                <wp:positionH relativeFrom="column">
-                  <wp:posOffset>-73025</wp:posOffset>
-                </wp:positionH>
-                <wp:positionV relativeFrom="paragraph">
-                  <wp:posOffset>86665</wp:posOffset>
-                </wp:positionV>
-                <wp:extent cx="6385560" cy="1228725"/>
-                <wp:effectExtent l="0" t="0" r="15240" b="28575"/>
-                <wp:wrapNone/>
-                <wp:docPr id="630949161" name="Retângulo 1"/>
-                <wp:cNvGraphicFramePr/>
-                <a:graphic xmlns:a="http://schemas.openxmlformats.org/drawingml/2006/main">
-                  <a:graphicData uri="http://schemas.microsoft.com/office/word/2010/wordprocessingShape">
-                    <wps:wsp>
-                      <wps:cNvSpPr/>
-                      <wps:spPr>
-                        <a:xfrm>
-                          <a:off x="0" y="0"/>
-                          <a:ext cx="6385560" cy="1228725"/>
-                        </a:xfrm>
-                        <a:prstGeom prst="rect">
-                          <a:avLst/>
-                        </a:prstGeom>
-                        <a:noFill/>
-                        <a:ln w="9525" cap="flat" cmpd="sng" algn="ctr">
-                          <a:solidFill>
-                            <a:schemeClr val="dk1"/>
-                          </a:solidFill>
-                          <a:prstDash val="solid"/>
-                          <a:round/>
-                          <a:headEnd type="none" w="med" len="med"/>
-                          <a:tailEnd type="none" w="med" len="med"/>
-                        </a:ln>
-                      </wps:spPr>
-                      <wps:style>
-                        <a:lnRef idx="0">
-                          <a:scrgbClr r="0" g="0" b="0"/>
-                        </a:lnRef>
-                        <a:fillRef idx="0">
-                          <a:scrgbClr r="0" g="0" b="0"/>
-                        </a:fillRef>
-                        <a:effectRef idx="0">
-                          <a:scrgbClr r="0" g="0" b="0"/>
-                        </a:effectRef>
-                        <a:fontRef idx="minor">
-                          <a:schemeClr val="dk1"/>
-                        </a:fontRef>
-                      </wps:style>
-                      <wps:bodyPr rot="0" spcFirstLastPara="0" vertOverflow="overflow" horzOverflow="overflow" vert="horz" wrap="square" lIns="91440" tIns="45720" rIns="91440" bIns="45720" numCol="1" spcCol="0" rtlCol="0" fromWordArt="0" anchor="ctr" anchorCtr="0" forceAA="0" compatLnSpc="1">
-                        <a:prstTxWarp prst="textNoShape">
-                          <a:avLst/>
-                        </a:prstTxWarp>
-                        <a:noAutofit/>
-                      </wps:bodyPr>
-                    </wps:wsp>
-                  </a:graphicData>
-                </a:graphic>
-                <wp14:sizeRelH relativeFrom="margin">
-                  <wp14:pctWidth>0</wp14:pctWidth>
-                </wp14:sizeRelH>
-                <wp14:sizeRelV relativeFrom="margin">
-                  <wp14:pctHeight>0</wp14:pctHeight>
-                </wp14:sizeRelV>
-              </wp:anchor>
-            </w:drawing>
-          </mc:Choice>
-          <mc:Fallback>
-            <w:pict>
-              <v:rect w14:anchorId="21645D16" id="Retângulo 1" o:spid="_x0000_s1026" style="position:absolute;margin-left:-5.75pt;margin-top:6.8pt;width:502.8pt;height:96.75pt;z-index:251664384;visibility:visible;mso-wrap-style:square;mso-width-percent:0;mso-height-percent:0;mso-wrap-distance-left:9pt;mso-wrap-distance-top:0;mso-wrap-distance-right:9pt;mso-wrap-distance-bottom:0;mso-position-horizontal:absolute;mso-position-horizontal-relative:text;mso-position-vertical:absolute;mso-position-vertical-relative:text;mso-width-percent:0;mso-height-percent:0;mso-width-relative:margin;mso-height-relative:margin;v-text-anchor:middle" o:gfxdata="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" filled="f" strokecolor="black [3200]">
-                <v:stroke joinstyle="round"/>
-              </v:rect>
-            </w:pict>
-          </mc:Fallback>
-        </mc:AlternateContent>
-      </w:r>
-    </w:p>
-    <w:p>
-      <w:pPr>
-        <w:spacing w:after="0" w:line="240" w:lineRule="auto"/>
-        <w:rPr>
-          <w:rFonts w:asciiTheme="majorHAnsi" w:hAnsiTheme="majorHAnsi" w:cstheme="majorHAnsi"/>
-          <w:lang w:val="pt-BR"/>
-        </w:rPr>
-      </w:pPr>
-      <w:r>
-        <w:rPr>
-          <w:rFonts w:asciiTheme="majorHAnsi" w:hAnsiTheme="majorHAnsi" w:cstheme="majorHAnsi"/>
-          <w:lang w:val="pt-BR"/>
-        </w:rPr>
-        <w:t xml:space="preserve">Marca: {{Marca}}</w:t>
-      </w:r>
-    </w:p>
-    <w:p>
-      <w:pPr>
-        <w:spacing w:after="0" w:line="240" w:lineRule="auto"/>
-        <w:rPr>
-          <w:rFonts w:asciiTheme="majorHAnsi" w:hAnsiTheme="majorHAnsi" w:cstheme="majorHAnsi"/>
-          <w:lang w:val="pt-BR"/>
-        </w:rPr>
-      </w:pPr>
-      <w:r>
-        <w:rPr>
-          <w:rFonts w:asciiTheme="majorHAnsi" w:hAnsiTheme="majorHAnsi" w:cstheme="majorHAnsi"/>
-          <w:lang w:val="pt-BR"/>
-        </w:rPr>
-        <w:t xml:space="preserve">Modelo: {{Modelo}}             Versão: {{Versão}}</w:t>
-      </w:r>
-    </w:p>
-    <w:p>
-      <w:pPr>
-        <w:spacing w:after="0" w:line="240" w:lineRule="auto"/>
-        <w:rPr>
-          <w:rFonts w:asciiTheme="majorHAnsi" w:hAnsiTheme="majorHAnsi" w:cstheme="majorHAnsi"/>
-          <w:lang w:val="pt-BR"/>
-        </w:rPr>
-      </w:pPr>
-      <w:r>
-        <w:rPr>
-          <w:rFonts w:asciiTheme="majorHAnsi" w:hAnsiTheme="majorHAnsi" w:cstheme="majorHAnsi"/>
-          <w:lang w:val="pt-BR"/>
-        </w:rPr>
-        <w:t xml:space="preserve">Ano Fabricação: {{Ano Fabricação}}      Ano Modelo: {{Ano Modelo}}     Cor: {{Cor}}</w:t>
-      </w:r>
-    </w:p>
-    <w:p>
-      <w:pPr>
-        <w:spacing w:after="0" w:line="240" w:lineRule="auto"/>
-        <w:rPr>
-          <w:rFonts w:asciiTheme="majorHAnsi" w:hAnsiTheme="majorHAnsi" w:cstheme="majorHAnsi"/>
-          <w:lang w:val="pt-BR"/>
-        </w:rPr>
-      </w:pPr>
-      <w:r>
-        <w:rPr>
-          <w:rFonts w:asciiTheme="majorHAnsi" w:hAnsiTheme="majorHAnsi" w:cstheme="majorHAnsi"/>
-          <w:lang w:val="pt-BR"/>
-        </w:rPr>
-        <w:t xml:space="preserve">Placa: {{Placa}}                      Chassi: {{Chassi}}                           Renavan: {{Renavam}} </w:t>
-      </w:r>
-    </w:p>
-    <w:p>
-      <w:pPr>
-        <w:spacing w:after="0" w:line="240" w:lineRule="auto"/>
-        <w:rPr>
-          <w:rFonts w:asciiTheme="majorHAnsi" w:hAnsiTheme="majorHAnsi" w:cstheme="majorHAnsi"/>
-          <w:lang w:val="pt-BR"/>
-        </w:rPr>
-      </w:pPr>
-      <w:r>
-        <w:rPr>
-          <w:rFonts w:asciiTheme="majorHAnsi" w:hAnsiTheme="majorHAnsi" w:cstheme="majorHAnsi"/>
-          <w:lang w:val="pt-BR"/>
-        </w:rPr>
-        <w:t xml:space="preserve">Combustível: {{Combustível}}                                                     Km Atual: {{KM}}</w:t>
-      </w:r>
-    </w:p>
-    <w:p>
-      <w:pPr>
-        <w:spacing w:after="0" w:line="240" w:lineRule="auto"/>
-        <w:rPr>
-          <w:rFonts w:asciiTheme="majorHAnsi" w:hAnsiTheme="majorHAnsi" w:cstheme="majorHAnsi"/>
-          <w:lang w:val="pt-BR"/>
-        </w:rPr>
-      </w:pPr>
-      <w:r>
-        <w:rPr>
-          <w:rFonts w:asciiTheme="majorHAnsi" w:hAnsiTheme="majorHAnsi" w:cstheme="majorHAnsi"/>
-          <w:lang w:val="pt-BR"/>
-        </w:rPr>
-        <w:t xml:space="preserve">Valor da Venda: {{Valor da Venda}}</w:t>
-      </w:r>
-    </w:p>
-    <w:p>
-      <w:pPr>
-        <w:spacing w:after="0" w:line="240" w:lineRule="auto"/>
-        <w:rPr>
-          <w:rFonts w:asciiTheme="majorHAnsi" w:hAnsiTheme="majorHAnsi" w:cstheme="majorHAnsi"/>
-          <w:b/>
-          <w:bCs/>
-          <w:szCs w:val="20"/>
-          <w:lang w:val="pt-BR"/>
-        </w:rPr>
-      </w:pPr>
-      <w:r>
-        <w:rPr>
-          <w:noProof/>
-          <w:color w:val="555555"/>
-          <w:sz w:val="18"/>
-          <w:szCs w:val="18"/>
-          <w:lang w:val="pt-BR"/>
-        </w:rPr>
-        <mc:AlternateContent>
-          <mc:Choice Requires="wps">
-            <w:drawing>
-              <wp:anchor distT="0" distB="0" distL="114300" distR="114300" simplePos="0" relativeHeight="251668480" behindDoc="0" locked="0" layoutInCell="1" allowOverlap="1" wp14:anchorId="06FEA610" wp14:editId="1E5E472F">
-                <wp:simplePos x="0" y="0"/>
-                <wp:positionH relativeFrom="column">
-                  <wp:posOffset>51207</wp:posOffset>
-                </wp:positionH>
-                <wp:positionV relativeFrom="paragraph">
-                  <wp:posOffset>214198</wp:posOffset>
-                </wp:positionV>
-                <wp:extent cx="1718768" cy="248285"/>
-                <wp:effectExtent l="0" t="0" r="0" b="0"/>
-                <wp:wrapNone/>
-                <wp:docPr id="1905243769" name="Caixa de Texto 3"/>
-                <wp:cNvGraphicFramePr/>
-                <a:graphic xmlns:a="http://schemas.openxmlformats.org/drawingml/2006/main">
-                  <a:graphicData uri="http://schemas.microsoft.com/office/word/2010/wordprocessingShape">
-                    <wps:wsp>
-                      <wps:cNvSpPr txBox="1"/>
-                      <wps:spPr>
-                        <a:xfrm>
-                          <a:off x="0" y="0"/>
-                          <a:ext cx="1718768" cy="248285"/>
-                        </a:xfrm>
-                        <a:prstGeom prst="rect">
-                          <a:avLst/>
-                        </a:prstGeom>
-                        <a:solidFill>
-                          <a:schemeClr val="lt1"/>
-                        </a:solidFill>
-                        <a:ln w="6350">
-                          <a:noFill/>
-                        </a:ln>
-                      </wps:spPr>
-                      <wps:txbx>
-                        <w:txbxContent>
-                          <w:p>
-                            <w:pPr>
-                              <w:rPr>
-                                <w:b/>
-                                <w:bCs/>
-                                <w:color w:val="808080" w:themeColor="background1" w:themeShade="80"/>
-                                <w:lang w:val="pt-BR"/>
-                              </w:rPr>
-                            </w:pPr>
-                            <w:r>
-                              <w:rPr>
-                                <w:b/>
-                                <w:bCs/>
-                                <w:color w:val="808080" w:themeColor="background1" w:themeShade="80"/>
-                                <w:lang w:val="pt-BR"/>
-                              </w:rPr>
-                              <w:t>Condiç</w:t>
-                            </w:r>
-                            <w:r>
-                              <w:rPr>
-                                <w:b/>
-                                <w:bCs/>
-                                <w:color w:val="808080" w:themeColor="background1" w:themeShade="80"/>
-                                <w:lang w:val="pt-BR"/>
-                              </w:rPr>
-                              <w:t xml:space="preserve">ões </w:t>
-                            </w:r>
-                            <w:r>
-                              <w:rPr>
-                                <w:b/>
-                                <w:bCs/>
-                                <w:color w:val="808080" w:themeColor="background1" w:themeShade="80"/>
-                                <w:lang w:val="pt-BR"/>
-                              </w:rPr>
-                              <w:t xml:space="preserve">da </w:t>
-                            </w:r>
-                            <w:r>
-                              <w:rPr>
-                                <w:b/>
-                                <w:bCs/>
-                                <w:color w:val="808080" w:themeColor="background1" w:themeShade="80"/>
-                                <w:lang w:val="pt-BR"/>
-                              </w:rPr>
-                              <w:t xml:space="preserve">Transação </w:t>
-                            </w:r>
-                          </w:p>
-                        </w:txbxContent>
-                      </wps:txbx>
-                      <wps:bodyPr rot="0" spcFirstLastPara="0" vertOverflow="overflow" horzOverflow="overflow" vert="horz" wrap="square" lIns="91440" tIns="45720" rIns="91440" bIns="45720" numCol="1" spcCol="0" rtlCol="0" fromWordArt="0" anchor="t" anchorCtr="0" forceAA="0" compatLnSpc="1">
-                        <a:prstTxWarp prst="textNoShape">
-                          <a:avLst/>
-                        </a:prstTxWarp>
-                        <a:noAutofit/>
-                      </wps:bodyPr>
-                    </wps:wsp>
-                  </a:graphicData>
-                </a:graphic>
-                <wp14:sizeRelH relativeFrom="margin">
-                  <wp14:pctWidth>0</wp14:pctWidth>
-                </wp14:sizeRelH>
-                <wp14:sizeRelV relativeFrom="margin">
-                  <wp14:pctHeight>0</wp14:pctHeight>
-                </wp14:sizeRelV>
-              </wp:anchor>
-            </w:drawing>
-          </mc:Choice>
-          <mc:Fallback>
-            <w:pict>
-              <v:shape w14:anchorId="06FEA610" id="_x0000_s1028" type="#_x0000_t202" style="position:absolute;margin-left:4.05pt;margin-top:16.85pt;width:135.35pt;height:19.55pt;z-index:251668480;visibility:visible;mso-wrap-style:square;mso-width-percent:0;mso-height-percent:0;mso-wrap-distance-left:9pt;mso-wrap-distance-top:0;mso-wrap-distance-right:9pt;mso-wrap-distance-bottom:0;mso-position-horizontal:absolute;mso-position-horizontal-relative:text;mso-position-vertical:absolute;mso-position-vertical-relative:text;mso-width-percent:0;mso-height-percent:0;mso-width-relative:margin;mso-height-relative:margin;v-text-anchor:top" o:gfxdata="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" fillcolor="white [3201]" stroked="f" strokeweight=".5pt">
-                <v:textbox>
-                  <w:txbxContent>
-                    <w:p>
-                      <w:pPr>
-                        <w:rPr>
-                          <w:b/>
-                          <w:bCs/>
-                          <w:color w:val="808080" w:themeColor="background1" w:themeShade="80"/>
-                          <w:lang w:val="pt-BR"/>
-                        </w:rPr>
-                      </w:pPr>
-                      <w:r>
-                        <w:rPr>
-                          <w:b/>
-                          <w:bCs/>
-                          <w:color w:val="808080" w:themeColor="background1" w:themeShade="80"/>
-                          <w:lang w:val="pt-BR"/>
-                        </w:rPr>
-                        <w:t>Condiç</w:t>
-                      </w:r>
-                      <w:r>
-                        <w:rPr>
-                          <w:b/>
-                          <w:bCs/>
-                          <w:color w:val="808080" w:themeColor="background1" w:themeShade="80"/>
-                          <w:lang w:val="pt-BR"/>
-                        </w:rPr>
-                        <w:t xml:space="preserve">ões </w:t>
-                      </w:r>
-                      <w:r>
-                        <w:rPr>
-                          <w:b/>
-                          <w:bCs/>
-                          <w:color w:val="808080" w:themeColor="background1" w:themeShade="80"/>
-                          <w:lang w:val="pt-BR"/>
-                        </w:rPr>
-                        <w:t xml:space="preserve">da </w:t>
-                      </w:r>
-                      <w:r>
-                        <w:rPr>
-                          <w:b/>
-                          <w:bCs/>
-                          <w:color w:val="808080" w:themeColor="background1" w:themeShade="80"/>
-                          <w:lang w:val="pt-BR"/>
-                        </w:rPr>
-                        <w:t xml:space="preserve">Transação </w:t>
-                      </w:r>
-                    </w:p>
-                  </w:txbxContent>
-                </v:textbox>
-              </v:shape>
-            </w:pict>
-          </mc:Fallback>
-        </mc:AlternateContent>
-      </w:r>
-    </w:p>
-    <w:p>
-      <w:pPr>
-        <w:spacing w:after="0" w:line="240" w:lineRule="auto"/>
-        <w:rPr>
-          <w:rFonts w:asciiTheme="majorHAnsi" w:hAnsiTheme="majorHAnsi" w:cstheme="majorHAnsi"/>
-          <w:szCs w:val="20"/>
-          <w:lang w:val="pt-BR"/>
-        </w:rPr>
-      </w:pPr>
-    </w:p>
-    <w:p>
-      <w:pPr>
-        <w:spacing w:after="0" w:line="240" w:lineRule="auto"/>
-        <w:rPr>
-          <w:rFonts w:asciiTheme="majorHAnsi" w:hAnsiTheme="majorHAnsi" w:cstheme="majorHAnsi"/>
-          <w:szCs w:val="20"/>
-          <w:lang w:val="pt-BR"/>
-        </w:rPr>
-      </w:pPr>
-      <w:r>
-        <w:rPr>
-          <w:noProof/>
-          <w:color w:val="FFFFFF" w:themeColor="background1"/>
-          <w:sz w:val="24"/>
-          <w:szCs w:val="24"/>
-          <w:lang w:val="pt-BR"/>
-        </w:rPr>
-        <mc:AlternateContent>
-          <mc:Choice Requires="wps">
-            <w:drawing>
-              <wp:anchor distT="0" distB="0" distL="114300" distR="114300" simplePos="0" relativeHeight="251667456" behindDoc="0" locked="0" layoutInCell="1" allowOverlap="1" wp14:anchorId="1788E6E1" wp14:editId="2AE1750B">
-                <wp:simplePos x="0" y="0"/>
-                <wp:positionH relativeFrom="column">
-                  <wp:posOffset>-73152</wp:posOffset>
-                </wp:positionH>
-                <wp:positionV relativeFrom="paragraph">
-                  <wp:posOffset>35993</wp:posOffset>
-                </wp:positionV>
-                <wp:extent cx="6385560" cy="548640"/>
-                <wp:effectExtent l="0" t="0" r="15240" b="22860"/>
-                <wp:wrapNone/>
-                <wp:docPr id="1624956887" name="Retângulo 1"/>
-                <wp:cNvGraphicFramePr/>
-                <a:graphic xmlns:a="http://schemas.openxmlformats.org/drawingml/2006/main">
-                  <a:graphicData uri="http://schemas.microsoft.com/office/word/2010/wordprocessingShape">
-                    <wps:wsp>
-                      <wps:cNvSpPr/>
-                      <wps:spPr>
-                        <a:xfrm>
-                          <a:off x="0" y="0"/>
-                          <a:ext cx="6385560" cy="548640"/>
-                        </a:xfrm>
-                        <a:prstGeom prst="rect">
-                          <a:avLst/>
-                        </a:prstGeom>
-                        <a:noFill/>
-                        <a:ln w="9525" cap="flat" cmpd="sng" algn="ctr">
-                          <a:solidFill>
-                            <a:schemeClr val="dk1"/>
-                          </a:solidFill>
-                          <a:prstDash val="solid"/>
-                          <a:round/>
-                          <a:headEnd type="none" w="med" len="med"/>
-                          <a:tailEnd type="none" w="med" len="med"/>
-                        </a:ln>
-                      </wps:spPr>
-                      <wps:style>
-                        <a:lnRef idx="0">
-                          <a:scrgbClr r="0" g="0" b="0"/>
-                        </a:lnRef>
-                        <a:fillRef idx="0">
-                          <a:scrgbClr r="0" g="0" b="0"/>
-                        </a:fillRef>
-                        <a:effectRef idx="0">
-                          <a:scrgbClr r="0" g="0" b="0"/>
-                        </a:effectRef>
-                        <a:fontRef idx="minor">
-                          <a:schemeClr val="dk1"/>
-                        </a:fontRef>
-                      </wps:style>
-                      <wps:bodyPr rot="0" spcFirstLastPara="0" vertOverflow="overflow" horzOverflow="overflow" vert="horz" wrap="square" lIns="91440" tIns="45720" rIns="91440" bIns="45720" numCol="1" spcCol="0" rtlCol="0" fromWordArt="0" anchor="ctr" anchorCtr="0" forceAA="0" compatLnSpc="1">
-                        <a:prstTxWarp prst="textNoShape">
-                          <a:avLst/>
-                        </a:prstTxWarp>
-                        <a:noAutofit/>
-                      </wps:bodyPr>
-                    </wps:wsp>
-                  </a:graphicData>
-                </a:graphic>
-                <wp14:sizeRelH relativeFrom="margin">
-                  <wp14:pctWidth>0</wp14:pctWidth>
-                </wp14:sizeRelH>
-                <wp14:sizeRelV relativeFrom="margin">
-                  <wp14:pctHeight>0</wp14:pctHeight>
-                </wp14:sizeRelV>
-              </wp:anchor>
-            </w:drawing>
-          </mc:Choice>
-          <mc:Fallback>
-            <w:pict>
-              <v:rect w14:anchorId="5428BBBC" id="Retângulo 1" o:spid="_x0000_s1026" style="position:absolute;margin-left:-5.75pt;margin-top:2.85pt;width:502.8pt;height:43.2pt;z-index:251667456;visibility:visible;mso-wrap-style:square;mso-width-percent:0;mso-height-percent:0;mso-wrap-distance-left:9pt;mso-wrap-distance-top:0;mso-wrap-distance-right:9pt;mso-wrap-distance-bottom:0;mso-position-horizontal:absolute;mso-position-horizontal-relative:text;mso-position-vertical:absolute;mso-position-vertical-relative:text;mso-width-percent:0;mso-height-percent:0;mso-width-relative:margin;mso-height-relative:margin;v-text-anchor:middle" o:gfxdata="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" filled="f" strokecolor="black [3200]">
-                <v:stroke joinstyle="round"/>
-              </v:rect>
-            </w:pict>
-          </mc:Fallback>
-        </mc:AlternateContent>
-      </w:r>
-    </w:p>
-    <w:p>
-      <w:pPr>
-        <w:spacing w:after="0" w:line="240" w:lineRule="auto"/>
-        <w:rPr>
-          <w:rFonts w:asciiTheme="majorHAnsi" w:hAnsiTheme="majorHAnsi" w:cstheme="majorHAnsi"/>
-          <w:szCs w:val="20"/>
-          <w:lang w:val="pt-BR"/>
-        </w:rPr>
-      </w:pPr>
-      <w:r>
-        <w:rPr>
-          <w:rFonts w:asciiTheme="majorHAnsi" w:hAnsiTheme="majorHAnsi" w:cstheme="majorHAnsi"/>
-          <w:szCs w:val="20"/>
-          <w:lang w:val="pt-BR"/>
-        </w:rPr>
-        <w:t xml:space="preserve">Eu, {{Nome do Cliente}}, afirmo ter pago a JTS INTERMEDIAÇÕES E NEGOCIOS LTDA pela compra do veiculo citado, a quantia de: {{Valor da Venda}} ( Valor por extenso), a ser pago da forma descrita abaixo:</w:t>
-      </w:r>
-    </w:p>
-    <w:p>
-      <w:pPr>
-        <w:spacing w:after="0" w:line="240" w:lineRule="auto"/>
-        <w:rPr>
-          <w:rFonts w:asciiTheme="majorHAnsi" w:hAnsiTheme="majorHAnsi" w:cstheme="majorHAnsi"/>
-          <w:b/>
-          <w:bCs/>
-          <w:szCs w:val="20"/>
-          <w:lang w:val="pt-BR"/>
-        </w:rPr>
-      </w:pPr>
-    </w:p>
-    <w:p>
-      <w:pPr>
-        <w:spacing w:after="0" w:line="240" w:lineRule="auto"/>
-        <w:rPr>
-          <w:rFonts w:asciiTheme="majorHAnsi" w:hAnsiTheme="majorHAnsi" w:cstheme="majorHAnsi"/>
-          <w:b/>
-          <w:bCs/>
-          <w:szCs w:val="20"/>
-          <w:lang w:val="pt-BR"/>
-        </w:rPr>
-      </w:pPr>
-      <w:r>
-        <w:rPr>
-          <w:noProof/>
-          <w:color w:val="555555"/>
-          <w:sz w:val="18"/>
-          <w:szCs w:val="18"/>
-          <w:lang w:val="pt-BR"/>
-        </w:rPr>
-        <mc:AlternateContent>
-          <mc:Choice Requires="wps">
-            <w:drawing>
-              <wp:anchor distT="0" distB="0" distL="114300" distR="114300" simplePos="0" relativeHeight="251671552" behindDoc="0" locked="0" layoutInCell="1" allowOverlap="1" wp14:anchorId="4B60A431" wp14:editId="781A1018">
-                <wp:simplePos x="0" y="0"/>
-                <wp:positionH relativeFrom="column">
-                  <wp:posOffset>70790</wp:posOffset>
-                </wp:positionH>
-                <wp:positionV relativeFrom="paragraph">
-                  <wp:posOffset>131445</wp:posOffset>
-                </wp:positionV>
-                <wp:extent cx="1791970" cy="248285"/>
-                <wp:effectExtent l="0" t="0" r="0" b="0"/>
-                <wp:wrapNone/>
-                <wp:docPr id="1531168136" name="Caixa de Texto 3"/>
-                <wp:cNvGraphicFramePr/>
-                <a:graphic xmlns:a="http://schemas.openxmlformats.org/drawingml/2006/main">
-                  <a:graphicData uri="http://schemas.microsoft.com/office/word/2010/wordprocessingShape">
-                    <wps:wsp>
-                      <wps:cNvSpPr txBox="1"/>
-                      <wps:spPr>
-                        <a:xfrm>
-                          <a:off x="0" y="0"/>
-                          <a:ext cx="1791970" cy="248285"/>
-                        </a:xfrm>
-                        <a:prstGeom prst="rect">
-                          <a:avLst/>
-                        </a:prstGeom>
-                        <a:solidFill>
-                          <a:schemeClr val="lt1"/>
-                        </a:solidFill>
-                        <a:ln w="6350">
-                          <a:noFill/>
-                        </a:ln>
-                      </wps:spPr>
-                      <wps:txbx>
-                        <w:txbxContent>
-                          <w:p>
-                            <w:pPr>
-                              <w:rPr>
-                                <w:b/>
-                                <w:bCs/>
-                                <w:color w:val="808080" w:themeColor="background1" w:themeShade="80"/>
-                                <w:lang w:val="pt-BR"/>
-                              </w:rPr>
-                            </w:pPr>
-                            <w:r>
-                              <w:rPr>
-                                <w:b/>
-                                <w:bCs/>
-                                <w:color w:val="808080" w:themeColor="background1" w:themeShade="80"/>
-                                <w:lang w:val="pt-BR"/>
-                              </w:rPr>
-                              <w:t>Condiç</w:t>
-                            </w:r>
-                            <w:r>
-                              <w:rPr>
-                                <w:b/>
-                                <w:bCs/>
-                                <w:color w:val="808080" w:themeColor="background1" w:themeShade="80"/>
-                                <w:lang w:val="pt-BR"/>
-                              </w:rPr>
-                              <w:t xml:space="preserve">ões </w:t>
-                            </w:r>
-                            <w:r>
-                              <w:rPr>
-                                <w:b/>
-                                <w:bCs/>
-                                <w:color w:val="808080" w:themeColor="background1" w:themeShade="80"/>
-                                <w:lang w:val="pt-BR"/>
-                              </w:rPr>
-                              <w:t>d</w:t>
-                            </w:r>
-                            <w:r>
-                              <w:rPr>
-                                <w:b/>
-                                <w:bCs/>
-                                <w:color w:val="808080" w:themeColor="background1" w:themeShade="80"/>
-                                <w:lang w:val="pt-BR"/>
-                              </w:rPr>
-                              <w:t xml:space="preserve">o </w:t>
-                            </w:r>
-                            <w:r>
-                              <w:rPr>
-                                <w:b/>
-                                <w:bCs/>
-                                <w:color w:val="808080" w:themeColor="background1" w:themeShade="80"/>
-                                <w:lang w:val="pt-BR"/>
-                              </w:rPr>
-                              <w:t>Pagamento</w:t>
-                            </w:r>
-                          </w:p>
-                        </w:txbxContent>
-                      </wps:txbx>
-                      <wps:bodyPr rot="0" spcFirstLastPara="0" vertOverflow="overflow" horzOverflow="overflow" vert="horz" wrap="square" lIns="91440" tIns="45720" rIns="91440" bIns="45720" numCol="1" spcCol="0" rtlCol="0" fromWordArt="0" anchor="t" anchorCtr="0" forceAA="0" compatLnSpc="1">
-                        <a:prstTxWarp prst="textNoShape">
-                          <a:avLst/>
-                        </a:prstTxWarp>
-                        <a:noAutofit/>
-                      </wps:bodyPr>
-                    </wps:wsp>
-                  </a:graphicData>
-                </a:graphic>
-                <wp14:sizeRelH relativeFrom="margin">
-                  <wp14:pctWidth>0</wp14:pctWidth>
-                </wp14:sizeRelH>
-                <wp14:sizeRelV relativeFrom="margin">
-                  <wp14:pctHeight>0</wp14:pctHeight>
-                </wp14:sizeRelV>
-              </wp:anchor>
-            </w:drawing>
-          </mc:Choice>
-          <mc:Fallback>
-            <w:pict>
-              <v:shape w14:anchorId="4B60A431" id="_x0000_s1029" type="#_x0000_t202" style="position:absolute;margin-left:5.55pt;margin-top:10.35pt;width:141.1pt;height:19.55pt;z-index:251671552;visibility:visible;mso-wrap-style:square;mso-width-percent:0;mso-height-percent:0;mso-wrap-distance-left:9pt;mso-wrap-distance-top:0;mso-wrap-distance-right:9pt;mso-wrap-distance-bottom:0;mso-position-horizontal:absolute;mso-position-horizontal-relative:text;mso-position-vertical:absolute;mso-position-vertical-relative:text;mso-width-percent:0;mso-height-percent:0;mso-width-relative:margin;mso-height-relative:margin;v-text-anchor:top" o:gfxdata="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" fillcolor="white [3201]" stroked="f" strokeweight=".5pt">
-                <v:textbox>
-                  <w:txbxContent>
-                    <w:p>
-                      <w:pPr>
-                        <w:rPr>
-                          <w:b/>
-                          <w:bCs/>
-                          <w:color w:val="808080" w:themeColor="background1" w:themeShade="80"/>
-                          <w:lang w:val="pt-BR"/>
-                        </w:rPr>
-                      </w:pPr>
-                      <w:r>
-                        <w:rPr>
-                          <w:b/>
-                          <w:bCs/>
-                          <w:color w:val="808080" w:themeColor="background1" w:themeShade="80"/>
-                          <w:lang w:val="pt-BR"/>
-                        </w:rPr>
-                        <w:t>Condiç</w:t>
-                      </w:r>
-                      <w:r>
-                        <w:rPr>
-                          <w:b/>
-                          <w:bCs/>
-                          <w:color w:val="808080" w:themeColor="background1" w:themeShade="80"/>
-                          <w:lang w:val="pt-BR"/>
-                        </w:rPr>
-                        <w:t xml:space="preserve">ões </w:t>
-                      </w:r>
-                      <w:r>
-                        <w:rPr>
-                          <w:b/>
-                          <w:bCs/>
-                          <w:color w:val="808080" w:themeColor="background1" w:themeShade="80"/>
-                          <w:lang w:val="pt-BR"/>
-                        </w:rPr>
-                        <w:t>d</w:t>
-                      </w:r>
-                      <w:r>
-                        <w:rPr>
-                          <w:b/>
-                          <w:bCs/>
-                          <w:color w:val="808080" w:themeColor="background1" w:themeShade="80"/>
-                          <w:lang w:val="pt-BR"/>
-                        </w:rPr>
-                        <w:t xml:space="preserve">o </w:t>
-                      </w:r>
-                      <w:r>
-                        <w:rPr>
-                          <w:b/>
-                          <w:bCs/>
-                          <w:color w:val="808080" w:themeColor="background1" w:themeShade="80"/>
-                          <w:lang w:val="pt-BR"/>
-                        </w:rPr>
-                        <w:t>Pagamento</w:t>
-                      </w:r>
-                    </w:p>
-                  </w:txbxContent>
-                </v:textbox>
-              </v:shape>
-            </w:pict>
-          </mc:Fallback>
-        </mc:AlternateContent>
-      </w:r>
-    </w:p>
-    <w:p>
-      <w:pPr>
-        <w:spacing w:after="0" w:line="240" w:lineRule="auto"/>
-        <w:rPr>
-          <w:rFonts w:asciiTheme="majorHAnsi" w:hAnsiTheme="majorHAnsi" w:cstheme="majorHAnsi"/>
-          <w:b/>
-          <w:bCs/>
-          <w:szCs w:val="20"/>
-          <w:lang w:val="pt-BR"/>
-        </w:rPr>
-      </w:pPr>
-      <w:r>
-        <w:rPr>
-          <w:noProof/>
-          <w:color w:val="FFFFFF" w:themeColor="background1"/>
-          <w:sz w:val="24"/>
-          <w:szCs w:val="24"/>
-          <w:lang w:val="pt-BR"/>
-        </w:rPr>
-        <mc:AlternateContent>
-          <mc:Choice Requires="wps">
-            <w:drawing>
-              <wp:anchor distT="0" distB="0" distL="114300" distR="114300" simplePos="0" relativeHeight="251670528" behindDoc="0" locked="0" layoutInCell="1" allowOverlap="1" wp14:anchorId="29611BA2" wp14:editId="2140EFAC">
-                <wp:simplePos x="0" y="0"/>
-                <wp:positionH relativeFrom="column">
-                  <wp:posOffset>-63195</wp:posOffset>
-                </wp:positionH>
-                <wp:positionV relativeFrom="paragraph">
-                  <wp:posOffset>109855</wp:posOffset>
-                </wp:positionV>
-                <wp:extent cx="6385560" cy="3095625"/>
-                <wp:effectExtent l="0" t="0" r="15240" b="28575"/>
-                <wp:wrapNone/>
-                <wp:docPr id="966023408" name="Retângulo 1"/>
-                <wp:cNvGraphicFramePr/>
-                <a:graphic xmlns:a="http://schemas.openxmlformats.org/drawingml/2006/main">
-                  <a:graphicData uri="http://schemas.microsoft.com/office/word/2010/wordprocessingShape">
-                    <wps:wsp>
-                      <wps:cNvSpPr/>
-                      <wps:spPr>
-                        <a:xfrm>
-                          <a:off x="0" y="0"/>
-                          <a:ext cx="6385560" cy="3095625"/>
-                        </a:xfrm>
-                        <a:prstGeom prst="rect">
-                          <a:avLst/>
-                        </a:prstGeom>
-                        <a:noFill/>
-                        <a:ln w="9525" cap="flat" cmpd="sng" algn="ctr">
-                          <a:solidFill>
-                            <a:schemeClr val="dk1"/>
-                          </a:solidFill>
-                          <a:prstDash val="solid"/>
-                          <a:round/>
-                          <a:headEnd type="none" w="med" len="med"/>
-                          <a:tailEnd type="none" w="med" len="med"/>
-                        </a:ln>
-                      </wps:spPr>
-                      <wps:style>
-                        <a:lnRef idx="0">
-                          <a:scrgbClr r="0" g="0" b="0"/>
-                        </a:lnRef>
-                        <a:fillRef idx="0">
-                          <a:scrgbClr r="0" g="0" b="0"/>
-                        </a:fillRef>
-                        <a:effectRef idx="0">
-                          <a:scrgbClr r="0" g="0" b="0"/>
-                        </a:effectRef>
-                        <a:fontRef idx="minor">
-                          <a:schemeClr val="dk1"/>
-                        </a:fontRef>
-                      </wps:style>
-                      <wps:bodyPr rot="0" spcFirstLastPara="0" vertOverflow="overflow" horzOverflow="overflow" vert="horz" wrap="square" lIns="91440" tIns="45720" rIns="91440" bIns="45720" numCol="1" spcCol="0" rtlCol="0" fromWordArt="0" anchor="ctr" anchorCtr="0" forceAA="0" compatLnSpc="1">
-                        <a:prstTxWarp prst="textNoShape">
-                          <a:avLst/>
-                        </a:prstTxWarp>
-                        <a:noAutofit/>
-                      </wps:bodyPr>
-                    </wps:wsp>
-                  </a:graphicData>
-                </a:graphic>
-                <wp14:sizeRelH relativeFrom="margin">
-                  <wp14:pctWidth>0</wp14:pctWidth>
-                </wp14:sizeRelH>
-                <wp14:sizeRelV relativeFrom="margin">
-                  <wp14:pctHeight>0</wp14:pctHeight>
-                </wp14:sizeRelV>
-              </wp:anchor>
-            </w:drawing>
-          </mc:Choice>
-          <mc:Fallback>
-            <w:pict>
-              <v:rect w14:anchorId="61ADDDEF" id="Retângulo 1" o:spid="_x0000_s1026" style="position:absolute;margin-left:-5pt;margin-top:8.65pt;width:502.8pt;height:243.75pt;z-index:251670528;visibility:visible;mso-wrap-style:square;mso-width-percent:0;mso-height-percent:0;mso-wrap-distance-left:9pt;mso-wrap-distance-top:0;mso-wrap-distance-right:9pt;mso-wrap-distance-bottom:0;mso-position-horizontal:absolute;mso-position-horizontal-relative:text;mso-position-vertical:absolute;mso-position-vertical-relative:text;mso-width-percent:0;mso-height-percent:0;mso-width-relative:margin;mso-height-relative:margin;v-text-anchor:middle" o:gfxdata="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" filled="f" strokecolor="black [3200]">
-                <v:stroke joinstyle="round"/>
-              </v:rect>
-            </w:pict>
-          </mc:Fallback>
-        </mc:AlternateContent>
-      </w:r>
-    </w:p>
-    <w:p>
-      <w:pPr>
-        <w:spacing w:after="0" w:line="240" w:lineRule="auto"/>
-        <w:rPr>
-          <w:rFonts w:asciiTheme="majorHAnsi" w:hAnsiTheme="majorHAnsi" w:cstheme="majorHAnsi"/>
-          <w:b/>
-          <w:bCs/>
-          <w:szCs w:val="20"/>
-          <w:lang w:val="pt-BR"/>
-        </w:rPr>
-      </w:pPr>
-    </w:p>
-    <w:p>
-      <w:pPr>
-        <w:spacing w:after="0" w:line="240" w:lineRule="auto"/>
-        <w:rPr>
-          <w:rFonts w:asciiTheme="majorHAnsi" w:hAnsiTheme="majorHAnsi" w:cstheme="majorHAnsi"/>
-          <w:b/>
-          <w:bCs/>
-          <w:szCs w:val="20"/>
-          <w:lang w:val="pt-BR"/>
-        </w:rPr>
-      </w:pPr>
-      <w:r>
-        <w:rPr>
-          <w:rFonts w:asciiTheme="majorHAnsi" w:hAnsiTheme="majorHAnsi" w:cstheme="majorHAnsi"/>
-          <w:b/>
-          <w:bCs/>
-          <w:szCs w:val="20"/>
-          <w:lang w:val="pt-BR"/>
-        </w:rPr>
-        <w:t xml:space="preserve">Data da Venda: {{Data da Venda}}                 Valor de Venda: {{Valor da Venda}} </w:t>
-      </w:r>
-    </w:p>
-    <w:p>
-      <w:pPr>
-        <w:spacing w:after="0" w:line="240" w:lineRule="auto"/>
-        <w:rPr>
-          <w:rFonts w:asciiTheme="majorHAnsi" w:hAnsiTheme="majorHAnsi" w:cstheme="majorHAnsi"/>
-          <w:b/>
-          <w:bCs/>
-          <w:szCs w:val="20"/>
-          <w:lang w:val="pt-BR"/>
-        </w:rPr>
-      </w:pPr>
-    </w:p>
-    <w:p>
-      <w:pPr>
-        <w:spacing w:after="0" w:line="240" w:lineRule="auto"/>
-        <w:rPr>
-          <w:rFonts w:asciiTheme="majorHAnsi" w:hAnsiTheme="majorHAnsi" w:cstheme="majorHAnsi"/>
-          <w:color w:val="auto"/>
-          <w:szCs w:val="20"/>
-          <w:lang w:val="pt-BR"/>
-        </w:rPr>
-      </w:pPr>
-      <w:r>
-        <w:rPr>
-          <w:rFonts w:asciiTheme="majorHAnsi" w:hAnsiTheme="majorHAnsi" w:cstheme="majorHAnsi"/>
-          <w:color w:val="auto"/>
-          <w:szCs w:val="20"/>
-          <w:lang w:val="pt-BR"/>
-        </w:rPr>
-        <w:t xml:space="preserve">Forma de Pagamento: {{Forma de Pagamento}}</w:t>
-      </w:r>
-    </w:p>
-    <w:p>
-      <w:pPr>
-        <w:spacing w:after="0" w:line="240" w:lineRule="auto"/>
-        <w:rPr>
-          <w:rFonts w:asciiTheme="majorHAnsi" w:hAnsiTheme="majorHAnsi" w:cstheme="majorHAnsi"/>
-          <w:b/>
-          <w:bCs/>
-          <w:color w:val="auto"/>
-          <w:szCs w:val="20"/>
-          <w:lang w:val="pt-BR"/>
-        </w:rPr>
-      </w:pPr>
-      <w:r>
-        <w:rPr>
-          <w:rFonts w:asciiTheme="majorHAnsi" w:hAnsiTheme="majorHAnsi" w:cstheme="majorHAnsi"/>
-          <w:b/>
-          <w:bCs/>
-          <w:color w:val="auto"/>
-          <w:szCs w:val="20"/>
-          <w:lang w:val="pt-BR"/>
-        </w:rPr>
-        <w:t xml:space="preserve">Entrada: {{Valor da Entrada Financiamento}}</w:t>
-      </w:r>
-    </w:p>
-    <w:p>
-      <w:pPr>
-        <w:spacing w:after="0" w:line="240" w:lineRule="auto"/>
-        <w:rPr>
-          <w:rFonts w:asciiTheme="majorHAnsi" w:hAnsiTheme="majorHAnsi" w:cstheme="majorHAnsi"/>
-          <w:b/>
-          <w:bCs/>
-          <w:color w:val="auto"/>
-          <w:szCs w:val="20"/>
-          <w:lang w:val="pt-BR"/>
-        </w:rPr>
-      </w:pPr>
-      <w:r>
-        <w:rPr>
-          <w:rFonts w:asciiTheme="majorHAnsi" w:hAnsiTheme="majorHAnsi" w:cstheme="majorHAnsi"/>
-          <w:b/>
-          <w:bCs/>
-          <w:color w:val="auto"/>
-          <w:szCs w:val="20"/>
-          <w:lang w:val="pt-BR"/>
-        </w:rPr>
-        <w:t xml:space="preserve">Financeira: {{Financeira}}                          Data do Financiamento: {{Data do Financiamento}}</w:t>
-      </w:r>
-    </w:p>
-    <w:p>
-      <w:pPr>
-        <w:spacing w:after="0" w:line="240" w:lineRule="auto"/>
-        <w:rPr>
-          <w:rFonts w:asciiTheme="majorHAnsi" w:hAnsiTheme="majorHAnsi" w:cstheme="majorHAnsi"/>
-          <w:b/>
-          <w:bCs/>
-          <w:color w:val="auto"/>
-          <w:szCs w:val="20"/>
-          <w:lang w:val="pt-BR"/>
-        </w:rPr>
-      </w:pPr>
-      <w:r>
-        <w:rPr>
-          <w:rFonts w:asciiTheme="majorHAnsi" w:hAnsiTheme="majorHAnsi" w:cstheme="majorHAnsi"/>
-          <w:b/>
-          <w:bCs/>
-          <w:color w:val="auto"/>
-          <w:szCs w:val="20"/>
-          <w:lang w:val="pt-BR"/>
-        </w:rPr>
-        <w:t xml:space="preserve">Valor Financiado: {{Valor Financiado}}   Nº de Parcelas: {{N° de Parcelas}}   Valor das Parcelas: {{Valor das Parcelas}}</w:t>
-      </w:r>
-    </w:p>
-    <w:p>
-      <w:pPr>
-        <w:spacing w:after="0" w:line="240" w:lineRule="auto"/>
-        <w:rPr>
-          <w:rFonts w:asciiTheme="majorHAnsi" w:hAnsiTheme="majorHAnsi" w:cstheme="majorHAnsi"/>
-          <w:b/>
-          <w:bCs/>
-          <w:color w:val="auto"/>
-          <w:szCs w:val="20"/>
-          <w:lang w:val="pt-BR"/>
-        </w:rPr>
-      </w:pPr>
-    </w:p>
-    <w:p>
-      <w:pPr>
-        <w:spacing w:after="0" w:line="240" w:lineRule="auto"/>
-        <w:rPr>
-          <w:rFonts w:asciiTheme="majorHAnsi" w:hAnsiTheme="majorHAnsi" w:cstheme="majorHAnsi"/>
-          <w:b/>
-          <w:bCs/>
-          <w:color w:val="auto"/>
-          <w:szCs w:val="20"/>
-          <w:lang w:val="pt-BR"/>
-        </w:rPr>
-      </w:pPr>
-      <w:r>
-        <w:rPr>
-          <w:rFonts w:asciiTheme="majorHAnsi" w:hAnsiTheme="majorHAnsi" w:cstheme="majorHAnsi"/>
-          <w:b/>
-          <w:bCs/>
-          <w:color w:val="auto"/>
-          <w:szCs w:val="20"/>
-          <w:lang w:val="pt-BR"/>
-        </w:rPr>
-        <w:t xml:space="preserve">Veiculo na Troca: {{Veículo na Troca}}</w:t>
-      </w:r>
-    </w:p>
-    <w:p>
-      <w:pPr>
-        <w:spacing w:after="0" w:line="240" w:lineRule="auto"/>
-        <w:rPr>
-          <w:rFonts w:asciiTheme="majorHAnsi" w:hAnsiTheme="majorHAnsi" w:cstheme="majorHAnsi"/>
-          <w:lang w:val="pt-BR"/>
-        </w:rPr>
-      </w:pPr>
-      <w:r>
-        <w:rPr>
-          <w:rFonts w:asciiTheme="majorHAnsi" w:hAnsiTheme="majorHAnsi" w:cstheme="majorHAnsi"/>
-          <w:lang w:val="pt-BR"/>
-        </w:rPr>
-        <w:t xml:space="preserve">Marca: {{Marca Troca}}</w:t>
-      </w:r>
-    </w:p>
-    <w:p>
-      <w:pPr>
-        <w:spacing w:after="0" w:line="240" w:lineRule="auto"/>
-        <w:rPr>
-          <w:rFonts w:asciiTheme="majorHAnsi" w:hAnsiTheme="majorHAnsi" w:cstheme="majorHAnsi"/>
-          <w:lang w:val="pt-BR"/>
-        </w:rPr>
-      </w:pPr>
-      <w:r>
-        <w:rPr>
-          <w:rFonts w:asciiTheme="majorHAnsi" w:hAnsiTheme="majorHAnsi" w:cstheme="majorHAnsi"/>
-          <w:lang w:val="pt-BR"/>
-        </w:rPr>
-        <w:t xml:space="preserve">Modelo: {{Modelo Troca}}             Versão: {{Versão Troca}}</w:t>
-      </w:r>
-    </w:p>
-    <w:p>
-      <w:pPr>
-        <w:spacing w:after="0" w:line="240" w:lineRule="auto"/>
-        <w:rPr>
-          <w:rFonts w:asciiTheme="majorHAnsi" w:hAnsiTheme="majorHAnsi" w:cstheme="majorHAnsi"/>
-          <w:lang w:val="pt-BR"/>
-        </w:rPr>
-      </w:pPr>
-      <w:r>
-        <w:rPr>
-          <w:rFonts w:asciiTheme="majorHAnsi" w:hAnsiTheme="majorHAnsi" w:cstheme="majorHAnsi"/>
-          <w:lang w:val="pt-BR"/>
-        </w:rPr>
-        <w:t xml:space="preserve">Ano Fabricação: {{Ano Troca}}      Cor: {{Cor Troca}}</w:t>
-      </w:r>
-    </w:p>
-    <w:p>
-      <w:pPr>
-        <w:spacing w:after="0" w:line="240" w:lineRule="auto"/>
-        <w:rPr>
-          <w:rFonts w:asciiTheme="majorHAnsi" w:hAnsiTheme="majorHAnsi" w:cstheme="majorHAnsi"/>
-          <w:lang w:val="pt-BR"/>
-        </w:rPr>
-      </w:pPr>
-      <w:r>
-        <w:rPr>
-          <w:rFonts w:asciiTheme="majorHAnsi" w:hAnsiTheme="majorHAnsi" w:cstheme="majorHAnsi"/>
-          <w:lang w:val="pt-BR"/>
-        </w:rPr>
-        <w:t xml:space="preserve">Placa: {{Placa Troca}}                      Renavan: {{Renavam Troca}} </w:t>
-      </w:r>
-    </w:p>
-    <w:p>
-      <w:pPr>
-        <w:spacing w:after="0" w:line="240" w:lineRule="auto"/>
-        <w:rPr>
-          <w:rFonts w:asciiTheme="majorHAnsi" w:hAnsiTheme="majorHAnsi" w:cstheme="majorHAnsi"/>
-          <w:lang w:val="pt-BR"/>
-        </w:rPr>
-      </w:pPr>
-      <w:r>
-        <w:rPr>
-          <w:rFonts w:asciiTheme="majorHAnsi" w:hAnsiTheme="majorHAnsi" w:cstheme="majorHAnsi"/>
-          <w:lang w:val="pt-BR"/>
-        </w:rPr>
-        <w:t xml:space="preserve">Combustível: {{Combustível Troca}}                                                     Km Atual: {{KM Troca}}</w:t>
-      </w:r>
-    </w:p>
-    <w:p>
-      <w:pPr>
-        <w:spacing w:after="0" w:line="240" w:lineRule="auto"/>
-        <w:rPr>
-          <w:rFonts w:asciiTheme="majorHAnsi" w:hAnsiTheme="majorHAnsi" w:cstheme="majorHAnsi"/>
-          <w:lang w:val="pt-BR"/>
-        </w:rPr>
-      </w:pPr>
-      <w:r>
-        <w:rPr>
-          <w:rFonts w:asciiTheme="majorHAnsi" w:hAnsiTheme="majorHAnsi" w:cstheme="majorHAnsi"/>
-          <w:lang w:val="pt-BR"/>
-        </w:rPr>
-        <w:t xml:space="preserve">Valor da Compra: {{Valor da Compra}}</w:t>
-      </w:r>
-    </w:p>
-    <w:p>
-      <w:pPr>
-        <w:spacing w:after="0" w:line="240" w:lineRule="auto"/>
-        <w:rPr>
-          <w:rFonts w:asciiTheme="majorHAnsi" w:hAnsiTheme="majorHAnsi" w:cstheme="majorHAnsi"/>
-          <w:lang w:val="pt-BR"/>
-        </w:rPr>
-      </w:pPr>
-      <w:r>
-        <w:rPr>
-          <w:rFonts w:asciiTheme="majorHAnsi" w:hAnsiTheme="majorHAnsi" w:cstheme="majorHAnsi"/>
-          <w:lang w:val="pt-BR"/>
-        </w:rPr>
-        <w:t xml:space="preserve">Débitos: {{Débitos}}</w:t>
-      </w:r>
-    </w:p>
-    <w:p>
-      <w:pPr>
-        <w:spacing w:after="0" w:line="240" w:lineRule="auto"/>
-        <w:rPr>
-          <w:rFonts w:asciiTheme="majorHAnsi" w:hAnsiTheme="majorHAnsi" w:cstheme="majorHAnsi"/>
-          <w:lang w:val="pt-BR"/>
-        </w:rPr>
-      </w:pPr>
-      <w:r>
-        <w:rPr>
-          <w:rFonts w:asciiTheme="majorHAnsi" w:hAnsiTheme="majorHAnsi" w:cstheme="majorHAnsi"/>
-          <w:lang w:val="pt-BR"/>
-        </w:rPr>
-        <w:t xml:space="preserve">Detalhe dos débitos: {{Observação sobre Débitos}}</w:t>
-      </w:r>
-    </w:p>
-    <w:p>
-      <w:pPr>
-        <w:spacing w:after="0" w:line="240" w:lineRule="auto"/>
-        <w:rPr>
-          <w:rFonts w:asciiTheme="majorHAnsi" w:hAnsiTheme="majorHAnsi" w:cstheme="majorHAnsi"/>
-          <w:lang w:val="pt-BR"/>
-        </w:rPr>
-      </w:pPr>
-      <w:r>
-        <w:rPr>
-          <w:rFonts w:asciiTheme="majorHAnsi" w:hAnsiTheme="majorHAnsi" w:cstheme="majorHAnsi"/>
-          <w:lang w:val="pt-BR"/>
-        </w:rPr>
-        <w:t xml:space="preserve">Valor de Entrada (Valor da Compra – Débitos): {{Valor da Entrada Veículo Troca}}</w:t>
-      </w:r>
-    </w:p>
-    <w:p>
-      <w:pPr>
-        <w:spacing w:after="0" w:line="240" w:lineRule="auto"/>
-        <w:rPr>
-          <w:rFonts w:asciiTheme="majorHAnsi" w:hAnsiTheme="majorHAnsi" w:cstheme="majorHAnsi"/>
-          <w:lang w:val="pt-BR"/>
-        </w:rPr>
-      </w:pPr>
-    </w:p>
-    <w:p>
-      <w:pPr>
-        <w:spacing w:after="0" w:line="240" w:lineRule="auto"/>
-        <w:rPr>
-          <w:rFonts w:asciiTheme="majorHAnsi" w:hAnsiTheme="majorHAnsi" w:cstheme="majorHAnsi"/>
-          <w:lang w:val="pt-BR"/>
-        </w:rPr>
-      </w:pPr>
-    </w:p>
-    <w:p>
-      <w:pPr>
-        <w:spacing w:after="0" w:line="240" w:lineRule="auto"/>
-        <w:rPr>
-          <w:rFonts w:asciiTheme="majorHAnsi" w:hAnsiTheme="majorHAnsi" w:cstheme="majorHAnsi"/>
-          <w:lang w:val="pt-BR"/>
-        </w:rPr>
-      </w:pPr>
-      <w:r>
-        <w:rPr>
-          <w:noProof/>
-          <w:color w:val="555555"/>
-          <w:sz w:val="18"/>
-          <w:szCs w:val="18"/>
-          <w:lang w:val="pt-BR"/>
-        </w:rPr>
-        <mc:AlternateContent>
-          <mc:Choice Requires="wps">
-            <w:drawing>
-              <wp:anchor distT="0" distB="0" distL="114300" distR="114300" simplePos="0" relativeHeight="251674624" behindDoc="0" locked="0" layoutInCell="1" allowOverlap="1" wp14:anchorId="145F6907" wp14:editId="28043652">
-                <wp:simplePos x="0" y="0"/>
-                <wp:positionH relativeFrom="column">
-                  <wp:posOffset>73152</wp:posOffset>
-                </wp:positionH>
-                <wp:positionV relativeFrom="paragraph">
-                  <wp:posOffset>50317</wp:posOffset>
-                </wp:positionV>
-                <wp:extent cx="1250899" cy="248285"/>
-                <wp:effectExtent l="0" t="0" r="6985" b="0"/>
-                <wp:wrapNone/>
-                <wp:docPr id="903896546" name="Caixa de Texto 3"/>
-                <wp:cNvGraphicFramePr/>
-                <a:graphic xmlns:a="http://schemas.openxmlformats.org/drawingml/2006/main">
-                  <a:graphicData uri="http://schemas.microsoft.com/office/word/2010/wordprocessingShape">
-                    <wps:wsp>
-                      <wps:cNvSpPr txBox="1"/>
-                      <wps:spPr>
-                        <a:xfrm>
-                          <a:off x="0" y="0"/>
-                          <a:ext cx="1250899" cy="248285"/>
-                        </a:xfrm>
-                        <a:prstGeom prst="rect">
-                          <a:avLst/>
-                        </a:prstGeom>
-                        <a:solidFill>
-                          <a:schemeClr val="lt1"/>
-                        </a:solidFill>
-                        <a:ln w="6350">
-                          <a:noFill/>
-                        </a:ln>
-                      </wps:spPr>
-                      <wps:txbx>
-                        <w:txbxContent>
-                          <w:p>
-                            <w:pPr>
-                              <w:rPr>
-                                <w:b/>
-                                <w:bCs/>
-                                <w:color w:val="808080" w:themeColor="background1" w:themeShade="80"/>
-                                <w:lang w:val="pt-BR"/>
-                              </w:rPr>
-                            </w:pPr>
-                            <w:r>
-                              <w:rPr>
-                                <w:b/>
-                                <w:bCs/>
-                                <w:color w:val="808080" w:themeColor="background1" w:themeShade="80"/>
-                                <w:lang w:val="pt-BR"/>
-                              </w:rPr>
-                              <w:t>Documentação</w:t>
-                            </w:r>
-                          </w:p>
-                        </w:txbxContent>
-                      </wps:txbx>
-                      <wps:bodyPr rot="0" spcFirstLastPara="0" vertOverflow="overflow" horzOverflow="overflow" vert="horz" wrap="square" lIns="91440" tIns="45720" rIns="91440" bIns="45720" numCol="1" spcCol="0" rtlCol="0" fromWordArt="0" anchor="t" anchorCtr="0" forceAA="0" compatLnSpc="1">
-                        <a:prstTxWarp prst="textNoShape">
-                          <a:avLst/>
-                        </a:prstTxWarp>
-                        <a:noAutofit/>
-                      </wps:bodyPr>
-                    </wps:wsp>
-                  </a:graphicData>
-                </a:graphic>
-                <wp14:sizeRelH relativeFrom="margin">
-                  <wp14:pctWidth>0</wp14:pctWidth>
-                </wp14:sizeRelH>
-                <wp14:sizeRelV relativeFrom="margin">
-                  <wp14:pctHeight>0</wp14:pctHeight>
-                </wp14:sizeRelV>
-              </wp:anchor>
-            </w:drawing>
-          </mc:Choice>
-          <mc:Fallback>
-            <w:pict>
-              <v:shape w14:anchorId="145F6907" id="_x0000_s1030" type="#_x0000_t202" style="position:absolute;margin-left:5.75pt;margin-top:3.95pt;width:98.5pt;height:19.55pt;z-index:251674624;visibility:visible;mso-wrap-style:square;mso-width-percent:0;mso-height-percent:0;mso-wrap-distance-left:9pt;mso-wrap-distance-top:0;mso-wrap-distance-right:9pt;mso-wrap-distance-bottom:0;mso-position-horizontal:absolute;mso-position-horizontal-relative:text;mso-position-vertical:absolute;mso-position-vertical-relative:text;mso-width-percent:0;mso-height-percent:0;mso-width-relative:margin;mso-height-relative:margin;v-text-anchor:top" o:gfxdata="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" fillcolor="white [3201]" stroked="f" strokeweight=".5pt">
-                <v:textbox>
-                  <w:txbxContent>
-                    <w:p>
-                      <w:pPr>
-                        <w:rPr>
-                          <w:b/>
-                          <w:bCs/>
-                          <w:color w:val="808080" w:themeColor="background1" w:themeShade="80"/>
-                          <w:lang w:val="pt-BR"/>
-                        </w:rPr>
-                      </w:pPr>
-                      <w:r>
-                        <w:rPr>
-                          <w:b/>
-                          <w:bCs/>
-                          <w:color w:val="808080" w:themeColor="background1" w:themeShade="80"/>
-                          <w:lang w:val="pt-BR"/>
-                        </w:rPr>
-                        <w:t>Documentação</w:t>
-                      </w:r>
-                    </w:p>
-                  </w:txbxContent>
-                </v:textbox>
-              </v:shape>
-            </w:pict>
-          </mc:Fallback>
-        </mc:AlternateContent>
-      </w:r>
-      <w:r>
-        <w:rPr>
-          <w:rFonts w:asciiTheme="majorHAnsi" w:hAnsiTheme="majorHAnsi" w:cstheme="majorHAnsi"/>
-          <w:noProof/>
-          <w:lang w:val="pt-BR"/>
-        </w:rPr>
-        <mc:AlternateContent>
-          <mc:Choice Requires="wps">
-            <w:drawing>
-              <wp:anchor distT="0" distB="0" distL="114300" distR="114300" simplePos="0" relativeHeight="251672576" behindDoc="0" locked="0" layoutInCell="1" allowOverlap="1" wp14:anchorId="22FA0A02" wp14:editId="3A2326B8">
-                <wp:simplePos x="0" y="0"/>
-                <wp:positionH relativeFrom="column">
-                  <wp:posOffset>-58522</wp:posOffset>
-                </wp:positionH>
-                <wp:positionV relativeFrom="paragraph">
-                  <wp:posOffset>174677</wp:posOffset>
-                </wp:positionV>
-                <wp:extent cx="6379210" cy="438912"/>
-                <wp:effectExtent l="0" t="0" r="21590" b="18415"/>
-                <wp:wrapNone/>
-                <wp:docPr id="831407363" name="Retângulo 5"/>
-                <wp:cNvGraphicFramePr/>
-                <a:graphic xmlns:a="http://schemas.openxmlformats.org/drawingml/2006/main">
-                  <a:graphicData uri="http://schemas.microsoft.com/office/word/2010/wordprocessingShape">
-                    <wps:wsp>
-                      <wps:cNvSpPr/>
-                      <wps:spPr>
-                        <a:xfrm>
-                          <a:off x="0" y="0"/>
-                          <a:ext cx="6379210" cy="438912"/>
-                        </a:xfrm>
-                        <a:prstGeom prst="rect">
-                          <a:avLst/>
-                        </a:prstGeom>
-                        <a:noFill/>
-                        <a:ln w="9525" cap="flat" cmpd="sng" algn="ctr">
-                          <a:solidFill>
-                            <a:schemeClr val="dk1"/>
-                          </a:solidFill>
-                          <a:prstDash val="solid"/>
-                          <a:round/>
-                          <a:headEnd type="none" w="med" len="med"/>
-                          <a:tailEnd type="none" w="med" len="med"/>
-                        </a:ln>
-                      </wps:spPr>
-                      <wps:style>
-                        <a:lnRef idx="0">
-                          <a:scrgbClr r="0" g="0" b="0"/>
-                        </a:lnRef>
-                        <a:fillRef idx="0">
-                          <a:scrgbClr r="0" g="0" b="0"/>
-                        </a:fillRef>
-                        <a:effectRef idx="0">
-                          <a:scrgbClr r="0" g="0" b="0"/>
-                        </a:effectRef>
-                        <a:fontRef idx="minor">
-                          <a:schemeClr val="dk1"/>
-                        </a:fontRef>
-                      </wps:style>
-                      <wps:bodyPr rot="0" spcFirstLastPara="0" vertOverflow="overflow" horzOverflow="overflow" vert="horz" wrap="square" lIns="91440" tIns="45720" rIns="91440" bIns="45720" numCol="1" spcCol="0" rtlCol="0" fromWordArt="0" anchor="ctr" anchorCtr="0" forceAA="0" compatLnSpc="1">
-                        <a:prstTxWarp prst="textNoShape">
-                          <a:avLst/>
-                        </a:prstTxWarp>
-                        <a:noAutofit/>
-                      </wps:bodyPr>
-                    </wps:wsp>
-                  </a:graphicData>
-                </a:graphic>
-                <wp14:sizeRelH relativeFrom="margin">
-                  <wp14:pctWidth>0</wp14:pctWidth>
-                </wp14:sizeRelH>
-                <wp14:sizeRelV relativeFrom="margin">
-                  <wp14:pctHeight>0</wp14:pctHeight>
-                </wp14:sizeRelV>
-              </wp:anchor>
-            </w:drawing>
-          </mc:Choice>
-          <mc:Fallback>
-            <w:pict>
-              <v:rect w14:anchorId="50609028" id="Retângulo 5" o:spid="_x0000_s1026" style="position:absolute;margin-left:-4.6pt;margin-top:13.75pt;width:502.3pt;height:34.55pt;z-index:251672576;visibility:visible;mso-wrap-style:square;mso-width-percent:0;mso-height-percent:0;mso-wrap-distance-left:9pt;mso-wrap-distance-top:0;mso-wrap-distance-right:9pt;mso-wrap-distance-bottom:0;mso-position-horizontal:absolute;mso-position-horizontal-relative:text;mso-position-vertical:absolute;mso-position-vertical-relative:text;mso-width-percent:0;mso-height-percent:0;mso-width-relative:margin;mso-height-relative:margin;v-text-anchor:middle" o:gfxdata="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" filled="f" strokecolor="black [3200]">
-                <v:stroke joinstyle="round"/>
-              </v:rect>
-            </w:pict>
-          </mc:Fallback>
-        </mc:AlternateContent>
-      </w:r>
-    </w:p>
-    <w:p>
-      <w:pPr>
-        <w:spacing w:after="0" w:line="240" w:lineRule="auto"/>
-        <w:rPr>
-          <w:rFonts w:asciiTheme="majorHAnsi" w:hAnsiTheme="majorHAnsi" w:cstheme="majorHAnsi"/>
-          <w:lang w:val="pt-BR"/>
-        </w:rPr>
-      </w:pPr>
-    </w:p>
-    <w:p>
-      <w:pPr>
-        <w:spacing w:after="0" w:line="240" w:lineRule="auto"/>
-        <w:rPr>
-          <w:rFonts w:asciiTheme="majorHAnsi" w:hAnsiTheme="majorHAnsi" w:cstheme="majorHAnsi"/>
-          <w:color w:val="auto"/>
-          <w:lang w:val="pt-BR"/>
-        </w:rPr>
-      </w:pPr>
-      <w:r>
-        <w:rPr>
-          <w:rFonts w:asciiTheme="majorHAnsi" w:hAnsiTheme="majorHAnsi" w:cstheme="majorHAnsi"/>
-          <w:color w:val="auto"/>
-          <w:lang w:val="pt-BR"/>
-        </w:rPr>
-        <w:t xml:space="preserve">{{Documentação Veículo}}</w:t>
-      </w:r>
-    </w:p>
-    <w:p>
-      <w:pPr>
-        <w:spacing w:after="0" w:line="240" w:lineRule="auto"/>
-        <w:rPr>
-          <w:rFonts w:asciiTheme="majorHAnsi" w:hAnsiTheme="majorHAnsi" w:cstheme="majorHAnsi"/>
-          <w:lang w:val="pt-BR"/>
-        </w:rPr>
-      </w:pPr>
-      <w:r>
-        <w:rPr>
-          <w:noProof/>
-          <w:color w:val="555555"/>
-          <w:sz w:val="18"/>
-          <w:szCs w:val="18"/>
-          <w:lang w:val="pt-BR"/>
-        </w:rPr>
-        <w:lastRenderedPageBreak/>
-        <mc:AlternateContent>
-          <mc:Choice Requires="wps">
-            <w:drawing>
-              <wp:anchor distT="0" distB="0" distL="114300" distR="114300" simplePos="0" relativeHeight="251680768" behindDoc="0" locked="0" layoutInCell="1" allowOverlap="1" wp14:anchorId="2EA83F9D" wp14:editId="1879DC18">
-                <wp:simplePos x="0" y="0"/>
-                <wp:positionH relativeFrom="column">
-                  <wp:posOffset>131674</wp:posOffset>
-                </wp:positionH>
-                <wp:positionV relativeFrom="paragraph">
-                  <wp:posOffset>-131674</wp:posOffset>
-                </wp:positionV>
-                <wp:extent cx="1543507" cy="248285"/>
-                <wp:effectExtent l="0" t="0" r="0" b="0"/>
-                <wp:wrapNone/>
-                <wp:docPr id="61563809" name="Caixa de Texto 3"/>
-                <wp:cNvGraphicFramePr/>
-                <a:graphic xmlns:a="http://schemas.openxmlformats.org/drawingml/2006/main">
-                  <a:graphicData uri="http://schemas.microsoft.com/office/word/2010/wordprocessingShape">
-                    <wps:wsp>
-                      <wps:cNvSpPr txBox="1"/>
-                      <wps:spPr>
-                        <a:xfrm>
-                          <a:off x="0" y="0"/>
-                          <a:ext cx="1543507" cy="248285"/>
-                        </a:xfrm>
-                        <a:prstGeom prst="rect">
-                          <a:avLst/>
-                        </a:prstGeom>
-                        <a:solidFill>
-                          <a:schemeClr val="lt1"/>
-                        </a:solidFill>
-                        <a:ln w="6350">
-                          <a:noFill/>
-                        </a:ln>
-                      </wps:spPr>
-                      <wps:txbx>
-                        <w:txbxContent>
-                          <w:p>
-                            <w:pPr>
-                              <w:rPr>
-                                <w:b/>
-                                <w:bCs/>
-                                <w:color w:val="808080" w:themeColor="background1" w:themeShade="80"/>
-                                <w:lang w:val="pt-BR"/>
-                              </w:rPr>
-                            </w:pPr>
-                            <w:r>
-                              <w:rPr>
-                                <w:b/>
-                                <w:bCs/>
-                                <w:color w:val="808080" w:themeColor="background1" w:themeShade="80"/>
-                                <w:lang w:val="pt-BR"/>
-                              </w:rPr>
-                              <w:t xml:space="preserve">Retirada do </w:t>
-                            </w:r>
-                            <w:r>
-                              <w:rPr>
-                                <w:b/>
-                                <w:bCs/>
-                                <w:color w:val="808080" w:themeColor="background1" w:themeShade="80"/>
-                                <w:lang w:val="pt-BR"/>
-                              </w:rPr>
-                              <w:t>Veículo</w:t>
-                            </w:r>
-                          </w:p>
-                        </w:txbxContent>
-                      </wps:txbx>
-                      <wps:bodyPr rot="0" spcFirstLastPara="0" vertOverflow="overflow" horzOverflow="overflow" vert="horz" wrap="square" lIns="91440" tIns="45720" rIns="91440" bIns="45720" numCol="1" spcCol="0" rtlCol="0" fromWordArt="0" anchor="t" anchorCtr="0" forceAA="0" compatLnSpc="1">
-                        <a:prstTxWarp prst="textNoShape">
-                          <a:avLst/>
-                        </a:prstTxWarp>
-                        <a:noAutofit/>
-                      </wps:bodyPr>
-                    </wps:wsp>
-                  </a:graphicData>
-                </a:graphic>
-                <wp14:sizeRelH relativeFrom="margin">
-                  <wp14:pctWidth>0</wp14:pctWidth>
-                </wp14:sizeRelH>
-                <wp14:sizeRelV relativeFrom="margin">
-                  <wp14:pctHeight>0</wp14:pctHeight>
-                </wp14:sizeRelV>
-              </wp:anchor>
-            </w:drawing>
-          </mc:Choice>
-          <mc:Fallback>
-            <w:pict>
-              <v:shape w14:anchorId="2EA83F9D" id="_x0000_s1031" type="#_x0000_t202" style="position:absolute;margin-left:10.35pt;margin-top:-10.35pt;width:121.55pt;height:19.55pt;z-index:251680768;visibility:visible;mso-wrap-style:square;mso-width-percent:0;mso-height-percent:0;mso-wrap-distance-left:9pt;mso-wrap-distance-top:0;mso-wrap-distance-right:9pt;mso-wrap-distance-bottom:0;mso-position-horizontal:absolute;mso-position-horizontal-relative:text;mso-position-vertical:absolute;mso-position-vertical-relative:text;mso-width-percent:0;mso-height-percent:0;mso-width-relative:margin;mso-height-relative:margin;v-text-anchor:top" o:gfxdata="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" fillcolor="white [3201]" stroked="f" strokeweight=".5pt">
-                <v:textbox>
-                  <w:txbxContent>
-                    <w:p>
-                      <w:pPr>
-                        <w:rPr>
-                          <w:b/>
-                          <w:bCs/>
-                          <w:color w:val="808080" w:themeColor="background1" w:themeShade="80"/>
-                          <w:lang w:val="pt-BR"/>
-                        </w:rPr>
-                      </w:pPr>
-                      <w:r>
-                        <w:rPr>
-                          <w:b/>
-                          <w:bCs/>
-                          <w:color w:val="808080" w:themeColor="background1" w:themeShade="80"/>
-                          <w:lang w:val="pt-BR"/>
-                        </w:rPr>
-                        <w:t xml:space="preserve">Retirada do </w:t>
-                      </w:r>
-                      <w:r>
-                        <w:rPr>
-                          <w:b/>
-                          <w:bCs/>
-                          <w:color w:val="808080" w:themeColor="background1" w:themeShade="80"/>
-                          <w:lang w:val="pt-BR"/>
-                        </w:rPr>
-                        <w:t>Veículo</w:t>
-                      </w:r>
-                    </w:p>
-                  </w:txbxContent>
-                </v:textbox>
-              </v:shape>
-            </w:pict>
-          </mc:Fallback>
-        </mc:AlternateContent>
-      </w:r>
-      <w:r>
-        <w:rPr>
-          <w:rFonts w:asciiTheme="majorHAnsi" w:hAnsiTheme="majorHAnsi" w:cstheme="majorHAnsi"/>
-          <w:noProof/>
-          <w:lang w:val="pt-BR"/>
-        </w:rPr>
-        <mc:AlternateContent>
-          <mc:Choice Requires="wps">
-            <w:drawing>
-              <wp:anchor distT="0" distB="0" distL="114300" distR="114300" simplePos="0" relativeHeight="251679744" behindDoc="0" locked="0" layoutInCell="1" allowOverlap="1" wp14:anchorId="74EAEBD4" wp14:editId="248F0758">
-                <wp:simplePos x="0" y="0"/>
-                <wp:positionH relativeFrom="column">
-                  <wp:posOffset>0</wp:posOffset>
-                </wp:positionH>
-                <wp:positionV relativeFrom="paragraph">
-                  <wp:posOffset>-6985</wp:posOffset>
-                </wp:positionV>
-                <wp:extent cx="6379210" cy="438785"/>
-                <wp:effectExtent l="0" t="0" r="21590" b="18415"/>
-                <wp:wrapNone/>
-                <wp:docPr id="251581415" name="Retângulo 5"/>
-                <wp:cNvGraphicFramePr/>
-                <a:graphic xmlns:a="http://schemas.openxmlformats.org/drawingml/2006/main">
-                  <a:graphicData uri="http://schemas.microsoft.com/office/word/2010/wordprocessingShape">
-                    <wps:wsp>
-                      <wps:cNvSpPr/>
-                      <wps:spPr>
-                        <a:xfrm>
-                          <a:off x="0" y="0"/>
-                          <a:ext cx="6379210" cy="438785"/>
-                        </a:xfrm>
-                        <a:prstGeom prst="rect">
-                          <a:avLst/>
-                        </a:prstGeom>
-                        <a:noFill/>
-                        <a:ln w="9525" cap="flat" cmpd="sng" algn="ctr">
-                          <a:solidFill>
-                            <a:schemeClr val="dk1"/>
-                          </a:solidFill>
-                          <a:prstDash val="solid"/>
-                          <a:round/>
-                          <a:headEnd type="none" w="med" len="med"/>
-                          <a:tailEnd type="none" w="med" len="med"/>
-                        </a:ln>
-                      </wps:spPr>
-                      <wps:style>
-                        <a:lnRef idx="0">
-                          <a:scrgbClr r="0" g="0" b="0"/>
-                        </a:lnRef>
-                        <a:fillRef idx="0">
-                          <a:scrgbClr r="0" g="0" b="0"/>
-                        </a:fillRef>
-                        <a:effectRef idx="0">
-                          <a:scrgbClr r="0" g="0" b="0"/>
-                        </a:effectRef>
-                        <a:fontRef idx="minor">
-                          <a:schemeClr val="dk1"/>
-                        </a:fontRef>
-                      </wps:style>
-                      <wps:bodyPr rot="0" spcFirstLastPara="0" vertOverflow="overflow" horzOverflow="overflow" vert="horz" wrap="square" lIns="91440" tIns="45720" rIns="91440" bIns="45720" numCol="1" spcCol="0" rtlCol="0" fromWordArt="0" anchor="ctr" anchorCtr="0" forceAA="0" compatLnSpc="1">
-                        <a:prstTxWarp prst="textNoShape">
-                          <a:avLst/>
-                        </a:prstTxWarp>
-                        <a:noAutofit/>
-                      </wps:bodyPr>
-                    </wps:wsp>
-                  </a:graphicData>
-                </a:graphic>
-                <wp14:sizeRelH relativeFrom="margin">
-                  <wp14:pctWidth>0</wp14:pctWidth>
-                </wp14:sizeRelH>
-                <wp14:sizeRelV relativeFrom="margin">
-                  <wp14:pctHeight>0</wp14:pctHeight>
-                </wp14:sizeRelV>
-              </wp:anchor>
-            </w:drawing>
-          </mc:Choice>
-          <mc:Fallback>
-            <w:pict>
-              <v:rect w14:anchorId="490DDC60" id="Retângulo 5" o:spid="_x0000_s1026" style="position:absolute;margin-left:0;margin-top:-.55pt;width:502.3pt;height:34.55pt;z-index:251679744;visibility:visible;mso-wrap-style:square;mso-width-percent:0;mso-height-percent:0;mso-wrap-distance-left:9pt;mso-wrap-distance-top:0;mso-wrap-distance-right:9pt;mso-wrap-distance-bottom:0;mso-position-horizontal:absolute;mso-position-horizontal-relative:text;mso-position-vertical:absolute;mso-position-vertical-relative:text;mso-width-percent:0;mso-height-percent:0;mso-width-relative:margin;mso-height-relative:margin;v-text-anchor:middle" o:gfxdata="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" filled="f" strokecolor="black [3200]">
-                <v:stroke joinstyle="round"/>
-              </v:rect>
-            </w:pict>
-          </mc:Fallback>
-        </mc:AlternateContent>
-      </w:r>
-      <w:r>
-        <w:rPr>
-          <w:rFonts w:asciiTheme="majorHAnsi" w:hAnsiTheme="majorHAnsi" w:cstheme="majorHAnsi"/>
-          <w:noProof/>
-          <w:lang w:val="pt-BR"/>
-        </w:rPr>
-        <mc:AlternateContent>
-          <mc:Choice Requires="wps">
-            <w:drawing>
-              <wp:anchor distT="0" distB="0" distL="114300" distR="114300" simplePos="0" relativeHeight="251676672" behindDoc="0" locked="0" layoutInCell="1" allowOverlap="1" wp14:anchorId="45FFBD53" wp14:editId="75B855EB">
-                <wp:simplePos x="0" y="0"/>
-                <wp:positionH relativeFrom="column">
-                  <wp:posOffset>58420</wp:posOffset>
-                </wp:positionH>
-                <wp:positionV relativeFrom="paragraph">
-                  <wp:posOffset>-8009992</wp:posOffset>
-                </wp:positionV>
-                <wp:extent cx="6379210" cy="438912"/>
-                <wp:effectExtent l="0" t="0" r="21590" b="18415"/>
-                <wp:wrapNone/>
-                <wp:docPr id="1169075387" name="Retângulo 5"/>
-                <wp:cNvGraphicFramePr/>
-                <a:graphic xmlns:a="http://schemas.openxmlformats.org/drawingml/2006/main">
-                  <a:graphicData uri="http://schemas.microsoft.com/office/word/2010/wordprocessingShape">
-                    <wps:wsp>
-                      <wps:cNvSpPr/>
-                      <wps:spPr>
-                        <a:xfrm>
-                          <a:off x="0" y="0"/>
-                          <a:ext cx="6379210" cy="438912"/>
-                        </a:xfrm>
-                        <a:prstGeom prst="rect">
-                          <a:avLst/>
-                        </a:prstGeom>
-                        <a:noFill/>
-                        <a:ln w="9525" cap="flat" cmpd="sng" algn="ctr">
-                          <a:solidFill>
-                            <a:schemeClr val="dk1"/>
-                          </a:solidFill>
-                          <a:prstDash val="solid"/>
-                          <a:round/>
-                          <a:headEnd type="none" w="med" len="med"/>
-                          <a:tailEnd type="none" w="med" len="med"/>
-                        </a:ln>
-                      </wps:spPr>
-                      <wps:style>
-                        <a:lnRef idx="0">
-                          <a:scrgbClr r="0" g="0" b="0"/>
-                        </a:lnRef>
-                        <a:fillRef idx="0">
-                          <a:scrgbClr r="0" g="0" b="0"/>
-                        </a:fillRef>
-                        <a:effectRef idx="0">
-                          <a:scrgbClr r="0" g="0" b="0"/>
-                        </a:effectRef>
-                        <a:fontRef idx="minor">
-                          <a:schemeClr val="dk1"/>
-                        </a:fontRef>
-                      </wps:style>
-                      <wps:bodyPr rot="0" spcFirstLastPara="0" vertOverflow="overflow" horzOverflow="overflow" vert="horz" wrap="square" lIns="91440" tIns="45720" rIns="91440" bIns="45720" numCol="1" spcCol="0" rtlCol="0" fromWordArt="0" anchor="ctr" anchorCtr="0" forceAA="0" compatLnSpc="1">
-                        <a:prstTxWarp prst="textNoShape">
-                          <a:avLst/>
-                        </a:prstTxWarp>
-                        <a:noAutofit/>
-                      </wps:bodyPr>
-                    </wps:wsp>
-                  </a:graphicData>
-                </a:graphic>
-                <wp14:sizeRelH relativeFrom="margin">
-                  <wp14:pctWidth>0</wp14:pctWidth>
-                </wp14:sizeRelH>
-                <wp14:sizeRelV relativeFrom="margin">
-                  <wp14:pctHeight>0</wp14:pctHeight>
-                </wp14:sizeRelV>
-              </wp:anchor>
-            </w:drawing>
-          </mc:Choice>
-          <mc:Fallback>
-            <w:pict>
-              <v:rect w14:anchorId="27A27FCF" id="Retângulo 5" o:spid="_x0000_s1026" style="position:absolute;margin-left:4.6pt;margin-top:-630.7pt;width:502.3pt;height:34.55pt;z-index:251676672;visibility:visible;mso-wrap-style:square;mso-width-percent:0;mso-height-percent:0;mso-wrap-distance-left:9pt;mso-wrap-distance-top:0;mso-wrap-distance-right:9pt;mso-wrap-distance-bottom:0;mso-position-horizontal:absolute;mso-position-horizontal-relative:text;mso-position-vertical:absolute;mso-position-vertical-relative:text;mso-width-percent:0;mso-height-percent:0;mso-width-relative:margin;mso-height-relative:margin;v-text-anchor:middle" o:gfxdata="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" filled="f" strokecolor="black [3200]">
-                <v:stroke joinstyle="round"/>
-              </v:rect>
-            </w:pict>
-          </mc:Fallback>
-        </mc:AlternateContent>
-      </w:r>
-      <w:r>
-        <w:rPr>
-          <w:noProof/>
-          <w:color w:val="555555"/>
-          <w:sz w:val="18"/>
-          <w:szCs w:val="18"/>
-          <w:lang w:val="pt-BR"/>
-        </w:rPr>
-        <mc:AlternateContent>
-          <mc:Choice Requires="wps">
-            <w:drawing>
-              <wp:anchor distT="0" distB="0" distL="114300" distR="114300" simplePos="0" relativeHeight="251677696" behindDoc="0" locked="0" layoutInCell="1" allowOverlap="1" wp14:anchorId="7D0B1ABE" wp14:editId="3BC50F5C">
-                <wp:simplePos x="0" y="0"/>
-                <wp:positionH relativeFrom="column">
-                  <wp:posOffset>190094</wp:posOffset>
-                </wp:positionH>
-                <wp:positionV relativeFrom="paragraph">
-                  <wp:posOffset>-8134350</wp:posOffset>
-                </wp:positionV>
-                <wp:extent cx="1250899" cy="248285"/>
-                <wp:effectExtent l="0" t="0" r="6985" b="0"/>
-                <wp:wrapNone/>
-                <wp:docPr id="516805717" name="Caixa de Texto 3"/>
-                <wp:cNvGraphicFramePr/>
-                <a:graphic xmlns:a="http://schemas.openxmlformats.org/drawingml/2006/main">
-                  <a:graphicData uri="http://schemas.microsoft.com/office/word/2010/wordprocessingShape">
-                    <wps:wsp>
-                      <wps:cNvSpPr txBox="1"/>
-                      <wps:spPr>
-                        <a:xfrm>
-                          <a:off x="0" y="0"/>
-                          <a:ext cx="1250899" cy="248285"/>
-                        </a:xfrm>
-                        <a:prstGeom prst="rect">
-                          <a:avLst/>
-                        </a:prstGeom>
-                        <a:solidFill>
-                          <a:schemeClr val="lt1"/>
-                        </a:solidFill>
-                        <a:ln w="6350">
-                          <a:noFill/>
-                        </a:ln>
-                      </wps:spPr>
-                      <wps:txbx>
-                        <w:txbxContent>
-                          <w:p>
-                            <w:pPr>
-                              <w:rPr>
-                                <w:b/>
-                                <w:bCs/>
-                                <w:color w:val="808080" w:themeColor="background1" w:themeShade="80"/>
-                                <w:lang w:val="pt-BR"/>
-                              </w:rPr>
-                            </w:pPr>
-                            <w:r>
-                              <w:rPr>
-                                <w:b/>
-                                <w:bCs/>
-                                <w:color w:val="808080" w:themeColor="background1" w:themeShade="80"/>
-                                <w:lang w:val="pt-BR"/>
-                              </w:rPr>
-                              <w:t>Documentação</w:t>
-                            </w:r>
-                          </w:p>
-                        </w:txbxContent>
-                      </wps:txbx>
-                      <wps:bodyPr rot="0" spcFirstLastPara="0" vertOverflow="overflow" horzOverflow="overflow" vert="horz" wrap="square" lIns="91440" tIns="45720" rIns="91440" bIns="45720" numCol="1" spcCol="0" rtlCol="0" fromWordArt="0" anchor="t" anchorCtr="0" forceAA="0" compatLnSpc="1">
-                        <a:prstTxWarp prst="textNoShape">
-                          <a:avLst/>
-                        </a:prstTxWarp>
-                        <a:noAutofit/>
-                      </wps:bodyPr>
-                    </wps:wsp>
-                  </a:graphicData>
-                </a:graphic>
-                <wp14:sizeRelH relativeFrom="margin">
-                  <wp14:pctWidth>0</wp14:pctWidth>
-                </wp14:sizeRelH>
-                <wp14:sizeRelV relativeFrom="margin">
-                  <wp14:pctHeight>0</wp14:pctHeight>
-                </wp14:sizeRelV>
-              </wp:anchor>
-            </w:drawing>
-          </mc:Choice>
-          <mc:Fallback>
-            <w:pict>
-              <v:shape w14:anchorId="7D0B1ABE" id="_x0000_s1032" type="#_x0000_t202" style="position:absolute;margin-left:14.95pt;margin-top:-640.5pt;width:98.5pt;height:19.55pt;z-index:251677696;visibility:visible;mso-wrap-style:square;mso-width-percent:0;mso-height-percent:0;mso-wrap-distance-left:9pt;mso-wrap-distance-top:0;mso-wrap-distance-right:9pt;mso-wrap-distance-bottom:0;mso-position-horizontal:absolute;mso-position-horizontal-relative:text;mso-position-vertical:absolute;mso-position-vertical-relative:text;mso-width-percent:0;mso-height-percent:0;mso-width-relative:margin;mso-height-relative:margin;v-text-anchor:top" o:gfxdata="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" fillcolor="white [3201]" stroked="f" strokeweight=".5pt">
-                <v:textbox>
-                  <w:txbxContent>
-                    <w:p>
-                      <w:pPr>
-                        <w:rPr>
-                          <w:b/>
-                          <w:bCs/>
-                          <w:color w:val="808080" w:themeColor="background1" w:themeShade="80"/>
-                          <w:lang w:val="pt-BR"/>
-                        </w:rPr>
-                      </w:pPr>
-                      <w:r>
-                        <w:rPr>
-                          <w:b/>
-                          <w:bCs/>
-                          <w:color w:val="808080" w:themeColor="background1" w:themeShade="80"/>
-                          <w:lang w:val="pt-BR"/>
-                        </w:rPr>
-                        <w:t>Documentação</w:t>
-                      </w:r>
-                    </w:p>
-                  </w:txbxContent>
-                </v:textbox>
-              </v:shape>
-            </w:pict>
-          </mc:Fallback>
-        </mc:AlternateContent>
-      </w:r>
-    </w:p>
-    <w:p>
-      <w:pPr>
-        <w:spacing w:after="0" w:line="240" w:lineRule="auto"/>
-        <w:rPr>
-          <w:rFonts w:asciiTheme="majorHAnsi" w:hAnsiTheme="majorHAnsi" w:cstheme="majorHAnsi"/>
-          <w:lang w:val="pt-BR"/>
-        </w:rPr>
-      </w:pPr>
-      <w:r>
-        <w:rPr>
-          <w:rFonts w:asciiTheme="majorHAnsi" w:hAnsiTheme="majorHAnsi" w:cstheme="majorHAnsi"/>
-          <w:lang w:val="pt-BR"/>
-        </w:rPr>
-        <w:t xml:space="preserve">   Data: _____/_____/__________ Hora: _____:_____ KM: {{KM}}</w:t>
-      </w:r>
-    </w:p>
-    <w:p>
-      <w:pPr>
-        <w:spacing w:after="0" w:line="240" w:lineRule="auto"/>
-        <w:rPr>
-          <w:rFonts w:asciiTheme="majorHAnsi" w:hAnsiTheme="majorHAnsi" w:cstheme="majorHAnsi"/>
-          <w:lang w:val="pt-BR"/>
-        </w:rPr>
-      </w:pPr>
-    </w:p>
-    <w:p>
-      <w:pPr>
-        <w:spacing w:after="0" w:line="240" w:lineRule="auto"/>
-        <w:rPr>
-          <w:rFonts w:asciiTheme="majorHAnsi" w:hAnsiTheme="majorHAnsi" w:cstheme="majorHAnsi"/>
-          <w:lang w:val="pt-BR"/>
-        </w:rPr>
-      </w:pPr>
-    </w:p>
-    <w:p>
-      <w:pPr>
-        <w:spacing w:after="0" w:line="240" w:lineRule="auto"/>
-        <w:rPr>
-          <w:rFonts w:asciiTheme="majorHAnsi" w:hAnsiTheme="majorHAnsi" w:cstheme="majorHAnsi"/>
-          <w:b/>
-          <w:bCs/>
-          <w:lang w:val="pt-BR"/>
-        </w:rPr>
-      </w:pPr>
-      <w:r>
-        <w:rPr>
-          <w:rFonts w:asciiTheme="majorHAnsi" w:hAnsiTheme="majorHAnsi" w:cstheme="majorHAnsi"/>
-          <w:b/>
-          <w:bCs/>
-          <w:lang w:val="pt-BR"/>
-        </w:rPr>
-        <w:t>TERMO DE CONSENTIMENTO</w:t>
-      </w:r>
-    </w:p>
-    <w:p>
-      <w:pPr>
-        <w:spacing w:after="0" w:line="240" w:lineRule="auto"/>
-        <w:rPr>
-          <w:rFonts w:asciiTheme="majorHAnsi" w:hAnsiTheme="majorHAnsi" w:cstheme="majorHAnsi"/>
-          <w:lang w:val="pt-BR"/>
-        </w:rPr>
-      </w:pPr>
-      <w:r>
-        <w:rPr>
-          <w:rFonts w:asciiTheme="majorHAnsi" w:hAnsiTheme="majorHAnsi" w:cstheme="majorHAnsi"/>
-          <w:lang w:val="pt-BR"/>
-        </w:rPr>
-        <w:t>Termo de consentimento para armazenamento e tratamento de dados pessoais em conformidade com a LGPD. O proprietário, na condição de titular dos dados pessoais, manifesta livre, informada e inequívoca concordância com o tratamento de seus dados pessoais pela (BROTHERS MULTIMARCAS) para finalidade específica, em conformidade com a Lei nº 13.709 – Lei Geral de Proteção de Dados Pessoais (LGPD), tendo assegurado seu direito de acesso, retificação e eliminação dos mesmos, devendo, para tanto, solicitar à (BROTHERS MULTIMARCAS). O presente termo isenta a (INTERMEDIADORA) (BROTHERS MULTIMARCAS), das responsabilidades e obrigações inerentes a infrações de trânsito e eventuais IMPOSTOS E/OU TAXAS (IPVA/SEGURO OBRIGATÓRIO/ LICENCIAMENTO) que ocorrerem a partir desta data, já o Comprador (CLIENTE) se responsabiliza por infrações de trânsito e eventuais IMPOSTOS E/OU TAXAS (IPVA/SEGURO OBRIGATÓRIO/ LICENCIAMENTO) que ocorrerem a partir desta data. O comprador (a) declara neste recibo, haver examinado o veículo acima descrito. Este veículo possui garantia em conformidade com o Art.26 II C.D.C. Prevalecerá o que ocorrer primeiro. No caso da venda do veículo pela INTERMEDIADORA e o COMPRADOR (CLIENTE) desistir da venda em questão dentro do prazo legal, fica estipulado a cobrança no valor da comissão de 6% (Seis) deste contrato, para que a INTERMEDIADORA pague todas as despesas em decorrência da venda. Fica acordado entre as partes que a negociação está sendo realizada através de intermediação entre o (VENDEDOR (PROPRIETÁRIO)) e o (COMPRADOR (CLIENTE)), deste modo a loja se dispõe de todos os recursos administrativos para viabilizar a operação de COMPRA/VENDA.E por estar de pleno acordo com o aqui descrito, assina o comprador o presente.</w:t>
-      </w:r>
-    </w:p>
-    <w:p>
-      <w:pPr>
-        <w:spacing w:after="0" w:line="240" w:lineRule="auto"/>
-        <w:rPr>
-          <w:rFonts w:asciiTheme="majorHAnsi" w:hAnsiTheme="majorHAnsi" w:cstheme="majorHAnsi"/>
-          <w:lang w:val="pt-BR"/>
-        </w:rPr>
-      </w:pPr>
-    </w:p>
-    <w:p>
-      <w:pPr>
-        <w:rPr>
-          <w:rFonts w:asciiTheme="majorHAnsi" w:hAnsiTheme="majorHAnsi" w:cstheme="majorHAnsi"/>
-          <w:lang w:val="pt-BR"/>
-        </w:rPr>
-      </w:pPr>
-    </w:p>
-    <w:p>
-      <w:pPr>
-        <w:rPr>
-          <w:lang w:val="pt-BR"/>
-        </w:rPr>
-      </w:pPr>
-      <w:r>
-        <w:rPr>
-          <w:lang w:val="pt-BR"/>
-        </w:rPr>
-        <w:t xml:space="preserve">Guarulhos, {{Data da Venda}}.</w:t>
-      </w:r>
-    </w:p>
-    <w:p>
-      <w:pPr>
-        <w:spacing w:after="0" w:line="240" w:lineRule="auto"/>
-        <w:rPr>
-          <w:b/>
-          <w:bCs/>
-          <w:lang w:val="pt-BR"/>
-        </w:rPr>
-      </w:pPr>
-    </w:p>
-    <w:p>
-      <w:pPr>
-        <w:spacing w:after="0" w:line="240" w:lineRule="auto"/>
-        <w:rPr>
-          <w:b/>
-          <w:bCs/>
-          <w:lang w:val="pt-BR"/>
-        </w:rPr>
-      </w:pPr>
-    </w:p>
-    <w:p>
-      <w:pPr>
-        <w:spacing w:after="0" w:line="240" w:lineRule="auto"/>
-        <w:rPr>
-          <w:b/>
-          <w:bCs/>
-          <w:lang w:val="pt-BR"/>
-        </w:rPr>
-      </w:pPr>
-      <w:r>
-        <w:rPr>
-          <w:b/>
-          <w:bCs/>
-          <w:lang w:val="pt-BR"/>
-        </w:rPr>
-        <w:t>_____________________________________________________________</w:t>
-      </w:r>
-    </w:p>
-    <w:p>
-      <w:pPr>
-        <w:spacing w:after="0" w:line="240" w:lineRule="auto"/>
-        <w:rPr>
-          <w:lang w:val="pt-BR"/>
-        </w:rPr>
-      </w:pPr>
-      <w:r>
-        <w:rPr>
-          <w:lang w:val="pt-BR"/>
-        </w:rPr>
-        <w:t xml:space="preserve">Cliente: {{Nome do Cliente}}CPF: {{{CPF}}}</w:t>
-      </w:r>
-    </w:p>
-    <w:p>
-      <w:pPr>
-        <w:spacing w:after="0" w:line="240" w:lineRule="auto"/>
-        <w:rPr>
-          <w:lang w:val="pt-BR"/>
-        </w:rPr>
-      </w:pPr>
-    </w:p>
-    <w:p>
-      <w:pPr>
-        <w:spacing w:after="0" w:line="240" w:lineRule="auto"/>
-        <w:rPr>
-          <w:lang w:val="pt-BR"/>
-        </w:rPr>
-      </w:pPr>
-    </w:p>
-    <w:p>
-      <w:pPr>
-        <w:spacing w:after="0" w:line="240" w:lineRule="auto"/>
-        <w:rPr>
-          <w:b/>
-          <w:bCs/>
-          <w:lang w:val="pt-BR"/>
-        </w:rPr>
-      </w:pPr>
-    </w:p>
-    <w:p>
-      <w:pPr>
-        <w:spacing w:after="0" w:line="240" w:lineRule="auto"/>
-        <w:rPr>
-          <w:b/>
-          <w:bCs/>
-          <w:lang w:val="pt-BR"/>
-        </w:rPr>
-      </w:pPr>
-    </w:p>
-    <w:p>
-      <w:pPr>
-        <w:spacing w:after="0" w:line="240" w:lineRule="auto"/>
-        <w:rPr>
-          <w:b/>
-          <w:bCs/>
-          <w:lang w:val="pt-BR"/>
-        </w:rPr>
-      </w:pPr>
-    </w:p>
-    <w:p>
-      <w:pPr>
-        <w:spacing w:after="0" w:line="240" w:lineRule="auto"/>
-        <w:rPr>
-          <w:b/>
-          <w:bCs/>
-          <w:lang w:val="pt-BR"/>
-        </w:rPr>
-      </w:pPr>
-      <w:r>
-        <w:rPr>
-          <w:b/>
-          <w:bCs/>
-          <w:lang w:val="pt-BR"/>
-        </w:rPr>
-        <w:t>_____________________________________________________________</w:t>
-      </w:r>
-    </w:p>
-    <w:p>
-      <w:pPr>
-        <w:spacing w:after="0" w:line="240" w:lineRule="auto"/>
-        <w:rPr>
-          <w:b/>
-          <w:bCs/>
-          <w:lang w:val="pt-BR"/>
-        </w:rPr>
-      </w:pPr>
-      <w:r>
-        <w:rPr>
-          <w:b/>
-          <w:bCs/>
-          <w:lang w:val="pt-BR"/>
-        </w:rPr>
-        <w:t>JTS INTERMEDIAÇÕES E NEGOCIOS LTDA</w:t>
-      </w:r>
-    </w:p>
-    <w:p>
-      <w:pPr>
-        <w:spacing w:after="0" w:line="240" w:lineRule="auto"/>
-        <w:rPr>
-          <w:b/>
-          <w:bCs/>
-          <w:lang w:val="pt-BR"/>
-        </w:rPr>
-      </w:pPr>
-    </w:p>
-    <w:p>
-      <w:pPr>
-        <w:spacing w:after="0" w:line="240" w:lineRule="auto"/>
-        <w:rPr>
-          <w:b/>
-          <w:bCs/>
-          <w:lang w:val="pt-BR"/>
-        </w:rPr>
-      </w:pPr>
-    </w:p>
-    <w:p>
-      <w:pPr>
-        <w:spacing w:after="0" w:line="240" w:lineRule="auto"/>
-        <w:rPr>
-          <w:b/>
-          <w:bCs/>
-          <w:lang w:val="pt-BR"/>
-        </w:rPr>
-      </w:pPr>
-    </w:p>
-    <w:p>
-      <w:pPr>
-        <w:spacing w:after="0" w:line="240" w:lineRule="auto"/>
-        <w:rPr>
-          <w:b/>
-          <w:bCs/>
-          <w:lang w:val="pt-BR"/>
-        </w:rPr>
-      </w:pPr>
-      <w:r>
-        <w:rPr>
-          <w:b/>
-          <w:bCs/>
-          <w:lang w:val="pt-BR"/>
-        </w:rPr>
-        <w:t>_____________________________________________________________</w:t>
-      </w:r>
-    </w:p>
-    <w:p>
-      <w:pPr>
-        <w:spacing w:after="0" w:line="240" w:lineRule="auto"/>
-        <w:rPr>
-          <w:b/>
-          <w:bCs/>
-          <w:lang w:val="pt-BR"/>
-        </w:rPr>
-      </w:pPr>
-      <w:r>
-        <w:rPr>
-          <w:b/>
-          <w:bCs/>
-          <w:lang w:val="pt-BR"/>
-        </w:rPr>
-        <w:t xml:space="preserve">Vendedor: {{Vendedor}}</w:t>
-      </w:r>
-    </w:p>
-    <w:p>
-      <w:pPr>
-        <w:spacing w:after="0" w:line="240" w:lineRule="auto"/>
-        <w:rPr>
-          <w:b/>
-          <w:bCs/>
-          <w:lang w:val="pt-BR"/>
-        </w:rPr>
-      </w:pPr>
-    </w:p>
-    <w:p>
-      <w:pPr>
-        <w:spacing w:after="0" w:line="240" w:lineRule="auto"/>
-        <w:rPr>
-          <w:b/>
-          <w:bCs/>
-          <w:lang w:val="pt-BR"/>
-        </w:rPr>
-      </w:pPr>
-    </w:p>
-    <w:p>
-      <w:pPr>
-        <w:spacing w:after="0" w:line="240" w:lineRule="auto"/>
-        <w:rPr>
-          <w:b/>
-          <w:bCs/>
-          <w:lang w:val="pt-BR"/>
-        </w:rPr>
-      </w:pPr>
-    </w:p>
-    <w:p>
-      <w:pPr>
-        <w:spacing w:after="0" w:line="240" w:lineRule="auto"/>
-        <w:rPr>
-          <w:b/>
-          <w:bCs/>
-          <w:lang w:val="pt-BR"/>
-        </w:rPr>
-      </w:pPr>
-    </w:p>
-    <w:p>
-      <w:pPr>
-        <w:spacing w:after="0" w:line="240" w:lineRule="auto"/>
-        <w:rPr>
-          <w:b/>
-          <w:bCs/>
-          <w:lang w:val="pt-BR"/>
-        </w:rPr>
-      </w:pPr>
-    </w:p>
-    <w:p>
-      <w:pPr>
-        <w:spacing w:after="0" w:line="240" w:lineRule="auto"/>
-        <w:rPr>
-          <w:b/>
-          <w:bCs/>
-          <w:lang w:val="pt-BR"/>
-        </w:rPr>
-      </w:pPr>
-    </w:p>
-    <w:p>
-      <w:pPr>
-        <w:rPr>
-          <w:lang w:val="pt-BR"/>
-        </w:rPr>
-      </w:pPr>
-      <w:r>
-        <w:rPr>
-          <w:b/>
-          <w:bCs/>
-          <w:lang w:val="pt-BR"/>
-        </w:rPr>
-        <w:t>Testemunhas:</w:t>
-      </w:r>
-    </w:p>
-    <w:p>
-      <w:pPr>
-        <w:numPr>
-          <w:ilvl w:val="0"/>
-          <w:numId w:val="15"/>
-        </w:numPr>
-        <w:rPr>
-          <w:lang w:val="pt-BR"/>
-        </w:rPr>
-      </w:pPr>
-      <w:r>
-        <w:rPr>
-          <w:lang w:val="pt-BR"/>
-        </w:rPr>
-        <w:t>___________</w:t>
-      </w:r>
-      <w:r>
-        <w:rPr>
-          <w:lang w:val="pt-BR"/>
-        </w:rPr>
-        <w:t>______________</w:t>
-      </w:r>
-      <w:r>
-        <w:rPr>
-          <w:lang w:val="pt-BR"/>
-        </w:rPr>
-        <w:t>__________ - CPF: ________</w:t>
-      </w:r>
-      <w:r>
-        <w:rPr>
-          <w:lang w:val="pt-BR"/>
-        </w:rPr>
-        <w:t>______</w:t>
-      </w:r>
-    </w:p>
-    <w:p>
-      <w:pPr>
-        <w:numPr>
-          <w:ilvl w:val="0"/>
-          <w:numId w:val="15"/>
-        </w:numPr>
-        <w:rPr>
-          <w:lang w:val="pt-BR"/>
-        </w:rPr>
-      </w:pPr>
-      <w:r>
-        <w:rPr>
-          <w:lang w:val="pt-BR"/>
-        </w:rPr>
-        <w:t>____________________</w:t>
-      </w:r>
-      <w:r>
-        <w:rPr>
-          <w:lang w:val="pt-BR"/>
-        </w:rPr>
-        <w:t>______________</w:t>
-      </w:r>
-      <w:r>
-        <w:rPr>
-          <w:lang w:val="pt-BR"/>
-        </w:rPr>
-        <w:t>_ - CPF: _______</w:t>
-      </w:r>
-      <w:r>
-        <w:rPr>
-          <w:lang w:val="pt-BR"/>
-        </w:rPr>
-        <w:t>______</w:t>
-      </w:r>
-      <w:r>
-        <w:rPr>
-          <w:lang w:val="pt-BR"/>
-        </w:rPr>
-        <w:t>_</w:t>
-      </w:r>
-    </w:p>
-    <w:p>
-      <w:pPr>
-        <w:rPr>
-          <w:lang w:val="pt-BR"/>
-        </w:rPr>
-      </w:pPr>
-    </w:p>
-    <w:sectPr>
-      <w:pgSz w:w="12240" w:h="15840"/>
-      <w:pgMar w:top="1152" w:right="1152" w:bottom="1152" w:left="1152" w:header="720" w:footer="720" w:gutter="0"/>
-      <w:cols w:space="720"/>
-      <w:docGrid w:linePitch="360"/>
-    </w:sectPr>
-  </w:body>
-</w:document>
+<file path=word/document.xml><?xml version="1.0" encoding="UTF-8" standalone="yes"?>
+<w:document xmlns:wpc="http://schemas.microsoft.com/office/word/2010/wordprocessingCanvas" xmlns:cx="http://schemas.microsoft.com/office/drawing/2014/chartex" xmlns:cx1="http://schemas.microsoft.com/office/drawing/2015/9/8/chartex" xmlns:cx2="http://schemas.microsoft.com/office/drawing/2015/10/21/chartex" xmlns:cx3="http://schemas.microsoft.com/office/drawing/2016/5/9/chartex" xmlns:cx4="http://schemas.microsoft.com/office/drawing/2016/5/10/chartex" xmlns:cx5="http://schemas.microsoft.com/office/drawing/2016/5/11/chartex" xmlns:cx6="http://schemas.microsoft.com/office/drawing/2016/5/12/chartex" xmlns:cx7="http://schemas.microsoft.com/office/drawing/2016/5/13/chartex" xmlns:cx8="http://schemas.microsoft.com/office/drawing/2016/5/14/chartex" xmlns:mc="http://schemas.openxmlformats.org/markup-compatibility/2006" xmlns:aink="http://schemas.microsoft.com/office/drawing/2016/ink" xmlns:am3d="http://schemas.microsoft.com/office/drawing/2017/model3d" xmlns:o="urn:schemas-microsoft-com:office:office" xmlns:oel="http://schemas.microsoft.com/office/2019/extlst" xmlns:r="http://schemas.openxmlformats.org/officeDocument/2006/relationships" xmlns:m="http://schemas.openxmlformats.org/officeDocument/2006/math" xmlns:v="urn:schemas-microsoft-com:vml" xmlns:wp14="http://schemas.microsoft.com/office/word/2010/wordprocessingDrawing" xmlns:wp="http://schemas.openxmlformats.org/drawingml/2006/wordprocessingDrawing" xmlns:w10="urn:schemas-microsoft-com:office:word" xmlns:w="http://schemas.openxmlformats.org/wordprocessingml/2006/main" xmlns:w14="http://schemas.microsoft.com/office/word/2010/wordml" xmlns:w15="http://schemas.microsoft.com/office/word/2012/wordml" xmlns:w16cex="http://schemas.microsoft.com/office/word/2018/wordml/cex" xmlns:w16cid="http://schemas.microsoft.com/office/word/2016/wordml/cid" xmlns:w16="http://schemas.microsoft.com/office/word/2018/wordml" xmlns:w16du="http://schemas.microsoft.com/office/word/2023/wordml/word16du" xmlns:w16sdtdh="http://schemas.microsoft.com/office/word/2020/wordml/sdtdatahash" xmlns:w16sdtfl="http://schemas.microsoft.com/office/word/2024/wordml/sdtformatlock" xmlns:w16se="http://schemas.microsoft.com/office/word/2015/wordml/symex" xmlns:wpg="http://schemas.microsoft.com/office/word/2010/wordprocessingGroup" xmlns:wpi="http://schemas.microsoft.com/office/word/2010/wordprocessingInk" xmlns:wne="http://schemas.microsoft.com/office/word/2006/wordml" xmlns:wps="http://schemas.microsoft.com/office/word/2010/wordprocessingShape" mc:Ignorable="w14 w15 w16se w16cid w16 w16cex w16sdtdh w16sdtfl w16du wp14"><w:body><w:p><w:pPr><w:spacing w:after="40"/><w:jc w:val="center"/><w:rPr><w:color w:val="808080" w:themeColor="background1" w:themeShade="80"/><w:sz w:val="24"/><w:szCs w:val="24"/><w:lang w:val="pt-BR"/></w:rPr></w:pPr><w:r><w:rPr><w:b/><w:color w:val="808080" w:themeColor="background1" w:themeShade="80"/><w:sz w:val="24"/><w:szCs w:val="24"/><w:lang w:val="pt-BR"/></w:rPr><w:t>JTS INTERMEDIAÇÕES E NEGÓCIOS LTDA</w:t></w:r></w:p><w:p><w:pPr><w:spacing w:after="280"/><w:jc w:val="center"/><w:rPr><w:color w:val="555555"/><w:sz w:val="18"/><w:szCs w:val="18"/><w:lang w:val="pt-BR"/></w:rPr></w:pPr><w:r><w:rPr><w:color w:val="555555"/><w:sz w:val="18"/><w:szCs w:val="18"/><w:lang w:val="pt-BR"/></w:rPr><w:t>CNPJ: 48.573.595/0001-09Informações Cliente</w:t></w:r></w:p></w:txbxContent></wps:txbx><wps:bodyPr rot="0" spcFirstLastPara="0" vertOverflow="overflow" horzOverflow="overflow" vert="horz" wrap="square" lIns="91440" tIns="45720" rIns="91440" bIns="45720" numCol="1" spcCol="0" rtlCol="0" fromWordArt="0" anchor="t" anchorCtr="0" forceAA="0" compatLnSpc="1"><a:prstTxWarp prst="textNoShape"><a:avLst/></a:prstTxWarp><a:noAutofit/></wps:bodyPr></wps:wsp></a:graphicData></a:graphic><wp14:sizeRelH relativeFrom="margin"><wp14:pctWidth>0</wp14:pctWidth></wp14:sizeRelH><wp14:sizeRelV relativeFrom="margin"><wp14:pctHeight>0</wp14:pctHeight></wp14:sizeRelV></wp:anchor></w:drawing></mc:Choice><mc:Fallback><w:pict><v:shapetype w14:anchorId="678F545F" id="_x0000_t202" coordsize="21600,21600" o:spt="202" path="m,l,21600r21600,l21600,xe"><v:stroke joinstyle="miter"/><v:path gradientshapeok="t" o:connecttype="rect"/></v:shapetype><v:shape id="Caixa de Texto 3" o:spid="_x0000_s1026" type="#_x0000_t202" style="position:absolute;left:0;text-align:left;margin-left:10.35pt;margin-top:26.35pt;width:118.1pt;height:17.85pt;z-index:251659264;visibility:visible;mso-wrap-style:square;mso-width-percent:0;mso-height-percent:0;mso-wrap-distance-left:9pt;mso-wrap-distance-top:0;mso-wrap-distance-right:9pt;mso-wrap-distance-bottom:0;mso-position-horizontal:absolute;mso-position-horizontal-relative:text;mso-position-vertical:absolute;mso-position-vertical-relative:text;mso-width-percent:0;mso-height-percent:0;mso-width-relative:margin;mso-height-relative:margin;v-text-anchor:top" o:gfxdata="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" fillcolor="white [3201]" stroked="f" strokeweight=".5pt"><v:textbox><w:txbxContent><w:p><w:pPr><w:rPr><w:b/><w:bCs/><w:color w:val="808080" w:themeColor="background1" w:themeShade="80"/></w:rPr></w:pPr><w:r><w:rPr><w:b/><w:bCs/><w:color w:val="808080" w:themeColor="background1" w:themeShade="80"/></w:rPr><w:t xml:space="preserve">Informações Cliente</w:t></w:r></w:p></w:txbxContent></v:textbox></v:shape></w:pict></mc:Fallback></mc:AlternateContent></w:r><w:r><w:rPr><w:rFonts w:ascii="Arial" w:hAnsi="Arial"/><w:color w:val="808080" w:themeColor="background1" w:themeShade="80"/><w:sz w:val="24"/><w:szCs w:val="24"/><w:lang w:val="pt-BR"/></w:rPr><w:t>CONTRATO DE VENDA</w:t></w:r></w:p><w:p><w:pPr><w:pStyle w:val="SemEspaamento"/><w:rPr><w:rFonts w:asciiTheme="majorHAnsi" w:hAnsiTheme="majorHAnsi" w:cstheme="majorHAnsi"/><w:sz w:val="20"/><w:szCs w:val="20"/><w:lang w:val="pt-BR"/></w:rPr></w:pPr><w:r><w:rPr><w:rFonts w:ascii="Arial" w:hAnsi="Arial"/><w:noProof/><w:color w:val="FFFFFF" w:themeColor="background1"/><w:sz w:val="24"/><w:szCs w:val="24"/><w:lang w:val="pt-BR"/></w:rPr><mc:AlternateContent><mc:Choice Requires="wps"><w:drawing><wp:anchor distT="0" distB="0" distL="114300" distR="114300" simplePos="0" relativeHeight="251658240" behindDoc="0" locked="0" layoutInCell="1" allowOverlap="1" wp14:anchorId="11820F6D" wp14:editId="7AA75AAD"><wp:simplePos x="0" y="0"/><wp:positionH relativeFrom="column"><wp:posOffset>-58522</wp:posOffset></wp:positionH><wp:positionV relativeFrom="paragraph"><wp:posOffset>36881</wp:posOffset></wp:positionV><wp:extent cx="6371540" cy="1041121"/><wp:effectExtent l="0" t="0" r="10795" b="26035"/><wp:wrapNone/><wp:docPr id="783150584" name="Retângulo 1"/><wp:cNvGraphicFramePr/><a:graphic xmlns:a="http://schemas.openxmlformats.org/drawingml/2006/main"><a:graphicData uri="http://schemas.microsoft.com/office/word/2010/wordprocessingShape"><wps:wsp><wps:cNvSpPr/><wps:spPr><a:xfrm><a:off x="0" y="0"/><a:ext cx="6371540" cy="1041121"/></a:xfrm><a:prstGeom prst="rect"><a:avLst/></a:prstGeom><a:noFill/><a:ln w="9525" cap="flat" cmpd="sng" algn="ctr"><a:solidFill><a:schemeClr val="dk1"/></a:solidFill><a:prstDash val="solid"/><a:round/><a:headEnd type="none" w="med" len="med"/><a:tailEnd type="none" w="med" len="med"/></a:ln></wps:spPr><wps:style><a:lnRef idx="0"><a:scrgbClr r="0" g="0" b="0"/></a:lnRef><a:fillRef idx="0"><a:scrgbClr r="0" g="0" b="0"/></a:fillRef><a:effectRef idx="0"><a:scrgbClr r="0" g="0" b="0"/></a:effectRef><a:fontRef idx="minor"><a:schemeClr val="dk1"/></a:fontRef></wps:style><wps:bodyPr rot="0" spcFirstLastPara="0" vertOverflow="overflow" horzOverflow="overflow" vert="horz" wrap="square" lIns="91440" tIns="45720" rIns="91440" bIns="45720" numCol="1" spcCol="0" rtlCol="0" fromWordArt="0" anchor="ctr" anchorCtr="0" forceAA="0" compatLnSpc="1"><a:prstTxWarp prst="textNoShape"><a:avLst/></a:prstTxWarp><a:noAutofit/></wps:bodyPr></wps:wsp></a:graphicData></a:graphic><wp14:sizeRelH relativeFrom="margin"><wp14:pctWidth>0</wp14:pctWidth></wp14:sizeRelH><wp14:sizeRelV relativeFrom="margin"><wp14:pctHeight>0</wp14:pctHeight></wp14:sizeRelV></wp:anchor></w:drawing></mc:Choice><mc:Fallback><w:pict><v:rect w14:anchorId="056EE728" id="Retângulo 1" o:spid="_x0000_s1026" style="position:absolute;margin-left:-4.6pt;margin-top:2.9pt;width:501.7pt;height:82pt;z-index:251658240;visibility:visible;mso-wrap-style:square;mso-width-percent:0;mso-height-percent:0;mso-wrap-distance-left:9pt;mso-wrap-distance-top:0;mso-wrap-distance-right:9pt;mso-wrap-distance-bottom:0;mso-position-horizontal:absolute;mso-position-horizontal-relative:text;mso-position-vertical:absolute;mso-position-vertical-relative:text;mso-width-percent:0;mso-height-percent:0;mso-width-relative:margin;mso-height-relative:margin;v-text-anchor:middle" o:gfxdata="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" filled="f" strokecolor="black [3200]"><v:stroke joinstyle="round"/></v:rect></w:pict></mc:Fallback></mc:AlternateContent></w:r></w:p><w:p><w:pPr><w:pStyle w:val="SemEspaamento"/><w:rPr><w:rFonts w:asciiTheme="majorHAnsi" w:hAnsiTheme="majorHAnsi" w:cstheme="majorHAnsi"/><w:sz w:val="20"/><w:szCs w:val="20"/><w:lang w:val="pt-BR"/></w:rPr></w:pPr><w:r><w:rPr><w:rFonts w:asciiTheme="majorHAnsi" w:hAnsiTheme="majorHAnsi" w:cstheme="majorHAnsi"/><w:b/><w:bCs/><w:sz w:val="20"/><w:szCs w:val="20"/><w:lang w:val="pt-BR"/></w:rPr><w:t>Nome: {{Nome do Cliente}}</w:t></w:r></w:p><w:p><w:pPr><w:pStyle w:val="SemEspaamento"/><w:rPr><w:rFonts w:asciiTheme="majorHAnsi" w:hAnsiTheme="majorHAnsi" w:cstheme="majorHAnsi"/><w:sz w:val="20"/><w:szCs w:val="20"/><w:lang w:val="pt-BR"/></w:rPr></w:pPr><w:r><w:rPr><w:rFonts w:asciiTheme="majorHAnsi" w:hAnsiTheme="majorHAnsi" w:cstheme="majorHAnsi"/><w:b/><w:bCs/><w:sz w:val="20"/><w:szCs w:val="20"/><w:lang w:val="pt-BR"/></w:rPr><w:t>RG n.: {{RG}}                                                                    CPF/MF n.: {{CPF}}</w:t></w:r></w:p><w:p><w:pPr><w:pStyle w:val="SemEspaamento"/><w:rPr><w:rFonts w:asciiTheme="majorHAnsi" w:hAnsiTheme="majorHAnsi" w:cstheme="majorHAnsi"/><w:sz w:val="20"/><w:szCs w:val="20"/><w:lang w:val="pt-BR"/></w:rPr></w:pPr><w:r><w:rPr><w:rFonts w:asciiTheme="majorHAnsi" w:hAnsiTheme="majorHAnsi" w:cstheme="majorHAnsi"/><w:b/><w:bCs/><w:sz w:val="20"/><w:szCs w:val="20"/><w:lang w:val="pt-BR"/></w:rPr><w:t>Endereco: {{Rua/Av}}, {{Número}}                               Bairro: {{Bairro}}</w:t></w:r></w:p><w:p><w:pPr><w:pStyle w:val="SemEspaamento"/><w:rPr><w:rFonts w:asciiTheme="majorHAnsi" w:hAnsiTheme="majorHAnsi" w:cstheme="majorHAnsi"/><w:sz w:val="20"/><w:szCs w:val="20"/><w:lang w:val="pt-BR"/></w:rPr></w:pPr><w:r><w:rPr><w:rFonts w:asciiTheme="majorHAnsi" w:hAnsiTheme="majorHAnsi" w:cstheme="majorHAnsi"/><w:b/><w:bCs/><w:sz w:val="20"/><w:szCs w:val="20"/><w:lang w:val="pt-BR"/></w:rPr><w:t>Cidade/Municipio: {{Cidade}}                                      Estado: {{Estado}}                        Cep:{{Cep}}.</w:t></w:r></w:p><w:p><w:pPr><w:pStyle w:val="SemEspaamento"/><w:rPr><w:rFonts w:asciiTheme="majorHAnsi" w:hAnsiTheme="majorHAnsi" w:cstheme="majorHAnsi"/><w:sz w:val="20"/><w:szCs w:val="20"/><w:lang w:val="pt-BR"/></w:rPr></w:pPr><w:r><w:rPr><w:rFonts w:asciiTheme="majorHAnsi" w:hAnsiTheme="majorHAnsi" w:cstheme="majorHAnsi"/><w:b/><w:bCs/><w:sz w:val="20"/><w:szCs w:val="20"/><w:lang w:val="pt-BR"/></w:rPr><w:t>Cel: {{Celular}}.                                                                E-mail: {{Email}}</w:t></w:r></w:p><w:p><w:pPr><w:rPr><w:rFonts w:asciiTheme="majorHAnsi" w:hAnsiTheme="majorHAnsi" w:cstheme="majorHAnsi"/><w:lang w:val="pt-BR"/></w:rPr></w:pPr><w:r><w:rPr><w:noProof/><w:color w:val="555555"/><w:sz w:val="18"/><w:szCs w:val="18"/><w:lang w:val="pt-BR"/></w:rPr><mc:AlternateContent><mc:Choice Requires="wps"><w:drawing><wp:anchor distT="0" distB="0" distL="114300" distR="114300" simplePos="0" relativeHeight="251665408" behindDoc="0" locked="0" layoutInCell="1" allowOverlap="1" wp14:anchorId="44729B3B" wp14:editId="13676B9F"><wp:simplePos x="0" y="0"/><wp:positionH relativeFrom="column"><wp:posOffset>51207</wp:posOffset></wp:positionH><wp:positionV relativeFrom="paragraph"><wp:posOffset>269723</wp:posOffset></wp:positionV><wp:extent cx="1324052" cy="248285"/><wp:effectExtent l="0" t="0" r="9525" b="0"/><wp:wrapNone/><wp:docPr id="952711642" name="Caixa de Texto 3"/><wp:cNvGraphicFramePr/><a:graphic xmlns:a="http://schemas.openxmlformats.org/drawingml/2006/main"><a:graphicData uri="http://schemas.microsoft.com/office/word/2010/wordprocessingShape"><wps:wsp><wps:cNvSpPr txBox="1"/><wps:spPr><a:xfrm><a:off x="0" y="0"/><a:ext cx="1324052" cy="248285"/></a:xfrm><a:prstGeom prst="rect"><a:avLst/></a:prstGeom><a:solidFill><a:schemeClr val="lt1"/></a:solidFill><a:ln w="6350"><a:noFill/></a:ln></wps:spPr><wps:txbx><w:txbxContent><w:p><w:pPr><w:rPr><w:b/><w:bCs/><w:color w:val="808080" w:themeColor="background1" w:themeShade="80"/></w:rPr></w:pPr><w:r><w:rPr><w:b/><w:bCs/><w:color w:val="808080" w:themeColor="background1" w:themeShade="80"/></w:rPr><w:t>Dados do Veículo</w:t></w:r></w:p></w:txbxContent></wps:txbx><wps:bodyPr rot="0" spcFirstLastPara="0" vertOverflow="overflow" horzOverflow="overflow" vert="horz" wrap="square" lIns="91440" tIns="45720" rIns="91440" bIns="45720" numCol="1" spcCol="0" rtlCol="0" fromWordArt="0" anchor="t" anchorCtr="0" forceAA="0" compatLnSpc="1"><a:prstTxWarp prst="textNoShape"><a:avLst/></a:prstTxWarp><a:noAutofit/></wps:bodyPr></wps:wsp></a:graphicData></a:graphic><wp14:sizeRelH relativeFrom="margin"><wp14:pctWidth>0</wp14:pctWidth></wp14:sizeRelH><wp14:sizeRelV relativeFrom="margin"><wp14:pctHeight>0</wp14:pctHeight></wp14:sizeRelV></wp:anchor></w:drawing></mc:Choice><mc:Fallback><w:pict><v:shape w14:anchorId="44729B3B" id="_x0000_s1027" type="#_x0000_t202" style="position:absolute;margin-left:4.05pt;margin-top:21.25pt;width:104.25pt;height:19.55pt;z-index:251665408;visibility:visible;mso-wrap-style:square;mso-width-percent:0;mso-height-percent:0;mso-wrap-distance-left:9pt;mso-wrap-distance-top:0;mso-wrap-distance-right:9pt;mso-wrap-distance-bottom:0;mso-position-horizontal:absolute;mso-position-horizontal-relative:text;mso-position-vertical:absolute;mso-position-vertical-relative:text;mso-width-percent:0;mso-height-percent:0;mso-width-relative:margin;mso-height-relative:margin;v-text-anchor:top" o:gfxdata="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" fillcolor="white [3201]" stroked="f" strokeweight=".5pt"><v:textbox><w:txbxContent><w:p><w:pPr><w:rPr><w:b/><w:bCs/><w:color w:val="808080" w:themeColor="background1" w:themeShade="80"/></w:rPr></w:pPr><w:r><w:rPr><w:b/><w:bCs/><w:color w:val="808080" w:themeColor="background1" w:themeShade="80"/></w:rPr><w:t>Dados do Veículo</w:t></w:r></w:p></w:txbxContent></v:textbox></v:shape></w:pict></mc:Fallback></mc:AlternateContent></w:r></w:p><w:p><w:pPr><w:rPr><w:rFonts w:asciiTheme="majorHAnsi" w:hAnsiTheme="majorHAnsi" w:cstheme="majorHAnsi"/><w:lang w:val="pt-BR"/></w:rPr></w:pPr><w:r><w:rPr><w:noProof/><w:color w:val="FFFFFF" w:themeColor="background1"/><w:sz w:val="24"/><w:szCs w:val="24"/><w:lang w:val="pt-BR"/></w:rPr><mc:AlternateContent><mc:Choice Requires="wps"><w:drawing><wp:anchor distT="0" distB="0" distL="114300" distR="114300" simplePos="0" relativeHeight="251664384" behindDoc="0" locked="0" layoutInCell="1" allowOverlap="1" wp14:anchorId="50CA5240" wp14:editId="6F754A48"><wp:simplePos x="0" y="0"/><wp:positionH relativeFrom="column"><wp:posOffset>-73025</wp:posOffset></wp:positionH><wp:positionV relativeFrom="paragraph"><wp:posOffset>86665</wp:posOffset></wp:positionV><wp:extent cx="6385560" cy="1228725"/><wp:effectExtent l="0" t="0" r="15240" b="28575"/><wp:wrapNone/><wp:docPr id="630949161" name="Retângulo 1"/><wp:cNvGraphicFramePr/><a:graphic xmlns:a="http://schemas.openxmlformats.org/drawingml/2006/main"><a:graphicData uri="http://schemas.microsoft.com/office/word/2010/wordprocessingShape"><wps:wsp><wps:cNvSpPr/><wps:spPr><a:xfrm><a:off x="0" y="0"/><a:ext cx="6385560" cy="1228725"/></a:xfrm><a:prstGeom prst="rect"><a:avLst/></a:prstGeom><a:noFill/><a:ln w="9525" cap="flat" cmpd="sng" algn="ctr"><a:solidFill><a:schemeClr val="dk1"/></a:solidFill><a:prstDash val="solid"/><a:round/><a:headEnd type="none" w="med" len="med"/><a:tailEnd type="none" w="med" len="med"/></a:ln></wps:spPr><wps:style><a:lnRef idx="0"><a:scrgbClr r="0" g="0" b="0"/></a:lnRef><a:fillRef idx="0"><a:scrgbClr r="0" g="0" b="0"/></a:fillRef><a:effectRef idx="0"><a:scrgbClr r="0" g="0" b="0"/></a:effectRef><a:fontRef idx="minor"><a:schemeClr val="dk1"/></a:fontRef></wps:style><wps:bodyPr rot="0" spcFirstLastPara="0" vertOverflow="overflow" horzOverflow="overflow" vert="horz" wrap="square" lIns="91440" tIns="45720" rIns="91440" bIns="45720" numCol="1" spcCol="0" rtlCol="0" fromWordArt="0" anchor="ctr" anchorCtr="0" forceAA="0" compatLnSpc="1"><a:prstTxWarp prst="textNoShape"><a:avLst/></a:prstTxWarp><a:noAutofit/></wps:bodyPr></wps:wsp></a:graphicData></a:graphic><wp14:sizeRelH relativeFrom="margin"><wp14:pctWidth>0</wp14:pctWidth></wp14:sizeRelH><wp14:sizeRelV relativeFrom="margin"><wp14:pctHeight>0</wp14:pctHeight></wp14:sizeRelV></wp:anchor></w:drawing></mc:Choice><mc:Fallback><w:pict><v:rect w14:anchorId="21645D16" id="Retângulo 1" o:spid="_x0000_s1026" style="position:absolute;margin-left:-5.75pt;margin-top:6.8pt;width:502.8pt;height:96.75pt;z-index:251664384;visibility:visible;mso-wrap-style:square;mso-width-percent:0;mso-height-percent:0;mso-wrap-distance-left:9pt;mso-wrap-distance-top:0;mso-wrap-distance-right:9pt;mso-wrap-distance-bottom:0;mso-position-horizontal:absolute;mso-position-horizontal-relative:text;mso-position-vertical:absolute;mso-position-vertical-relative:text;mso-width-percent:0;mso-height-percent:0;mso-width-relative:margin;mso-height-relative:margin;v-text-anchor:middle" o:gfxdata="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" filled="f" strokecolor="black [3200]"><v:stroke joinstyle="round"/></v:rect></w:pict></mc:Fallback></mc:AlternateContent></w:r></w:p><w:p><w:pPr><w:spacing w:after="0" w:line="240" w:lineRule="auto"/><w:rPr><w:rFonts w:asciiTheme="majorHAnsi" w:hAnsiTheme="majorHAnsi" w:cstheme="majorHAnsi"/><w:lang w:val="pt-BR"/></w:rPr></w:pPr><w:r><w:rPr><w:rFonts w:asciiTheme="majorHAnsi" w:hAnsiTheme="majorHAnsi" w:cstheme="majorHAnsi"/><w:b/><w:bCs/><w:lang w:val="pt-BR"/></w:rPr><w:t>Marca: {{Marca}}</w:t></w:r></w:p><w:p><w:pPr><w:spacing w:after="0" w:line="240" w:lineRule="auto"/><w:rPr><w:rFonts w:asciiTheme="majorHAnsi" w:hAnsiTheme="majorHAnsi" w:cstheme="majorHAnsi"/><w:lang w:val="pt-BR"/></w:rPr></w:pPr><w:r><w:rPr><w:rFonts w:asciiTheme="majorHAnsi" w:hAnsiTheme="majorHAnsi" w:cstheme="majorHAnsi"/><w:b/><w:bCs/><w:lang w:val="pt-BR"/></w:rPr><w:t>Modelo: {{Modelo}}             Versão: {{Versão}}</w:t></w:r></w:p><w:p><w:pPr><w:spacing w:after="0" w:line="240" w:lineRule="auto"/><w:rPr><w:rFonts w:asciiTheme="majorHAnsi" w:hAnsiTheme="majorHAnsi" w:cstheme="majorHAnsi"/><w:lang w:val="pt-BR"/></w:rPr></w:pPr><w:r><w:rPr><w:rFonts w:asciiTheme="majorHAnsi" w:hAnsiTheme="majorHAnsi" w:cstheme="majorHAnsi"/><w:b/><w:bCs/><w:lang w:val="pt-BR"/></w:rPr><w:t>Ano Fabricação: {{Ano Fabricação}}      Ano Modelo: {{Ano Modelo}}     Cor: {{Cor}}</w:t></w:r></w:p><w:p><w:pPr><w:spacing w:after="0" w:line="240" w:lineRule="auto"/><w:rPr><w:rFonts w:asciiTheme="majorHAnsi" w:hAnsiTheme="majorHAnsi" w:cstheme="majorHAnsi"/><w:lang w:val="pt-BR"/></w:rPr></w:pPr><w:r><w:rPr><w:rFonts w:asciiTheme="majorHAnsi" w:hAnsiTheme="majorHAnsi" w:cstheme="majorHAnsi"/><w:b/><w:bCs/><w:lang w:val="pt-BR"/></w:rPr><w:t>Placa: {{Placa}}                      Chassi: {{Chassi}}                           Renavan: {{Renavam}} </w:t></w:r></w:p><w:p><w:pPr><w:spacing w:after="0" w:line="240" w:lineRule="auto"/><w:rPr><w:rFonts w:asciiTheme="majorHAnsi" w:hAnsiTheme="majorHAnsi" w:cstheme="majorHAnsi"/><w:lang w:val="pt-BR"/></w:rPr></w:pPr><w:r><w:rPr><w:rFonts w:asciiTheme="majorHAnsi" w:hAnsiTheme="majorHAnsi" w:cstheme="majorHAnsi"/><w:b/><w:bCs/><w:lang w:val="pt-BR"/></w:rPr><w:t>Combustível: {{Combustível}}                                                     Km Atual: {{KM}}</w:t></w:r></w:p><w:p><w:pPr><w:spacing w:after="0" w:line="240" w:lineRule="auto"/><w:rPr><w:rFonts w:asciiTheme="majorHAnsi" w:hAnsiTheme="majorHAnsi" w:cstheme="majorHAnsi"/><w:lang w:val="pt-BR"/></w:rPr></w:pPr><w:r><w:rPr><w:rFonts w:asciiTheme="majorHAnsi" w:hAnsiTheme="majorHAnsi" w:cstheme="majorHAnsi"/><w:b/><w:bCs/><w:lang w:val="pt-BR"/></w:rPr><w:t>Valor da Venda: {{Valor da Venda}}</w:t></w:r></w:p><w:p><w:pPr><w:spacing w:after="0" w:line="240" w:lineRule="auto"/><w:rPr><w:rFonts w:asciiTheme="majorHAnsi" w:hAnsiTheme="majorHAnsi" w:cstheme="majorHAnsi"/><w:b/><w:bCs/><w:szCs w:val="20"/><w:lang w:val="pt-BR"/></w:rPr></w:pPr><w:r><w:rPr><w:noProof/><w:color w:val="555555"/><w:sz w:val="18"/><w:szCs w:val="18"/><w:lang w:val="pt-BR"/></w:rPr><mc:AlternateContent><mc:Choice Requires="wps"><w:drawing><wp:anchor distT="0" distB="0" distL="114300" distR="114300" simplePos="0" relativeHeight="251668480" behindDoc="0" locked="0" layoutInCell="1" allowOverlap="1" wp14:anchorId="06FEA610" wp14:editId="1E5E472F"><wp:simplePos x="0" y="0"/><wp:positionH relativeFrom="column"><wp:posOffset>51207</wp:posOffset></wp:positionH><wp:positionV relativeFrom="paragraph"><wp:posOffset>214198</wp:posOffset></wp:positionV><wp:extent cx="1718768" cy="248285"/><wp:effectExtent l="0" t="0" r="0" b="0"/><wp:wrapNone/><wp:docPr id="1905243769" name="Caixa de Texto 3"/><wp:cNvGraphicFramePr/><a:graphic xmlns:a="http://schemas.openxmlformats.org/drawingml/2006/main"><a:graphicData uri="http://schemas.microsoft.com/office/word/2010/wordprocessingShape"><wps:wsp><wps:cNvSpPr txBox="1"/><wps:spPr><a:xfrm><a:off x="0" y="0"/><a:ext cx="1718768" cy="248285"/></a:xfrm><a:prstGeom prst="rect"><a:avLst/></a:prstGeom><a:solidFill><a:schemeClr val="lt1"/></a:solidFill><a:ln w="6350"><a:noFill/></a:ln></wps:spPr><wps:txbx><w:txbxContent><w:p><w:pPr><w:rPr><w:b/><w:bCs/><w:color w:val="808080" w:themeColor="background1" w:themeShade="80"/><w:lang w:val="pt-BR"/></w:rPr></w:pPr><w:r><w:rPr><w:b/><w:bCs/><w:color w:val="808080" w:themeColor="background1" w:themeShade="80"/><w:lang w:val="pt-BR"/></w:rPr><w:t>Condições da Transação </w:t></w:r></w:p></w:txbxContent></wps:txbx><wps:bodyPr rot="0" spcFirstLastPara="0" vertOverflow="overflow" horzOverflow="overflow" vert="horz" wrap="square" lIns="91440" tIns="45720" rIns="91440" bIns="45720" numCol="1" spcCol="0" rtlCol="0" fromWordArt="0" anchor="t" anchorCtr="0" forceAA="0" compatLnSpc="1"><a:prstTxWarp prst="textNoShape"><a:avLst/></a:prstTxWarp><a:noAutofit/></wps:bodyPr></wps:wsp></a:graphicData></a:graphic><wp14:sizeRelH relativeFrom="margin"><wp14:pctWidth>0</wp14:pctWidth></wp14:sizeRelH><wp14:sizeRelV relativeFrom="margin"><wp14:pctHeight>0</wp14:pctHeight></wp14:sizeRelV></wp:anchor></w:drawing></mc:Choice><mc:Fallback><w:pict><v:shape w14:anchorId="06FEA610" id="_x0000_s1028" type="#_x0000_t202" style="position:absolute;margin-left:4.05pt;margin-top:16.85pt;width:135.35pt;height:19.55pt;z-index:251668480;visibility:visible;mso-wrap-style:square;mso-width-percent:0;mso-height-percent:0;mso-wrap-distance-left:9pt;mso-wrap-distance-top:0;mso-wrap-distance-right:9pt;mso-wrap-distance-bottom:0;mso-position-horizontal:absolute;mso-position-horizontal-relative:text;mso-position-vertical:absolute;mso-position-vertical-relative:text;mso-width-percent:0;mso-height-percent:0;mso-width-relative:margin;mso-height-relative:margin;v-text-anchor:top" o:gfxdata="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" fillcolor="white [3201]" stroked="f" strokeweight=".5pt"><v:textbox><w:txbxContent><w:p><w:pPr><w:rPr><w:b/><w:bCs/><w:color w:val="808080" w:themeColor="background1" w:themeShade="80"/><w:lang w:val="pt-BR"/></w:rPr></w:pPr><w:r><w:rPr><w:b/><w:bCs/><w:color w:val="808080" w:themeColor="background1" w:themeShade="80"/><w:lang w:val="pt-BR"/></w:rPr><w:t>Condições da Transação </w:t></w:r></w:p></w:txbxContent></v:textbox></v:shape></w:pict></mc:Fallback></mc:AlternateContent></w:r></w:p><w:p><w:pPr><w:spacing w:after="0" w:line="240" w:lineRule="auto"/><w:rPr><w:rFonts w:asciiTheme="majorHAnsi" w:hAnsiTheme="majorHAnsi" w:cstheme="majorHAnsi"/><w:szCs w:val="20"/><w:lang w:val="pt-BR"/></w:rPr></w:pPr></w:p><w:p><w:pPr><w:spacing w:after="0" w:line="240" w:lineRule="auto"/><w:rPr><w:rFonts w:asciiTheme="majorHAnsi" w:hAnsiTheme="majorHAnsi" w:cstheme="majorHAnsi"/><w:szCs w:val="20"/><w:lang w:val="pt-BR"/></w:rPr></w:pPr><w:r><w:rPr><w:noProof/><w:color w:val="FFFFFF" w:themeColor="background1"/><w:sz w:val="24"/><w:szCs w:val="24"/><w:lang w:val="pt-BR"/></w:rPr><mc:AlternateContent><mc:Choice Requires="wps"><w:drawing><wp:anchor distT="0" distB="0" distL="114300" distR="114300" simplePos="0" relativeHeight="251667456" behindDoc="0" locked="0" layoutInCell="1" allowOverlap="1" wp14:anchorId="1788E6E1" wp14:editId="2AE1750B"><wp:simplePos x="0" y="0"/><wp:positionH relativeFrom="column"><wp:posOffset>-73152</wp:posOffset></wp:positionH><wp:positionV relativeFrom="paragraph"><wp:posOffset>35993</wp:posOffset></wp:positionV><wp:extent cx="6385560" cy="548640"/><wp:effectExtent l="0" t="0" r="15240" b="22860"/><wp:wrapNone/><wp:docPr id="1624956887" name="Retângulo 1"/><wp:cNvGraphicFramePr/><a:graphic xmlns:a="http://schemas.openxmlformats.org/drawingml/2006/main"><a:graphicData uri="http://schemas.microsoft.com/office/word/2010/wordprocessingShape"><wps:wsp><wps:cNvSpPr/><wps:spPr><a:xfrm><a:off x="0" y="0"/><a:ext cx="6385560" cy="548640"/></a:xfrm><a:prstGeom prst="rect"><a:avLst/></a:prstGeom><a:noFill/><a:ln w="9525" cap="flat" cmpd="sng" algn="ctr"><a:solidFill><a:schemeClr val="dk1"/></a:solidFill><a:prstDash val="solid"/><a:round/><a:headEnd type="none" w="med" len="med"/><a:tailEnd type="none" w="med" len="med"/></a:ln></wps:spPr><wps:style><a:lnRef idx="0"><a:scrgbClr r="0" g="0" b="0"/></a:lnRef><a:fillRef idx="0"><a:scrgbClr r="0" g="0" b="0"/></a:fillRef><a:effectRef idx="0"><a:scrgbClr r="0" g="0" b="0"/></a:effectRef><a:fontRef idx="minor"><a:schemeClr val="dk1"/></a:fontRef></wps:style><wps:bodyPr rot="0" spcFirstLastPara="0" vertOverflow="overflow" horzOverflow="overflow" vert="horz" wrap="square" lIns="91440" tIns="45720" rIns="91440" bIns="45720" numCol="1" spcCol="0" rtlCol="0" fromWordArt="0" anchor="ctr" anchorCtr="0" forceAA="0" compatLnSpc="1"><a:prstTxWarp prst="textNoShape"><a:avLst/></a:prstTxWarp><a:noAutofit/></wps:bodyPr></wps:wsp></a:graphicData></a:graphic><wp14:sizeRelH relativeFrom="margin"><wp14:pctWidth>0</wp14:pctWidth></wp14:sizeRelH><wp14:sizeRelV relativeFrom="margin"><wp14:pctHeight>0</wp14:pctHeight></wp14:sizeRelV></wp:anchor></w:drawing></mc:Choice><mc:Fallback><w:pict><v:rect w14:anchorId="5428BBBC" id="Retângulo 1" o:spid="_x0000_s1026" style="position:absolute;margin-left:-5.75pt;margin-top:2.85pt;width:502.8pt;height:43.2pt;z-index:251667456;visibility:visible;mso-wrap-style:square;mso-width-percent:0;mso-height-percent:0;mso-wrap-distance-left:9pt;mso-wrap-distance-top:0;mso-wrap-distance-right:9pt;mso-wrap-distance-bottom:0;mso-position-horizontal:absolute;mso-position-horizontal-relative:text;mso-position-vertical:absolute;mso-position-vertical-relative:text;mso-width-percent:0;mso-height-percent:0;mso-width-relative:margin;mso-height-relative:margin;v-text-anchor:middle" o:gfxdata="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" filled="f" strokecolor="black [3200]"><v:stroke joinstyle="round"/></v:rect></w:pict></mc:Fallback></mc:AlternateContent></w:r></w:p><w:p><w:pPr><w:spacing w:after="0" w:line="240" w:lineRule="auto"/><w:rPr><w:rFonts w:asciiTheme="majorHAnsi" w:hAnsiTheme="majorHAnsi" w:cstheme="majorHAnsi"/><w:szCs w:val="20"/><w:lang w:val="pt-BR"/></w:rPr></w:pPr><w:r><w:rPr><w:rFonts w:asciiTheme="majorHAnsi" w:hAnsiTheme="majorHAnsi" w:cstheme="majorHAnsi"/><w:szCs w:val="20"/><w:lang w:val="pt-BR"/></w:rPr><w:t>Eu, {{Nome do Cliente}}, afirmo ter pago a JTS INTERMEDIAÇÕES E NEGOCIOS LTDA pela compra do veiculo citado, a quantia de: {{Valor da Venda}} ( Valor por extenso), a ser pago da forma descrita abaixo:</w:t></w:r></w:p><w:p><w:pPr><w:spacing w:after="0" w:line="240" w:lineRule="auto"/><w:rPr><w:rFonts w:asciiTheme="majorHAnsi" w:hAnsiTheme="majorHAnsi" w:cstheme="majorHAnsi"/><w:b/><w:bCs/><w:szCs w:val="20"/><w:lang w:val="pt-BR"/></w:rPr></w:pPr></w:p><w:p><w:pPr><w:spacing w:after="0" w:line="240" w:lineRule="auto"/><w:rPr><w:rFonts w:asciiTheme="majorHAnsi" w:hAnsiTheme="majorHAnsi" w:cstheme="majorHAnsi"/><w:b/><w:bCs/><w:szCs w:val="20"/><w:lang w:val="pt-BR"/></w:rPr></w:pPr><w:r><w:rPr><w:noProof/><w:color w:val="555555"/><w:sz w:val="18"/><w:szCs w:val="18"/><w:lang w:val="pt-BR"/></w:rPr><mc:AlternateContent><mc:Choice Requires="wps"><w:drawing><wp:anchor distT="0" distB="0" distL="114300" distR="114300" simplePos="0" relativeHeight="251671552" behindDoc="0" locked="0" layoutInCell="1" allowOverlap="1" wp14:anchorId="4B60A431" wp14:editId="781A1018"><wp:simplePos x="0" y="0"/><wp:positionH relativeFrom="column"><wp:posOffset>70790</wp:posOffset></wp:positionH><wp:positionV relativeFrom="paragraph"><wp:posOffset>131445</wp:posOffset></wp:positionV><wp:extent cx="1791970" cy="248285"/><wp:effectExtent l="0" t="0" r="0" b="0"/><wp:wrapNone/><wp:docPr id="1531168136" name="Caixa de Texto 3"/><wp:cNvGraphicFramePr/><a:graphic xmlns:a="http://schemas.openxmlformats.org/drawingml/2006/main"><a:graphicData uri="http://schemas.microsoft.com/office/word/2010/wordprocessingShape"><wps:wsp><wps:cNvSpPr txBox="1"/><wps:spPr><a:xfrm><a:off x="0" y="0"/><a:ext cx="1791970" cy="248285"/></a:xfrm><a:prstGeom prst="rect"><a:avLst/></a:prstGeom><a:solidFill><a:schemeClr val="lt1"/></a:solidFill><a:ln w="6350"><a:noFill/></a:ln></wps:spPr><wps:txbx><w:txbxContent><w:p><w:pPr><w:rPr><w:b/><w:bCs/><w:color w:val="808080" w:themeColor="background1" w:themeShade="80"/><w:lang w:val="pt-BR"/></w:rPr></w:pPr><w:r><w:rPr><w:b/><w:bCs/><w:color w:val="808080" w:themeColor="background1" w:themeShade="80"/><w:lang w:val="pt-BR"/></w:rPr><w:t>Condições do Pagamento</w:t></w:r></w:p></w:txbxContent></wps:txbx><wps:bodyPr rot="0" spcFirstLastPara="0" vertOverflow="overflow" horzOverflow="overflow" vert="horz" wrap="square" lIns="91440" tIns="45720" rIns="91440" bIns="45720" numCol="1" spcCol="0" rtlCol="0" fromWordArt="0" anchor="t" anchorCtr="0" forceAA="0" compatLnSpc="1"><a:prstTxWarp prst="textNoShape"><a:avLst/></a:prstTxWarp><a:noAutofit/></wps:bodyPr></wps:wsp></a:graphicData></a:graphic><wp14:sizeRelH relativeFrom="margin"><wp14:pctWidth>0</wp14:pctWidth></wp14:sizeRelH><wp14:sizeRelV relativeFrom="margin"><wp14:pctHeight>0</wp14:pctHeight></wp14:sizeRelV></wp:anchor></w:drawing></mc:Choice><mc:Fallback><w:pict><v:shape w14:anchorId="4B60A431" id="_x0000_s1029" type="#_x0000_t202" style="position:absolute;margin-left:5.55pt;margin-top:10.35pt;width:141.1pt;height:19.55pt;z-index:251671552;visibility:visible;mso-wrap-style:square;mso-width-percent:0;mso-height-percent:0;mso-wrap-distance-left:9pt;mso-wrap-distance-top:0;mso-wrap-distance-right:9pt;mso-wrap-distance-bottom:0;mso-position-horizontal:absolute;mso-position-horizontal-relative:text;mso-position-vertical:absolute;mso-position-vertical-relative:text;mso-width-percent:0;mso-height-percent:0;mso-width-relative:margin;mso-height-relative:margin;v-text-anchor:top" o:gfxdata="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" fillcolor="white [3201]" stroked="f" strokeweight=".5pt"><v:textbox><w:txbxContent><w:p><w:pPr><w:rPr><w:b/><w:bCs/><w:color w:val="808080" w:themeColor="background1" w:themeShade="80"/><w:lang w:val="pt-BR"/></w:rPr></w:pPr><w:r><w:rPr><w:b/><w:bCs/><w:color w:val="808080" w:themeColor="background1" w:themeShade="80"/><w:lang w:val="pt-BR"/></w:rPr><w:t>Condições do Pagamento</w:t></w:r></w:p></w:txbxContent></v:textbox></v:shape></w:pict></mc:Fallback></mc:AlternateContent></w:r></w:p><w:p><w:pPr><w:spacing w:after="0" w:line="240" w:lineRule="auto"/><w:rPr><w:rFonts w:asciiTheme="majorHAnsi" w:hAnsiTheme="majorHAnsi" w:cstheme="majorHAnsi"/><w:b/><w:bCs/><w:szCs w:val="20"/><w:lang w:val="pt-BR"/></w:rPr></w:pPr><w:r><w:rPr><w:noProof/><w:color w:val="FFFFFF" w:themeColor="background1"/><w:sz w:val="24"/><w:szCs w:val="24"/><w:lang w:val="pt-BR"/></w:rPr><mc:AlternateContent><mc:Choice Requires="wps"><w:drawing><wp:anchor distT="0" distB="0" distL="114300" distR="114300" simplePos="0" relativeHeight="251670528" behindDoc="0" locked="0" layoutInCell="1" allowOverlap="1" wp14:anchorId="29611BA2" wp14:editId="2140EFAC"><wp:simplePos x="0" y="0"/><wp:positionH relativeFrom="column"><wp:posOffset>-63195</wp:posOffset></wp:positionH><wp:positionV relativeFrom="paragraph"><wp:posOffset>109855</wp:posOffset></wp:positionV><wp:extent cx="6385560" cy="3095625"/><wp:effectExtent l="0" t="0" r="15240" b="28575"/><wp:wrapNone/><wp:docPr id="966023408" name="Retângulo 1"/><wp:cNvGraphicFramePr/><a:graphic xmlns:a="http://schemas.openxmlformats.org/drawingml/2006/main"><a:graphicData uri="http://schemas.microsoft.com/office/word/2010/wordprocessingShape"><wps:wsp><wps:cNvSpPr/><wps:spPr><a:xfrm><a:off x="0" y="0"/><a:ext cx="6385560" cy="3095625"/></a:xfrm><a:prstGeom prst="rect"><a:avLst/></a:prstGeom><a:noFill/><a:ln w="9525" cap="flat" cmpd="sng" algn="ctr"><a:solidFill><a:schemeClr val="dk1"/></a:solidFill><a:prstDash val="solid"/><a:round/><a:headEnd type="none" w="med" len="med"/><a:tailEnd type="none" w="med" len="med"/></a:ln></wps:spPr><wps:style><a:lnRef idx="0"><a:scrgbClr r="0" g="0" b="0"/></a:lnRef><a:fillRef idx="0"><a:scrgbClr r="0" g="0" b="0"/></a:fillRef><a:effectRef idx="0"><a:scrgbClr r="0" g="0" b="0"/></a:effectRef><a:fontRef idx="minor"><a:schemeClr val="dk1"/></a:fontRef></wps:style><wps:bodyPr rot="0" spcFirstLastPara="0" vertOverflow="overflow" horzOverflow="overflow" vert="horz" wrap="square" lIns="91440" tIns="45720" rIns="91440" bIns="45720" numCol="1" spcCol="0" rtlCol="0" fromWordArt="0" anchor="ctr" anchorCtr="0" forceAA="0" compatLnSpc="1"><a:prstTxWarp prst="textNoShape"><a:avLst/></a:prstTxWarp><a:noAutofit/></wps:bodyPr></wps:wsp></a:graphicData></a:graphic><wp14:sizeRelH relativeFrom="margin"><wp14:pctWidth>0</wp14:pctWidth></wp14:sizeRelH><wp14:sizeRelV relativeFrom="margin"><wp14:pctHeight>0</wp14:pctHeight></wp14:sizeRelV></wp:anchor></w:drawing></mc:Choice><mc:Fallback><w:pict><v:rect w14:anchorId="61ADDDEF" id="Retângulo 1" o:spid="_x0000_s1026" style="position:absolute;margin-left:-5pt;margin-top:8.65pt;width:502.8pt;height:243.75pt;z-index:251670528;visibility:visible;mso-wrap-style:square;mso-width-percent:0;mso-height-percent:0;mso-wrap-distance-left:9pt;mso-wrap-distance-top:0;mso-wrap-distance-right:9pt;mso-wrap-distance-bottom:0;mso-position-horizontal:absolute;mso-position-horizontal-relative:text;mso-position-vertical:absolute;mso-position-vertical-relative:text;mso-width-percent:0;mso-height-percent:0;mso-width-relative:margin;mso-height-relative:margin;v-text-anchor:middle" o:gfxdata="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" filled="f" strokecolor="black [3200]"><v:stroke joinstyle="round"/></v:rect></w:pict></mc:Fallback></mc:AlternateContent></w:r></w:p><w:p><w:pPr><w:spacing w:after="0" w:line="240" w:lineRule="auto"/><w:rPr><w:rFonts w:asciiTheme="majorHAnsi" w:hAnsiTheme="majorHAnsi" w:cstheme="majorHAnsi"/><w:b/><w:bCs/><w:szCs w:val="20"/><w:lang w:val="pt-BR"/></w:rPr></w:pPr></w:p><w:p><w:pPr><w:spacing w:after="0" w:line="240" w:lineRule="auto"/><w:rPr><w:rFonts w:asciiTheme="majorHAnsi" w:hAnsiTheme="majorHAnsi" w:cstheme="majorHAnsi"/><w:b/><w:bCs/><w:szCs w:val="20"/><w:lang w:val="pt-BR"/></w:rPr></w:pPr><w:r><w:rPr><w:rFonts w:asciiTheme="majorHAnsi" w:hAnsiTheme="majorHAnsi" w:cstheme="majorHAnsi"/><w:b/><w:bCs/><w:szCs w:val="20"/><w:lang w:val="pt-BR"/></w:rPr><w:t xml:space="preserve">Data da Venda: {{Data da Venda}}                 Valor de Venda: {{Valor da Venda}} </w:t></w:r></w:p><w:p><w:pPr><w:spacing w:after="0" w:line="240" w:lineRule="auto"/><w:rPr><w:rFonts w:asciiTheme="majorHAnsi" w:hAnsiTheme="majorHAnsi" w:cstheme="majorHAnsi"/><w:b/><w:bCs/><w:szCs w:val="20"/><w:lang w:val="pt-BR"/></w:rPr></w:pPr></w:p><w:p><w:pPr><w:spacing w:after="0" w:line="240" w:lineRule="auto"/><w:rPr><w:rFonts w:asciiTheme="majorHAnsi" w:hAnsiTheme="majorHAnsi" w:cstheme="majorHAnsi"/><w:color w:val="auto"/><w:szCs w:val="20"/><w:lang w:val="pt-BR"/></w:rPr></w:pPr><w:r><w:rPr><w:rFonts w:asciiTheme="majorHAnsi" w:hAnsiTheme="majorHAnsi" w:cstheme="majorHAnsi"/><w:b/><w:bCs/><w:color w:val="auto"/><w:szCs w:val="20"/><w:lang w:val="pt-BR"/></w:rPr><w:t xml:space="preserve">Forma de Pagamento: {{Forma de Pagamento}}</w:t></w:r></w:p><w:p><w:pPr><w:spacing w:after="0" w:line="240" w:lineRule="auto"/><w:rPr><w:rFonts w:asciiTheme="majorHAnsi" w:hAnsiTheme="majorHAnsi" w:cstheme="majorHAnsi"/><w:b/><w:bCs/><w:color w:val="auto"/><w:szCs w:val="20"/><w:lang w:val="pt-BR"/></w:rPr></w:pPr><w:r><w:rPr><w:rFonts w:asciiTheme="majorHAnsi" w:hAnsiTheme="majorHAnsi" w:cstheme="majorHAnsi"/><w:b/><w:bCs/><w:color w:val="auto"/><w:szCs w:val="20"/><w:lang w:val="pt-BR"/></w:rPr><w:t>Entrada: {{Valor da Entrada Financiamento}}</w:t></w:r></w:p><w:p><w:pPr><w:spacing w:after="0" w:line="240" w:lineRule="auto"/><w:rPr><w:rFonts w:asciiTheme="majorHAnsi" w:hAnsiTheme="majorHAnsi" w:cstheme="majorHAnsi"/><w:b/><w:bCs/><w:color w:val="auto"/><w:szCs w:val="20"/><w:lang w:val="pt-BR"/></w:rPr></w:pPr><w:r><w:rPr><w:rFonts w:asciiTheme="majorHAnsi" w:hAnsiTheme="majorHAnsi" w:cstheme="majorHAnsi"/><w:b/><w:bCs/><w:color w:val="auto"/><w:szCs w:val="20"/><w:lang w:val="pt-BR"/></w:rPr><w:t xml:space="preserve">Financeira: {{Financeira}}                          Data do Financiamento: {{Data do Financiamento}}</w:t></w:r></w:p><w:p><w:pPr><w:spacing w:after="0" w:line="240" w:lineRule="auto"/><w:rPr><w:rFonts w:asciiTheme="majorHAnsi" w:hAnsiTheme="majorHAnsi" w:cstheme="majorHAnsi"/><w:b/><w:bCs/><w:color w:val="auto"/><w:szCs w:val="20"/><w:lang w:val="pt-BR"/></w:rPr></w:pPr><w:r><w:rPr><w:rFonts w:asciiTheme="majorHAnsi" w:hAnsiTheme="majorHAnsi" w:cstheme="majorHAnsi"/><w:b/><w:bCs/><w:color w:val="auto"/><w:szCs w:val="20"/><w:lang w:val="pt-BR"/></w:rPr><w:t>Valor Financiado: {{Valor Financiado}}   Nº de Parcelas: {{N° de Parcelas}}   Valor das Parcelas: {{Valor das Parcelas}}</w:t></w:r></w:p><w:p><w:pPr><w:spacing w:after="0" w:line="240" w:lineRule="auto"/><w:rPr><w:rFonts w:asciiTheme="majorHAnsi" w:hAnsiTheme="majorHAnsi" w:cstheme="majorHAnsi"/><w:b/><w:bCs/><w:color w:val="auto"/><w:szCs w:val="20"/><w:lang w:val="pt-BR"/></w:rPr></w:pPr></w:p><w:p><w:pPr><w:spacing w:after="0" w:line="240" w:lineRule="auto"/><w:rPr><w:rFonts w:asciiTheme="majorHAnsi" w:hAnsiTheme="majorHAnsi" w:cstheme="majorHAnsi"/><w:b/><w:bCs/><w:color w:val="auto"/><w:szCs w:val="20"/><w:lang w:val="pt-BR"/></w:rPr></w:pPr><w:r><w:rPr><w:rFonts w:asciiTheme="majorHAnsi" w:hAnsiTheme="majorHAnsi" w:cstheme="majorHAnsi"/><w:b/><w:bCs/><w:color w:val="auto"/><w:szCs w:val="20"/><w:lang w:val="pt-BR"/></w:rPr><w:t xml:space="preserve">Veiculo na Troca: {{Veículo na Troca}}</w:t></w:r></w:p><w:p><w:pPr><w:spacing w:after="0" w:line="240" w:lineRule="auto"/><w:rPr><w:rFonts w:asciiTheme="majorHAnsi" w:hAnsiTheme="majorHAnsi" w:cstheme="majorHAnsi"/><w:lang w:val="pt-BR"/></w:rPr></w:pPr><w:r><w:rPr><w:rFonts w:asciiTheme="majorHAnsi" w:hAnsiTheme="majorHAnsi" w:cstheme="majorHAnsi"/><w:b/><w:bCs/><w:lang w:val="pt-BR"/></w:rPr><w:t>Marca: {{Marca Troca}}</w:t></w:r></w:p><w:p><w:pPr><w:spacing w:after="0" w:line="240" w:lineRule="auto"/><w:rPr><w:rFonts w:asciiTheme="majorHAnsi" w:hAnsiTheme="majorHAnsi" w:cstheme="majorHAnsi"/><w:lang w:val="pt-BR"/></w:rPr></w:pPr><w:r><w:rPr><w:rFonts w:asciiTheme="majorHAnsi" w:hAnsiTheme="majorHAnsi" w:cstheme="majorHAnsi"/><w:b/><w:bCs/><w:lang w:val="pt-BR"/></w:rPr><w:t>Modelo: {{Modelo Troca}}             Versão: {{Versão Troca}}</w:t></w:r></w:p><w:p><w:pPr><w:spacing w:after="0" w:line="240" w:lineRule="auto"/><w:rPr><w:rFonts w:asciiTheme="majorHAnsi" w:hAnsiTheme="majorHAnsi" w:cstheme="majorHAnsi"/><w:lang w:val="pt-BR"/></w:rPr></w:pPr><w:r><w:rPr><w:rFonts w:asciiTheme="majorHAnsi" w:hAnsiTheme="majorHAnsi" w:cstheme="majorHAnsi"/><w:b/><w:bCs/><w:lang w:val="pt-BR"/></w:rPr><w:t>Ano Fabricação: {{Ano Troca}}      Cor: {{Cor Troca}}</w:t></w:r></w:p><w:p><w:pPr><w:spacing w:after="0" w:line="240" w:lineRule="auto"/><w:rPr><w:rFonts w:asciiTheme="majorHAnsi" w:hAnsiTheme="majorHAnsi" w:cstheme="majorHAnsi"/><w:lang w:val="pt-BR"/></w:rPr></w:pPr><w:r><w:rPr><w:rFonts w:asciiTheme="majorHAnsi" w:hAnsiTheme="majorHAnsi" w:cstheme="majorHAnsi"/><w:b/><w:bCs/><w:lang w:val="pt-BR"/></w:rPr><w:t>Placa: {{Placa Troca}}                      Renavan: {{Renavam Troca}} </w:t></w:r></w:p><w:p><w:pPr><w:spacing w:after="0" w:line="240" w:lineRule="auto"/><w:rPr><w:rFonts w:asciiTheme="majorHAnsi" w:hAnsiTheme="majorHAnsi" w:cstheme="majorHAnsi"/><w:lang w:val="pt-BR"/></w:rPr></w:pPr><w:r><w:rPr><w:rFonts w:asciiTheme="majorHAnsi" w:hAnsiTheme="majorHAnsi" w:cstheme="majorHAnsi"/><w:b/><w:bCs/><w:lang w:val="pt-BR"/></w:rPr><w:t xml:space="preserve">Combustível: {{Combustível Troca}}                                                     Km Atual: {{KM Troca}}</w:t></w:r></w:p><w:p><w:pPr><w:spacing w:after="0" w:line="240" w:lineRule="auto"/><w:rPr><w:rFonts w:asciiTheme="majorHAnsi" w:hAnsiTheme="majorHAnsi" w:cstheme="majorHAnsi"/><w:lang w:val="pt-BR"/></w:rPr></w:pPr><w:r><w:rPr><w:rFonts w:asciiTheme="majorHAnsi" w:hAnsiTheme="majorHAnsi" w:cstheme="majorHAnsi"/><w:b/><w:bCs/><w:lang w:val="pt-BR"/></w:rPr><w:t xml:space="preserve">Valor da Compra: {{Valor da Compra}}</w:t></w:r></w:p><w:p><w:pPr><w:spacing w:after="0" w:line="240" w:lineRule="auto"/><w:rPr><w:rFonts w:asciiTheme="majorHAnsi" w:hAnsiTheme="majorHAnsi" w:cstheme="majorHAnsi"/><w:lang w:val="pt-BR"/></w:rPr></w:pPr><w:r><w:rPr><w:rFonts w:asciiTheme="majorHAnsi" w:hAnsiTheme="majorHAnsi" w:cstheme="majorHAnsi"/><w:b/><w:bCs/><w:lang w:val="pt-BR"/></w:rPr><w:t>Débitos: {{Débitos}}</w:t></w:r></w:p><w:p><w:pPr><w:spacing w:after="0" w:line="240" w:lineRule="auto"/><w:rPr><w:rFonts w:asciiTheme="majorHAnsi" w:hAnsiTheme="majorHAnsi" w:cstheme="majorHAnsi"/><w:lang w:val="pt-BR"/></w:rPr></w:pPr><w:r><w:rPr><w:rFonts w:asciiTheme="majorHAnsi" w:hAnsiTheme="majorHAnsi" w:cstheme="majorHAnsi"/><w:b/><w:bCs/><w:lang w:val="pt-BR"/></w:rPr><w:t>Detalhe dos débitos: {{Observação sobre Débitos}}</w:t></w:r></w:p><w:p><w:pPr><w:spacing w:after="0" w:line="240" w:lineRule="auto"/><w:rPr><w:rFonts w:asciiTheme="majorHAnsi" w:hAnsiTheme="majorHAnsi" w:cstheme="majorHAnsi"/><w:lang w:val="pt-BR"/></w:rPr></w:pPr><w:r><w:rPr><w:rFonts w:asciiTheme="majorHAnsi" w:hAnsiTheme="majorHAnsi" w:cstheme="majorHAnsi"/><w:b/><w:bCs/><w:lang w:val="pt-BR"/></w:rPr><w:t>Valor de Entrada (Valor da Compra – Débitos): {{Valor da Entrada Veículo Troca}}</w:t></w:r></w:p><w:p><w:pPr><w:spacing w:after="0" w:line="240" w:lineRule="auto"/><w:rPr><w:rFonts w:asciiTheme="majorHAnsi" w:hAnsiTheme="majorHAnsi" w:cstheme="majorHAnsi"/><w:lang w:val="pt-BR"/></w:rPr></w:pPr></w:p><w:p><w:pPr><w:spacing w:after="0" w:line="240" w:lineRule="auto"/><w:rPr><w:rFonts w:asciiTheme="majorHAnsi" w:hAnsiTheme="majorHAnsi" w:cstheme="majorHAnsi"/><w:lang w:val="pt-BR"/></w:rPr></w:pPr></w:p><w:p><w:pPr><w:spacing w:after="0" w:line="240" w:lineRule="auto"/><w:rPr><w:rFonts w:asciiTheme="majorHAnsi" w:hAnsiTheme="majorHAnsi" w:cstheme="majorHAnsi"/><w:lang w:val="pt-BR"/></w:rPr></w:pPr><w:r><w:rPr><w:noProof/><w:color w:val="555555"/><w:sz w:val="18"/><w:szCs w:val="18"/><w:lang w:val="pt-BR"/></w:rPr><mc:AlternateContent><mc:Choice Requires="wps"><w:drawing><wp:anchor distT="0" distB="0" distL="114300" distR="114300" simplePos="0" relativeHeight="251674624" behindDoc="0" locked="0" layoutInCell="1" allowOverlap="1" wp14:anchorId="145F6907" wp14:editId="28043652"><wp:simplePos x="0" y="0"/><wp:positionH relativeFrom="column"><wp:posOffset>73152</wp:posOffset></wp:positionH><wp:positionV relativeFrom="paragraph"><wp:posOffset>50317</wp:posOffset></wp:positionV><wp:extent cx="1250899" cy="248285"/><wp:effectExtent l="0" t="0" r="6985" b="0"/><wp:wrapNone/><wp:docPr id="903896546" name="Caixa de Texto 3"/><wp:cNvGraphicFramePr/><a:graphic xmlns:a="http://schemas.openxmlformats.org/drawingml/2006/main"><a:graphicData uri="http://schemas.microsoft.com/office/word/2010/wordprocessingShape"><wps:wsp><wps:cNvSpPr txBox="1"/><wps:spPr><a:xfrm><a:off x="0" y="0"/><a:ext cx="1250899" cy="248285"/></a:xfrm><a:prstGeom prst="rect"><a:avLst/></a:prstGeom><a:solidFill><a:schemeClr val="lt1"/></a:solidFill><a:ln w="6350"><a:noFill/></a:ln></wps:spPr><wps:txbx><w:txbxContent><w:p><w:pPr><w:rPr><w:b/><w:bCs/><w:color w:val="808080" w:themeColor="background1" w:themeShade="80"/><w:lang w:val="pt-BR"/></w:rPr></w:pPr><w:r><w:rPr><w:b/><w:bCs/><w:color w:val="808080" w:themeColor="background1" w:themeShade="80"/><w:lang w:val="pt-BR"/></w:rPr><w:t>Documentação</w:t></w:r></w:p></w:txbxContent></wps:txbx><wps:bodyPr rot="0" spcFirstLastPara="0" vertOverflow="overflow" horzOverflow="overflow" vert="horz" wrap="square" lIns="91440" tIns="45720" rIns="91440" bIns="45720" numCol="1" spcCol="0" rtlCol="0" fromWordArt="0" anchor="t" anchorCtr="0" forceAA="0" compatLnSpc="1"><a:prstTxWarp prst="textNoShape"><a:avLst/></a:prstTxWarp><a:noAutofit/></wps:bodyPr></wps:wsp></a:graphicData></a:graphic><wp14:sizeRelH relativeFrom="margin"><wp14:pctWidth>0</wp14:pctWidth></wp14:sizeRelH><wp14:sizeRelV relativeFrom="margin"><wp14:pctHeight>0</wp14:pctHeight></wp14:sizeRelV></wp:anchor></w:drawing></mc:Choice><mc:Fallback><w:pict><v:shape w14:anchorId="145F6907" id="_x0000_s1030" type="#_x0000_t202" style="position:absolute;margin-left:5.75pt;margin-top:3.95pt;width:98.5pt;height:19.55pt;z-index:251674624;visibility:visible;mso-wrap-style:square;mso-width-percent:0;mso-height-percent:0;mso-wrap-distance-left:9pt;mso-wrap-distance-top:0;mso-wrap-distance-right:9pt;mso-wrap-distance-bottom:0;mso-position-horizontal:absolute;mso-position-horizontal-relative:text;mso-position-vertical:absolute;mso-position-vertical-relative:text;mso-width-percent:0;mso-height-percent:0;mso-width-relative:margin;mso-height-relative:margin;v-text-anchor:top" o:gfxdata="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" fillcolor="white [3201]" stroked="f" strokeweight=".5pt"><v:textbox><w:txbxContent><w:p><w:pPr><w:rPr><w:b/><w:bCs/><w:color w:val="808080" w:themeColor="background1" w:themeShade="80"/><w:lang w:val="pt-BR"/></w:rPr></w:pPr><w:r><w:rPr><w:b/><w:bCs/><w:color w:val="808080" w:themeColor="background1" w:themeShade="80"/><w:lang w:val="pt-BR"/></w:rPr><w:t>Documentação</w:t></w:r></w:p></w:txbxContent></v:textbox></v:shape></w:pict></mc:Fallback></mc:AlternateContent></w:r><w:r><w:rPr><w:rFonts w:asciiTheme="majorHAnsi" w:hAnsiTheme="majorHAnsi" w:cstheme="majorHAnsi"/><w:noProof/><w:lang w:val="pt-BR"/></w:rPr><mc:AlternateContent><mc:Choice Requires="wps"><w:drawing><wp:anchor distT="0" distB="0" distL="114300" distR="114300" simplePos="0" relativeHeight="251672576" behindDoc="0" locked="0" layoutInCell="1" allowOverlap="1" wp14:anchorId="22FA0A02" wp14:editId="3A2326B8"><wp:simplePos x="0" y="0"/><wp:positionH relativeFrom="column"><wp:posOffset>-58522</wp:posOffset></wp:positionH><wp:positionV relativeFrom="paragraph"><wp:posOffset>174677</wp:posOffset></wp:positionV><wp:extent cx="6379210" cy="438912"/><wp:effectExtent l="0" t="0" r="21590" b="18415"/><wp:wrapNone/><wp:docPr id="831407363" name="Retângulo 5"/><wp:cNvGraphicFramePr/><a:graphic xmlns:a="http://schemas.openxmlformats.org/drawingml/2006/main"><a:graphicData uri="http://schemas.microsoft.com/office/word/2010/wordprocessingShape"><wps:wsp><wps:cNvSpPr/><wps:spPr><a:xfrm><a:off x="0" y="0"/><a:ext cx="6379210" cy="438912"/></a:xfrm><a:prstGeom prst="rect"><a:avLst/></a:prstGeom><a:noFill/><a:ln w="9525" cap="flat" cmpd="sng" algn="ctr"><a:solidFill><a:schemeClr val="dk1"/></a:solidFill><a:prstDash val="solid"/><a:round/><a:headEnd type="none" w="med" len="med"/><a:tailEnd type="none" w="med" len="med"/></a:ln></wps:spPr><wps:style><a:lnRef idx="0"><a:scrgbClr r="0" g="0" b="0"/></a:lnRef><a:fillRef idx="0"><a:scrgbClr r="0" g="0" b="0"/></a:fillRef><a:effectRef idx="0"><a:scrgbClr r="0" g="0" b="0"/></a:effectRef><a:fontRef idx="minor"><a:schemeClr val="dk1"/></a:fontRef></wps:style><wps:bodyPr rot="0" spcFirstLastPara="0" vertOverflow="overflow" horzOverflow="overflow" vert="horz" wrap="square" lIns="91440" tIns="45720" rIns="91440" bIns="45720" numCol="1" spcCol="0" rtlCol="0" fromWordArt="0" anchor="ctr" anchorCtr="0" forceAA="0" compatLnSpc="1"><a:prstTxWarp prst="textNoShape"><a:avLst/></a:prstTxWarp><a:noAutofit/></wps:bodyPr></wps:wsp></a:graphicData></a:graphic><wp14:sizeRelH relativeFrom="margin"><wp14:pctWidth>0</wp14:pctWidth></wp14:sizeRelH><wp14:sizeRelV relativeFrom="margin"><wp14:pctHeight>0</wp14:pctHeight></wp14:sizeRelV></wp:anchor></w:drawing></mc:Choice><mc:Fallback><w:pict><v:rect w14:anchorId="50609028" id="Retângulo 5" o:spid="_x0000_s1026" style="position:absolute;margin-left:-4.6pt;margin-top:13.75pt;width:502.3pt;height:34.55pt;z-index:251672576;visibility:visible;mso-wrap-style:square;mso-width-percent:0;mso-height-percent:0;mso-wrap-distance-left:9pt;mso-wrap-distance-top:0;mso-wrap-distance-right:9pt;mso-wrap-distance-bottom:0;mso-position-horizontal:absolute;mso-position-horizontal-relative:text;mso-position-vertical:absolute;mso-position-vertical-relative:text;mso-width-percent:0;mso-height-percent:0;mso-width-relative:margin;mso-height-relative:margin;v-text-anchor:middle" o:gfxdata="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" filled="f" strokecolor="black [3200]"><v:stroke joinstyle="round"/></v:rect></w:pict></mc:Fallback></mc:AlternateContent></w:r></w:p><w:p><w:pPr><w:spacing w:after="0" w:line="240" w:lineRule="auto"/><w:rPr><w:rFonts w:asciiTheme="majorHAnsi" w:hAnsiTheme="majorHAnsi" w:cstheme="majorHAnsi"/><w:lang w:val="pt-BR"/></w:rPr></w:pPr></w:p><w:p><w:pPr><w:spacing w:after="0" w:line="240" w:lineRule="auto"/><w:rPr><w:rFonts w:asciiTheme="majorHAnsi" w:hAnsiTheme="majorHAnsi" w:cstheme="majorHAnsi"/><w:color w:val="auto"/><w:lang w:val="pt-BR"/></w:rPr></w:pPr><w:r><w:rPr><w:rFonts w:asciiTheme="majorHAnsi" w:hAnsiTheme="majorHAnsi" w:cstheme="majorHAnsi"/><w:color w:val="auto"/><w:lang w:val="pt-BR"/></w:rPr><w:t>{{Documentação Veículo}}</w:t></w:r></w:p><w:p><w:pPr><w:spacing w:after="0" w:line="240" w:lineRule="auto"/><w:rPr><w:rFonts w:asciiTheme="majorHAnsi" w:hAnsiTheme="majorHAnsi" w:cstheme="majorHAnsi"/><w:lang w:val="pt-BR"/></w:rPr></w:pPr><w:r><w:rPr><w:noProof/><w:color w:val="555555"/><w:sz w:val="18"/><w:szCs w:val="18"/><w:lang w:val="pt-BR"/></w:rPr><w:lastRenderedPageBreak/><mc:AlternateContent><mc:Choice Requires="wps"><w:drawing><wp:anchor distT="0" distB="0" distL="114300" distR="114300" simplePos="0" relativeHeight="251680768" behindDoc="0" locked="0" layoutInCell="1" allowOverlap="1" wp14:anchorId="2EA83F9D" wp14:editId="1879DC18"><wp:simplePos x="0" y="0"/><wp:positionH relativeFrom="column"><wp:posOffset>131674</wp:posOffset></wp:positionH><wp:positionV relativeFrom="paragraph"><wp:posOffset>-131674</wp:posOffset></wp:positionV><wp:extent cx="1543507" cy="248285"/><wp:effectExtent l="0" t="0" r="0" b="0"/><wp:wrapNone/><wp:docPr id="61563809" name="Caixa de Texto 3"/><wp:cNvGraphicFramePr/><a:graphic xmlns:a="http://schemas.openxmlformats.org/drawingml/2006/main"><a:graphicData uri="http://schemas.microsoft.com/office/word/2010/wordprocessingShape"><wps:wsp><wps:cNvSpPr txBox="1"/><wps:spPr><a:xfrm><a:off x="0" y="0"/><a:ext cx="1543507" cy="248285"/></a:xfrm><a:prstGeom prst="rect"><a:avLst/></a:prstGeom><a:solidFill><a:schemeClr val="lt1"/></a:solidFill><a:ln w="6350"><a:noFill/></a:ln></wps:spPr><wps:txbx><w:txbxContent><w:p><w:pPr><w:rPr><w:b/><w:bCs/><w:color w:val="808080" w:themeColor="background1" w:themeShade="80"/><w:lang w:val="pt-BR"/></w:rPr></w:pPr><w:r><w:rPr><w:b/><w:bCs/><w:color w:val="808080" w:themeColor="background1" w:themeShade="80"/><w:lang w:val="pt-BR"/></w:rPr><w:t xml:space="preserve">Retirada do Veículo</w:t></w:r></w:p></w:txbxContent></wps:txbx><wps:bodyPr rot="0" spcFirstLastPara="0" vertOverflow="overflow" horzOverflow="overflow" vert="horz" wrap="square" lIns="91440" tIns="45720" rIns="91440" bIns="45720" numCol="1" spcCol="0" rtlCol="0" fromWordArt="0" anchor="t" anchorCtr="0" forceAA="0" compatLnSpc="1"><a:prstTxWarp prst="textNoShape"><a:avLst/></a:prstTxWarp><a:noAutofit/></wps:bodyPr></wps:wsp></a:graphicData></a:graphic><wp14:sizeRelH relativeFrom="margin"><wp14:pctWidth>0</wp14:pctWidth></wp14:sizeRelH><wp14:sizeRelV relativeFrom="margin"><wp14:pctHeight>0</wp14:pctHeight></wp14:sizeRelV></wp:anchor></w:drawing></mc:Choice><mc:Fallback><w:pict><v:shape w14:anchorId="2EA83F9D" id="_x0000_s1031" type="#_x0000_t202" style="position:absolute;margin-left:10.35pt;margin-top:-10.35pt;width:121.55pt;height:19.55pt;z-index:251680768;visibility:visible;mso-wrap-style:square;mso-width-percent:0;mso-height-percent:0;mso-wrap-distance-left:9pt;mso-wrap-distance-top:0;mso-wrap-distance-right:9pt;mso-wrap-distance-bottom:0;mso-position-horizontal:absolute;mso-position-horizontal-relative:text;mso-position-vertical:absolute;mso-position-vertical-relative:text;mso-width-percent:0;mso-height-percent:0;mso-width-relative:margin;mso-height-relative:margin;v-text-anchor:top" o:gfxdata="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" fillcolor="white [3201]" stroked="f" strokeweight=".5pt"><v:textbox><w:txbxContent><w:p><w:pPr><w:rPr><w:b/><w:bCs/><w:color w:val="808080" w:themeColor="background1" w:themeShade="80"/><w:lang w:val="pt-BR"/></w:rPr></w:pPr><w:r><w:rPr><w:b/><w:bCs/><w:color w:val="808080" w:themeColor="background1" w:themeShade="80"/><w:lang w:val="pt-BR"/></w:rPr><w:t xml:space="preserve">Retirada do Veículo</w:t></w:r></w:p></w:txbxContent></v:textbox></v:shape></w:pict></mc:Fallback></mc:AlternateContent></w:r><w:r><w:rPr><w:rFonts w:asciiTheme="majorHAnsi" w:hAnsiTheme="majorHAnsi" w:cstheme="majorHAnsi"/><w:noProof/><w:lang w:val="pt-BR"/></w:rPr><mc:AlternateContent><mc:Choice Requires="wps"><w:drawing><wp:anchor distT="0" distB="0" distL="114300" distR="114300" simplePos="0" relativeHeight="251679744" behindDoc="0" locked="0" layoutInCell="1" allowOverlap="1" wp14:anchorId="74EAEBD4" wp14:editId="248F0758"><wp:simplePos x="0" y="0"/><wp:positionH relativeFrom="column"><wp:posOffset>0</wp:posOffset></wp:positionH><wp:positionV relativeFrom="paragraph"><wp:posOffset>-6985</wp:posOffset></wp:positionV><wp:extent cx="6379210" cy="438785"/><wp:effectExtent l="0" t="0" r="21590" b="18415"/><wp:wrapNone/><wp:docPr id="251581415" name="Retângulo 5"/><wp:cNvGraphicFramePr/><a:graphic xmlns:a="http://schemas.openxmlformats.org/drawingml/2006/main"><a:graphicData uri="http://schemas.microsoft.com/office/word/2010/wordprocessingShape"><wps:wsp><wps:cNvSpPr/><wps:spPr><a:xfrm><a:off x="0" y="0"/><a:ext cx="6379210" cy="438785"/></a:xfrm><a:prstGeom prst="rect"><a:avLst/></a:prstGeom><a:noFill/><a:ln w="9525" cap="flat" cmpd="sng" algn="ctr"><a:solidFill><a:schemeClr val="dk1"/></a:solidFill><a:prstDash val="solid"/><a:round/><a:headEnd type="none" w="med" len="med"/><a:tailEnd type="none" w="med" len="med"/></a:ln></wps:spPr><wps:style><a:lnRef idx="0"><a:scrgbClr r="0" g="0" b="0"/></a:lnRef><a:fillRef idx="0"><a:scrgbClr r="0" g="0" b="0"/></a:fillRef><a:effectRef idx="0"><a:scrgbClr r="0" g="0" b="0"/></a:effectRef><a:fontRef idx="minor"><a:schemeClr val="dk1"/></a:fontRef></wps:style><wps:bodyPr rot="0" spcFirstLastPara="0" vertOverflow="overflow" horzOverflow="overflow" vert="horz" wrap="square" lIns="91440" tIns="45720" rIns="91440" bIns="45720" numCol="1" spcCol="0" rtlCol="0" fromWordArt="0" anchor="ctr" anchorCtr="0" forceAA="0" compatLnSpc="1"><a:prstTxWarp prst="textNoShape"><a:avLst/></a:prstTxWarp><a:noAutofit/></wps:bodyPr></wps:wsp></a:graphicData></a:graphic><wp14:sizeRelH relativeFrom="margin"><wp14:pctWidth>0</wp14:pctWidth></wp14:sizeRelH><wp14:sizeRelV relativeFrom="margin"><wp14:pctHeight>0</wp14:pctHeight></wp14:sizeRelV></wp:anchor></w:drawing></mc:Choice><mc:Fallback><w:pict><v:rect w14:anchorId="490DDC60" id="Retângulo 5" o:spid="_x0000_s1026" style="position:absolute;margin-left:0;margin-top:-.55pt;width:502.3pt;height:34.55pt;z-index:251679744;visibility:visible;mso-wrap-style:square;mso-width-percent:0;mso-height-percent:0;mso-wrap-distance-left:9pt;mso-wrap-distance-top:0;mso-wrap-distance-right:9pt;mso-wrap-distance-bottom:0;mso-position-horizontal:absolute;mso-position-horizontal-relative:text;mso-position-vertical:absolute;mso-position-vertical-relative:text;mso-width-percent:0;mso-height-percent:0;mso-width-relative:margin;mso-height-relative:margin;v-text-anchor:middle" o:gfxdata="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" filled="f" strokecolor="black [3200]"><v:stroke joinstyle="round"/></v:rect></w:pict></mc:Fallback></mc:AlternateContent></w:r><w:r><w:rPr><w:rFonts w:asciiTheme="majorHAnsi" w:hAnsiTheme="majorHAnsi" w:cstheme="majorHAnsi"/><w:noProof/><w:lang w:val="pt-BR"/></w:rPr><mc:AlternateContent><mc:Choice Requires="wps"><w:drawing><wp:anchor distT="0" distB="0" distL="114300" distR="114300" simplePos="0" relativeHeight="251676672" behindDoc="0" locked="0" layoutInCell="1" allowOverlap="1" wp14:anchorId="45FFBD53" wp14:editId="75B855EB"><wp:simplePos x="0" y="0"/><wp:positionH relativeFrom="column"><wp:posOffset>58420</wp:posOffset></wp:positionH><wp:positionV relativeFrom="paragraph"><wp:posOffset>-8009992</wp:posOffset></wp:positionV><wp:extent cx="6379210" cy="438912"/><wp:effectExtent l="0" t="0" r="21590" b="18415"/><wp:wrapNone/><wp:docPr id="1169075387" name="Retângulo 5"/><wp:cNvGraphicFramePr/><a:graphic xmlns:a="http://schemas.openxmlformats.org/drawingml/2006/main"><a:graphicData uri="http://schemas.microsoft.com/office/word/2010/wordprocessingShape"><wps:wsp><wps:cNvSpPr/><wps:spPr><a:xfrm><a:off x="0" y="0"/><a:ext cx="6379210" cy="438912"/></a:xfrm><a:prstGeom prst="rect"><a:avLst/></a:prstGeom><a:noFill/><a:ln w="9525" cap="flat" cmpd="sng" algn="ctr"><a:solidFill><a:schemeClr val="dk1"/></a:solidFill><a:prstDash val="solid"/><a:round/><a:headEnd type="none" w="med" len="med"/><a:tailEnd type="none" w="med" len="med"/></a:ln></wps:spPr><wps:style><a:lnRef idx="0"><a:scrgbClr r="0" g="0" b="0"/></a:lnRef><a:fillRef idx="0"><a:scrgbClr r="0" g="0" b="0"/></a:fillRef><a:effectRef idx="0"><a:scrgbClr r="0" g="0" b="0"/></a:effectRef><a:fontRef idx="minor"><a:schemeClr val="dk1"/></a:fontRef></wps:style><wps:bodyPr rot="0" spcFirstLastPara="0" vertOverflow="overflow" horzOverflow="overflow" vert="horz" wrap="square" lIns="91440" tIns="45720" rIns="91440" bIns="45720" numCol="1" spcCol="0" rtlCol="0" fromWordArt="0" anchor="ctr" anchorCtr="0" forceAA="0" compatLnSpc="1"><a:prstTxWarp prst="textNoShape"><a:avLst/></a:prstTxWarp><a:noAutofit/></wps:bodyPr></wps:wsp></a:graphicData></a:graphic><wp14:sizeRelH relativeFrom="margin"><wp14:pctWidth>0</wp14:pctWidth></wp14:sizeRelH><wp14:sizeRelV relativeFrom="margin"><wp14:pctHeight>0</wp14:pctHeight></wp14:sizeRelV></wp:anchor></w:drawing></mc:Choice><mc:Fallback><w:pict><v:rect w14:anchorId="27A27FCF" id="Retângulo 5" o:spid="_x0000_s1026" style="position:absolute;margin-left:4.6pt;margin-top:-630.7pt;width:502.3pt;height:34.55pt;z-index:251676672;visibility:visible;mso-wrap-style:square;mso-width-percent:0;mso-height-percent:0;mso-wrap-distance-left:9pt;mso-wrap-distance-top:0;mso-wrap-distance-right:9pt;mso-wrap-distance-bottom:0;mso-position-horizontal:absolute;mso-position-horizontal-relative:text;mso-position-vertical:absolute;mso-position-vertical-relative:text;mso-width-percent:0;mso-height-percent:0;mso-width-relative:margin;mso-height-relative:margin;v-text-anchor:middle" o:gfxdata="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" filled="f" strokecolor="black [3200]"><v:stroke joinstyle="round"/></v:rect></w:pict></mc:Fallback></mc:AlternateContent></w:r><w:r><w:rPr><w:noProof/><w:color w:val="555555"/><w:sz w:val="18"/><w:szCs w:val="18"/><w:lang w:val="pt-BR"/></w:rPr><mc:AlternateContent><mc:Choice Requires="wps"><w:drawing><wp:anchor distT="0" distB="0" distL="114300" distR="114300" simplePos="0" relativeHeight="251677696" behindDoc="0" locked="0" layoutInCell="1" allowOverlap="1" wp14:anchorId="7D0B1ABE" wp14:editId="3BC50F5C"><wp:simplePos x="0" y="0"/><wp:positionH relativeFrom="column"><wp:posOffset>190094</wp:posOffset></wp:positionH><wp:positionV relativeFrom="paragraph"><wp:posOffset>-8134350</wp:posOffset></wp:positionV><wp:extent cx="1250899" cy="248285"/><wp:effectExtent l="0" t="0" r="6985" b="0"/><wp:wrapNone/><wp:docPr id="516805717" name="Caixa de Texto 3"/><wp:cNvGraphicFramePr/><a:graphic xmlns:a="http://schemas.openxmlformats.org/drawingml/2006/main"><a:graphicData uri="http://schemas.microsoft.com/office/word/2010/wordprocessingShape"><wps:wsp><wps:cNvSpPr txBox="1"/><wps:spPr><a:xfrm><a:off x="0" y="0"/><a:ext cx="1250899" cy="248285"/></a:xfrm><a:prstGeom prst="rect"><a:avLst/></a:prstGeom><a:solidFill><a:schemeClr val="lt1"/></a:solidFill><a:ln w="6350"><a:noFill/></a:ln></wps:spPr><wps:txbx><w:txbxContent><w:p><w:pPr><w:rPr><w:b/><w:bCs/><w:color w:val="808080" w:themeColor="background1" w:themeShade="80"/><w:lang w:val="pt-BR"/></w:rPr></w:pPr><w:r><w:rPr><w:b/><w:bCs/><w:color w:val="808080" w:themeColor="background1" w:themeShade="80"/><w:lang w:val="pt-BR"/></w:rPr><w:t>Documentação</w:t></w:r></w:p></w:txbxContent></wps:txbx><wps:bodyPr rot="0" spcFirstLastPara="0" vertOverflow="overflow" horzOverflow="overflow" vert="horz" wrap="square" lIns="91440" tIns="45720" rIns="91440" bIns="45720" numCol="1" spcCol="0" rtlCol="0" fromWordArt="0" anchor="t" anchorCtr="0" forceAA="0" compatLnSpc="1"><a:prstTxWarp prst="textNoShape"><a:avLst/></a:prstTxWarp><a:noAutofit/></wps:bodyPr></wps:wsp></a:graphicData></a:graphic><wp14:sizeRelH relativeFrom="margin"><wp14:pctWidth>0</wp14:pctWidth></wp14:sizeRelH><wp14:sizeRelV relativeFrom="margin"><wp14:pctHeight>0</wp14:pctHeight></wp14:sizeRelV></wp:anchor></w:drawing></mc:Choice><mc:Fallback><w:pict><v:shape w14:anchorId="7D0B1ABE" id="_x0000_s1032" type="#_x0000_t202" style="position:absolute;margin-left:14.95pt;margin-top:-640.5pt;width:98.5pt;height:19.55pt;z-index:251677696;visibility:visible;mso-wrap-style:square;mso-width-percent:0;mso-height-percent:0;mso-wrap-distance-left:9pt;mso-wrap-distance-top:0;mso-wrap-distance-right:9pt;mso-wrap-distance-bottom:0;mso-position-horizontal:absolute;mso-position-horizontal-relative:text;mso-position-vertical:absolute;mso-position-vertical-relative:text;mso-width-percent:0;mso-height-percent:0;mso-width-relative:margin;mso-height-relative:margin;v-text-anchor:top" o:gfxdata="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" fillcolor="white [3201]" stroked="f" strokeweight=".5pt"><v:textbox><w:txbxContent><w:p><w:pPr><w:rPr><w:b/><w:bCs/><w:color w:val="808080" w:themeColor="background1" w:themeShade="80"/><w:lang w:val="pt-BR"/></w:rPr></w:pPr><w:r><w:rPr><w:b/><w:bCs/><w:color w:val="808080" w:themeColor="background1" w:themeShade="80"/><w:lang w:val="pt-BR"/></w:rPr><w:t>Documentação</w:t></w:r></w:p></w:txbxContent></v:textbox></v:shape></w:pict></mc:Fallback></mc:AlternateContent></w:r></w:p><w:p><w:pPr><w:spacing w:after="0" w:line="240" w:lineRule="auto"/><w:rPr><w:rFonts w:asciiTheme="majorHAnsi" w:hAnsiTheme="majorHAnsi" w:cstheme="majorHAnsi"/><w:lang w:val="pt-BR"/></w:rPr></w:pPr><w:r><w:rPr><w:rFonts w:asciiTheme="majorHAnsi" w:hAnsiTheme="majorHAnsi" w:cstheme="majorHAnsi"/><w:lang w:val="pt-BR"/></w:rPr><w:t xml:space="preserve">   Data: _____/_____/__________ Hora: _____:_____ KM: {{KM}}</w:t></w:r></w:p><w:p><w:pPr><w:spacing w:after="0" w:line="240" w:lineRule="auto"/><w:rPr><w:rFonts w:asciiTheme="majorHAnsi" w:hAnsiTheme="majorHAnsi" w:cstheme="majorHAnsi"/><w:lang w:val="pt-BR"/></w:rPr></w:pPr></w:p><w:p><w:pPr><w:spacing w:after="0" w:line="240" w:lineRule="auto"/><w:rPr><w:rFonts w:asciiTheme="majorHAnsi" w:hAnsiTheme="majorHAnsi" w:cstheme="majorHAnsi"/><w:lang w:val="pt-BR"/></w:rPr></w:pPr></w:p><w:p><w:pPr><w:spacing w:after="0" w:line="240" w:lineRule="auto"/><w:rPr><w:rFonts w:asciiTheme="majorHAnsi" w:hAnsiTheme="majorHAnsi" w:cstheme="majorHAnsi"/><w:b/><w:bCs/><w:lang w:val="pt-BR"/></w:rPr></w:pPr><w:r><w:rPr><w:rFonts w:asciiTheme="majorHAnsi" w:hAnsiTheme="majorHAnsi" w:cstheme="majorHAnsi"/><w:b/><w:bCs/><w:lang w:val="pt-BR"/></w:rPr><w:t>TERMO DE CONSENTIMENTO</w:t></w:r></w:p><w:p><w:pPr><w:spacing w:after="0" w:line="240" w:lineRule="auto"/><w:rPr><w:rFonts w:asciiTheme="majorHAnsi" w:hAnsiTheme="majorHAnsi" w:cstheme="majorHAnsi"/><w:lang w:val="pt-BR"/></w:rPr></w:pPr><w:r><w:rPr><w:rFonts w:asciiTheme="majorHAnsi" w:hAnsiTheme="majorHAnsi" w:cstheme="majorHAnsi"/><w:lang w:val="pt-BR"/></w:rPr><w:t>Termo de consentimento para armazenamento e tratamento de dados pessoais em conformidade com a LGPD. O proprietário, na condição de titular dos dados pessoais, manifesta livre, informada e inequívoca concordância com o tratamento de seus dados pessoais pela (BROTHERS MULTIMARCAS) para finalidade específica, em conformidade com a Lei nº 13.709 – Lei Geral de Proteção de Dados Pessoais (LGPD), tendo assegurado seu direito de acesso, retificação e eliminação dos mesmos, devendo, para tanto, solicitar à (BROTHERS MULTIMARCAS). O presente termo isenta a (INTERMEDIADORA) (BROTHERS MULTIMARCAS), das responsabilidades e obrigações inerentes a infrações de trânsito e eventuais IMPOSTOS E/OU TAXAS (IPVA/SEGURO OBRIGATÓRIO/ LICENCIAMENTO) que ocorrerem a partir desta data, já o Comprador (CLIENTE) se responsabiliza por infrações de trânsito e eventuais IMPOSTOS E/OU TAXAS (IPVA/SEGURO OBRIGATÓRIO/ LICENCIAMENTO) que ocorrerem a partir desta data. O comprador (a) declara neste recibo, haver examinado o veículo acima descrito. Este veículo possui garantia em conformidade com o Art.26 II C.D.C. Prevalecerá o que ocorrer primeiro. No caso da venda do veículo pela INTERMEDIADORA e o COMPRADOR (CLIENTE) desistir da venda em questão dentro do prazo legal, fica estipulado a cobrança no valor da comissão de 6% (Seis) deste contrato, para que a INTERMEDIADORA pague todas as despesas em decorrência da venda. Fica acordado entre as partes que a negociação está sendo realizada através de intermediação entre o (VENDEDOR (PROPRIETÁRIO)) e o (COMPRADOR (CLIENTE)), deste modo a loja se dispõe de todos os recursos administrativos para viabilizar a operação de COMPRA/VENDA.E por estar de pleno acordo com o aqui descrito, assina o comprador o presente.</w:t></w:r></w:p><w:p><w:pPr><w:spacing w:after="0" w:line="240" w:lineRule="auto"/><w:rPr><w:rFonts w:asciiTheme="majorHAnsi" w:hAnsiTheme="majorHAnsi" w:cstheme="majorHAnsi"/><w:lang w:val="pt-BR"/></w:rPr></w:pPr></w:p><w:p><w:pPr><w:rPr><w:rFonts w:asciiTheme="majorHAnsi" w:hAnsiTheme="majorHAnsi" w:cstheme="majorHAnsi"/><w:lang w:val="pt-BR"/></w:rPr></w:pPr></w:p><w:p><w:pPr><w:rPr><w:lang w:val="pt-BR"/></w:rPr></w:pPr><w:r><w:rPr><w:b/><w:bCs/><w:lang w:val="pt-BR"/></w:rPr><w:t xml:space="preserve">Guarulhos, {{Data da Venda}}.</w:t></w:r></w:p><w:p><w:pPr><w:spacing w:after="0" w:line="240" w:lineRule="auto"/><w:rPr><w:b/><w:bCs/><w:lang w:val="pt-BR"/></w:rPr></w:pPr></w:p><w:p><w:pPr><w:spacing w:after="0" w:line="240" w:lineRule="auto"/><w:rPr><w:b/><w:bCs/><w:lang w:val="pt-BR"/></w:rPr></w:pPr></w:p><w:p><w:pPr><w:spacing w:after="0" w:line="240" w:lineRule="auto"/><w:rPr><w:b/><w:bCs/><w:lang w:val="pt-BR"/></w:rPr></w:pPr><w:r><w:rPr><w:b/><w:bCs/><w:lang w:val="pt-BR"/></w:rPr><w:t>_____________________________________________________________</w:t></w:r></w:p><w:p><w:pPr><w:spacing w:after="0" w:line="240" w:lineRule="auto"/><w:rPr><w:lang w:val="pt-BR"/></w:rPr></w:pPr><w:r><w:rPr><w:b/><w:bCs/><w:lang w:val="pt-BR"/></w:rPr><w:t>Cliente: {{Nome do Cliente}}CPF: {{CPF}}</w:t></w:r></w:p><w:p><w:pPr><w:spacing w:after="0" w:line="240" w:lineRule="auto"/><w:rPr><w:lang w:val="pt-BR"/></w:rPr></w:pPr></w:p><w:p><w:pPr><w:spacing w:after="0" w:line="240" w:lineRule="auto"/><w:rPr><w:lang w:val="pt-BR"/></w:rPr></w:pPr></w:p><w:p><w:pPr><w:spacing w:after="0" w:line="240" w:lineRule="auto"/><w:rPr><w:b/><w:bCs/><w:lang w:val="pt-BR"/></w:rPr></w:pPr></w:p><w:p><w:pPr><w:spacing w:after="0" w:line="240" w:lineRule="auto"/><w:rPr><w:b/><w:bCs/><w:lang w:val="pt-BR"/></w:rPr></w:pPr></w:p><w:p><w:pPr><w:spacing w:after="0" w:line="240" w:lineRule="auto"/><w:rPr><w:b/><w:bCs/><w:lang w:val="pt-BR"/></w:rPr></w:pPr></w:p><w:p><w:pPr><w:spacing w:after="0" w:line="240" w:lineRule="auto"/><w:rPr><w:b/><w:bCs/><w:lang w:val="pt-BR"/></w:rPr></w:pPr><w:r><w:rPr><w:b/><w:bCs/><w:lang w:val="pt-BR"/></w:rPr><w:t>_____________________________________________________________</w:t></w:r></w:p><w:p><w:pPr><w:spacing w:after="0" w:line="240" w:lineRule="auto"/><w:rPr><w:b/><w:bCs/><w:lang w:val="pt-BR"/></w:rPr></w:pPr><w:r><w:rPr><w:b/><w:bCs/><w:lang w:val="pt-BR"/></w:rPr><w:t>JTS INTERMEDIAÇÕES E NEGOCIOS LTDA</w:t></w:r></w:p><w:p><w:pPr><w:spacing w:after="0" w:line="240" w:lineRule="auto"/><w:rPr><w:b/><w:bCs/><w:lang w:val="pt-BR"/></w:rPr></w:pPr></w:p><w:p><w:pPr><w:spacing w:after="0" w:line="240" w:lineRule="auto"/><w:rPr><w:b/><w:bCs/><w:lang w:val="pt-BR"/></w:rPr></w:pPr></w:p><w:p><w:pPr><w:spacing w:after="0" w:line="240" w:lineRule="auto"/><w:rPr><w:b/><w:bCs/><w:lang w:val="pt-BR"/></w:rPr></w:pPr></w:p><w:p><w:pPr><w:spacing w:after="0" w:line="240" w:lineRule="auto"/><w:rPr><w:b/><w:bCs/><w:lang w:val="pt-BR"/></w:rPr></w:pPr><w:r><w:rPr><w:b/><w:bCs/><w:lang w:val="pt-BR"/></w:rPr><w:t>_____________________________________________________________</w:t></w:r></w:p><w:p><w:pPr><w:spacing w:after="0" w:line="240" w:lineRule="auto"/><w:rPr><w:b/><w:bCs/><w:lang w:val="pt-BR"/></w:rPr></w:pPr><w:r><w:rPr><w:b/><w:bCs/><w:lang w:val="pt-BR"/></w:rPr><w:t>Vendedor: {{Vendedor}}</w:t></w:r></w:p><w:p><w:pPr><w:spacing w:after="0" w:line="240" w:lineRule="auto"/><w:rPr><w:b/><w:bCs/><w:lang w:val="pt-BR"/></w:rPr></w:pPr></w:p><w:p><w:pPr><w:spacing w:after="0" w:line="240" w:lineRule="auto"/><w:rPr><w:b/><w:bCs/><w:lang w:val="pt-BR"/></w:rPr></w:pPr></w:p><w:p><w:pPr><w:spacing w:after="0" w:line="240" w:lineRule="auto"/><w:rPr><w:b/><w:bCs/><w:lang w:val="pt-BR"/></w:rPr></w:pPr></w:p><w:p><w:pPr><w:spacing w:after="0" w:line="240" w:lineRule="auto"/><w:rPr><w:b/><w:bCs/><w:lang w:val="pt-BR"/></w:rPr></w:pPr></w:p><w:p><w:pPr><w:spacing w:after="0" w:line="240" w:lineRule="auto"/><w:rPr><w:b/><w:bCs/><w:lang w:val="pt-BR"/></w:rPr></w:pPr></w:p><w:p><w:pPr><w:spacing w:after="0" w:line="240" w:lineRule="auto"/><w:rPr><w:b/><w:bCs/><w:lang w:val="pt-BR"/></w:rPr></w:pPr></w:p><w:p><w:pPr><w:rPr><w:lang w:val="pt-BR"/></w:rPr></w:pPr><w:r><w:rPr><w:b/><w:bCs/><w:lang w:val="pt-BR"/></w:rPr><w:t>Testemunhas:</w:t></w:r></w:p><w:p><w:pPr><w:numPr><w:ilvl w:val="0"/><w:numId w:val="15"/></w:numPr><w:rPr><w:lang w:val="pt-BR"/></w:rPr></w:pPr><w:r><w:rPr><w:lang w:val="pt-BR"/></w:rPr><w:t>___________________________________ - CPF: ______________</w:t></w:r></w:p><w:p><w:pPr><w:numPr><w:ilvl w:val="0"/><w:numId w:val="15"/></w:numPr><w:rPr><w:lang w:val="pt-BR"/></w:rPr></w:pPr><w:r><w:rPr><w:lang w:val="pt-BR"/></w:rPr><w:t>___________________________________ - CPF: ______________</w:t></w:r></w:p><w:p><w:pPr><w:rPr><w:lang w:val="pt-BR"/></w:rPr></w:pPr></w:p><w:sectPr><w:pgSz w:w="12240" w:h="15840"/><w:pgMar w:top="1152" w:right="1152" w:bottom="1152" w:left="1152" w:header="720" w:footer="720" w:gutter="0"/><w:cols w:space="720"/><w:docGrid w:linePitch="360"/></w:sectPr></w:body></w:document>
 </file>
 
 <file path=word/numbering.xml><?xml version="1.0" encoding="utf-8"?>

</xml_diff>

<commit_message>
fix: substitui template contrato_venda.docx por versao corrigida
</commit_message>
<xml_diff>
--- a/backend/templates/contrato_venda.docx
+++ b/backend/templates/contrato_venda.docx
@@ -1,6 +1,4478 @@
 
-<file path=word/document.xml><?xml version="1.0" encoding="UTF-8" standalone="yes"?>
-<w:document xmlns:wpc="http://schemas.microsoft.com/office/word/2010/wordprocessingCanvas" xmlns:cx="http://schemas.microsoft.com/office/drawing/2014/chartex" xmlns:cx1="http://schemas.microsoft.com/office/drawing/2015/9/8/chartex" xmlns:cx2="http://schemas.microsoft.com/office/drawing/2015/10/21/chartex" xmlns:cx3="http://schemas.microsoft.com/office/drawing/2016/5/9/chartex" xmlns:cx4="http://schemas.microsoft.com/office/drawing/2016/5/10/chartex" xmlns:cx5="http://schemas.microsoft.com/office/drawing/2016/5/11/chartex" xmlns:cx6="http://schemas.microsoft.com/office/drawing/2016/5/12/chartex" xmlns:cx7="http://schemas.microsoft.com/office/drawing/2016/5/13/chartex" xmlns:cx8="http://schemas.microsoft.com/office/drawing/2016/5/14/chartex" xmlns:mc="http://schemas.openxmlformats.org/markup-compatibility/2006" xmlns:aink="http://schemas.microsoft.com/office/drawing/2016/ink" xmlns:am3d="http://schemas.microsoft.com/office/drawing/2017/model3d" xmlns:o="urn:schemas-microsoft-com:office:office" xmlns:oel="http://schemas.microsoft.com/office/2019/extlst" xmlns:r="http://schemas.openxmlformats.org/officeDocument/2006/relationships" xmlns:m="http://schemas.openxmlformats.org/officeDocument/2006/math" xmlns:v="urn:schemas-microsoft-com:vml" xmlns:wp14="http://schemas.microsoft.com/office/word/2010/wordprocessingDrawing" xmlns:wp="http://schemas.openxmlformats.org/drawingml/2006/wordprocessingDrawing" xmlns:w10="urn:schemas-microsoft-com:office:word" xmlns:w="http://schemas.openxmlformats.org/wordprocessingml/2006/main" xmlns:w14="http://schemas.microsoft.com/office/word/2010/wordml" xmlns:w15="http://schemas.microsoft.com/office/word/2012/wordml" xmlns:w16cex="http://schemas.microsoft.com/office/word/2018/wordml/cex" xmlns:w16cid="http://schemas.microsoft.com/office/word/2016/wordml/cid" xmlns:w16="http://schemas.microsoft.com/office/word/2018/wordml" xmlns:w16du="http://schemas.microsoft.com/office/word/2023/wordml/word16du" xmlns:w16sdtdh="http://schemas.microsoft.com/office/word/2020/wordml/sdtdatahash" xmlns:w16sdtfl="http://schemas.microsoft.com/office/word/2024/wordml/sdtformatlock" xmlns:w16se="http://schemas.microsoft.com/office/word/2015/wordml/symex" xmlns:wpg="http://schemas.microsoft.com/office/word/2010/wordprocessingGroup" xmlns:wpi="http://schemas.microsoft.com/office/word/2010/wordprocessingInk" xmlns:wne="http://schemas.microsoft.com/office/word/2006/wordml" xmlns:wps="http://schemas.microsoft.com/office/word/2010/wordprocessingShape" mc:Ignorable="w14 w15 w16se w16cid w16 w16cex w16sdtdh w16sdtfl w16du wp14"><w:body><w:p><w:pPr><w:spacing w:after="40"/><w:jc w:val="center"/><w:rPr><w:color w:val="808080" w:themeColor="background1" w:themeShade="80"/><w:sz w:val="24"/><w:szCs w:val="24"/><w:lang w:val="pt-BR"/></w:rPr></w:pPr><w:r><w:rPr><w:b/><w:color w:val="808080" w:themeColor="background1" w:themeShade="80"/><w:sz w:val="24"/><w:szCs w:val="24"/><w:lang w:val="pt-BR"/></w:rPr><w:t>JTS INTERMEDIAÇÕES E NEGÓCIOS LTDA</w:t></w:r></w:p><w:p><w:pPr><w:spacing w:after="280"/><w:jc w:val="center"/><w:rPr><w:color w:val="555555"/><w:sz w:val="18"/><w:szCs w:val="18"/><w:lang w:val="pt-BR"/></w:rPr></w:pPr><w:r><w:rPr><w:color w:val="555555"/><w:sz w:val="18"/><w:szCs w:val="18"/><w:lang w:val="pt-BR"/></w:rPr><w:t>CNPJ: 48.573.595/0001-09Informações Cliente</w:t></w:r></w:p></w:txbxContent></wps:txbx><wps:bodyPr rot="0" spcFirstLastPara="0" vertOverflow="overflow" horzOverflow="overflow" vert="horz" wrap="square" lIns="91440" tIns="45720" rIns="91440" bIns="45720" numCol="1" spcCol="0" rtlCol="0" fromWordArt="0" anchor="t" anchorCtr="0" forceAA="0" compatLnSpc="1"><a:prstTxWarp prst="textNoShape"><a:avLst/></a:prstTxWarp><a:noAutofit/></wps:bodyPr></wps:wsp></a:graphicData></a:graphic><wp14:sizeRelH relativeFrom="margin"><wp14:pctWidth>0</wp14:pctWidth></wp14:sizeRelH><wp14:sizeRelV relativeFrom="margin"><wp14:pctHeight>0</wp14:pctHeight></wp14:sizeRelV></wp:anchor></w:drawing></mc:Choice><mc:Fallback><w:pict><v:shapetype w14:anchorId="678F545F" id="_x0000_t202" coordsize="21600,21600" o:spt="202" path="m,l,21600r21600,l21600,xe"><v:stroke joinstyle="miter"/><v:path gradientshapeok="t" o:connecttype="rect"/></v:shapetype><v:shape id="Caixa de Texto 3" o:spid="_x0000_s1026" type="#_x0000_t202" style="position:absolute;left:0;text-align:left;margin-left:10.35pt;margin-top:26.35pt;width:118.1pt;height:17.85pt;z-index:251659264;visibility:visible;mso-wrap-style:square;mso-width-percent:0;mso-height-percent:0;mso-wrap-distance-left:9pt;mso-wrap-distance-top:0;mso-wrap-distance-right:9pt;mso-wrap-distance-bottom:0;mso-position-horizontal:absolute;mso-position-horizontal-relative:text;mso-position-vertical:absolute;mso-position-vertical-relative:text;mso-width-percent:0;mso-height-percent:0;mso-width-relative:margin;mso-height-relative:margin;v-text-anchor:top" o:gfxdata="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" fillcolor="white [3201]" stroked="f" strokeweight=".5pt"><v:textbox><w:txbxContent><w:p><w:pPr><w:rPr><w:b/><w:bCs/><w:color w:val="808080" w:themeColor="background1" w:themeShade="80"/></w:rPr></w:pPr><w:r><w:rPr><w:b/><w:bCs/><w:color w:val="808080" w:themeColor="background1" w:themeShade="80"/></w:rPr><w:t xml:space="preserve">Informações Cliente</w:t></w:r></w:p></w:txbxContent></v:textbox></v:shape></w:pict></mc:Fallback></mc:AlternateContent></w:r><w:r><w:rPr><w:rFonts w:ascii="Arial" w:hAnsi="Arial"/><w:color w:val="808080" w:themeColor="background1" w:themeShade="80"/><w:sz w:val="24"/><w:szCs w:val="24"/><w:lang w:val="pt-BR"/></w:rPr><w:t>CONTRATO DE VENDA</w:t></w:r></w:p><w:p><w:pPr><w:pStyle w:val="SemEspaamento"/><w:rPr><w:rFonts w:asciiTheme="majorHAnsi" w:hAnsiTheme="majorHAnsi" w:cstheme="majorHAnsi"/><w:sz w:val="20"/><w:szCs w:val="20"/><w:lang w:val="pt-BR"/></w:rPr></w:pPr><w:r><w:rPr><w:rFonts w:ascii="Arial" w:hAnsi="Arial"/><w:noProof/><w:color w:val="FFFFFF" w:themeColor="background1"/><w:sz w:val="24"/><w:szCs w:val="24"/><w:lang w:val="pt-BR"/></w:rPr><mc:AlternateContent><mc:Choice Requires="wps"><w:drawing><wp:anchor distT="0" distB="0" distL="114300" distR="114300" simplePos="0" relativeHeight="251658240" behindDoc="0" locked="0" layoutInCell="1" allowOverlap="1" wp14:anchorId="11820F6D" wp14:editId="7AA75AAD"><wp:simplePos x="0" y="0"/><wp:positionH relativeFrom="column"><wp:posOffset>-58522</wp:posOffset></wp:positionH><wp:positionV relativeFrom="paragraph"><wp:posOffset>36881</wp:posOffset></wp:positionV><wp:extent cx="6371540" cy="1041121"/><wp:effectExtent l="0" t="0" r="10795" b="26035"/><wp:wrapNone/><wp:docPr id="783150584" name="Retângulo 1"/><wp:cNvGraphicFramePr/><a:graphic xmlns:a="http://schemas.openxmlformats.org/drawingml/2006/main"><a:graphicData uri="http://schemas.microsoft.com/office/word/2010/wordprocessingShape"><wps:wsp><wps:cNvSpPr/><wps:spPr><a:xfrm><a:off x="0" y="0"/><a:ext cx="6371540" cy="1041121"/></a:xfrm><a:prstGeom prst="rect"><a:avLst/></a:prstGeom><a:noFill/><a:ln w="9525" cap="flat" cmpd="sng" algn="ctr"><a:solidFill><a:schemeClr val="dk1"/></a:solidFill><a:prstDash val="solid"/><a:round/><a:headEnd type="none" w="med" len="med"/><a:tailEnd type="none" w="med" len="med"/></a:ln></wps:spPr><wps:style><a:lnRef idx="0"><a:scrgbClr r="0" g="0" b="0"/></a:lnRef><a:fillRef idx="0"><a:scrgbClr r="0" g="0" b="0"/></a:fillRef><a:effectRef idx="0"><a:scrgbClr r="0" g="0" b="0"/></a:effectRef><a:fontRef idx="minor"><a:schemeClr val="dk1"/></a:fontRef></wps:style><wps:bodyPr rot="0" spcFirstLastPara="0" vertOverflow="overflow" horzOverflow="overflow" vert="horz" wrap="square" lIns="91440" tIns="45720" rIns="91440" bIns="45720" numCol="1" spcCol="0" rtlCol="0" fromWordArt="0" anchor="ctr" anchorCtr="0" forceAA="0" compatLnSpc="1"><a:prstTxWarp prst="textNoShape"><a:avLst/></a:prstTxWarp><a:noAutofit/></wps:bodyPr></wps:wsp></a:graphicData></a:graphic><wp14:sizeRelH relativeFrom="margin"><wp14:pctWidth>0</wp14:pctWidth></wp14:sizeRelH><wp14:sizeRelV relativeFrom="margin"><wp14:pctHeight>0</wp14:pctHeight></wp14:sizeRelV></wp:anchor></w:drawing></mc:Choice><mc:Fallback><w:pict><v:rect w14:anchorId="056EE728" id="Retângulo 1" o:spid="_x0000_s1026" style="position:absolute;margin-left:-4.6pt;margin-top:2.9pt;width:501.7pt;height:82pt;z-index:251658240;visibility:visible;mso-wrap-style:square;mso-width-percent:0;mso-height-percent:0;mso-wrap-distance-left:9pt;mso-wrap-distance-top:0;mso-wrap-distance-right:9pt;mso-wrap-distance-bottom:0;mso-position-horizontal:absolute;mso-position-horizontal-relative:text;mso-position-vertical:absolute;mso-position-vertical-relative:text;mso-width-percent:0;mso-height-percent:0;mso-width-relative:margin;mso-height-relative:margin;v-text-anchor:middle" o:gfxdata="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" filled="f" strokecolor="black [3200]"><v:stroke joinstyle="round"/></v:rect></w:pict></mc:Fallback></mc:AlternateContent></w:r></w:p><w:p><w:pPr><w:pStyle w:val="SemEspaamento"/><w:rPr><w:rFonts w:asciiTheme="majorHAnsi" w:hAnsiTheme="majorHAnsi" w:cstheme="majorHAnsi"/><w:sz w:val="20"/><w:szCs w:val="20"/><w:lang w:val="pt-BR"/></w:rPr></w:pPr><w:r><w:rPr><w:rFonts w:asciiTheme="majorHAnsi" w:hAnsiTheme="majorHAnsi" w:cstheme="majorHAnsi"/><w:b/><w:bCs/><w:sz w:val="20"/><w:szCs w:val="20"/><w:lang w:val="pt-BR"/></w:rPr><w:t>Nome: {{Nome do Cliente}}</w:t></w:r></w:p><w:p><w:pPr><w:pStyle w:val="SemEspaamento"/><w:rPr><w:rFonts w:asciiTheme="majorHAnsi" w:hAnsiTheme="majorHAnsi" w:cstheme="majorHAnsi"/><w:sz w:val="20"/><w:szCs w:val="20"/><w:lang w:val="pt-BR"/></w:rPr></w:pPr><w:r><w:rPr><w:rFonts w:asciiTheme="majorHAnsi" w:hAnsiTheme="majorHAnsi" w:cstheme="majorHAnsi"/><w:b/><w:bCs/><w:sz w:val="20"/><w:szCs w:val="20"/><w:lang w:val="pt-BR"/></w:rPr><w:t>RG n.: {{RG}}                                                                    CPF/MF n.: {{CPF}}</w:t></w:r></w:p><w:p><w:pPr><w:pStyle w:val="SemEspaamento"/><w:rPr><w:rFonts w:asciiTheme="majorHAnsi" w:hAnsiTheme="majorHAnsi" w:cstheme="majorHAnsi"/><w:sz w:val="20"/><w:szCs w:val="20"/><w:lang w:val="pt-BR"/></w:rPr></w:pPr><w:r><w:rPr><w:rFonts w:asciiTheme="majorHAnsi" w:hAnsiTheme="majorHAnsi" w:cstheme="majorHAnsi"/><w:b/><w:bCs/><w:sz w:val="20"/><w:szCs w:val="20"/><w:lang w:val="pt-BR"/></w:rPr><w:t>Endereco: {{Rua/Av}}, {{Número}}                               Bairro: {{Bairro}}</w:t></w:r></w:p><w:p><w:pPr><w:pStyle w:val="SemEspaamento"/><w:rPr><w:rFonts w:asciiTheme="majorHAnsi" w:hAnsiTheme="majorHAnsi" w:cstheme="majorHAnsi"/><w:sz w:val="20"/><w:szCs w:val="20"/><w:lang w:val="pt-BR"/></w:rPr></w:pPr><w:r><w:rPr><w:rFonts w:asciiTheme="majorHAnsi" w:hAnsiTheme="majorHAnsi" w:cstheme="majorHAnsi"/><w:b/><w:bCs/><w:sz w:val="20"/><w:szCs w:val="20"/><w:lang w:val="pt-BR"/></w:rPr><w:t>Cidade/Municipio: {{Cidade}}                                      Estado: {{Estado}}                        Cep:{{Cep}}.</w:t></w:r></w:p><w:p><w:pPr><w:pStyle w:val="SemEspaamento"/><w:rPr><w:rFonts w:asciiTheme="majorHAnsi" w:hAnsiTheme="majorHAnsi" w:cstheme="majorHAnsi"/><w:sz w:val="20"/><w:szCs w:val="20"/><w:lang w:val="pt-BR"/></w:rPr></w:pPr><w:r><w:rPr><w:rFonts w:asciiTheme="majorHAnsi" w:hAnsiTheme="majorHAnsi" w:cstheme="majorHAnsi"/><w:b/><w:bCs/><w:sz w:val="20"/><w:szCs w:val="20"/><w:lang w:val="pt-BR"/></w:rPr><w:t>Cel: {{Celular}}.                                                                E-mail: {{Email}}</w:t></w:r></w:p><w:p><w:pPr><w:rPr><w:rFonts w:asciiTheme="majorHAnsi" w:hAnsiTheme="majorHAnsi" w:cstheme="majorHAnsi"/><w:lang w:val="pt-BR"/></w:rPr></w:pPr><w:r><w:rPr><w:noProof/><w:color w:val="555555"/><w:sz w:val="18"/><w:szCs w:val="18"/><w:lang w:val="pt-BR"/></w:rPr><mc:AlternateContent><mc:Choice Requires="wps"><w:drawing><wp:anchor distT="0" distB="0" distL="114300" distR="114300" simplePos="0" relativeHeight="251665408" behindDoc="0" locked="0" layoutInCell="1" allowOverlap="1" wp14:anchorId="44729B3B" wp14:editId="13676B9F"><wp:simplePos x="0" y="0"/><wp:positionH relativeFrom="column"><wp:posOffset>51207</wp:posOffset></wp:positionH><wp:positionV relativeFrom="paragraph"><wp:posOffset>269723</wp:posOffset></wp:positionV><wp:extent cx="1324052" cy="248285"/><wp:effectExtent l="0" t="0" r="9525" b="0"/><wp:wrapNone/><wp:docPr id="952711642" name="Caixa de Texto 3"/><wp:cNvGraphicFramePr/><a:graphic xmlns:a="http://schemas.openxmlformats.org/drawingml/2006/main"><a:graphicData uri="http://schemas.microsoft.com/office/word/2010/wordprocessingShape"><wps:wsp><wps:cNvSpPr txBox="1"/><wps:spPr><a:xfrm><a:off x="0" y="0"/><a:ext cx="1324052" cy="248285"/></a:xfrm><a:prstGeom prst="rect"><a:avLst/></a:prstGeom><a:solidFill><a:schemeClr val="lt1"/></a:solidFill><a:ln w="6350"><a:noFill/></a:ln></wps:spPr><wps:txbx><w:txbxContent><w:p><w:pPr><w:rPr><w:b/><w:bCs/><w:color w:val="808080" w:themeColor="background1" w:themeShade="80"/></w:rPr></w:pPr><w:r><w:rPr><w:b/><w:bCs/><w:color w:val="808080" w:themeColor="background1" w:themeShade="80"/></w:rPr><w:t>Dados do Veículo</w:t></w:r></w:p></w:txbxContent></wps:txbx><wps:bodyPr rot="0" spcFirstLastPara="0" vertOverflow="overflow" horzOverflow="overflow" vert="horz" wrap="square" lIns="91440" tIns="45720" rIns="91440" bIns="45720" numCol="1" spcCol="0" rtlCol="0" fromWordArt="0" anchor="t" anchorCtr="0" forceAA="0" compatLnSpc="1"><a:prstTxWarp prst="textNoShape"><a:avLst/></a:prstTxWarp><a:noAutofit/></wps:bodyPr></wps:wsp></a:graphicData></a:graphic><wp14:sizeRelH relativeFrom="margin"><wp14:pctWidth>0</wp14:pctWidth></wp14:sizeRelH><wp14:sizeRelV relativeFrom="margin"><wp14:pctHeight>0</wp14:pctHeight></wp14:sizeRelV></wp:anchor></w:drawing></mc:Choice><mc:Fallback><w:pict><v:shape w14:anchorId="44729B3B" id="_x0000_s1027" type="#_x0000_t202" style="position:absolute;margin-left:4.05pt;margin-top:21.25pt;width:104.25pt;height:19.55pt;z-index:251665408;visibility:visible;mso-wrap-style:square;mso-width-percent:0;mso-height-percent:0;mso-wrap-distance-left:9pt;mso-wrap-distance-top:0;mso-wrap-distance-right:9pt;mso-wrap-distance-bottom:0;mso-position-horizontal:absolute;mso-position-horizontal-relative:text;mso-position-vertical:absolute;mso-position-vertical-relative:text;mso-width-percent:0;mso-height-percent:0;mso-width-relative:margin;mso-height-relative:margin;v-text-anchor:top" o:gfxdata="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" fillcolor="white [3201]" stroked="f" strokeweight=".5pt"><v:textbox><w:txbxContent><w:p><w:pPr><w:rPr><w:b/><w:bCs/><w:color w:val="808080" w:themeColor="background1" w:themeShade="80"/></w:rPr></w:pPr><w:r><w:rPr><w:b/><w:bCs/><w:color w:val="808080" w:themeColor="background1" w:themeShade="80"/></w:rPr><w:t>Dados do Veículo</w:t></w:r></w:p></w:txbxContent></v:textbox></v:shape></w:pict></mc:Fallback></mc:AlternateContent></w:r></w:p><w:p><w:pPr><w:rPr><w:rFonts w:asciiTheme="majorHAnsi" w:hAnsiTheme="majorHAnsi" w:cstheme="majorHAnsi"/><w:lang w:val="pt-BR"/></w:rPr></w:pPr><w:r><w:rPr><w:noProof/><w:color w:val="FFFFFF" w:themeColor="background1"/><w:sz w:val="24"/><w:szCs w:val="24"/><w:lang w:val="pt-BR"/></w:rPr><mc:AlternateContent><mc:Choice Requires="wps"><w:drawing><wp:anchor distT="0" distB="0" distL="114300" distR="114300" simplePos="0" relativeHeight="251664384" behindDoc="0" locked="0" layoutInCell="1" allowOverlap="1" wp14:anchorId="50CA5240" wp14:editId="6F754A48"><wp:simplePos x="0" y="0"/><wp:positionH relativeFrom="column"><wp:posOffset>-73025</wp:posOffset></wp:positionH><wp:positionV relativeFrom="paragraph"><wp:posOffset>86665</wp:posOffset></wp:positionV><wp:extent cx="6385560" cy="1228725"/><wp:effectExtent l="0" t="0" r="15240" b="28575"/><wp:wrapNone/><wp:docPr id="630949161" name="Retângulo 1"/><wp:cNvGraphicFramePr/><a:graphic xmlns:a="http://schemas.openxmlformats.org/drawingml/2006/main"><a:graphicData uri="http://schemas.microsoft.com/office/word/2010/wordprocessingShape"><wps:wsp><wps:cNvSpPr/><wps:spPr><a:xfrm><a:off x="0" y="0"/><a:ext cx="6385560" cy="1228725"/></a:xfrm><a:prstGeom prst="rect"><a:avLst/></a:prstGeom><a:noFill/><a:ln w="9525" cap="flat" cmpd="sng" algn="ctr"><a:solidFill><a:schemeClr val="dk1"/></a:solidFill><a:prstDash val="solid"/><a:round/><a:headEnd type="none" w="med" len="med"/><a:tailEnd type="none" w="med" len="med"/></a:ln></wps:spPr><wps:style><a:lnRef idx="0"><a:scrgbClr r="0" g="0" b="0"/></a:lnRef><a:fillRef idx="0"><a:scrgbClr r="0" g="0" b="0"/></a:fillRef><a:effectRef idx="0"><a:scrgbClr r="0" g="0" b="0"/></a:effectRef><a:fontRef idx="minor"><a:schemeClr val="dk1"/></a:fontRef></wps:style><wps:bodyPr rot="0" spcFirstLastPara="0" vertOverflow="overflow" horzOverflow="overflow" vert="horz" wrap="square" lIns="91440" tIns="45720" rIns="91440" bIns="45720" numCol="1" spcCol="0" rtlCol="0" fromWordArt="0" anchor="ctr" anchorCtr="0" forceAA="0" compatLnSpc="1"><a:prstTxWarp prst="textNoShape"><a:avLst/></a:prstTxWarp><a:noAutofit/></wps:bodyPr></wps:wsp></a:graphicData></a:graphic><wp14:sizeRelH relativeFrom="margin"><wp14:pctWidth>0</wp14:pctWidth></wp14:sizeRelH><wp14:sizeRelV relativeFrom="margin"><wp14:pctHeight>0</wp14:pctHeight></wp14:sizeRelV></wp:anchor></w:drawing></mc:Choice><mc:Fallback><w:pict><v:rect w14:anchorId="21645D16" id="Retângulo 1" o:spid="_x0000_s1026" style="position:absolute;margin-left:-5.75pt;margin-top:6.8pt;width:502.8pt;height:96.75pt;z-index:251664384;visibility:visible;mso-wrap-style:square;mso-width-percent:0;mso-height-percent:0;mso-wrap-distance-left:9pt;mso-wrap-distance-top:0;mso-wrap-distance-right:9pt;mso-wrap-distance-bottom:0;mso-position-horizontal:absolute;mso-position-horizontal-relative:text;mso-position-vertical:absolute;mso-position-vertical-relative:text;mso-width-percent:0;mso-height-percent:0;mso-width-relative:margin;mso-height-relative:margin;v-text-anchor:middle" o:gfxdata="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" filled="f" strokecolor="black [3200]"><v:stroke joinstyle="round"/></v:rect></w:pict></mc:Fallback></mc:AlternateContent></w:r></w:p><w:p><w:pPr><w:spacing w:after="0" w:line="240" w:lineRule="auto"/><w:rPr><w:rFonts w:asciiTheme="majorHAnsi" w:hAnsiTheme="majorHAnsi" w:cstheme="majorHAnsi"/><w:lang w:val="pt-BR"/></w:rPr></w:pPr><w:r><w:rPr><w:rFonts w:asciiTheme="majorHAnsi" w:hAnsiTheme="majorHAnsi" w:cstheme="majorHAnsi"/><w:b/><w:bCs/><w:lang w:val="pt-BR"/></w:rPr><w:t>Marca: {{Marca}}</w:t></w:r></w:p><w:p><w:pPr><w:spacing w:after="0" w:line="240" w:lineRule="auto"/><w:rPr><w:rFonts w:asciiTheme="majorHAnsi" w:hAnsiTheme="majorHAnsi" w:cstheme="majorHAnsi"/><w:lang w:val="pt-BR"/></w:rPr></w:pPr><w:r><w:rPr><w:rFonts w:asciiTheme="majorHAnsi" w:hAnsiTheme="majorHAnsi" w:cstheme="majorHAnsi"/><w:b/><w:bCs/><w:lang w:val="pt-BR"/></w:rPr><w:t>Modelo: {{Modelo}}             Versão: {{Versão}}</w:t></w:r></w:p><w:p><w:pPr><w:spacing w:after="0" w:line="240" w:lineRule="auto"/><w:rPr><w:rFonts w:asciiTheme="majorHAnsi" w:hAnsiTheme="majorHAnsi" w:cstheme="majorHAnsi"/><w:lang w:val="pt-BR"/></w:rPr></w:pPr><w:r><w:rPr><w:rFonts w:asciiTheme="majorHAnsi" w:hAnsiTheme="majorHAnsi" w:cstheme="majorHAnsi"/><w:b/><w:bCs/><w:lang w:val="pt-BR"/></w:rPr><w:t>Ano Fabricação: {{Ano Fabricação}}      Ano Modelo: {{Ano Modelo}}     Cor: {{Cor}}</w:t></w:r></w:p><w:p><w:pPr><w:spacing w:after="0" w:line="240" w:lineRule="auto"/><w:rPr><w:rFonts w:asciiTheme="majorHAnsi" w:hAnsiTheme="majorHAnsi" w:cstheme="majorHAnsi"/><w:lang w:val="pt-BR"/></w:rPr></w:pPr><w:r><w:rPr><w:rFonts w:asciiTheme="majorHAnsi" w:hAnsiTheme="majorHAnsi" w:cstheme="majorHAnsi"/><w:b/><w:bCs/><w:lang w:val="pt-BR"/></w:rPr><w:t>Placa: {{Placa}}                      Chassi: {{Chassi}}                           Renavan: {{Renavam}} </w:t></w:r></w:p><w:p><w:pPr><w:spacing w:after="0" w:line="240" w:lineRule="auto"/><w:rPr><w:rFonts w:asciiTheme="majorHAnsi" w:hAnsiTheme="majorHAnsi" w:cstheme="majorHAnsi"/><w:lang w:val="pt-BR"/></w:rPr></w:pPr><w:r><w:rPr><w:rFonts w:asciiTheme="majorHAnsi" w:hAnsiTheme="majorHAnsi" w:cstheme="majorHAnsi"/><w:b/><w:bCs/><w:lang w:val="pt-BR"/></w:rPr><w:t>Combustível: {{Combustível}}                                                     Km Atual: {{KM}}</w:t></w:r></w:p><w:p><w:pPr><w:spacing w:after="0" w:line="240" w:lineRule="auto"/><w:rPr><w:rFonts w:asciiTheme="majorHAnsi" w:hAnsiTheme="majorHAnsi" w:cstheme="majorHAnsi"/><w:lang w:val="pt-BR"/></w:rPr></w:pPr><w:r><w:rPr><w:rFonts w:asciiTheme="majorHAnsi" w:hAnsiTheme="majorHAnsi" w:cstheme="majorHAnsi"/><w:b/><w:bCs/><w:lang w:val="pt-BR"/></w:rPr><w:t>Valor da Venda: {{Valor da Venda}}</w:t></w:r></w:p><w:p><w:pPr><w:spacing w:after="0" w:line="240" w:lineRule="auto"/><w:rPr><w:rFonts w:asciiTheme="majorHAnsi" w:hAnsiTheme="majorHAnsi" w:cstheme="majorHAnsi"/><w:b/><w:bCs/><w:szCs w:val="20"/><w:lang w:val="pt-BR"/></w:rPr></w:pPr><w:r><w:rPr><w:noProof/><w:color w:val="555555"/><w:sz w:val="18"/><w:szCs w:val="18"/><w:lang w:val="pt-BR"/></w:rPr><mc:AlternateContent><mc:Choice Requires="wps"><w:drawing><wp:anchor distT="0" distB="0" distL="114300" distR="114300" simplePos="0" relativeHeight="251668480" behindDoc="0" locked="0" layoutInCell="1" allowOverlap="1" wp14:anchorId="06FEA610" wp14:editId="1E5E472F"><wp:simplePos x="0" y="0"/><wp:positionH relativeFrom="column"><wp:posOffset>51207</wp:posOffset></wp:positionH><wp:positionV relativeFrom="paragraph"><wp:posOffset>214198</wp:posOffset></wp:positionV><wp:extent cx="1718768" cy="248285"/><wp:effectExtent l="0" t="0" r="0" b="0"/><wp:wrapNone/><wp:docPr id="1905243769" name="Caixa de Texto 3"/><wp:cNvGraphicFramePr/><a:graphic xmlns:a="http://schemas.openxmlformats.org/drawingml/2006/main"><a:graphicData uri="http://schemas.microsoft.com/office/word/2010/wordprocessingShape"><wps:wsp><wps:cNvSpPr txBox="1"/><wps:spPr><a:xfrm><a:off x="0" y="0"/><a:ext cx="1718768" cy="248285"/></a:xfrm><a:prstGeom prst="rect"><a:avLst/></a:prstGeom><a:solidFill><a:schemeClr val="lt1"/></a:solidFill><a:ln w="6350"><a:noFill/></a:ln></wps:spPr><wps:txbx><w:txbxContent><w:p><w:pPr><w:rPr><w:b/><w:bCs/><w:color w:val="808080" w:themeColor="background1" w:themeShade="80"/><w:lang w:val="pt-BR"/></w:rPr></w:pPr><w:r><w:rPr><w:b/><w:bCs/><w:color w:val="808080" w:themeColor="background1" w:themeShade="80"/><w:lang w:val="pt-BR"/></w:rPr><w:t>Condições da Transação </w:t></w:r></w:p></w:txbxContent></wps:txbx><wps:bodyPr rot="0" spcFirstLastPara="0" vertOverflow="overflow" horzOverflow="overflow" vert="horz" wrap="square" lIns="91440" tIns="45720" rIns="91440" bIns="45720" numCol="1" spcCol="0" rtlCol="0" fromWordArt="0" anchor="t" anchorCtr="0" forceAA="0" compatLnSpc="1"><a:prstTxWarp prst="textNoShape"><a:avLst/></a:prstTxWarp><a:noAutofit/></wps:bodyPr></wps:wsp></a:graphicData></a:graphic><wp14:sizeRelH relativeFrom="margin"><wp14:pctWidth>0</wp14:pctWidth></wp14:sizeRelH><wp14:sizeRelV relativeFrom="margin"><wp14:pctHeight>0</wp14:pctHeight></wp14:sizeRelV></wp:anchor></w:drawing></mc:Choice><mc:Fallback><w:pict><v:shape w14:anchorId="06FEA610" id="_x0000_s1028" type="#_x0000_t202" style="position:absolute;margin-left:4.05pt;margin-top:16.85pt;width:135.35pt;height:19.55pt;z-index:251668480;visibility:visible;mso-wrap-style:square;mso-width-percent:0;mso-height-percent:0;mso-wrap-distance-left:9pt;mso-wrap-distance-top:0;mso-wrap-distance-right:9pt;mso-wrap-distance-bottom:0;mso-position-horizontal:absolute;mso-position-horizontal-relative:text;mso-position-vertical:absolute;mso-position-vertical-relative:text;mso-width-percent:0;mso-height-percent:0;mso-width-relative:margin;mso-height-relative:margin;v-text-anchor:top" o:gfxdata="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" fillcolor="white [3201]" stroked="f" strokeweight=".5pt"><v:textbox><w:txbxContent><w:p><w:pPr><w:rPr><w:b/><w:bCs/><w:color w:val="808080" w:themeColor="background1" w:themeShade="80"/><w:lang w:val="pt-BR"/></w:rPr></w:pPr><w:r><w:rPr><w:b/><w:bCs/><w:color w:val="808080" w:themeColor="background1" w:themeShade="80"/><w:lang w:val="pt-BR"/></w:rPr><w:t>Condições da Transação </w:t></w:r></w:p></w:txbxContent></v:textbox></v:shape></w:pict></mc:Fallback></mc:AlternateContent></w:r></w:p><w:p><w:pPr><w:spacing w:after="0" w:line="240" w:lineRule="auto"/><w:rPr><w:rFonts w:asciiTheme="majorHAnsi" w:hAnsiTheme="majorHAnsi" w:cstheme="majorHAnsi"/><w:szCs w:val="20"/><w:lang w:val="pt-BR"/></w:rPr></w:pPr></w:p><w:p><w:pPr><w:spacing w:after="0" w:line="240" w:lineRule="auto"/><w:rPr><w:rFonts w:asciiTheme="majorHAnsi" w:hAnsiTheme="majorHAnsi" w:cstheme="majorHAnsi"/><w:szCs w:val="20"/><w:lang w:val="pt-BR"/></w:rPr></w:pPr><w:r><w:rPr><w:noProof/><w:color w:val="FFFFFF" w:themeColor="background1"/><w:sz w:val="24"/><w:szCs w:val="24"/><w:lang w:val="pt-BR"/></w:rPr><mc:AlternateContent><mc:Choice Requires="wps"><w:drawing><wp:anchor distT="0" distB="0" distL="114300" distR="114300" simplePos="0" relativeHeight="251667456" behindDoc="0" locked="0" layoutInCell="1" allowOverlap="1" wp14:anchorId="1788E6E1" wp14:editId="2AE1750B"><wp:simplePos x="0" y="0"/><wp:positionH relativeFrom="column"><wp:posOffset>-73152</wp:posOffset></wp:positionH><wp:positionV relativeFrom="paragraph"><wp:posOffset>35993</wp:posOffset></wp:positionV><wp:extent cx="6385560" cy="548640"/><wp:effectExtent l="0" t="0" r="15240" b="22860"/><wp:wrapNone/><wp:docPr id="1624956887" name="Retângulo 1"/><wp:cNvGraphicFramePr/><a:graphic xmlns:a="http://schemas.openxmlformats.org/drawingml/2006/main"><a:graphicData uri="http://schemas.microsoft.com/office/word/2010/wordprocessingShape"><wps:wsp><wps:cNvSpPr/><wps:spPr><a:xfrm><a:off x="0" y="0"/><a:ext cx="6385560" cy="548640"/></a:xfrm><a:prstGeom prst="rect"><a:avLst/></a:prstGeom><a:noFill/><a:ln w="9525" cap="flat" cmpd="sng" algn="ctr"><a:solidFill><a:schemeClr val="dk1"/></a:solidFill><a:prstDash val="solid"/><a:round/><a:headEnd type="none" w="med" len="med"/><a:tailEnd type="none" w="med" len="med"/></a:ln></wps:spPr><wps:style><a:lnRef idx="0"><a:scrgbClr r="0" g="0" b="0"/></a:lnRef><a:fillRef idx="0"><a:scrgbClr r="0" g="0" b="0"/></a:fillRef><a:effectRef idx="0"><a:scrgbClr r="0" g="0" b="0"/></a:effectRef><a:fontRef idx="minor"><a:schemeClr val="dk1"/></a:fontRef></wps:style><wps:bodyPr rot="0" spcFirstLastPara="0" vertOverflow="overflow" horzOverflow="overflow" vert="horz" wrap="square" lIns="91440" tIns="45720" rIns="91440" bIns="45720" numCol="1" spcCol="0" rtlCol="0" fromWordArt="0" anchor="ctr" anchorCtr="0" forceAA="0" compatLnSpc="1"><a:prstTxWarp prst="textNoShape"><a:avLst/></a:prstTxWarp><a:noAutofit/></wps:bodyPr></wps:wsp></a:graphicData></a:graphic><wp14:sizeRelH relativeFrom="margin"><wp14:pctWidth>0</wp14:pctWidth></wp14:sizeRelH><wp14:sizeRelV relativeFrom="margin"><wp14:pctHeight>0</wp14:pctHeight></wp14:sizeRelV></wp:anchor></w:drawing></mc:Choice><mc:Fallback><w:pict><v:rect w14:anchorId="5428BBBC" id="Retângulo 1" o:spid="_x0000_s1026" style="position:absolute;margin-left:-5.75pt;margin-top:2.85pt;width:502.8pt;height:43.2pt;z-index:251667456;visibility:visible;mso-wrap-style:square;mso-width-percent:0;mso-height-percent:0;mso-wrap-distance-left:9pt;mso-wrap-distance-top:0;mso-wrap-distance-right:9pt;mso-wrap-distance-bottom:0;mso-position-horizontal:absolute;mso-position-horizontal-relative:text;mso-position-vertical:absolute;mso-position-vertical-relative:text;mso-width-percent:0;mso-height-percent:0;mso-width-relative:margin;mso-height-relative:margin;v-text-anchor:middle" o:gfxdata="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" filled="f" strokecolor="black [3200]"><v:stroke joinstyle="round"/></v:rect></w:pict></mc:Fallback></mc:AlternateContent></w:r></w:p><w:p><w:pPr><w:spacing w:after="0" w:line="240" w:lineRule="auto"/><w:rPr><w:rFonts w:asciiTheme="majorHAnsi" w:hAnsiTheme="majorHAnsi" w:cstheme="majorHAnsi"/><w:szCs w:val="20"/><w:lang w:val="pt-BR"/></w:rPr></w:pPr><w:r><w:rPr><w:rFonts w:asciiTheme="majorHAnsi" w:hAnsiTheme="majorHAnsi" w:cstheme="majorHAnsi"/><w:szCs w:val="20"/><w:lang w:val="pt-BR"/></w:rPr><w:t>Eu, {{Nome do Cliente}}, afirmo ter pago a JTS INTERMEDIAÇÕES E NEGOCIOS LTDA pela compra do veiculo citado, a quantia de: {{Valor da Venda}} ( Valor por extenso), a ser pago da forma descrita abaixo:</w:t></w:r></w:p><w:p><w:pPr><w:spacing w:after="0" w:line="240" w:lineRule="auto"/><w:rPr><w:rFonts w:asciiTheme="majorHAnsi" w:hAnsiTheme="majorHAnsi" w:cstheme="majorHAnsi"/><w:b/><w:bCs/><w:szCs w:val="20"/><w:lang w:val="pt-BR"/></w:rPr></w:pPr></w:p><w:p><w:pPr><w:spacing w:after="0" w:line="240" w:lineRule="auto"/><w:rPr><w:rFonts w:asciiTheme="majorHAnsi" w:hAnsiTheme="majorHAnsi" w:cstheme="majorHAnsi"/><w:b/><w:bCs/><w:szCs w:val="20"/><w:lang w:val="pt-BR"/></w:rPr></w:pPr><w:r><w:rPr><w:noProof/><w:color w:val="555555"/><w:sz w:val="18"/><w:szCs w:val="18"/><w:lang w:val="pt-BR"/></w:rPr><mc:AlternateContent><mc:Choice Requires="wps"><w:drawing><wp:anchor distT="0" distB="0" distL="114300" distR="114300" simplePos="0" relativeHeight="251671552" behindDoc="0" locked="0" layoutInCell="1" allowOverlap="1" wp14:anchorId="4B60A431" wp14:editId="781A1018"><wp:simplePos x="0" y="0"/><wp:positionH relativeFrom="column"><wp:posOffset>70790</wp:posOffset></wp:positionH><wp:positionV relativeFrom="paragraph"><wp:posOffset>131445</wp:posOffset></wp:positionV><wp:extent cx="1791970" cy="248285"/><wp:effectExtent l="0" t="0" r="0" b="0"/><wp:wrapNone/><wp:docPr id="1531168136" name="Caixa de Texto 3"/><wp:cNvGraphicFramePr/><a:graphic xmlns:a="http://schemas.openxmlformats.org/drawingml/2006/main"><a:graphicData uri="http://schemas.microsoft.com/office/word/2010/wordprocessingShape"><wps:wsp><wps:cNvSpPr txBox="1"/><wps:spPr><a:xfrm><a:off x="0" y="0"/><a:ext cx="1791970" cy="248285"/></a:xfrm><a:prstGeom prst="rect"><a:avLst/></a:prstGeom><a:solidFill><a:schemeClr val="lt1"/></a:solidFill><a:ln w="6350"><a:noFill/></a:ln></wps:spPr><wps:txbx><w:txbxContent><w:p><w:pPr><w:rPr><w:b/><w:bCs/><w:color w:val="808080" w:themeColor="background1" w:themeShade="80"/><w:lang w:val="pt-BR"/></w:rPr></w:pPr><w:r><w:rPr><w:b/><w:bCs/><w:color w:val="808080" w:themeColor="background1" w:themeShade="80"/><w:lang w:val="pt-BR"/></w:rPr><w:t>Condições do Pagamento</w:t></w:r></w:p></w:txbxContent></wps:txbx><wps:bodyPr rot="0" spcFirstLastPara="0" vertOverflow="overflow" horzOverflow="overflow" vert="horz" wrap="square" lIns="91440" tIns="45720" rIns="91440" bIns="45720" numCol="1" spcCol="0" rtlCol="0" fromWordArt="0" anchor="t" anchorCtr="0" forceAA="0" compatLnSpc="1"><a:prstTxWarp prst="textNoShape"><a:avLst/></a:prstTxWarp><a:noAutofit/></wps:bodyPr></wps:wsp></a:graphicData></a:graphic><wp14:sizeRelH relativeFrom="margin"><wp14:pctWidth>0</wp14:pctWidth></wp14:sizeRelH><wp14:sizeRelV relativeFrom="margin"><wp14:pctHeight>0</wp14:pctHeight></wp14:sizeRelV></wp:anchor></w:drawing></mc:Choice><mc:Fallback><w:pict><v:shape w14:anchorId="4B60A431" id="_x0000_s1029" type="#_x0000_t202" style="position:absolute;margin-left:5.55pt;margin-top:10.35pt;width:141.1pt;height:19.55pt;z-index:251671552;visibility:visible;mso-wrap-style:square;mso-width-percent:0;mso-height-percent:0;mso-wrap-distance-left:9pt;mso-wrap-distance-top:0;mso-wrap-distance-right:9pt;mso-wrap-distance-bottom:0;mso-position-horizontal:absolute;mso-position-horizontal-relative:text;mso-position-vertical:absolute;mso-position-vertical-relative:text;mso-width-percent:0;mso-height-percent:0;mso-width-relative:margin;mso-height-relative:margin;v-text-anchor:top" o:gfxdata="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" fillcolor="white [3201]" stroked="f" strokeweight=".5pt"><v:textbox><w:txbxContent><w:p><w:pPr><w:rPr><w:b/><w:bCs/><w:color w:val="808080" w:themeColor="background1" w:themeShade="80"/><w:lang w:val="pt-BR"/></w:rPr></w:pPr><w:r><w:rPr><w:b/><w:bCs/><w:color w:val="808080" w:themeColor="background1" w:themeShade="80"/><w:lang w:val="pt-BR"/></w:rPr><w:t>Condições do Pagamento</w:t></w:r></w:p></w:txbxContent></v:textbox></v:shape></w:pict></mc:Fallback></mc:AlternateContent></w:r></w:p><w:p><w:pPr><w:spacing w:after="0" w:line="240" w:lineRule="auto"/><w:rPr><w:rFonts w:asciiTheme="majorHAnsi" w:hAnsiTheme="majorHAnsi" w:cstheme="majorHAnsi"/><w:b/><w:bCs/><w:szCs w:val="20"/><w:lang w:val="pt-BR"/></w:rPr></w:pPr><w:r><w:rPr><w:noProof/><w:color w:val="FFFFFF" w:themeColor="background1"/><w:sz w:val="24"/><w:szCs w:val="24"/><w:lang w:val="pt-BR"/></w:rPr><mc:AlternateContent><mc:Choice Requires="wps"><w:drawing><wp:anchor distT="0" distB="0" distL="114300" distR="114300" simplePos="0" relativeHeight="251670528" behindDoc="0" locked="0" layoutInCell="1" allowOverlap="1" wp14:anchorId="29611BA2" wp14:editId="2140EFAC"><wp:simplePos x="0" y="0"/><wp:positionH relativeFrom="column"><wp:posOffset>-63195</wp:posOffset></wp:positionH><wp:positionV relativeFrom="paragraph"><wp:posOffset>109855</wp:posOffset></wp:positionV><wp:extent cx="6385560" cy="3095625"/><wp:effectExtent l="0" t="0" r="15240" b="28575"/><wp:wrapNone/><wp:docPr id="966023408" name="Retângulo 1"/><wp:cNvGraphicFramePr/><a:graphic xmlns:a="http://schemas.openxmlformats.org/drawingml/2006/main"><a:graphicData uri="http://schemas.microsoft.com/office/word/2010/wordprocessingShape"><wps:wsp><wps:cNvSpPr/><wps:spPr><a:xfrm><a:off x="0" y="0"/><a:ext cx="6385560" cy="3095625"/></a:xfrm><a:prstGeom prst="rect"><a:avLst/></a:prstGeom><a:noFill/><a:ln w="9525" cap="flat" cmpd="sng" algn="ctr"><a:solidFill><a:schemeClr val="dk1"/></a:solidFill><a:prstDash val="solid"/><a:round/><a:headEnd type="none" w="med" len="med"/><a:tailEnd type="none" w="med" len="med"/></a:ln></wps:spPr><wps:style><a:lnRef idx="0"><a:scrgbClr r="0" g="0" b="0"/></a:lnRef><a:fillRef idx="0"><a:scrgbClr r="0" g="0" b="0"/></a:fillRef><a:effectRef idx="0"><a:scrgbClr r="0" g="0" b="0"/></a:effectRef><a:fontRef idx="minor"><a:schemeClr val="dk1"/></a:fontRef></wps:style><wps:bodyPr rot="0" spcFirstLastPara="0" vertOverflow="overflow" horzOverflow="overflow" vert="horz" wrap="square" lIns="91440" tIns="45720" rIns="91440" bIns="45720" numCol="1" spcCol="0" rtlCol="0" fromWordArt="0" anchor="ctr" anchorCtr="0" forceAA="0" compatLnSpc="1"><a:prstTxWarp prst="textNoShape"><a:avLst/></a:prstTxWarp><a:noAutofit/></wps:bodyPr></wps:wsp></a:graphicData></a:graphic><wp14:sizeRelH relativeFrom="margin"><wp14:pctWidth>0</wp14:pctWidth></wp14:sizeRelH><wp14:sizeRelV relativeFrom="margin"><wp14:pctHeight>0</wp14:pctHeight></wp14:sizeRelV></wp:anchor></w:drawing></mc:Choice><mc:Fallback><w:pict><v:rect w14:anchorId="61ADDDEF" id="Retângulo 1" o:spid="_x0000_s1026" style="position:absolute;margin-left:-5pt;margin-top:8.65pt;width:502.8pt;height:243.75pt;z-index:251670528;visibility:visible;mso-wrap-style:square;mso-width-percent:0;mso-height-percent:0;mso-wrap-distance-left:9pt;mso-wrap-distance-top:0;mso-wrap-distance-right:9pt;mso-wrap-distance-bottom:0;mso-position-horizontal:absolute;mso-position-horizontal-relative:text;mso-position-vertical:absolute;mso-position-vertical-relative:text;mso-width-percent:0;mso-height-percent:0;mso-width-relative:margin;mso-height-relative:margin;v-text-anchor:middle" o:gfxdata="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" filled="f" strokecolor="black [3200]"><v:stroke joinstyle="round"/></v:rect></w:pict></mc:Fallback></mc:AlternateContent></w:r></w:p><w:p><w:pPr><w:spacing w:after="0" w:line="240" w:lineRule="auto"/><w:rPr><w:rFonts w:asciiTheme="majorHAnsi" w:hAnsiTheme="majorHAnsi" w:cstheme="majorHAnsi"/><w:b/><w:bCs/><w:szCs w:val="20"/><w:lang w:val="pt-BR"/></w:rPr></w:pPr></w:p><w:p><w:pPr><w:spacing w:after="0" w:line="240" w:lineRule="auto"/><w:rPr><w:rFonts w:asciiTheme="majorHAnsi" w:hAnsiTheme="majorHAnsi" w:cstheme="majorHAnsi"/><w:b/><w:bCs/><w:szCs w:val="20"/><w:lang w:val="pt-BR"/></w:rPr></w:pPr><w:r><w:rPr><w:rFonts w:asciiTheme="majorHAnsi" w:hAnsiTheme="majorHAnsi" w:cstheme="majorHAnsi"/><w:b/><w:bCs/><w:szCs w:val="20"/><w:lang w:val="pt-BR"/></w:rPr><w:t xml:space="preserve">Data da Venda: {{Data da Venda}}                 Valor de Venda: {{Valor da Venda}} </w:t></w:r></w:p><w:p><w:pPr><w:spacing w:after="0" w:line="240" w:lineRule="auto"/><w:rPr><w:rFonts w:asciiTheme="majorHAnsi" w:hAnsiTheme="majorHAnsi" w:cstheme="majorHAnsi"/><w:b/><w:bCs/><w:szCs w:val="20"/><w:lang w:val="pt-BR"/></w:rPr></w:pPr></w:p><w:p><w:pPr><w:spacing w:after="0" w:line="240" w:lineRule="auto"/><w:rPr><w:rFonts w:asciiTheme="majorHAnsi" w:hAnsiTheme="majorHAnsi" w:cstheme="majorHAnsi"/><w:color w:val="auto"/><w:szCs w:val="20"/><w:lang w:val="pt-BR"/></w:rPr></w:pPr><w:r><w:rPr><w:rFonts w:asciiTheme="majorHAnsi" w:hAnsiTheme="majorHAnsi" w:cstheme="majorHAnsi"/><w:b/><w:bCs/><w:color w:val="auto"/><w:szCs w:val="20"/><w:lang w:val="pt-BR"/></w:rPr><w:t xml:space="preserve">Forma de Pagamento: {{Forma de Pagamento}}</w:t></w:r></w:p><w:p><w:pPr><w:spacing w:after="0" w:line="240" w:lineRule="auto"/><w:rPr><w:rFonts w:asciiTheme="majorHAnsi" w:hAnsiTheme="majorHAnsi" w:cstheme="majorHAnsi"/><w:b/><w:bCs/><w:color w:val="auto"/><w:szCs w:val="20"/><w:lang w:val="pt-BR"/></w:rPr></w:pPr><w:r><w:rPr><w:rFonts w:asciiTheme="majorHAnsi" w:hAnsiTheme="majorHAnsi" w:cstheme="majorHAnsi"/><w:b/><w:bCs/><w:color w:val="auto"/><w:szCs w:val="20"/><w:lang w:val="pt-BR"/></w:rPr><w:t>Entrada: {{Valor da Entrada Financiamento}}</w:t></w:r></w:p><w:p><w:pPr><w:spacing w:after="0" w:line="240" w:lineRule="auto"/><w:rPr><w:rFonts w:asciiTheme="majorHAnsi" w:hAnsiTheme="majorHAnsi" w:cstheme="majorHAnsi"/><w:b/><w:bCs/><w:color w:val="auto"/><w:szCs w:val="20"/><w:lang w:val="pt-BR"/></w:rPr></w:pPr><w:r><w:rPr><w:rFonts w:asciiTheme="majorHAnsi" w:hAnsiTheme="majorHAnsi" w:cstheme="majorHAnsi"/><w:b/><w:bCs/><w:color w:val="auto"/><w:szCs w:val="20"/><w:lang w:val="pt-BR"/></w:rPr><w:t xml:space="preserve">Financeira: {{Financeira}}                          Data do Financiamento: {{Data do Financiamento}}</w:t></w:r></w:p><w:p><w:pPr><w:spacing w:after="0" w:line="240" w:lineRule="auto"/><w:rPr><w:rFonts w:asciiTheme="majorHAnsi" w:hAnsiTheme="majorHAnsi" w:cstheme="majorHAnsi"/><w:b/><w:bCs/><w:color w:val="auto"/><w:szCs w:val="20"/><w:lang w:val="pt-BR"/></w:rPr></w:pPr><w:r><w:rPr><w:rFonts w:asciiTheme="majorHAnsi" w:hAnsiTheme="majorHAnsi" w:cstheme="majorHAnsi"/><w:b/><w:bCs/><w:color w:val="auto"/><w:szCs w:val="20"/><w:lang w:val="pt-BR"/></w:rPr><w:t>Valor Financiado: {{Valor Financiado}}   Nº de Parcelas: {{N° de Parcelas}}   Valor das Parcelas: {{Valor das Parcelas}}</w:t></w:r></w:p><w:p><w:pPr><w:spacing w:after="0" w:line="240" w:lineRule="auto"/><w:rPr><w:rFonts w:asciiTheme="majorHAnsi" w:hAnsiTheme="majorHAnsi" w:cstheme="majorHAnsi"/><w:b/><w:bCs/><w:color w:val="auto"/><w:szCs w:val="20"/><w:lang w:val="pt-BR"/></w:rPr></w:pPr></w:p><w:p><w:pPr><w:spacing w:after="0" w:line="240" w:lineRule="auto"/><w:rPr><w:rFonts w:asciiTheme="majorHAnsi" w:hAnsiTheme="majorHAnsi" w:cstheme="majorHAnsi"/><w:b/><w:bCs/><w:color w:val="auto"/><w:szCs w:val="20"/><w:lang w:val="pt-BR"/></w:rPr></w:pPr><w:r><w:rPr><w:rFonts w:asciiTheme="majorHAnsi" w:hAnsiTheme="majorHAnsi" w:cstheme="majorHAnsi"/><w:b/><w:bCs/><w:color w:val="auto"/><w:szCs w:val="20"/><w:lang w:val="pt-BR"/></w:rPr><w:t xml:space="preserve">Veiculo na Troca: {{Veículo na Troca}}</w:t></w:r></w:p><w:p><w:pPr><w:spacing w:after="0" w:line="240" w:lineRule="auto"/><w:rPr><w:rFonts w:asciiTheme="majorHAnsi" w:hAnsiTheme="majorHAnsi" w:cstheme="majorHAnsi"/><w:lang w:val="pt-BR"/></w:rPr></w:pPr><w:r><w:rPr><w:rFonts w:asciiTheme="majorHAnsi" w:hAnsiTheme="majorHAnsi" w:cstheme="majorHAnsi"/><w:b/><w:bCs/><w:lang w:val="pt-BR"/></w:rPr><w:t>Marca: {{Marca Troca}}</w:t></w:r></w:p><w:p><w:pPr><w:spacing w:after="0" w:line="240" w:lineRule="auto"/><w:rPr><w:rFonts w:asciiTheme="majorHAnsi" w:hAnsiTheme="majorHAnsi" w:cstheme="majorHAnsi"/><w:lang w:val="pt-BR"/></w:rPr></w:pPr><w:r><w:rPr><w:rFonts w:asciiTheme="majorHAnsi" w:hAnsiTheme="majorHAnsi" w:cstheme="majorHAnsi"/><w:b/><w:bCs/><w:lang w:val="pt-BR"/></w:rPr><w:t>Modelo: {{Modelo Troca}}             Versão: {{Versão Troca}}</w:t></w:r></w:p><w:p><w:pPr><w:spacing w:after="0" w:line="240" w:lineRule="auto"/><w:rPr><w:rFonts w:asciiTheme="majorHAnsi" w:hAnsiTheme="majorHAnsi" w:cstheme="majorHAnsi"/><w:lang w:val="pt-BR"/></w:rPr></w:pPr><w:r><w:rPr><w:rFonts w:asciiTheme="majorHAnsi" w:hAnsiTheme="majorHAnsi" w:cstheme="majorHAnsi"/><w:b/><w:bCs/><w:lang w:val="pt-BR"/></w:rPr><w:t>Ano Fabricação: {{Ano Troca}}      Cor: {{Cor Troca}}</w:t></w:r></w:p><w:p><w:pPr><w:spacing w:after="0" w:line="240" w:lineRule="auto"/><w:rPr><w:rFonts w:asciiTheme="majorHAnsi" w:hAnsiTheme="majorHAnsi" w:cstheme="majorHAnsi"/><w:lang w:val="pt-BR"/></w:rPr></w:pPr><w:r><w:rPr><w:rFonts w:asciiTheme="majorHAnsi" w:hAnsiTheme="majorHAnsi" w:cstheme="majorHAnsi"/><w:b/><w:bCs/><w:lang w:val="pt-BR"/></w:rPr><w:t>Placa: {{Placa Troca}}                      Renavan: {{Renavam Troca}} </w:t></w:r></w:p><w:p><w:pPr><w:spacing w:after="0" w:line="240" w:lineRule="auto"/><w:rPr><w:rFonts w:asciiTheme="majorHAnsi" w:hAnsiTheme="majorHAnsi" w:cstheme="majorHAnsi"/><w:lang w:val="pt-BR"/></w:rPr></w:pPr><w:r><w:rPr><w:rFonts w:asciiTheme="majorHAnsi" w:hAnsiTheme="majorHAnsi" w:cstheme="majorHAnsi"/><w:b/><w:bCs/><w:lang w:val="pt-BR"/></w:rPr><w:t xml:space="preserve">Combustível: {{Combustível Troca}}                                                     Km Atual: {{KM Troca}}</w:t></w:r></w:p><w:p><w:pPr><w:spacing w:after="0" w:line="240" w:lineRule="auto"/><w:rPr><w:rFonts w:asciiTheme="majorHAnsi" w:hAnsiTheme="majorHAnsi" w:cstheme="majorHAnsi"/><w:lang w:val="pt-BR"/></w:rPr></w:pPr><w:r><w:rPr><w:rFonts w:asciiTheme="majorHAnsi" w:hAnsiTheme="majorHAnsi" w:cstheme="majorHAnsi"/><w:b/><w:bCs/><w:lang w:val="pt-BR"/></w:rPr><w:t xml:space="preserve">Valor da Compra: {{Valor da Compra}}</w:t></w:r></w:p><w:p><w:pPr><w:spacing w:after="0" w:line="240" w:lineRule="auto"/><w:rPr><w:rFonts w:asciiTheme="majorHAnsi" w:hAnsiTheme="majorHAnsi" w:cstheme="majorHAnsi"/><w:lang w:val="pt-BR"/></w:rPr></w:pPr><w:r><w:rPr><w:rFonts w:asciiTheme="majorHAnsi" w:hAnsiTheme="majorHAnsi" w:cstheme="majorHAnsi"/><w:b/><w:bCs/><w:lang w:val="pt-BR"/></w:rPr><w:t>Débitos: {{Débitos}}</w:t></w:r></w:p><w:p><w:pPr><w:spacing w:after="0" w:line="240" w:lineRule="auto"/><w:rPr><w:rFonts w:asciiTheme="majorHAnsi" w:hAnsiTheme="majorHAnsi" w:cstheme="majorHAnsi"/><w:lang w:val="pt-BR"/></w:rPr></w:pPr><w:r><w:rPr><w:rFonts w:asciiTheme="majorHAnsi" w:hAnsiTheme="majorHAnsi" w:cstheme="majorHAnsi"/><w:b/><w:bCs/><w:lang w:val="pt-BR"/></w:rPr><w:t>Detalhe dos débitos: {{Observação sobre Débitos}}</w:t></w:r></w:p><w:p><w:pPr><w:spacing w:after="0" w:line="240" w:lineRule="auto"/><w:rPr><w:rFonts w:asciiTheme="majorHAnsi" w:hAnsiTheme="majorHAnsi" w:cstheme="majorHAnsi"/><w:lang w:val="pt-BR"/></w:rPr></w:pPr><w:r><w:rPr><w:rFonts w:asciiTheme="majorHAnsi" w:hAnsiTheme="majorHAnsi" w:cstheme="majorHAnsi"/><w:b/><w:bCs/><w:lang w:val="pt-BR"/></w:rPr><w:t>Valor de Entrada (Valor da Compra – Débitos): {{Valor da Entrada Veículo Troca}}</w:t></w:r></w:p><w:p><w:pPr><w:spacing w:after="0" w:line="240" w:lineRule="auto"/><w:rPr><w:rFonts w:asciiTheme="majorHAnsi" w:hAnsiTheme="majorHAnsi" w:cstheme="majorHAnsi"/><w:lang w:val="pt-BR"/></w:rPr></w:pPr></w:p><w:p><w:pPr><w:spacing w:after="0" w:line="240" w:lineRule="auto"/><w:rPr><w:rFonts w:asciiTheme="majorHAnsi" w:hAnsiTheme="majorHAnsi" w:cstheme="majorHAnsi"/><w:lang w:val="pt-BR"/></w:rPr></w:pPr></w:p><w:p><w:pPr><w:spacing w:after="0" w:line="240" w:lineRule="auto"/><w:rPr><w:rFonts w:asciiTheme="majorHAnsi" w:hAnsiTheme="majorHAnsi" w:cstheme="majorHAnsi"/><w:lang w:val="pt-BR"/></w:rPr></w:pPr><w:r><w:rPr><w:noProof/><w:color w:val="555555"/><w:sz w:val="18"/><w:szCs w:val="18"/><w:lang w:val="pt-BR"/></w:rPr><mc:AlternateContent><mc:Choice Requires="wps"><w:drawing><wp:anchor distT="0" distB="0" distL="114300" distR="114300" simplePos="0" relativeHeight="251674624" behindDoc="0" locked="0" layoutInCell="1" allowOverlap="1" wp14:anchorId="145F6907" wp14:editId="28043652"><wp:simplePos x="0" y="0"/><wp:positionH relativeFrom="column"><wp:posOffset>73152</wp:posOffset></wp:positionH><wp:positionV relativeFrom="paragraph"><wp:posOffset>50317</wp:posOffset></wp:positionV><wp:extent cx="1250899" cy="248285"/><wp:effectExtent l="0" t="0" r="6985" b="0"/><wp:wrapNone/><wp:docPr id="903896546" name="Caixa de Texto 3"/><wp:cNvGraphicFramePr/><a:graphic xmlns:a="http://schemas.openxmlformats.org/drawingml/2006/main"><a:graphicData uri="http://schemas.microsoft.com/office/word/2010/wordprocessingShape"><wps:wsp><wps:cNvSpPr txBox="1"/><wps:spPr><a:xfrm><a:off x="0" y="0"/><a:ext cx="1250899" cy="248285"/></a:xfrm><a:prstGeom prst="rect"><a:avLst/></a:prstGeom><a:solidFill><a:schemeClr val="lt1"/></a:solidFill><a:ln w="6350"><a:noFill/></a:ln></wps:spPr><wps:txbx><w:txbxContent><w:p><w:pPr><w:rPr><w:b/><w:bCs/><w:color w:val="808080" w:themeColor="background1" w:themeShade="80"/><w:lang w:val="pt-BR"/></w:rPr></w:pPr><w:r><w:rPr><w:b/><w:bCs/><w:color w:val="808080" w:themeColor="background1" w:themeShade="80"/><w:lang w:val="pt-BR"/></w:rPr><w:t>Documentação</w:t></w:r></w:p></w:txbxContent></wps:txbx><wps:bodyPr rot="0" spcFirstLastPara="0" vertOverflow="overflow" horzOverflow="overflow" vert="horz" wrap="square" lIns="91440" tIns="45720" rIns="91440" bIns="45720" numCol="1" spcCol="0" rtlCol="0" fromWordArt="0" anchor="t" anchorCtr="0" forceAA="0" compatLnSpc="1"><a:prstTxWarp prst="textNoShape"><a:avLst/></a:prstTxWarp><a:noAutofit/></wps:bodyPr></wps:wsp></a:graphicData></a:graphic><wp14:sizeRelH relativeFrom="margin"><wp14:pctWidth>0</wp14:pctWidth></wp14:sizeRelH><wp14:sizeRelV relativeFrom="margin"><wp14:pctHeight>0</wp14:pctHeight></wp14:sizeRelV></wp:anchor></w:drawing></mc:Choice><mc:Fallback><w:pict><v:shape w14:anchorId="145F6907" id="_x0000_s1030" type="#_x0000_t202" style="position:absolute;margin-left:5.75pt;margin-top:3.95pt;width:98.5pt;height:19.55pt;z-index:251674624;visibility:visible;mso-wrap-style:square;mso-width-percent:0;mso-height-percent:0;mso-wrap-distance-left:9pt;mso-wrap-distance-top:0;mso-wrap-distance-right:9pt;mso-wrap-distance-bottom:0;mso-position-horizontal:absolute;mso-position-horizontal-relative:text;mso-position-vertical:absolute;mso-position-vertical-relative:text;mso-width-percent:0;mso-height-percent:0;mso-width-relative:margin;mso-height-relative:margin;v-text-anchor:top" o:gfxdata="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" fillcolor="white [3201]" stroked="f" strokeweight=".5pt"><v:textbox><w:txbxContent><w:p><w:pPr><w:rPr><w:b/><w:bCs/><w:color w:val="808080" w:themeColor="background1" w:themeShade="80"/><w:lang w:val="pt-BR"/></w:rPr></w:pPr><w:r><w:rPr><w:b/><w:bCs/><w:color w:val="808080" w:themeColor="background1" w:themeShade="80"/><w:lang w:val="pt-BR"/></w:rPr><w:t>Documentação</w:t></w:r></w:p></w:txbxContent></v:textbox></v:shape></w:pict></mc:Fallback></mc:AlternateContent></w:r><w:r><w:rPr><w:rFonts w:asciiTheme="majorHAnsi" w:hAnsiTheme="majorHAnsi" w:cstheme="majorHAnsi"/><w:noProof/><w:lang w:val="pt-BR"/></w:rPr><mc:AlternateContent><mc:Choice Requires="wps"><w:drawing><wp:anchor distT="0" distB="0" distL="114300" distR="114300" simplePos="0" relativeHeight="251672576" behindDoc="0" locked="0" layoutInCell="1" allowOverlap="1" wp14:anchorId="22FA0A02" wp14:editId="3A2326B8"><wp:simplePos x="0" y="0"/><wp:positionH relativeFrom="column"><wp:posOffset>-58522</wp:posOffset></wp:positionH><wp:positionV relativeFrom="paragraph"><wp:posOffset>174677</wp:posOffset></wp:positionV><wp:extent cx="6379210" cy="438912"/><wp:effectExtent l="0" t="0" r="21590" b="18415"/><wp:wrapNone/><wp:docPr id="831407363" name="Retângulo 5"/><wp:cNvGraphicFramePr/><a:graphic xmlns:a="http://schemas.openxmlformats.org/drawingml/2006/main"><a:graphicData uri="http://schemas.microsoft.com/office/word/2010/wordprocessingShape"><wps:wsp><wps:cNvSpPr/><wps:spPr><a:xfrm><a:off x="0" y="0"/><a:ext cx="6379210" cy="438912"/></a:xfrm><a:prstGeom prst="rect"><a:avLst/></a:prstGeom><a:noFill/><a:ln w="9525" cap="flat" cmpd="sng" algn="ctr"><a:solidFill><a:schemeClr val="dk1"/></a:solidFill><a:prstDash val="solid"/><a:round/><a:headEnd type="none" w="med" len="med"/><a:tailEnd type="none" w="med" len="med"/></a:ln></wps:spPr><wps:style><a:lnRef idx="0"><a:scrgbClr r="0" g="0" b="0"/></a:lnRef><a:fillRef idx="0"><a:scrgbClr r="0" g="0" b="0"/></a:fillRef><a:effectRef idx="0"><a:scrgbClr r="0" g="0" b="0"/></a:effectRef><a:fontRef idx="minor"><a:schemeClr val="dk1"/></a:fontRef></wps:style><wps:bodyPr rot="0" spcFirstLastPara="0" vertOverflow="overflow" horzOverflow="overflow" vert="horz" wrap="square" lIns="91440" tIns="45720" rIns="91440" bIns="45720" numCol="1" spcCol="0" rtlCol="0" fromWordArt="0" anchor="ctr" anchorCtr="0" forceAA="0" compatLnSpc="1"><a:prstTxWarp prst="textNoShape"><a:avLst/></a:prstTxWarp><a:noAutofit/></wps:bodyPr></wps:wsp></a:graphicData></a:graphic><wp14:sizeRelH relativeFrom="margin"><wp14:pctWidth>0</wp14:pctWidth></wp14:sizeRelH><wp14:sizeRelV relativeFrom="margin"><wp14:pctHeight>0</wp14:pctHeight></wp14:sizeRelV></wp:anchor></w:drawing></mc:Choice><mc:Fallback><w:pict><v:rect w14:anchorId="50609028" id="Retângulo 5" o:spid="_x0000_s1026" style="position:absolute;margin-left:-4.6pt;margin-top:13.75pt;width:502.3pt;height:34.55pt;z-index:251672576;visibility:visible;mso-wrap-style:square;mso-width-percent:0;mso-height-percent:0;mso-wrap-distance-left:9pt;mso-wrap-distance-top:0;mso-wrap-distance-right:9pt;mso-wrap-distance-bottom:0;mso-position-horizontal:absolute;mso-position-horizontal-relative:text;mso-position-vertical:absolute;mso-position-vertical-relative:text;mso-width-percent:0;mso-height-percent:0;mso-width-relative:margin;mso-height-relative:margin;v-text-anchor:middle" o:gfxdata="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" filled="f" strokecolor="black [3200]"><v:stroke joinstyle="round"/></v:rect></w:pict></mc:Fallback></mc:AlternateContent></w:r></w:p><w:p><w:pPr><w:spacing w:after="0" w:line="240" w:lineRule="auto"/><w:rPr><w:rFonts w:asciiTheme="majorHAnsi" w:hAnsiTheme="majorHAnsi" w:cstheme="majorHAnsi"/><w:lang w:val="pt-BR"/></w:rPr></w:pPr></w:p><w:p><w:pPr><w:spacing w:after="0" w:line="240" w:lineRule="auto"/><w:rPr><w:rFonts w:asciiTheme="majorHAnsi" w:hAnsiTheme="majorHAnsi" w:cstheme="majorHAnsi"/><w:color w:val="auto"/><w:lang w:val="pt-BR"/></w:rPr></w:pPr><w:r><w:rPr><w:rFonts w:asciiTheme="majorHAnsi" w:hAnsiTheme="majorHAnsi" w:cstheme="majorHAnsi"/><w:color w:val="auto"/><w:lang w:val="pt-BR"/></w:rPr><w:t>{{Documentação Veículo}}</w:t></w:r></w:p><w:p><w:pPr><w:spacing w:after="0" w:line="240" w:lineRule="auto"/><w:rPr><w:rFonts w:asciiTheme="majorHAnsi" w:hAnsiTheme="majorHAnsi" w:cstheme="majorHAnsi"/><w:lang w:val="pt-BR"/></w:rPr></w:pPr><w:r><w:rPr><w:noProof/><w:color w:val="555555"/><w:sz w:val="18"/><w:szCs w:val="18"/><w:lang w:val="pt-BR"/></w:rPr><w:lastRenderedPageBreak/><mc:AlternateContent><mc:Choice Requires="wps"><w:drawing><wp:anchor distT="0" distB="0" distL="114300" distR="114300" simplePos="0" relativeHeight="251680768" behindDoc="0" locked="0" layoutInCell="1" allowOverlap="1" wp14:anchorId="2EA83F9D" wp14:editId="1879DC18"><wp:simplePos x="0" y="0"/><wp:positionH relativeFrom="column"><wp:posOffset>131674</wp:posOffset></wp:positionH><wp:positionV relativeFrom="paragraph"><wp:posOffset>-131674</wp:posOffset></wp:positionV><wp:extent cx="1543507" cy="248285"/><wp:effectExtent l="0" t="0" r="0" b="0"/><wp:wrapNone/><wp:docPr id="61563809" name="Caixa de Texto 3"/><wp:cNvGraphicFramePr/><a:graphic xmlns:a="http://schemas.openxmlformats.org/drawingml/2006/main"><a:graphicData uri="http://schemas.microsoft.com/office/word/2010/wordprocessingShape"><wps:wsp><wps:cNvSpPr txBox="1"/><wps:spPr><a:xfrm><a:off x="0" y="0"/><a:ext cx="1543507" cy="248285"/></a:xfrm><a:prstGeom prst="rect"><a:avLst/></a:prstGeom><a:solidFill><a:schemeClr val="lt1"/></a:solidFill><a:ln w="6350"><a:noFill/></a:ln></wps:spPr><wps:txbx><w:txbxContent><w:p><w:pPr><w:rPr><w:b/><w:bCs/><w:color w:val="808080" w:themeColor="background1" w:themeShade="80"/><w:lang w:val="pt-BR"/></w:rPr></w:pPr><w:r><w:rPr><w:b/><w:bCs/><w:color w:val="808080" w:themeColor="background1" w:themeShade="80"/><w:lang w:val="pt-BR"/></w:rPr><w:t xml:space="preserve">Retirada do Veículo</w:t></w:r></w:p></w:txbxContent></wps:txbx><wps:bodyPr rot="0" spcFirstLastPara="0" vertOverflow="overflow" horzOverflow="overflow" vert="horz" wrap="square" lIns="91440" tIns="45720" rIns="91440" bIns="45720" numCol="1" spcCol="0" rtlCol="0" fromWordArt="0" anchor="t" anchorCtr="0" forceAA="0" compatLnSpc="1"><a:prstTxWarp prst="textNoShape"><a:avLst/></a:prstTxWarp><a:noAutofit/></wps:bodyPr></wps:wsp></a:graphicData></a:graphic><wp14:sizeRelH relativeFrom="margin"><wp14:pctWidth>0</wp14:pctWidth></wp14:sizeRelH><wp14:sizeRelV relativeFrom="margin"><wp14:pctHeight>0</wp14:pctHeight></wp14:sizeRelV></wp:anchor></w:drawing></mc:Choice><mc:Fallback><w:pict><v:shape w14:anchorId="2EA83F9D" id="_x0000_s1031" type="#_x0000_t202" style="position:absolute;margin-left:10.35pt;margin-top:-10.35pt;width:121.55pt;height:19.55pt;z-index:251680768;visibility:visible;mso-wrap-style:square;mso-width-percent:0;mso-height-percent:0;mso-wrap-distance-left:9pt;mso-wrap-distance-top:0;mso-wrap-distance-right:9pt;mso-wrap-distance-bottom:0;mso-position-horizontal:absolute;mso-position-horizontal-relative:text;mso-position-vertical:absolute;mso-position-vertical-relative:text;mso-width-percent:0;mso-height-percent:0;mso-width-relative:margin;mso-height-relative:margin;v-text-anchor:top" o:gfxdata="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" fillcolor="white [3201]" stroked="f" strokeweight=".5pt"><v:textbox><w:txbxContent><w:p><w:pPr><w:rPr><w:b/><w:bCs/><w:color w:val="808080" w:themeColor="background1" w:themeShade="80"/><w:lang w:val="pt-BR"/></w:rPr></w:pPr><w:r><w:rPr><w:b/><w:bCs/><w:color w:val="808080" w:themeColor="background1" w:themeShade="80"/><w:lang w:val="pt-BR"/></w:rPr><w:t xml:space="preserve">Retirada do Veículo</w:t></w:r></w:p></w:txbxContent></v:textbox></v:shape></w:pict></mc:Fallback></mc:AlternateContent></w:r><w:r><w:rPr><w:rFonts w:asciiTheme="majorHAnsi" w:hAnsiTheme="majorHAnsi" w:cstheme="majorHAnsi"/><w:noProof/><w:lang w:val="pt-BR"/></w:rPr><mc:AlternateContent><mc:Choice Requires="wps"><w:drawing><wp:anchor distT="0" distB="0" distL="114300" distR="114300" simplePos="0" relativeHeight="251679744" behindDoc="0" locked="0" layoutInCell="1" allowOverlap="1" wp14:anchorId="74EAEBD4" wp14:editId="248F0758"><wp:simplePos x="0" y="0"/><wp:positionH relativeFrom="column"><wp:posOffset>0</wp:posOffset></wp:positionH><wp:positionV relativeFrom="paragraph"><wp:posOffset>-6985</wp:posOffset></wp:positionV><wp:extent cx="6379210" cy="438785"/><wp:effectExtent l="0" t="0" r="21590" b="18415"/><wp:wrapNone/><wp:docPr id="251581415" name="Retângulo 5"/><wp:cNvGraphicFramePr/><a:graphic xmlns:a="http://schemas.openxmlformats.org/drawingml/2006/main"><a:graphicData uri="http://schemas.microsoft.com/office/word/2010/wordprocessingShape"><wps:wsp><wps:cNvSpPr/><wps:spPr><a:xfrm><a:off x="0" y="0"/><a:ext cx="6379210" cy="438785"/></a:xfrm><a:prstGeom prst="rect"><a:avLst/></a:prstGeom><a:noFill/><a:ln w="9525" cap="flat" cmpd="sng" algn="ctr"><a:solidFill><a:schemeClr val="dk1"/></a:solidFill><a:prstDash val="solid"/><a:round/><a:headEnd type="none" w="med" len="med"/><a:tailEnd type="none" w="med" len="med"/></a:ln></wps:spPr><wps:style><a:lnRef idx="0"><a:scrgbClr r="0" g="0" b="0"/></a:lnRef><a:fillRef idx="0"><a:scrgbClr r="0" g="0" b="0"/></a:fillRef><a:effectRef idx="0"><a:scrgbClr r="0" g="0" b="0"/></a:effectRef><a:fontRef idx="minor"><a:schemeClr val="dk1"/></a:fontRef></wps:style><wps:bodyPr rot="0" spcFirstLastPara="0" vertOverflow="overflow" horzOverflow="overflow" vert="horz" wrap="square" lIns="91440" tIns="45720" rIns="91440" bIns="45720" numCol="1" spcCol="0" rtlCol="0" fromWordArt="0" anchor="ctr" anchorCtr="0" forceAA="0" compatLnSpc="1"><a:prstTxWarp prst="textNoShape"><a:avLst/></a:prstTxWarp><a:noAutofit/></wps:bodyPr></wps:wsp></a:graphicData></a:graphic><wp14:sizeRelH relativeFrom="margin"><wp14:pctWidth>0</wp14:pctWidth></wp14:sizeRelH><wp14:sizeRelV relativeFrom="margin"><wp14:pctHeight>0</wp14:pctHeight></wp14:sizeRelV></wp:anchor></w:drawing></mc:Choice><mc:Fallback><w:pict><v:rect w14:anchorId="490DDC60" id="Retângulo 5" o:spid="_x0000_s1026" style="position:absolute;margin-left:0;margin-top:-.55pt;width:502.3pt;height:34.55pt;z-index:251679744;visibility:visible;mso-wrap-style:square;mso-width-percent:0;mso-height-percent:0;mso-wrap-distance-left:9pt;mso-wrap-distance-top:0;mso-wrap-distance-right:9pt;mso-wrap-distance-bottom:0;mso-position-horizontal:absolute;mso-position-horizontal-relative:text;mso-position-vertical:absolute;mso-position-vertical-relative:text;mso-width-percent:0;mso-height-percent:0;mso-width-relative:margin;mso-height-relative:margin;v-text-anchor:middle" o:gfxdata="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" filled="f" strokecolor="black [3200]"><v:stroke joinstyle="round"/></v:rect></w:pict></mc:Fallback></mc:AlternateContent></w:r><w:r><w:rPr><w:rFonts w:asciiTheme="majorHAnsi" w:hAnsiTheme="majorHAnsi" w:cstheme="majorHAnsi"/><w:noProof/><w:lang w:val="pt-BR"/></w:rPr><mc:AlternateContent><mc:Choice Requires="wps"><w:drawing><wp:anchor distT="0" distB="0" distL="114300" distR="114300" simplePos="0" relativeHeight="251676672" behindDoc="0" locked="0" layoutInCell="1" allowOverlap="1" wp14:anchorId="45FFBD53" wp14:editId="75B855EB"><wp:simplePos x="0" y="0"/><wp:positionH relativeFrom="column"><wp:posOffset>58420</wp:posOffset></wp:positionH><wp:positionV relativeFrom="paragraph"><wp:posOffset>-8009992</wp:posOffset></wp:positionV><wp:extent cx="6379210" cy="438912"/><wp:effectExtent l="0" t="0" r="21590" b="18415"/><wp:wrapNone/><wp:docPr id="1169075387" name="Retângulo 5"/><wp:cNvGraphicFramePr/><a:graphic xmlns:a="http://schemas.openxmlformats.org/drawingml/2006/main"><a:graphicData uri="http://schemas.microsoft.com/office/word/2010/wordprocessingShape"><wps:wsp><wps:cNvSpPr/><wps:spPr><a:xfrm><a:off x="0" y="0"/><a:ext cx="6379210" cy="438912"/></a:xfrm><a:prstGeom prst="rect"><a:avLst/></a:prstGeom><a:noFill/><a:ln w="9525" cap="flat" cmpd="sng" algn="ctr"><a:solidFill><a:schemeClr val="dk1"/></a:solidFill><a:prstDash val="solid"/><a:round/><a:headEnd type="none" w="med" len="med"/><a:tailEnd type="none" w="med" len="med"/></a:ln></wps:spPr><wps:style><a:lnRef idx="0"><a:scrgbClr r="0" g="0" b="0"/></a:lnRef><a:fillRef idx="0"><a:scrgbClr r="0" g="0" b="0"/></a:fillRef><a:effectRef idx="0"><a:scrgbClr r="0" g="0" b="0"/></a:effectRef><a:fontRef idx="minor"><a:schemeClr val="dk1"/></a:fontRef></wps:style><wps:bodyPr rot="0" spcFirstLastPara="0" vertOverflow="overflow" horzOverflow="overflow" vert="horz" wrap="square" lIns="91440" tIns="45720" rIns="91440" bIns="45720" numCol="1" spcCol="0" rtlCol="0" fromWordArt="0" anchor="ctr" anchorCtr="0" forceAA="0" compatLnSpc="1"><a:prstTxWarp prst="textNoShape"><a:avLst/></a:prstTxWarp><a:noAutofit/></wps:bodyPr></wps:wsp></a:graphicData></a:graphic><wp14:sizeRelH relativeFrom="margin"><wp14:pctWidth>0</wp14:pctWidth></wp14:sizeRelH><wp14:sizeRelV relativeFrom="margin"><wp14:pctHeight>0</wp14:pctHeight></wp14:sizeRelV></wp:anchor></w:drawing></mc:Choice><mc:Fallback><w:pict><v:rect w14:anchorId="27A27FCF" id="Retângulo 5" o:spid="_x0000_s1026" style="position:absolute;margin-left:4.6pt;margin-top:-630.7pt;width:502.3pt;height:34.55pt;z-index:251676672;visibility:visible;mso-wrap-style:square;mso-width-percent:0;mso-height-percent:0;mso-wrap-distance-left:9pt;mso-wrap-distance-top:0;mso-wrap-distance-right:9pt;mso-wrap-distance-bottom:0;mso-position-horizontal:absolute;mso-position-horizontal-relative:text;mso-position-vertical:absolute;mso-position-vertical-relative:text;mso-width-percent:0;mso-height-percent:0;mso-width-relative:margin;mso-height-relative:margin;v-text-anchor:middle" o:gfxdata="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" filled="f" strokecolor="black [3200]"><v:stroke joinstyle="round"/></v:rect></w:pict></mc:Fallback></mc:AlternateContent></w:r><w:r><w:rPr><w:noProof/><w:color w:val="555555"/><w:sz w:val="18"/><w:szCs w:val="18"/><w:lang w:val="pt-BR"/></w:rPr><mc:AlternateContent><mc:Choice Requires="wps"><w:drawing><wp:anchor distT="0" distB="0" distL="114300" distR="114300" simplePos="0" relativeHeight="251677696" behindDoc="0" locked="0" layoutInCell="1" allowOverlap="1" wp14:anchorId="7D0B1ABE" wp14:editId="3BC50F5C"><wp:simplePos x="0" y="0"/><wp:positionH relativeFrom="column"><wp:posOffset>190094</wp:posOffset></wp:positionH><wp:positionV relativeFrom="paragraph"><wp:posOffset>-8134350</wp:posOffset></wp:positionV><wp:extent cx="1250899" cy="248285"/><wp:effectExtent l="0" t="0" r="6985" b="0"/><wp:wrapNone/><wp:docPr id="516805717" name="Caixa de Texto 3"/><wp:cNvGraphicFramePr/><a:graphic xmlns:a="http://schemas.openxmlformats.org/drawingml/2006/main"><a:graphicData uri="http://schemas.microsoft.com/office/word/2010/wordprocessingShape"><wps:wsp><wps:cNvSpPr txBox="1"/><wps:spPr><a:xfrm><a:off x="0" y="0"/><a:ext cx="1250899" cy="248285"/></a:xfrm><a:prstGeom prst="rect"><a:avLst/></a:prstGeom><a:solidFill><a:schemeClr val="lt1"/></a:solidFill><a:ln w="6350"><a:noFill/></a:ln></wps:spPr><wps:txbx><w:txbxContent><w:p><w:pPr><w:rPr><w:b/><w:bCs/><w:color w:val="808080" w:themeColor="background1" w:themeShade="80"/><w:lang w:val="pt-BR"/></w:rPr></w:pPr><w:r><w:rPr><w:b/><w:bCs/><w:color w:val="808080" w:themeColor="background1" w:themeShade="80"/><w:lang w:val="pt-BR"/></w:rPr><w:t>Documentação</w:t></w:r></w:p></w:txbxContent></wps:txbx><wps:bodyPr rot="0" spcFirstLastPara="0" vertOverflow="overflow" horzOverflow="overflow" vert="horz" wrap="square" lIns="91440" tIns="45720" rIns="91440" bIns="45720" numCol="1" spcCol="0" rtlCol="0" fromWordArt="0" anchor="t" anchorCtr="0" forceAA="0" compatLnSpc="1"><a:prstTxWarp prst="textNoShape"><a:avLst/></a:prstTxWarp><a:noAutofit/></wps:bodyPr></wps:wsp></a:graphicData></a:graphic><wp14:sizeRelH relativeFrom="margin"><wp14:pctWidth>0</wp14:pctWidth></wp14:sizeRelH><wp14:sizeRelV relativeFrom="margin"><wp14:pctHeight>0</wp14:pctHeight></wp14:sizeRelV></wp:anchor></w:drawing></mc:Choice><mc:Fallback><w:pict><v:shape w14:anchorId="7D0B1ABE" id="_x0000_s1032" type="#_x0000_t202" style="position:absolute;margin-left:14.95pt;margin-top:-640.5pt;width:98.5pt;height:19.55pt;z-index:251677696;visibility:visible;mso-wrap-style:square;mso-width-percent:0;mso-height-percent:0;mso-wrap-distance-left:9pt;mso-wrap-distance-top:0;mso-wrap-distance-right:9pt;mso-wrap-distance-bottom:0;mso-position-horizontal:absolute;mso-position-horizontal-relative:text;mso-position-vertical:absolute;mso-position-vertical-relative:text;mso-width-percent:0;mso-height-percent:0;mso-width-relative:margin;mso-height-relative:margin;v-text-anchor:top" o:gfxdata="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" fillcolor="white [3201]" stroked="f" strokeweight=".5pt"><v:textbox><w:txbxContent><w:p><w:pPr><w:rPr><w:b/><w:bCs/><w:color w:val="808080" w:themeColor="background1" w:themeShade="80"/><w:lang w:val="pt-BR"/></w:rPr></w:pPr><w:r><w:rPr><w:b/><w:bCs/><w:color w:val="808080" w:themeColor="background1" w:themeShade="80"/><w:lang w:val="pt-BR"/></w:rPr><w:t>Documentação</w:t></w:r></w:p></w:txbxContent></v:textbox></v:shape></w:pict></mc:Fallback></mc:AlternateContent></w:r></w:p><w:p><w:pPr><w:spacing w:after="0" w:line="240" w:lineRule="auto"/><w:rPr><w:rFonts w:asciiTheme="majorHAnsi" w:hAnsiTheme="majorHAnsi" w:cstheme="majorHAnsi"/><w:lang w:val="pt-BR"/></w:rPr></w:pPr><w:r><w:rPr><w:rFonts w:asciiTheme="majorHAnsi" w:hAnsiTheme="majorHAnsi" w:cstheme="majorHAnsi"/><w:lang w:val="pt-BR"/></w:rPr><w:t xml:space="preserve">   Data: _____/_____/__________ Hora: _____:_____ KM: {{KM}}</w:t></w:r></w:p><w:p><w:pPr><w:spacing w:after="0" w:line="240" w:lineRule="auto"/><w:rPr><w:rFonts w:asciiTheme="majorHAnsi" w:hAnsiTheme="majorHAnsi" w:cstheme="majorHAnsi"/><w:lang w:val="pt-BR"/></w:rPr></w:pPr></w:p><w:p><w:pPr><w:spacing w:after="0" w:line="240" w:lineRule="auto"/><w:rPr><w:rFonts w:asciiTheme="majorHAnsi" w:hAnsiTheme="majorHAnsi" w:cstheme="majorHAnsi"/><w:lang w:val="pt-BR"/></w:rPr></w:pPr></w:p><w:p><w:pPr><w:spacing w:after="0" w:line="240" w:lineRule="auto"/><w:rPr><w:rFonts w:asciiTheme="majorHAnsi" w:hAnsiTheme="majorHAnsi" w:cstheme="majorHAnsi"/><w:b/><w:bCs/><w:lang w:val="pt-BR"/></w:rPr></w:pPr><w:r><w:rPr><w:rFonts w:asciiTheme="majorHAnsi" w:hAnsiTheme="majorHAnsi" w:cstheme="majorHAnsi"/><w:b/><w:bCs/><w:lang w:val="pt-BR"/></w:rPr><w:t>TERMO DE CONSENTIMENTO</w:t></w:r></w:p><w:p><w:pPr><w:spacing w:after="0" w:line="240" w:lineRule="auto"/><w:rPr><w:rFonts w:asciiTheme="majorHAnsi" w:hAnsiTheme="majorHAnsi" w:cstheme="majorHAnsi"/><w:lang w:val="pt-BR"/></w:rPr></w:pPr><w:r><w:rPr><w:rFonts w:asciiTheme="majorHAnsi" w:hAnsiTheme="majorHAnsi" w:cstheme="majorHAnsi"/><w:lang w:val="pt-BR"/></w:rPr><w:t>Termo de consentimento para armazenamento e tratamento de dados pessoais em conformidade com a LGPD. O proprietário, na condição de titular dos dados pessoais, manifesta livre, informada e inequívoca concordância com o tratamento de seus dados pessoais pela (BROTHERS MULTIMARCAS) para finalidade específica, em conformidade com a Lei nº 13.709 – Lei Geral de Proteção de Dados Pessoais (LGPD), tendo assegurado seu direito de acesso, retificação e eliminação dos mesmos, devendo, para tanto, solicitar à (BROTHERS MULTIMARCAS). O presente termo isenta a (INTERMEDIADORA) (BROTHERS MULTIMARCAS), das responsabilidades e obrigações inerentes a infrações de trânsito e eventuais IMPOSTOS E/OU TAXAS (IPVA/SEGURO OBRIGATÓRIO/ LICENCIAMENTO) que ocorrerem a partir desta data, já o Comprador (CLIENTE) se responsabiliza por infrações de trânsito e eventuais IMPOSTOS E/OU TAXAS (IPVA/SEGURO OBRIGATÓRIO/ LICENCIAMENTO) que ocorrerem a partir desta data. O comprador (a) declara neste recibo, haver examinado o veículo acima descrito. Este veículo possui garantia em conformidade com o Art.26 II C.D.C. Prevalecerá o que ocorrer primeiro. No caso da venda do veículo pela INTERMEDIADORA e o COMPRADOR (CLIENTE) desistir da venda em questão dentro do prazo legal, fica estipulado a cobrança no valor da comissão de 6% (Seis) deste contrato, para que a INTERMEDIADORA pague todas as despesas em decorrência da venda. Fica acordado entre as partes que a negociação está sendo realizada através de intermediação entre o (VENDEDOR (PROPRIETÁRIO)) e o (COMPRADOR (CLIENTE)), deste modo a loja se dispõe de todos os recursos administrativos para viabilizar a operação de COMPRA/VENDA.E por estar de pleno acordo com o aqui descrito, assina o comprador o presente.</w:t></w:r></w:p><w:p><w:pPr><w:spacing w:after="0" w:line="240" w:lineRule="auto"/><w:rPr><w:rFonts w:asciiTheme="majorHAnsi" w:hAnsiTheme="majorHAnsi" w:cstheme="majorHAnsi"/><w:lang w:val="pt-BR"/></w:rPr></w:pPr></w:p><w:p><w:pPr><w:rPr><w:rFonts w:asciiTheme="majorHAnsi" w:hAnsiTheme="majorHAnsi" w:cstheme="majorHAnsi"/><w:lang w:val="pt-BR"/></w:rPr></w:pPr></w:p><w:p><w:pPr><w:rPr><w:lang w:val="pt-BR"/></w:rPr></w:pPr><w:r><w:rPr><w:b/><w:bCs/><w:lang w:val="pt-BR"/></w:rPr><w:t xml:space="preserve">Guarulhos, {{Data da Venda}}.</w:t></w:r></w:p><w:p><w:pPr><w:spacing w:after="0" w:line="240" w:lineRule="auto"/><w:rPr><w:b/><w:bCs/><w:lang w:val="pt-BR"/></w:rPr></w:pPr></w:p><w:p><w:pPr><w:spacing w:after="0" w:line="240" w:lineRule="auto"/><w:rPr><w:b/><w:bCs/><w:lang w:val="pt-BR"/></w:rPr></w:pPr></w:p><w:p><w:pPr><w:spacing w:after="0" w:line="240" w:lineRule="auto"/><w:rPr><w:b/><w:bCs/><w:lang w:val="pt-BR"/></w:rPr></w:pPr><w:r><w:rPr><w:b/><w:bCs/><w:lang w:val="pt-BR"/></w:rPr><w:t>_____________________________________________________________</w:t></w:r></w:p><w:p><w:pPr><w:spacing w:after="0" w:line="240" w:lineRule="auto"/><w:rPr><w:lang w:val="pt-BR"/></w:rPr></w:pPr><w:r><w:rPr><w:b/><w:bCs/><w:lang w:val="pt-BR"/></w:rPr><w:t>Cliente: {{Nome do Cliente}}CPF: {{CPF}}</w:t></w:r></w:p><w:p><w:pPr><w:spacing w:after="0" w:line="240" w:lineRule="auto"/><w:rPr><w:lang w:val="pt-BR"/></w:rPr></w:pPr></w:p><w:p><w:pPr><w:spacing w:after="0" w:line="240" w:lineRule="auto"/><w:rPr><w:lang w:val="pt-BR"/></w:rPr></w:pPr></w:p><w:p><w:pPr><w:spacing w:after="0" w:line="240" w:lineRule="auto"/><w:rPr><w:b/><w:bCs/><w:lang w:val="pt-BR"/></w:rPr></w:pPr></w:p><w:p><w:pPr><w:spacing w:after="0" w:line="240" w:lineRule="auto"/><w:rPr><w:b/><w:bCs/><w:lang w:val="pt-BR"/></w:rPr></w:pPr></w:p><w:p><w:pPr><w:spacing w:after="0" w:line="240" w:lineRule="auto"/><w:rPr><w:b/><w:bCs/><w:lang w:val="pt-BR"/></w:rPr></w:pPr></w:p><w:p><w:pPr><w:spacing w:after="0" w:line="240" w:lineRule="auto"/><w:rPr><w:b/><w:bCs/><w:lang w:val="pt-BR"/></w:rPr></w:pPr><w:r><w:rPr><w:b/><w:bCs/><w:lang w:val="pt-BR"/></w:rPr><w:t>_____________________________________________________________</w:t></w:r></w:p><w:p><w:pPr><w:spacing w:after="0" w:line="240" w:lineRule="auto"/><w:rPr><w:b/><w:bCs/><w:lang w:val="pt-BR"/></w:rPr></w:pPr><w:r><w:rPr><w:b/><w:bCs/><w:lang w:val="pt-BR"/></w:rPr><w:t>JTS INTERMEDIAÇÕES E NEGOCIOS LTDA</w:t></w:r></w:p><w:p><w:pPr><w:spacing w:after="0" w:line="240" w:lineRule="auto"/><w:rPr><w:b/><w:bCs/><w:lang w:val="pt-BR"/></w:rPr></w:pPr></w:p><w:p><w:pPr><w:spacing w:after="0" w:line="240" w:lineRule="auto"/><w:rPr><w:b/><w:bCs/><w:lang w:val="pt-BR"/></w:rPr></w:pPr></w:p><w:p><w:pPr><w:spacing w:after="0" w:line="240" w:lineRule="auto"/><w:rPr><w:b/><w:bCs/><w:lang w:val="pt-BR"/></w:rPr></w:pPr></w:p><w:p><w:pPr><w:spacing w:after="0" w:line="240" w:lineRule="auto"/><w:rPr><w:b/><w:bCs/><w:lang w:val="pt-BR"/></w:rPr></w:pPr><w:r><w:rPr><w:b/><w:bCs/><w:lang w:val="pt-BR"/></w:rPr><w:t>_____________________________________________________________</w:t></w:r></w:p><w:p><w:pPr><w:spacing w:after="0" w:line="240" w:lineRule="auto"/><w:rPr><w:b/><w:bCs/><w:lang w:val="pt-BR"/></w:rPr></w:pPr><w:r><w:rPr><w:b/><w:bCs/><w:lang w:val="pt-BR"/></w:rPr><w:t>Vendedor: {{Vendedor}}</w:t></w:r></w:p><w:p><w:pPr><w:spacing w:after="0" w:line="240" w:lineRule="auto"/><w:rPr><w:b/><w:bCs/><w:lang w:val="pt-BR"/></w:rPr></w:pPr></w:p><w:p><w:pPr><w:spacing w:after="0" w:line="240" w:lineRule="auto"/><w:rPr><w:b/><w:bCs/><w:lang w:val="pt-BR"/></w:rPr></w:pPr></w:p><w:p><w:pPr><w:spacing w:after="0" w:line="240" w:lineRule="auto"/><w:rPr><w:b/><w:bCs/><w:lang w:val="pt-BR"/></w:rPr></w:pPr></w:p><w:p><w:pPr><w:spacing w:after="0" w:line="240" w:lineRule="auto"/><w:rPr><w:b/><w:bCs/><w:lang w:val="pt-BR"/></w:rPr></w:pPr></w:p><w:p><w:pPr><w:spacing w:after="0" w:line="240" w:lineRule="auto"/><w:rPr><w:b/><w:bCs/><w:lang w:val="pt-BR"/></w:rPr></w:pPr></w:p><w:p><w:pPr><w:spacing w:after="0" w:line="240" w:lineRule="auto"/><w:rPr><w:b/><w:bCs/><w:lang w:val="pt-BR"/></w:rPr></w:pPr></w:p><w:p><w:pPr><w:rPr><w:lang w:val="pt-BR"/></w:rPr></w:pPr><w:r><w:rPr><w:b/><w:bCs/><w:lang w:val="pt-BR"/></w:rPr><w:t>Testemunhas:</w:t></w:r></w:p><w:p><w:pPr><w:numPr><w:ilvl w:val="0"/><w:numId w:val="15"/></w:numPr><w:rPr><w:lang w:val="pt-BR"/></w:rPr></w:pPr><w:r><w:rPr><w:lang w:val="pt-BR"/></w:rPr><w:t>___________________________________ - CPF: ______________</w:t></w:r></w:p><w:p><w:pPr><w:numPr><w:ilvl w:val="0"/><w:numId w:val="15"/></w:numPr><w:rPr><w:lang w:val="pt-BR"/></w:rPr></w:pPr><w:r><w:rPr><w:lang w:val="pt-BR"/></w:rPr><w:t>___________________________________ - CPF: ______________</w:t></w:r></w:p><w:p><w:pPr><w:rPr><w:lang w:val="pt-BR"/></w:rPr></w:pPr></w:p><w:sectPr><w:pgSz w:w="12240" w:h="15840"/><w:pgMar w:top="1152" w:right="1152" w:bottom="1152" w:left="1152" w:header="720" w:footer="720" w:gutter="0"/><w:cols w:space="720"/><w:docGrid w:linePitch="360"/></w:sectPr></w:body></w:document>
+<file path=word/document.xml><?xml version="1.0" encoding="utf-8"?>
+<w:document xmlns:wpc="http://schemas.microsoft.com/office/word/2010/wordprocessingCanvas" xmlns:cx="http://schemas.microsoft.com/office/drawing/2014/chartex" xmlns:cx1="http://schemas.microsoft.com/office/drawing/2015/9/8/chartex" xmlns:cx2="http://schemas.microsoft.com/office/drawing/2015/10/21/chartex" xmlns:cx3="http://schemas.microsoft.com/office/drawing/2016/5/9/chartex" xmlns:cx4="http://schemas.microsoft.com/office/drawing/2016/5/10/chartex" xmlns:cx5="http://schemas.microsoft.com/office/drawing/2016/5/11/chartex" xmlns:cx6="http://schemas.microsoft.com/office/drawing/2016/5/12/chartex" xmlns:cx7="http://schemas.microsoft.com/office/drawing/2016/5/13/chartex" xmlns:cx8="http://schemas.microsoft.com/office/drawing/2016/5/14/chartex" xmlns:mc="http://schemas.openxmlformats.org/markup-compatibility/2006" xmlns:aink="http://schemas.microsoft.com/office/drawing/2016/ink" xmlns:am3d="http://schemas.microsoft.com/office/drawing/2017/model3d" xmlns:o="urn:schemas-microsoft-com:office:office" xmlns:oel="http://schemas.microsoft.com/office/2019/extlst" xmlns:r="http://schemas.openxmlformats.org/officeDocument/2006/relationships" xmlns:m="http://schemas.openxmlformats.org/officeDocument/2006/math" xmlns:v="urn:schemas-microsoft-com:vml" xmlns:wp14="http://schemas.microsoft.com/office/word/2010/wordprocessingDrawing" xmlns:wp="http://schemas.openxmlformats.org/drawingml/2006/wordprocessingDrawing" xmlns:w10="urn:schemas-microsoft-com:office:word" xmlns:w="http://schemas.openxmlformats.org/wordprocessingml/2006/main" xmlns:w14="http://schemas.microsoft.com/office/word/2010/wordml" xmlns:w15="http://schemas.microsoft.com/office/word/2012/wordml" xmlns:w16cex="http://schemas.microsoft.com/office/word/2018/wordml/cex" xmlns:w16cid="http://schemas.microsoft.com/office/word/2016/wordml/cid" xmlns:w16="http://schemas.microsoft.com/office/word/2018/wordml" xmlns:w16du="http://schemas.microsoft.com/office/word/2023/wordml/word16du" xmlns:w16sdtdh="http://schemas.microsoft.com/office/word/2020/wordml/sdtdatahash" xmlns:w16sdtfl="http://schemas.microsoft.com/office/word/2024/wordml/sdtformatlock" xmlns:w16se="http://schemas.microsoft.com/office/word/2015/wordml/symex" xmlns:wpg="http://schemas.microsoft.com/office/word/2010/wordprocessingGroup" xmlns:wpi="http://schemas.microsoft.com/office/word/2010/wordprocessingInk" xmlns:wne="http://schemas.microsoft.com/office/word/2006/wordml" xmlns:wps="http://schemas.microsoft.com/office/word/2010/wordprocessingShape" mc:Ignorable="w14 w15 w16se w16cid w16 w16cex w16sdtdh w16sdtfl w16du wp14">
+  <w:body>
+    <w:p>
+      <w:pPr>
+        <w:spacing w:after="40"/>
+        <w:jc w:val="center"/>
+        <w:rPr>
+          <w:color w:val="808080" w:themeColor="background1" w:themeShade="80"/>
+          <w:sz w:val="24"/>
+          <w:szCs w:val="24"/>
+          <w:lang w:val="pt-BR"/>
+        </w:rPr>
+      </w:pPr>
+      <w:r>
+        <w:rPr>
+          <w:b/>
+          <w:color w:val="808080" w:themeColor="background1" w:themeShade="80"/>
+          <w:sz w:val="24"/>
+          <w:szCs w:val="24"/>
+          <w:lang w:val="pt-BR"/>
+        </w:rPr>
+        <w:t>JTS INTERMEDIAÇÕES E NEGÓCIOS LTDA</w:t>
+      </w:r>
+    </w:p>
+    <w:p>
+      <w:pPr>
+        <w:spacing w:after="280"/>
+        <w:jc w:val="center"/>
+        <w:rPr>
+          <w:color w:val="555555"/>
+          <w:sz w:val="18"/>
+          <w:szCs w:val="18"/>
+          <w:lang w:val="pt-BR"/>
+        </w:rPr>
+      </w:pPr>
+      <w:r>
+        <w:rPr>
+          <w:color w:val="555555"/>
+          <w:sz w:val="18"/>
+          <w:szCs w:val="18"/>
+          <w:lang w:val="pt-BR"/>
+        </w:rPr>
+        <w:t>CNPJ: 48.573.595/0001-09</w:t>
+      </w:r>
+      <w:r>
+        <w:rPr>
+          <w:color w:val="555555"/>
+          <w:sz w:val="18"/>
+          <w:szCs w:val="18"/>
+          <w:lang w:val="pt-BR"/>
+        </w:rPr>
+        <w:br/>
+        <w:t>Av. Anton Philips, 186, Vila Hermínia - Guarulhos - SP</w:t>
+      </w:r>
+      <w:r>
+        <w:rPr>
+          <w:color w:val="555555"/>
+          <w:sz w:val="18"/>
+          <w:szCs w:val="18"/>
+          <w:lang w:val="pt-BR"/>
+        </w:rPr>
+        <w:br/>
+        <w:t>Tel: (11) 9588-15059</w:t>
+      </w:r>
+    </w:p>
+    <w:p>
+      <w:pPr>
+        <w:pStyle w:val="Ttulo1"/>
+        <w:pBdr>
+          <w:bottom w:val="single" w:sz="6" w:space="4" w:color="1B365D"/>
+        </w:pBdr>
+        <w:spacing w:before="240" w:after="240"/>
+        <w:jc w:val="center"/>
+        <w:rPr>
+          <w:color w:val="808080" w:themeColor="background1" w:themeShade="80"/>
+          <w:sz w:val="24"/>
+          <w:szCs w:val="24"/>
+          <w:lang w:val="pt-BR"/>
+        </w:rPr>
+      </w:pPr>
+      <w:r>
+        <w:rPr>
+          <w:noProof/>
+          <w:color w:val="555555"/>
+          <w:sz w:val="18"/>
+          <w:szCs w:val="18"/>
+          <w:lang w:val="pt-BR"/>
+        </w:rPr>
+        <mc:AlternateContent>
+          <mc:Choice Requires="wps">
+            <w:drawing>
+              <wp:anchor distT="0" distB="0" distL="114300" distR="114300" simplePos="0" relativeHeight="251659264" behindDoc="0" locked="0" layoutInCell="1" allowOverlap="1" wp14:anchorId="678F545F" wp14:editId="6D877F71">
+                <wp:simplePos x="0" y="0"/>
+                <wp:positionH relativeFrom="column">
+                  <wp:posOffset>131674</wp:posOffset>
+                </wp:positionH>
+                <wp:positionV relativeFrom="paragraph">
+                  <wp:posOffset>334493</wp:posOffset>
+                </wp:positionV>
+                <wp:extent cx="1499616" cy="226771"/>
+                <wp:effectExtent l="0" t="0" r="5715" b="1905"/>
+                <wp:wrapNone/>
+                <wp:docPr id="415614360" name="Caixa de Texto 3"/>
+                <wp:cNvGraphicFramePr/>
+                <a:graphic xmlns:a="http://schemas.openxmlformats.org/drawingml/2006/main">
+                  <a:graphicData uri="http://schemas.microsoft.com/office/word/2010/wordprocessingShape">
+                    <wps:wsp>
+                      <wps:cNvSpPr txBox="1"/>
+                      <wps:spPr>
+                        <a:xfrm>
+                          <a:off x="0" y="0"/>
+                          <a:ext cx="1499616" cy="226771"/>
+                        </a:xfrm>
+                        <a:prstGeom prst="rect">
+                          <a:avLst/>
+                        </a:prstGeom>
+                        <a:solidFill>
+                          <a:schemeClr val="lt1"/>
+                        </a:solidFill>
+                        <a:ln w="6350">
+                          <a:noFill/>
+                        </a:ln>
+                      </wps:spPr>
+                      <wps:txbx>
+                        <w:txbxContent>
+                          <w:p>
+                            <w:pPr>
+                              <w:rPr>
+                                <w:b/>
+                                <w:bCs/>
+                                <w:color w:val="808080" w:themeColor="background1" w:themeShade="80"/>
+                              </w:rPr>
+                            </w:pPr>
+                            <w:r>
+                              <w:rPr>
+                                <w:b/>
+                                <w:bCs/>
+                                <w:color w:val="808080" w:themeColor="background1" w:themeShade="80"/>
+                              </w:rPr>
+                              <w:t xml:space="preserve">Informações </w:t>
+                            </w:r>
+                            <w:r>
+                              <w:rPr>
+                                <w:b/>
+                                <w:bCs/>
+                                <w:color w:val="808080" w:themeColor="background1" w:themeShade="80"/>
+                              </w:rPr>
+                              <w:t>Cliente</w:t>
+                            </w:r>
+                          </w:p>
+                        </w:txbxContent>
+                      </wps:txbx>
+                      <wps:bodyPr rot="0" spcFirstLastPara="0" vertOverflow="overflow" horzOverflow="overflow" vert="horz" wrap="square" lIns="91440" tIns="45720" rIns="91440" bIns="45720" numCol="1" spcCol="0" rtlCol="0" fromWordArt="0" anchor="t" anchorCtr="0" forceAA="0" compatLnSpc="1">
+                        <a:prstTxWarp prst="textNoShape">
+                          <a:avLst/>
+                        </a:prstTxWarp>
+                        <a:noAutofit/>
+                      </wps:bodyPr>
+                    </wps:wsp>
+                  </a:graphicData>
+                </a:graphic>
+                <wp14:sizeRelH relativeFrom="margin">
+                  <wp14:pctWidth>0</wp14:pctWidth>
+                </wp14:sizeRelH>
+                <wp14:sizeRelV relativeFrom="margin">
+                  <wp14:pctHeight>0</wp14:pctHeight>
+                </wp14:sizeRelV>
+              </wp:anchor>
+            </w:drawing>
+          </mc:Choice>
+          <mc:Fallback>
+            <w:pict>
+              <v:shapetype w14:anchorId="678F545F" id="_x0000_t202" coordsize="21600,21600" o:spt="202" path="m,l,21600r21600,l21600,xe">
+                <v:stroke joinstyle="miter"/>
+                <v:path gradientshapeok="t" o:connecttype="rect"/>
+              </v:shapetype>
+              <v:shape id="Caixa de Texto 3" o:spid="_x0000_s1026" type="#_x0000_t202" style="position:absolute;left:0;text-align:left;margin-left:10.35pt;margin-top:26.35pt;width:118.1pt;height:17.85pt;z-index:251659264;visibility:visible;mso-wrap-style:square;mso-width-percent:0;mso-height-percent:0;mso-wrap-distance-left:9pt;mso-wrap-distance-top:0;mso-wrap-distance-right:9pt;mso-wrap-distance-bottom:0;mso-position-horizontal:absolute;mso-position-horizontal-relative:text;mso-position-vertical:absolute;mso-position-vertical-relative:text;mso-width-percent:0;mso-height-percent:0;mso-width-relative:margin;mso-height-relative:margin;v-text-anchor:top" o:gfxdata="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" fillcolor="white [3201]" stroked="f" strokeweight=".5pt">
+                <v:textbox>
+                  <w:txbxContent>
+                    <w:p>
+                      <w:pPr>
+                        <w:rPr>
+                          <w:b/>
+                          <w:bCs/>
+                          <w:color w:val="808080" w:themeColor="background1" w:themeShade="80"/>
+                        </w:rPr>
+                      </w:pPr>
+                      <w:r>
+                        <w:rPr>
+                          <w:b/>
+                          <w:bCs/>
+                          <w:color w:val="808080" w:themeColor="background1" w:themeShade="80"/>
+                        </w:rPr>
+                        <w:t xml:space="preserve">Informações </w:t>
+                      </w:r>
+                      <w:r>
+                        <w:rPr>
+                          <w:b/>
+                          <w:bCs/>
+                          <w:color w:val="808080" w:themeColor="background1" w:themeShade="80"/>
+                        </w:rPr>
+                        <w:t>Cliente</w:t>
+                      </w:r>
+                    </w:p>
+                  </w:txbxContent>
+                </v:textbox>
+              </v:shape>
+            </w:pict>
+          </mc:Fallback>
+        </mc:AlternateContent>
+      </w:r>
+      <w:r>
+        <w:rPr>
+          <w:rFonts w:ascii="Arial" w:hAnsi="Arial"/>
+          <w:color w:val="808080" w:themeColor="background1" w:themeShade="80"/>
+          <w:sz w:val="24"/>
+          <w:szCs w:val="24"/>
+          <w:lang w:val="pt-BR"/>
+        </w:rPr>
+        <w:t>CONTRATO DE VENDA</w:t>
+      </w:r>
+    </w:p>
+    <w:p>
+      <w:pPr>
+        <w:pStyle w:val="SemEspaamento"/>
+        <w:rPr>
+          <w:rFonts w:asciiTheme="majorHAnsi" w:hAnsiTheme="majorHAnsi" w:cstheme="majorHAnsi"/>
+          <w:sz w:val="20"/>
+          <w:szCs w:val="20"/>
+          <w:lang w:val="pt-BR"/>
+        </w:rPr>
+      </w:pPr>
+      <w:r>
+        <w:rPr>
+          <w:rFonts w:ascii="Arial" w:hAnsi="Arial"/>
+          <w:noProof/>
+          <w:color w:val="FFFFFF" w:themeColor="background1"/>
+          <w:sz w:val="24"/>
+          <w:szCs w:val="24"/>
+          <w:lang w:val="pt-BR"/>
+        </w:rPr>
+        <mc:AlternateContent>
+          <mc:Choice Requires="wps">
+            <w:drawing>
+              <wp:anchor distT="0" distB="0" distL="114300" distR="114300" simplePos="0" relativeHeight="251658240" behindDoc="0" locked="0" layoutInCell="1" allowOverlap="1" wp14:anchorId="11820F6D" wp14:editId="7AA75AAD">
+                <wp:simplePos x="0" y="0"/>
+                <wp:positionH relativeFrom="column">
+                  <wp:posOffset>-58522</wp:posOffset>
+                </wp:positionH>
+                <wp:positionV relativeFrom="paragraph">
+                  <wp:posOffset>36881</wp:posOffset>
+                </wp:positionV>
+                <wp:extent cx="6371540" cy="1041121"/>
+                <wp:effectExtent l="0" t="0" r="10795" b="26035"/>
+                <wp:wrapNone/>
+                <wp:docPr id="783150584" name="Retângulo 1"/>
+                <wp:cNvGraphicFramePr/>
+                <a:graphic xmlns:a="http://schemas.openxmlformats.org/drawingml/2006/main">
+                  <a:graphicData uri="http://schemas.microsoft.com/office/word/2010/wordprocessingShape">
+                    <wps:wsp>
+                      <wps:cNvSpPr/>
+                      <wps:spPr>
+                        <a:xfrm>
+                          <a:off x="0" y="0"/>
+                          <a:ext cx="6371540" cy="1041121"/>
+                        </a:xfrm>
+                        <a:prstGeom prst="rect">
+                          <a:avLst/>
+                        </a:prstGeom>
+                        <a:noFill/>
+                        <a:ln w="9525" cap="flat" cmpd="sng" algn="ctr">
+                          <a:solidFill>
+                            <a:schemeClr val="dk1"/>
+                          </a:solidFill>
+                          <a:prstDash val="solid"/>
+                          <a:round/>
+                          <a:headEnd type="none" w="med" len="med"/>
+                          <a:tailEnd type="none" w="med" len="med"/>
+                        </a:ln>
+                      </wps:spPr>
+                      <wps:style>
+                        <a:lnRef idx="0">
+                          <a:scrgbClr r="0" g="0" b="0"/>
+                        </a:lnRef>
+                        <a:fillRef idx="0">
+                          <a:scrgbClr r="0" g="0" b="0"/>
+                        </a:fillRef>
+                        <a:effectRef idx="0">
+                          <a:scrgbClr r="0" g="0" b="0"/>
+                        </a:effectRef>
+                        <a:fontRef idx="minor">
+                          <a:schemeClr val="dk1"/>
+                        </a:fontRef>
+                      </wps:style>
+                      <wps:bodyPr rot="0" spcFirstLastPara="0" vertOverflow="overflow" horzOverflow="overflow" vert="horz" wrap="square" lIns="91440" tIns="45720" rIns="91440" bIns="45720" numCol="1" spcCol="0" rtlCol="0" fromWordArt="0" anchor="ctr" anchorCtr="0" forceAA="0" compatLnSpc="1">
+                        <a:prstTxWarp prst="textNoShape">
+                          <a:avLst/>
+                        </a:prstTxWarp>
+                        <a:noAutofit/>
+                      </wps:bodyPr>
+                    </wps:wsp>
+                  </a:graphicData>
+                </a:graphic>
+                <wp14:sizeRelH relativeFrom="margin">
+                  <wp14:pctWidth>0</wp14:pctWidth>
+                </wp14:sizeRelH>
+                <wp14:sizeRelV relativeFrom="margin">
+                  <wp14:pctHeight>0</wp14:pctHeight>
+                </wp14:sizeRelV>
+              </wp:anchor>
+            </w:drawing>
+          </mc:Choice>
+          <mc:Fallback>
+            <w:pict>
+              <v:rect w14:anchorId="056EE728" id="Retângulo 1" o:spid="_x0000_s1026" style="position:absolute;margin-left:-4.6pt;margin-top:2.9pt;width:501.7pt;height:82pt;z-index:251658240;visibility:visible;mso-wrap-style:square;mso-width-percent:0;mso-height-percent:0;mso-wrap-distance-left:9pt;mso-wrap-distance-top:0;mso-wrap-distance-right:9pt;mso-wrap-distance-bottom:0;mso-position-horizontal:absolute;mso-position-horizontal-relative:text;mso-position-vertical:absolute;mso-position-vertical-relative:text;mso-width-percent:0;mso-height-percent:0;mso-width-relative:margin;mso-height-relative:margin;v-text-anchor:middle" o:gfxdata="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" filled="f" strokecolor="black [3200]">
+                <v:stroke joinstyle="round"/>
+              </v:rect>
+            </w:pict>
+          </mc:Fallback>
+        </mc:AlternateContent>
+      </w:r>
+    </w:p>
+    <w:p>
+      <w:pPr>
+        <w:pStyle w:val="SemEspaamento"/>
+        <w:rPr>
+          <w:rFonts w:asciiTheme="majorHAnsi" w:hAnsiTheme="majorHAnsi" w:cstheme="majorHAnsi"/>
+          <w:sz w:val="20"/>
+          <w:szCs w:val="20"/>
+          <w:lang w:val="pt-BR"/>
+        </w:rPr>
+      </w:pPr>
+      <w:r>
+        <w:rPr>
+          <w:rFonts w:asciiTheme="majorHAnsi" w:hAnsiTheme="majorHAnsi" w:cstheme="majorHAnsi"/>
+          <w:b/>
+          <w:bCs/>
+          <w:sz w:val="20"/>
+          <w:szCs w:val="20"/>
+          <w:lang w:val="pt-BR"/>
+        </w:rPr>
+        <w:t>Nome:</w:t>
+      </w:r>
+      <w:r>
+        <w:rPr>
+          <w:rFonts w:asciiTheme="majorHAnsi" w:hAnsiTheme="majorHAnsi" w:cstheme="majorHAnsi"/>
+          <w:sz w:val="20"/>
+          <w:szCs w:val="20"/>
+          <w:lang w:val="pt-BR"/>
+        </w:rPr>
+        <w:t xml:space="preserve"> </w:t>
+      </w:r>
+      <w:r>
+        <w:rPr>
+          <w:rFonts w:asciiTheme="majorHAnsi" w:hAnsiTheme="majorHAnsi" w:cstheme="majorHAnsi"/>
+          <w:sz w:val="20"/>
+          <w:szCs w:val="20"/>
+          <w:lang w:val="pt-BR"/>
+        </w:rPr>
+        <w:t>{Nome do Cliente}</w:t>
+      </w:r>
+    </w:p>
+    <w:p>
+      <w:pPr>
+        <w:pStyle w:val="SemEspaamento"/>
+        <w:rPr>
+          <w:rFonts w:asciiTheme="majorHAnsi" w:hAnsiTheme="majorHAnsi" w:cstheme="majorHAnsi"/>
+          <w:sz w:val="20"/>
+          <w:szCs w:val="20"/>
+          <w:lang w:val="pt-BR"/>
+        </w:rPr>
+      </w:pPr>
+      <w:r>
+        <w:rPr>
+          <w:rFonts w:asciiTheme="majorHAnsi" w:hAnsiTheme="majorHAnsi" w:cstheme="majorHAnsi"/>
+          <w:b/>
+          <w:bCs/>
+          <w:sz w:val="20"/>
+          <w:szCs w:val="20"/>
+          <w:lang w:val="pt-BR"/>
+        </w:rPr>
+        <w:t>RG n.</w:t>
+      </w:r>
+      <w:r>
+        <w:rPr>
+          <w:rFonts w:asciiTheme="majorHAnsi" w:hAnsiTheme="majorHAnsi" w:cstheme="majorHAnsi"/>
+          <w:b/>
+          <w:bCs/>
+          <w:sz w:val="20"/>
+          <w:szCs w:val="20"/>
+          <w:lang w:val="pt-BR"/>
+        </w:rPr>
+        <w:t>:</w:t>
+      </w:r>
+      <w:r>
+        <w:rPr>
+          <w:rFonts w:asciiTheme="majorHAnsi" w:hAnsiTheme="majorHAnsi" w:cstheme="majorHAnsi"/>
+          <w:sz w:val="20"/>
+          <w:szCs w:val="20"/>
+          <w:lang w:val="pt-BR"/>
+        </w:rPr>
+        <w:t xml:space="preserve"> </w:t>
+      </w:r>
+      <w:r>
+        <w:rPr>
+          <w:rFonts w:asciiTheme="majorHAnsi" w:hAnsiTheme="majorHAnsi" w:cstheme="majorHAnsi"/>
+          <w:sz w:val="20"/>
+          <w:szCs w:val="20"/>
+          <w:lang w:val="pt-BR"/>
+        </w:rPr>
+        <w:t>{RG}</w:t>
+      </w:r>
+      <w:r>
+        <w:rPr>
+          <w:rFonts w:asciiTheme="majorHAnsi" w:hAnsiTheme="majorHAnsi" w:cstheme="majorHAnsi"/>
+          <w:sz w:val="20"/>
+          <w:szCs w:val="20"/>
+          <w:lang w:val="pt-BR"/>
+        </w:rPr>
+        <w:t xml:space="preserve"> </w:t>
+      </w:r>
+      <w:r>
+        <w:rPr>
+          <w:rFonts w:asciiTheme="majorHAnsi" w:hAnsiTheme="majorHAnsi" w:cstheme="majorHAnsi"/>
+          <w:sz w:val="20"/>
+          <w:szCs w:val="20"/>
+          <w:lang w:val="pt-BR"/>
+        </w:rPr>
+        <w:t xml:space="preserve">                            </w:t>
+      </w:r>
+      <w:r>
+        <w:rPr>
+          <w:rFonts w:asciiTheme="majorHAnsi" w:hAnsiTheme="majorHAnsi" w:cstheme="majorHAnsi"/>
+          <w:sz w:val="20"/>
+          <w:szCs w:val="20"/>
+          <w:lang w:val="pt-BR"/>
+        </w:rPr>
+        <w:t xml:space="preserve">                                       </w:t>
+      </w:r>
+      <w:r>
+        <w:rPr>
+          <w:rFonts w:asciiTheme="majorHAnsi" w:hAnsiTheme="majorHAnsi" w:cstheme="majorHAnsi"/>
+          <w:b/>
+          <w:bCs/>
+          <w:sz w:val="20"/>
+          <w:szCs w:val="20"/>
+          <w:lang w:val="pt-BR"/>
+        </w:rPr>
+        <w:t>CPF/MF n.</w:t>
+      </w:r>
+      <w:r>
+        <w:rPr>
+          <w:rFonts w:asciiTheme="majorHAnsi" w:hAnsiTheme="majorHAnsi" w:cstheme="majorHAnsi"/>
+          <w:b/>
+          <w:bCs/>
+          <w:sz w:val="20"/>
+          <w:szCs w:val="20"/>
+          <w:lang w:val="pt-BR"/>
+        </w:rPr>
+        <w:t>:</w:t>
+      </w:r>
+      <w:r>
+        <w:rPr>
+          <w:rFonts w:asciiTheme="majorHAnsi" w:hAnsiTheme="majorHAnsi" w:cstheme="majorHAnsi"/>
+          <w:sz w:val="20"/>
+          <w:szCs w:val="20"/>
+          <w:lang w:val="pt-BR"/>
+        </w:rPr>
+        <w:t xml:space="preserve"> </w:t>
+      </w:r>
+      <w:r>
+        <w:rPr>
+          <w:rFonts w:asciiTheme="majorHAnsi" w:hAnsiTheme="majorHAnsi" w:cstheme="majorHAnsi"/>
+          <w:sz w:val="20"/>
+          <w:szCs w:val="20"/>
+          <w:lang w:val="pt-BR"/>
+        </w:rPr>
+        <w:t>{CPF}</w:t>
+      </w:r>
+    </w:p>
+    <w:p>
+      <w:pPr>
+        <w:pStyle w:val="SemEspaamento"/>
+        <w:rPr>
+          <w:rFonts w:asciiTheme="majorHAnsi" w:hAnsiTheme="majorHAnsi" w:cstheme="majorHAnsi"/>
+          <w:sz w:val="20"/>
+          <w:szCs w:val="20"/>
+          <w:lang w:val="pt-BR"/>
+        </w:rPr>
+      </w:pPr>
+      <w:r>
+        <w:rPr>
+          <w:rFonts w:asciiTheme="majorHAnsi" w:hAnsiTheme="majorHAnsi" w:cstheme="majorHAnsi"/>
+          <w:b/>
+          <w:bCs/>
+          <w:sz w:val="20"/>
+          <w:szCs w:val="20"/>
+          <w:lang w:val="pt-BR"/>
+        </w:rPr>
+        <w:t>Endereco:</w:t>
+      </w:r>
+      <w:r>
+        <w:rPr>
+          <w:rFonts w:asciiTheme="majorHAnsi" w:hAnsiTheme="majorHAnsi" w:cstheme="majorHAnsi"/>
+          <w:sz w:val="20"/>
+          <w:szCs w:val="20"/>
+          <w:lang w:val="pt-BR"/>
+        </w:rPr>
+        <w:t xml:space="preserve"> </w:t>
+      </w:r>
+      <w:r>
+        <w:rPr>
+          <w:rFonts w:asciiTheme="majorHAnsi" w:hAnsiTheme="majorHAnsi" w:cstheme="majorHAnsi"/>
+          <w:sz w:val="20"/>
+          <w:szCs w:val="20"/>
+          <w:lang w:val="pt-BR"/>
+        </w:rPr>
+        <w:t xml:space="preserve">{Rua/Av}, {Número} </w:t>
+      </w:r>
+      <w:r>
+        <w:rPr>
+          <w:rFonts w:asciiTheme="majorHAnsi" w:hAnsiTheme="majorHAnsi" w:cstheme="majorHAnsi"/>
+          <w:sz w:val="20"/>
+          <w:szCs w:val="20"/>
+          <w:lang w:val="pt-BR"/>
+        </w:rPr>
+        <w:t xml:space="preserve">                             </w:t>
+      </w:r>
+      <w:r>
+        <w:rPr>
+          <w:rFonts w:asciiTheme="majorHAnsi" w:hAnsiTheme="majorHAnsi" w:cstheme="majorHAnsi"/>
+          <w:sz w:val="20"/>
+          <w:szCs w:val="20"/>
+          <w:lang w:val="pt-BR"/>
+        </w:rPr>
+        <w:t xml:space="preserve"> </w:t>
+      </w:r>
+      <w:r>
+        <w:rPr>
+          <w:rFonts w:asciiTheme="majorHAnsi" w:hAnsiTheme="majorHAnsi" w:cstheme="majorHAnsi"/>
+          <w:b/>
+          <w:bCs/>
+          <w:sz w:val="20"/>
+          <w:szCs w:val="20"/>
+          <w:lang w:val="pt-BR"/>
+        </w:rPr>
+        <w:t>Bairro:</w:t>
+      </w:r>
+      <w:r>
+        <w:rPr>
+          <w:rFonts w:asciiTheme="majorHAnsi" w:hAnsiTheme="majorHAnsi" w:cstheme="majorHAnsi"/>
+          <w:sz w:val="20"/>
+          <w:szCs w:val="20"/>
+          <w:lang w:val="pt-BR"/>
+        </w:rPr>
+        <w:t xml:space="preserve"> </w:t>
+      </w:r>
+      <w:r>
+        <w:rPr>
+          <w:rFonts w:asciiTheme="majorHAnsi" w:hAnsiTheme="majorHAnsi" w:cstheme="majorHAnsi"/>
+          <w:sz w:val="20"/>
+          <w:szCs w:val="20"/>
+          <w:lang w:val="pt-BR"/>
+        </w:rPr>
+        <w:t>{Bairro}</w:t>
+      </w:r>
+    </w:p>
+    <w:p>
+      <w:pPr>
+        <w:pStyle w:val="SemEspaamento"/>
+        <w:rPr>
+          <w:rFonts w:asciiTheme="majorHAnsi" w:hAnsiTheme="majorHAnsi" w:cstheme="majorHAnsi"/>
+          <w:sz w:val="20"/>
+          <w:szCs w:val="20"/>
+          <w:lang w:val="pt-BR"/>
+        </w:rPr>
+      </w:pPr>
+      <w:r>
+        <w:rPr>
+          <w:rFonts w:asciiTheme="majorHAnsi" w:hAnsiTheme="majorHAnsi" w:cstheme="majorHAnsi"/>
+          <w:b/>
+          <w:bCs/>
+          <w:sz w:val="20"/>
+          <w:szCs w:val="20"/>
+          <w:lang w:val="pt-BR"/>
+        </w:rPr>
+        <w:t>Cidade/Municipio:</w:t>
+      </w:r>
+      <w:r>
+        <w:rPr>
+          <w:rFonts w:asciiTheme="majorHAnsi" w:hAnsiTheme="majorHAnsi" w:cstheme="majorHAnsi"/>
+          <w:sz w:val="20"/>
+          <w:szCs w:val="20"/>
+          <w:lang w:val="pt-BR"/>
+        </w:rPr>
+        <w:t xml:space="preserve"> {Cidade}</w:t>
+      </w:r>
+      <w:r>
+        <w:rPr>
+          <w:rFonts w:asciiTheme="majorHAnsi" w:hAnsiTheme="majorHAnsi" w:cstheme="majorHAnsi"/>
+          <w:sz w:val="20"/>
+          <w:szCs w:val="20"/>
+          <w:lang w:val="pt-BR"/>
+        </w:rPr>
+        <w:t xml:space="preserve">                                      </w:t>
+      </w:r>
+      <w:r>
+        <w:rPr>
+          <w:rFonts w:asciiTheme="majorHAnsi" w:hAnsiTheme="majorHAnsi" w:cstheme="majorHAnsi"/>
+          <w:b/>
+          <w:bCs/>
+          <w:sz w:val="20"/>
+          <w:szCs w:val="20"/>
+          <w:lang w:val="pt-BR"/>
+        </w:rPr>
+        <w:t>Estado:</w:t>
+      </w:r>
+      <w:r>
+        <w:rPr>
+          <w:rFonts w:asciiTheme="majorHAnsi" w:hAnsiTheme="majorHAnsi" w:cstheme="majorHAnsi"/>
+          <w:sz w:val="20"/>
+          <w:szCs w:val="20"/>
+          <w:lang w:val="pt-BR"/>
+        </w:rPr>
+        <w:t xml:space="preserve"> </w:t>
+      </w:r>
+      <w:r>
+        <w:rPr>
+          <w:rFonts w:asciiTheme="majorHAnsi" w:hAnsiTheme="majorHAnsi" w:cstheme="majorHAnsi"/>
+          <w:sz w:val="20"/>
+          <w:szCs w:val="20"/>
+          <w:lang w:val="pt-BR"/>
+        </w:rPr>
+        <w:t xml:space="preserve">{Estado} </w:t>
+      </w:r>
+      <w:r>
+        <w:rPr>
+          <w:rFonts w:asciiTheme="majorHAnsi" w:hAnsiTheme="majorHAnsi" w:cstheme="majorHAnsi"/>
+          <w:sz w:val="20"/>
+          <w:szCs w:val="20"/>
+          <w:lang w:val="pt-BR"/>
+        </w:rPr>
+        <w:t xml:space="preserve">                       </w:t>
+      </w:r>
+      <w:r>
+        <w:rPr>
+          <w:rFonts w:asciiTheme="majorHAnsi" w:hAnsiTheme="majorHAnsi" w:cstheme="majorHAnsi"/>
+          <w:b/>
+          <w:bCs/>
+          <w:sz w:val="20"/>
+          <w:szCs w:val="20"/>
+          <w:lang w:val="pt-BR"/>
+        </w:rPr>
+        <w:t>Cep:</w:t>
+      </w:r>
+      <w:r>
+        <w:rPr>
+          <w:rFonts w:asciiTheme="majorHAnsi" w:hAnsiTheme="majorHAnsi" w:cstheme="majorHAnsi"/>
+          <w:sz w:val="20"/>
+          <w:szCs w:val="20"/>
+          <w:lang w:val="pt-BR"/>
+        </w:rPr>
+        <w:t>{Cep}</w:t>
+      </w:r>
+      <w:r>
+        <w:rPr>
+          <w:rFonts w:asciiTheme="majorHAnsi" w:hAnsiTheme="majorHAnsi" w:cstheme="majorHAnsi"/>
+          <w:sz w:val="20"/>
+          <w:szCs w:val="20"/>
+          <w:lang w:val="pt-BR"/>
+        </w:rPr>
+        <w:t>.</w:t>
+      </w:r>
+    </w:p>
+    <w:p>
+      <w:pPr>
+        <w:pStyle w:val="SemEspaamento"/>
+        <w:rPr>
+          <w:rFonts w:asciiTheme="majorHAnsi" w:hAnsiTheme="majorHAnsi" w:cstheme="majorHAnsi"/>
+          <w:sz w:val="20"/>
+          <w:szCs w:val="20"/>
+          <w:lang w:val="pt-BR"/>
+        </w:rPr>
+      </w:pPr>
+      <w:r>
+        <w:rPr>
+          <w:rFonts w:asciiTheme="majorHAnsi" w:hAnsiTheme="majorHAnsi" w:cstheme="majorHAnsi"/>
+          <w:b/>
+          <w:bCs/>
+          <w:sz w:val="20"/>
+          <w:szCs w:val="20"/>
+          <w:lang w:val="pt-BR"/>
+        </w:rPr>
+        <w:t>Cel:</w:t>
+      </w:r>
+      <w:r>
+        <w:rPr>
+          <w:rFonts w:asciiTheme="majorHAnsi" w:hAnsiTheme="majorHAnsi" w:cstheme="majorHAnsi"/>
+          <w:sz w:val="20"/>
+          <w:szCs w:val="20"/>
+          <w:lang w:val="pt-BR"/>
+        </w:rPr>
+        <w:t xml:space="preserve"> </w:t>
+      </w:r>
+      <w:r>
+        <w:rPr>
+          <w:rFonts w:asciiTheme="majorHAnsi" w:hAnsiTheme="majorHAnsi" w:cstheme="majorHAnsi"/>
+          <w:sz w:val="20"/>
+          <w:szCs w:val="20"/>
+          <w:lang w:val="pt-BR"/>
+        </w:rPr>
+        <w:t>{Celu</w:t>
+      </w:r>
+      <w:r>
+        <w:rPr>
+          <w:rFonts w:asciiTheme="majorHAnsi" w:hAnsiTheme="majorHAnsi" w:cstheme="majorHAnsi"/>
+          <w:sz w:val="20"/>
+          <w:szCs w:val="20"/>
+          <w:lang w:val="pt-BR"/>
+        </w:rPr>
+        <w:t>lar}</w:t>
+      </w:r>
+      <w:r>
+        <w:rPr>
+          <w:rFonts w:asciiTheme="majorHAnsi" w:hAnsiTheme="majorHAnsi" w:cstheme="majorHAnsi"/>
+          <w:sz w:val="20"/>
+          <w:szCs w:val="20"/>
+          <w:lang w:val="pt-BR"/>
+        </w:rPr>
+        <w:t>.</w:t>
+      </w:r>
+      <w:r>
+        <w:rPr>
+          <w:rFonts w:asciiTheme="majorHAnsi" w:hAnsiTheme="majorHAnsi" w:cstheme="majorHAnsi"/>
+          <w:sz w:val="20"/>
+          <w:szCs w:val="20"/>
+          <w:lang w:val="pt-BR"/>
+        </w:rPr>
+        <w:t xml:space="preserve">                                                              </w:t>
+      </w:r>
+      <w:r>
+        <w:rPr>
+          <w:rFonts w:asciiTheme="majorHAnsi" w:hAnsiTheme="majorHAnsi" w:cstheme="majorHAnsi"/>
+          <w:sz w:val="20"/>
+          <w:szCs w:val="20"/>
+          <w:lang w:val="pt-BR"/>
+        </w:rPr>
+        <w:t xml:space="preserve">  </w:t>
+      </w:r>
+      <w:r>
+        <w:rPr>
+          <w:rFonts w:asciiTheme="majorHAnsi" w:hAnsiTheme="majorHAnsi" w:cstheme="majorHAnsi"/>
+          <w:b/>
+          <w:bCs/>
+          <w:sz w:val="20"/>
+          <w:szCs w:val="20"/>
+          <w:lang w:val="pt-BR"/>
+        </w:rPr>
+        <w:t>E-mail</w:t>
+      </w:r>
+      <w:r>
+        <w:rPr>
+          <w:rFonts w:asciiTheme="majorHAnsi" w:hAnsiTheme="majorHAnsi" w:cstheme="majorHAnsi"/>
+          <w:sz w:val="20"/>
+          <w:szCs w:val="20"/>
+          <w:lang w:val="pt-BR"/>
+        </w:rPr>
+        <w:t>: {</w:t>
+      </w:r>
+      <w:r>
+        <w:rPr>
+          <w:rFonts w:asciiTheme="majorHAnsi" w:hAnsiTheme="majorHAnsi" w:cstheme="majorHAnsi"/>
+          <w:sz w:val="20"/>
+          <w:szCs w:val="20"/>
+          <w:lang w:val="pt-BR"/>
+        </w:rPr>
+        <w:t>Email}</w:t>
+      </w:r>
+    </w:p>
+    <w:p>
+      <w:pPr>
+        <w:rPr>
+          <w:rFonts w:asciiTheme="majorHAnsi" w:hAnsiTheme="majorHAnsi" w:cstheme="majorHAnsi"/>
+          <w:lang w:val="pt-BR"/>
+        </w:rPr>
+      </w:pPr>
+      <w:r>
+        <w:rPr>
+          <w:noProof/>
+          <w:color w:val="555555"/>
+          <w:sz w:val="18"/>
+          <w:szCs w:val="18"/>
+          <w:lang w:val="pt-BR"/>
+        </w:rPr>
+        <mc:AlternateContent>
+          <mc:Choice Requires="wps">
+            <w:drawing>
+              <wp:anchor distT="0" distB="0" distL="114300" distR="114300" simplePos="0" relativeHeight="251665408" behindDoc="0" locked="0" layoutInCell="1" allowOverlap="1" wp14:anchorId="44729B3B" wp14:editId="13676B9F">
+                <wp:simplePos x="0" y="0"/>
+                <wp:positionH relativeFrom="column">
+                  <wp:posOffset>51207</wp:posOffset>
+                </wp:positionH>
+                <wp:positionV relativeFrom="paragraph">
+                  <wp:posOffset>269723</wp:posOffset>
+                </wp:positionV>
+                <wp:extent cx="1324052" cy="248285"/>
+                <wp:effectExtent l="0" t="0" r="9525" b="0"/>
+                <wp:wrapNone/>
+                <wp:docPr id="952711642" name="Caixa de Texto 3"/>
+                <wp:cNvGraphicFramePr/>
+                <a:graphic xmlns:a="http://schemas.openxmlformats.org/drawingml/2006/main">
+                  <a:graphicData uri="http://schemas.microsoft.com/office/word/2010/wordprocessingShape">
+                    <wps:wsp>
+                      <wps:cNvSpPr txBox="1"/>
+                      <wps:spPr>
+                        <a:xfrm>
+                          <a:off x="0" y="0"/>
+                          <a:ext cx="1324052" cy="248285"/>
+                        </a:xfrm>
+                        <a:prstGeom prst="rect">
+                          <a:avLst/>
+                        </a:prstGeom>
+                        <a:solidFill>
+                          <a:schemeClr val="lt1"/>
+                        </a:solidFill>
+                        <a:ln w="6350">
+                          <a:noFill/>
+                        </a:ln>
+                      </wps:spPr>
+                      <wps:txbx>
+                        <w:txbxContent>
+                          <w:p>
+                            <w:pPr>
+                              <w:rPr>
+                                <w:b/>
+                                <w:bCs/>
+                                <w:color w:val="808080" w:themeColor="background1" w:themeShade="80"/>
+                              </w:rPr>
+                            </w:pPr>
+                            <w:r>
+                              <w:rPr>
+                                <w:b/>
+                                <w:bCs/>
+                                <w:color w:val="808080" w:themeColor="background1" w:themeShade="80"/>
+                              </w:rPr>
+                              <w:t>Dados do Veículo</w:t>
+                            </w:r>
+                          </w:p>
+                        </w:txbxContent>
+                      </wps:txbx>
+                      <wps:bodyPr rot="0" spcFirstLastPara="0" vertOverflow="overflow" horzOverflow="overflow" vert="horz" wrap="square" lIns="91440" tIns="45720" rIns="91440" bIns="45720" numCol="1" spcCol="0" rtlCol="0" fromWordArt="0" anchor="t" anchorCtr="0" forceAA="0" compatLnSpc="1">
+                        <a:prstTxWarp prst="textNoShape">
+                          <a:avLst/>
+                        </a:prstTxWarp>
+                        <a:noAutofit/>
+                      </wps:bodyPr>
+                    </wps:wsp>
+                  </a:graphicData>
+                </a:graphic>
+                <wp14:sizeRelH relativeFrom="margin">
+                  <wp14:pctWidth>0</wp14:pctWidth>
+                </wp14:sizeRelH>
+                <wp14:sizeRelV relativeFrom="margin">
+                  <wp14:pctHeight>0</wp14:pctHeight>
+                </wp14:sizeRelV>
+              </wp:anchor>
+            </w:drawing>
+          </mc:Choice>
+          <mc:Fallback>
+            <w:pict>
+              <v:shape w14:anchorId="44729B3B" id="_x0000_s1027" type="#_x0000_t202" style="position:absolute;margin-left:4.05pt;margin-top:21.25pt;width:104.25pt;height:19.55pt;z-index:251665408;visibility:visible;mso-wrap-style:square;mso-width-percent:0;mso-height-percent:0;mso-wrap-distance-left:9pt;mso-wrap-distance-top:0;mso-wrap-distance-right:9pt;mso-wrap-distance-bottom:0;mso-position-horizontal:absolute;mso-position-horizontal-relative:text;mso-position-vertical:absolute;mso-position-vertical-relative:text;mso-width-percent:0;mso-height-percent:0;mso-width-relative:margin;mso-height-relative:margin;v-text-anchor:top" o:gfxdata="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" fillcolor="white [3201]" stroked="f" strokeweight=".5pt">
+                <v:textbox>
+                  <w:txbxContent>
+                    <w:p>
+                      <w:pPr>
+                        <w:rPr>
+                          <w:b/>
+                          <w:bCs/>
+                          <w:color w:val="808080" w:themeColor="background1" w:themeShade="80"/>
+                        </w:rPr>
+                      </w:pPr>
+                      <w:r>
+                        <w:rPr>
+                          <w:b/>
+                          <w:bCs/>
+                          <w:color w:val="808080" w:themeColor="background1" w:themeShade="80"/>
+                        </w:rPr>
+                        <w:t>Dados do Veículo</w:t>
+                      </w:r>
+                    </w:p>
+                  </w:txbxContent>
+                </v:textbox>
+              </v:shape>
+            </w:pict>
+          </mc:Fallback>
+        </mc:AlternateContent>
+      </w:r>
+    </w:p>
+    <w:p>
+      <w:pPr>
+        <w:rPr>
+          <w:rFonts w:asciiTheme="majorHAnsi" w:hAnsiTheme="majorHAnsi" w:cstheme="majorHAnsi"/>
+          <w:lang w:val="pt-BR"/>
+        </w:rPr>
+      </w:pPr>
+      <w:r>
+        <w:rPr>
+          <w:noProof/>
+          <w:color w:val="FFFFFF" w:themeColor="background1"/>
+          <w:sz w:val="24"/>
+          <w:szCs w:val="24"/>
+          <w:lang w:val="pt-BR"/>
+        </w:rPr>
+        <mc:AlternateContent>
+          <mc:Choice Requires="wps">
+            <w:drawing>
+              <wp:anchor distT="0" distB="0" distL="114300" distR="114300" simplePos="0" relativeHeight="251664384" behindDoc="0" locked="0" layoutInCell="1" allowOverlap="1" wp14:anchorId="50CA5240" wp14:editId="6F754A48">
+                <wp:simplePos x="0" y="0"/>
+                <wp:positionH relativeFrom="column">
+                  <wp:posOffset>-73025</wp:posOffset>
+                </wp:positionH>
+                <wp:positionV relativeFrom="paragraph">
+                  <wp:posOffset>86665</wp:posOffset>
+                </wp:positionV>
+                <wp:extent cx="6385560" cy="1228725"/>
+                <wp:effectExtent l="0" t="0" r="15240" b="28575"/>
+                <wp:wrapNone/>
+                <wp:docPr id="630949161" name="Retângulo 1"/>
+                <wp:cNvGraphicFramePr/>
+                <a:graphic xmlns:a="http://schemas.openxmlformats.org/drawingml/2006/main">
+                  <a:graphicData uri="http://schemas.microsoft.com/office/word/2010/wordprocessingShape">
+                    <wps:wsp>
+                      <wps:cNvSpPr/>
+                      <wps:spPr>
+                        <a:xfrm>
+                          <a:off x="0" y="0"/>
+                          <a:ext cx="6385560" cy="1228725"/>
+                        </a:xfrm>
+                        <a:prstGeom prst="rect">
+                          <a:avLst/>
+                        </a:prstGeom>
+                        <a:noFill/>
+                        <a:ln w="9525" cap="flat" cmpd="sng" algn="ctr">
+                          <a:solidFill>
+                            <a:schemeClr val="dk1"/>
+                          </a:solidFill>
+                          <a:prstDash val="solid"/>
+                          <a:round/>
+                          <a:headEnd type="none" w="med" len="med"/>
+                          <a:tailEnd type="none" w="med" len="med"/>
+                        </a:ln>
+                      </wps:spPr>
+                      <wps:style>
+                        <a:lnRef idx="0">
+                          <a:scrgbClr r="0" g="0" b="0"/>
+                        </a:lnRef>
+                        <a:fillRef idx="0">
+                          <a:scrgbClr r="0" g="0" b="0"/>
+                        </a:fillRef>
+                        <a:effectRef idx="0">
+                          <a:scrgbClr r="0" g="0" b="0"/>
+                        </a:effectRef>
+                        <a:fontRef idx="minor">
+                          <a:schemeClr val="dk1"/>
+                        </a:fontRef>
+                      </wps:style>
+                      <wps:bodyPr rot="0" spcFirstLastPara="0" vertOverflow="overflow" horzOverflow="overflow" vert="horz" wrap="square" lIns="91440" tIns="45720" rIns="91440" bIns="45720" numCol="1" spcCol="0" rtlCol="0" fromWordArt="0" anchor="ctr" anchorCtr="0" forceAA="0" compatLnSpc="1">
+                        <a:prstTxWarp prst="textNoShape">
+                          <a:avLst/>
+                        </a:prstTxWarp>
+                        <a:noAutofit/>
+                      </wps:bodyPr>
+                    </wps:wsp>
+                  </a:graphicData>
+                </a:graphic>
+                <wp14:sizeRelH relativeFrom="margin">
+                  <wp14:pctWidth>0</wp14:pctWidth>
+                </wp14:sizeRelH>
+                <wp14:sizeRelV relativeFrom="margin">
+                  <wp14:pctHeight>0</wp14:pctHeight>
+                </wp14:sizeRelV>
+              </wp:anchor>
+            </w:drawing>
+          </mc:Choice>
+          <mc:Fallback>
+            <w:pict>
+              <v:rect w14:anchorId="21645D16" id="Retângulo 1" o:spid="_x0000_s1026" style="position:absolute;margin-left:-5.75pt;margin-top:6.8pt;width:502.8pt;height:96.75pt;z-index:251664384;visibility:visible;mso-wrap-style:square;mso-width-percent:0;mso-height-percent:0;mso-wrap-distance-left:9pt;mso-wrap-distance-top:0;mso-wrap-distance-right:9pt;mso-wrap-distance-bottom:0;mso-position-horizontal:absolute;mso-position-horizontal-relative:text;mso-position-vertical:absolute;mso-position-vertical-relative:text;mso-width-percent:0;mso-height-percent:0;mso-width-relative:margin;mso-height-relative:margin;v-text-anchor:middle" o:gfxdata="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" filled="f" strokecolor="black [3200]">
+                <v:stroke joinstyle="round"/>
+              </v:rect>
+            </w:pict>
+          </mc:Fallback>
+        </mc:AlternateContent>
+      </w:r>
+    </w:p>
+    <w:p>
+      <w:pPr>
+        <w:spacing w:after="0" w:line="240" w:lineRule="auto"/>
+        <w:rPr>
+          <w:rFonts w:asciiTheme="majorHAnsi" w:hAnsiTheme="majorHAnsi" w:cstheme="majorHAnsi"/>
+          <w:lang w:val="pt-BR"/>
+        </w:rPr>
+      </w:pPr>
+      <w:r>
+        <w:rPr>
+          <w:rFonts w:asciiTheme="majorHAnsi" w:hAnsiTheme="majorHAnsi" w:cstheme="majorHAnsi"/>
+          <w:b/>
+          <w:bCs/>
+          <w:lang w:val="pt-BR"/>
+        </w:rPr>
+        <w:t>Marca:</w:t>
+      </w:r>
+      <w:r>
+        <w:rPr>
+          <w:rFonts w:asciiTheme="majorHAnsi" w:hAnsiTheme="majorHAnsi" w:cstheme="majorHAnsi"/>
+          <w:lang w:val="pt-BR"/>
+        </w:rPr>
+        <w:t xml:space="preserve"> </w:t>
+      </w:r>
+      <w:r>
+        <w:rPr>
+          <w:rFonts w:asciiTheme="majorHAnsi" w:hAnsiTheme="majorHAnsi" w:cstheme="majorHAnsi"/>
+          <w:lang w:val="pt-BR"/>
+        </w:rPr>
+        <w:t>{Marca}</w:t>
+      </w:r>
+    </w:p>
+    <w:p>
+      <w:pPr>
+        <w:spacing w:after="0" w:line="240" w:lineRule="auto"/>
+        <w:rPr>
+          <w:rFonts w:asciiTheme="majorHAnsi" w:hAnsiTheme="majorHAnsi" w:cstheme="majorHAnsi"/>
+          <w:lang w:val="pt-BR"/>
+        </w:rPr>
+      </w:pPr>
+      <w:r>
+        <w:rPr>
+          <w:rFonts w:asciiTheme="majorHAnsi" w:hAnsiTheme="majorHAnsi" w:cstheme="majorHAnsi"/>
+          <w:b/>
+          <w:bCs/>
+          <w:lang w:val="pt-BR"/>
+        </w:rPr>
+        <w:t>Modelo:</w:t>
+      </w:r>
+      <w:r>
+        <w:rPr>
+          <w:rFonts w:asciiTheme="majorHAnsi" w:hAnsiTheme="majorHAnsi" w:cstheme="majorHAnsi"/>
+          <w:lang w:val="pt-BR"/>
+        </w:rPr>
+        <w:t xml:space="preserve"> </w:t>
+      </w:r>
+      <w:r>
+        <w:rPr>
+          <w:rFonts w:asciiTheme="majorHAnsi" w:hAnsiTheme="majorHAnsi" w:cstheme="majorHAnsi"/>
+          <w:lang w:val="pt-BR"/>
+        </w:rPr>
+        <w:t xml:space="preserve">{Modelo}             </w:t>
+      </w:r>
+      <w:r>
+        <w:rPr>
+          <w:rFonts w:asciiTheme="majorHAnsi" w:hAnsiTheme="majorHAnsi" w:cstheme="majorHAnsi"/>
+          <w:b/>
+          <w:bCs/>
+          <w:lang w:val="pt-BR"/>
+        </w:rPr>
+        <w:t>Versão</w:t>
+      </w:r>
+      <w:r>
+        <w:rPr>
+          <w:rFonts w:asciiTheme="majorHAnsi" w:hAnsiTheme="majorHAnsi" w:cstheme="majorHAnsi"/>
+          <w:lang w:val="pt-BR"/>
+        </w:rPr>
+        <w:t xml:space="preserve">: </w:t>
+      </w:r>
+      <w:r>
+        <w:rPr>
+          <w:rFonts w:asciiTheme="majorHAnsi" w:hAnsiTheme="majorHAnsi" w:cstheme="majorHAnsi"/>
+          <w:lang w:val="pt-BR"/>
+        </w:rPr>
+        <w:t>{</w:t>
+      </w:r>
+      <w:r>
+        <w:rPr>
+          <w:rFonts w:asciiTheme="majorHAnsi" w:hAnsiTheme="majorHAnsi" w:cstheme="majorHAnsi"/>
+          <w:lang w:val="pt-BR"/>
+        </w:rPr>
+        <w:t>Versão</w:t>
+      </w:r>
+      <w:r>
+        <w:rPr>
+          <w:rFonts w:asciiTheme="majorHAnsi" w:hAnsiTheme="majorHAnsi" w:cstheme="majorHAnsi"/>
+          <w:lang w:val="pt-BR"/>
+        </w:rPr>
+        <w:t>}</w:t>
+      </w:r>
+    </w:p>
+    <w:p>
+      <w:pPr>
+        <w:spacing w:after="0" w:line="240" w:lineRule="auto"/>
+        <w:rPr>
+          <w:rFonts w:asciiTheme="majorHAnsi" w:hAnsiTheme="majorHAnsi" w:cstheme="majorHAnsi"/>
+          <w:lang w:val="pt-BR"/>
+        </w:rPr>
+      </w:pPr>
+      <w:r>
+        <w:rPr>
+          <w:rFonts w:asciiTheme="majorHAnsi" w:hAnsiTheme="majorHAnsi" w:cstheme="majorHAnsi"/>
+          <w:b/>
+          <w:bCs/>
+          <w:lang w:val="pt-BR"/>
+        </w:rPr>
+        <w:t>Ano</w:t>
+      </w:r>
+      <w:r>
+        <w:rPr>
+          <w:rFonts w:asciiTheme="majorHAnsi" w:hAnsiTheme="majorHAnsi" w:cstheme="majorHAnsi"/>
+          <w:b/>
+          <w:bCs/>
+          <w:lang w:val="pt-BR"/>
+        </w:rPr>
+        <w:t xml:space="preserve"> Fabricação</w:t>
+      </w:r>
+      <w:r>
+        <w:rPr>
+          <w:rFonts w:asciiTheme="majorHAnsi" w:hAnsiTheme="majorHAnsi" w:cstheme="majorHAnsi"/>
+          <w:b/>
+          <w:bCs/>
+          <w:lang w:val="pt-BR"/>
+        </w:rPr>
+        <w:t>:</w:t>
+      </w:r>
+      <w:r>
+        <w:rPr>
+          <w:rFonts w:asciiTheme="majorHAnsi" w:hAnsiTheme="majorHAnsi" w:cstheme="majorHAnsi"/>
+          <w:lang w:val="pt-BR"/>
+        </w:rPr>
+        <w:t xml:space="preserve"> </w:t>
+      </w:r>
+      <w:r>
+        <w:rPr>
+          <w:rFonts w:asciiTheme="majorHAnsi" w:hAnsiTheme="majorHAnsi" w:cstheme="majorHAnsi"/>
+          <w:lang w:val="pt-BR"/>
+        </w:rPr>
+        <w:t>{Ano</w:t>
+      </w:r>
+      <w:r>
+        <w:rPr>
+          <w:rFonts w:asciiTheme="majorHAnsi" w:hAnsiTheme="majorHAnsi" w:cstheme="majorHAnsi"/>
+          <w:lang w:val="pt-BR"/>
+        </w:rPr>
+        <w:t xml:space="preserve"> Fabricação</w:t>
+      </w:r>
+      <w:r>
+        <w:rPr>
+          <w:rFonts w:asciiTheme="majorHAnsi" w:hAnsiTheme="majorHAnsi" w:cstheme="majorHAnsi"/>
+          <w:lang w:val="pt-BR"/>
+        </w:rPr>
+        <w:t xml:space="preserve">}      </w:t>
+      </w:r>
+      <w:r>
+        <w:rPr>
+          <w:rFonts w:asciiTheme="majorHAnsi" w:hAnsiTheme="majorHAnsi" w:cstheme="majorHAnsi"/>
+          <w:b/>
+          <w:bCs/>
+          <w:lang w:val="pt-BR"/>
+        </w:rPr>
+        <w:t>Ano Modelo:</w:t>
+      </w:r>
+      <w:r>
+        <w:rPr>
+          <w:rFonts w:asciiTheme="majorHAnsi" w:hAnsiTheme="majorHAnsi" w:cstheme="majorHAnsi"/>
+          <w:lang w:val="pt-BR"/>
+        </w:rPr>
+        <w:t xml:space="preserve"> {Ano Modelo}     </w:t>
+      </w:r>
+      <w:r>
+        <w:rPr>
+          <w:rFonts w:asciiTheme="majorHAnsi" w:hAnsiTheme="majorHAnsi" w:cstheme="majorHAnsi"/>
+          <w:b/>
+          <w:bCs/>
+          <w:lang w:val="pt-BR"/>
+        </w:rPr>
+        <w:t>Cor:</w:t>
+      </w:r>
+      <w:r>
+        <w:rPr>
+          <w:rFonts w:asciiTheme="majorHAnsi" w:hAnsiTheme="majorHAnsi" w:cstheme="majorHAnsi"/>
+          <w:b/>
+          <w:bCs/>
+          <w:lang w:val="pt-BR"/>
+        </w:rPr>
+        <w:t xml:space="preserve"> </w:t>
+      </w:r>
+      <w:r>
+        <w:rPr>
+          <w:rFonts w:asciiTheme="majorHAnsi" w:hAnsiTheme="majorHAnsi" w:cstheme="majorHAnsi"/>
+          <w:lang w:val="pt-BR"/>
+        </w:rPr>
+        <w:t>{Cor}</w:t>
+      </w:r>
+    </w:p>
+    <w:p>
+      <w:pPr>
+        <w:spacing w:after="0" w:line="240" w:lineRule="auto"/>
+        <w:rPr>
+          <w:rFonts w:asciiTheme="majorHAnsi" w:hAnsiTheme="majorHAnsi" w:cstheme="majorHAnsi"/>
+          <w:lang w:val="pt-BR"/>
+        </w:rPr>
+      </w:pPr>
+      <w:r>
+        <w:rPr>
+          <w:rFonts w:asciiTheme="majorHAnsi" w:hAnsiTheme="majorHAnsi" w:cstheme="majorHAnsi"/>
+          <w:b/>
+          <w:bCs/>
+          <w:lang w:val="pt-BR"/>
+        </w:rPr>
+        <w:t>Placa:</w:t>
+      </w:r>
+      <w:r>
+        <w:rPr>
+          <w:rFonts w:asciiTheme="majorHAnsi" w:hAnsiTheme="majorHAnsi" w:cstheme="majorHAnsi"/>
+          <w:lang w:val="pt-BR"/>
+        </w:rPr>
+        <w:t xml:space="preserve"> </w:t>
+      </w:r>
+      <w:r>
+        <w:rPr>
+          <w:rFonts w:asciiTheme="majorHAnsi" w:hAnsiTheme="majorHAnsi" w:cstheme="majorHAnsi"/>
+          <w:lang w:val="pt-BR"/>
+        </w:rPr>
+        <w:t xml:space="preserve">{Placa}     </w:t>
+      </w:r>
+      <w:r>
+        <w:rPr>
+          <w:rFonts w:asciiTheme="majorHAnsi" w:hAnsiTheme="majorHAnsi" w:cstheme="majorHAnsi"/>
+          <w:lang w:val="pt-BR"/>
+        </w:rPr>
+        <w:t xml:space="preserve"> </w:t>
+      </w:r>
+      <w:r>
+        <w:rPr>
+          <w:rFonts w:asciiTheme="majorHAnsi" w:hAnsiTheme="majorHAnsi" w:cstheme="majorHAnsi"/>
+          <w:lang w:val="pt-BR"/>
+        </w:rPr>
+        <w:t xml:space="preserve">  </w:t>
+      </w:r>
+      <w:r>
+        <w:rPr>
+          <w:rFonts w:asciiTheme="majorHAnsi" w:hAnsiTheme="majorHAnsi" w:cstheme="majorHAnsi"/>
+          <w:lang w:val="pt-BR"/>
+        </w:rPr>
+        <w:t xml:space="preserve">              </w:t>
+      </w:r>
+      <w:r>
+        <w:rPr>
+          <w:rFonts w:asciiTheme="majorHAnsi" w:hAnsiTheme="majorHAnsi" w:cstheme="majorHAnsi"/>
+          <w:b/>
+          <w:bCs/>
+          <w:lang w:val="pt-BR"/>
+        </w:rPr>
+        <w:t>Chassi:</w:t>
+      </w:r>
+      <w:r>
+        <w:rPr>
+          <w:rFonts w:asciiTheme="majorHAnsi" w:hAnsiTheme="majorHAnsi" w:cstheme="majorHAnsi"/>
+          <w:lang w:val="pt-BR"/>
+        </w:rPr>
+        <w:t xml:space="preserve"> </w:t>
+      </w:r>
+      <w:r>
+        <w:rPr>
+          <w:rFonts w:asciiTheme="majorHAnsi" w:hAnsiTheme="majorHAnsi" w:cstheme="majorHAnsi"/>
+          <w:lang w:val="pt-BR"/>
+        </w:rPr>
+        <w:t xml:space="preserve">{Chassi}                           </w:t>
+      </w:r>
+      <w:r>
+        <w:rPr>
+          <w:rFonts w:asciiTheme="majorHAnsi" w:hAnsiTheme="majorHAnsi" w:cstheme="majorHAnsi"/>
+          <w:b/>
+          <w:bCs/>
+          <w:lang w:val="pt-BR"/>
+        </w:rPr>
+        <w:t>Renavan:</w:t>
+      </w:r>
+      <w:r>
+        <w:rPr>
+          <w:rFonts w:asciiTheme="majorHAnsi" w:hAnsiTheme="majorHAnsi" w:cstheme="majorHAnsi"/>
+          <w:lang w:val="pt-BR"/>
+        </w:rPr>
+        <w:t xml:space="preserve"> </w:t>
+      </w:r>
+      <w:r>
+        <w:rPr>
+          <w:rFonts w:asciiTheme="majorHAnsi" w:hAnsiTheme="majorHAnsi" w:cstheme="majorHAnsi"/>
+          <w:lang w:val="pt-BR"/>
+        </w:rPr>
+        <w:t>{Renavam}</w:t>
+      </w:r>
+      <w:r>
+        <w:rPr>
+          <w:rFonts w:asciiTheme="majorHAnsi" w:hAnsiTheme="majorHAnsi" w:cstheme="majorHAnsi"/>
+          <w:lang w:val="pt-BR"/>
+        </w:rPr>
+        <w:t xml:space="preserve"> </w:t>
+      </w:r>
+    </w:p>
+    <w:p>
+      <w:pPr>
+        <w:spacing w:after="0" w:line="240" w:lineRule="auto"/>
+        <w:rPr>
+          <w:rFonts w:asciiTheme="majorHAnsi" w:hAnsiTheme="majorHAnsi" w:cstheme="majorHAnsi"/>
+          <w:lang w:val="pt-BR"/>
+        </w:rPr>
+      </w:pPr>
+      <w:r>
+        <w:rPr>
+          <w:rFonts w:asciiTheme="majorHAnsi" w:hAnsiTheme="majorHAnsi" w:cstheme="majorHAnsi"/>
+          <w:b/>
+          <w:bCs/>
+          <w:lang w:val="pt-BR"/>
+        </w:rPr>
+        <w:t>Combustível</w:t>
+      </w:r>
+      <w:r>
+        <w:rPr>
+          <w:rFonts w:asciiTheme="majorHAnsi" w:hAnsiTheme="majorHAnsi" w:cstheme="majorHAnsi"/>
+          <w:b/>
+          <w:bCs/>
+          <w:lang w:val="pt-BR"/>
+        </w:rPr>
+        <w:t>:</w:t>
+      </w:r>
+      <w:r>
+        <w:rPr>
+          <w:rFonts w:asciiTheme="majorHAnsi" w:hAnsiTheme="majorHAnsi" w:cstheme="majorHAnsi"/>
+          <w:b/>
+          <w:bCs/>
+          <w:lang w:val="pt-BR"/>
+        </w:rPr>
+        <w:t xml:space="preserve"> </w:t>
+      </w:r>
+      <w:r>
+        <w:rPr>
+          <w:rFonts w:asciiTheme="majorHAnsi" w:hAnsiTheme="majorHAnsi" w:cstheme="majorHAnsi"/>
+          <w:lang w:val="pt-BR"/>
+        </w:rPr>
+        <w:t>{Combustível}</w:t>
+      </w:r>
+      <w:r>
+        <w:rPr>
+          <w:rFonts w:asciiTheme="majorHAnsi" w:hAnsiTheme="majorHAnsi" w:cstheme="majorHAnsi"/>
+          <w:b/>
+          <w:bCs/>
+          <w:lang w:val="pt-BR"/>
+        </w:rPr>
+        <w:t xml:space="preserve">                                     </w:t>
+      </w:r>
+      <w:r>
+        <w:rPr>
+          <w:rFonts w:asciiTheme="majorHAnsi" w:hAnsiTheme="majorHAnsi" w:cstheme="majorHAnsi"/>
+          <w:b/>
+          <w:bCs/>
+          <w:lang w:val="pt-BR"/>
+        </w:rPr>
+        <w:t xml:space="preserve">                </w:t>
+      </w:r>
+      <w:r>
+        <w:rPr>
+          <w:rFonts w:asciiTheme="majorHAnsi" w:hAnsiTheme="majorHAnsi" w:cstheme="majorHAnsi"/>
+          <w:b/>
+          <w:bCs/>
+          <w:lang w:val="pt-BR"/>
+        </w:rPr>
+        <w:t>Km Atual:</w:t>
+      </w:r>
+      <w:r>
+        <w:rPr>
+          <w:rFonts w:asciiTheme="majorHAnsi" w:hAnsiTheme="majorHAnsi" w:cstheme="majorHAnsi"/>
+          <w:lang w:val="pt-BR"/>
+        </w:rPr>
+        <w:t xml:space="preserve"> {KM}</w:t>
+      </w:r>
+    </w:p>
+    <w:p>
+      <w:pPr>
+        <w:spacing w:after="0" w:line="240" w:lineRule="auto"/>
+        <w:rPr>
+          <w:rFonts w:asciiTheme="majorHAnsi" w:hAnsiTheme="majorHAnsi" w:cstheme="majorHAnsi"/>
+          <w:lang w:val="pt-BR"/>
+        </w:rPr>
+      </w:pPr>
+      <w:r>
+        <w:rPr>
+          <w:rFonts w:asciiTheme="majorHAnsi" w:hAnsiTheme="majorHAnsi" w:cstheme="majorHAnsi"/>
+          <w:b/>
+          <w:bCs/>
+          <w:lang w:val="pt-BR"/>
+        </w:rPr>
+        <w:t>Valor da Venda:</w:t>
+      </w:r>
+      <w:r>
+        <w:rPr>
+          <w:rFonts w:asciiTheme="majorHAnsi" w:hAnsiTheme="majorHAnsi" w:cstheme="majorHAnsi"/>
+          <w:lang w:val="pt-BR"/>
+        </w:rPr>
+        <w:t xml:space="preserve"> {</w:t>
+      </w:r>
+      <w:r>
+        <w:rPr>
+          <w:rFonts w:asciiTheme="majorHAnsi" w:hAnsiTheme="majorHAnsi" w:cstheme="majorHAnsi"/>
+          <w:lang w:val="pt-BR"/>
+        </w:rPr>
+        <w:t>Valor da Venda}</w:t>
+      </w:r>
+    </w:p>
+    <w:p>
+      <w:pPr>
+        <w:spacing w:after="0" w:line="240" w:lineRule="auto"/>
+        <w:rPr>
+          <w:rFonts w:asciiTheme="majorHAnsi" w:hAnsiTheme="majorHAnsi" w:cstheme="majorHAnsi"/>
+          <w:b/>
+          <w:bCs/>
+          <w:szCs w:val="20"/>
+          <w:lang w:val="pt-BR"/>
+        </w:rPr>
+      </w:pPr>
+      <w:r>
+        <w:rPr>
+          <w:noProof/>
+          <w:color w:val="555555"/>
+          <w:sz w:val="18"/>
+          <w:szCs w:val="18"/>
+          <w:lang w:val="pt-BR"/>
+        </w:rPr>
+        <mc:AlternateContent>
+          <mc:Choice Requires="wps">
+            <w:drawing>
+              <wp:anchor distT="0" distB="0" distL="114300" distR="114300" simplePos="0" relativeHeight="251668480" behindDoc="0" locked="0" layoutInCell="1" allowOverlap="1" wp14:anchorId="06FEA610" wp14:editId="1E5E472F">
+                <wp:simplePos x="0" y="0"/>
+                <wp:positionH relativeFrom="column">
+                  <wp:posOffset>51207</wp:posOffset>
+                </wp:positionH>
+                <wp:positionV relativeFrom="paragraph">
+                  <wp:posOffset>214198</wp:posOffset>
+                </wp:positionV>
+                <wp:extent cx="1718768" cy="248285"/>
+                <wp:effectExtent l="0" t="0" r="0" b="0"/>
+                <wp:wrapNone/>
+                <wp:docPr id="1905243769" name="Caixa de Texto 3"/>
+                <wp:cNvGraphicFramePr/>
+                <a:graphic xmlns:a="http://schemas.openxmlformats.org/drawingml/2006/main">
+                  <a:graphicData uri="http://schemas.microsoft.com/office/word/2010/wordprocessingShape">
+                    <wps:wsp>
+                      <wps:cNvSpPr txBox="1"/>
+                      <wps:spPr>
+                        <a:xfrm>
+                          <a:off x="0" y="0"/>
+                          <a:ext cx="1718768" cy="248285"/>
+                        </a:xfrm>
+                        <a:prstGeom prst="rect">
+                          <a:avLst/>
+                        </a:prstGeom>
+                        <a:solidFill>
+                          <a:schemeClr val="lt1"/>
+                        </a:solidFill>
+                        <a:ln w="6350">
+                          <a:noFill/>
+                        </a:ln>
+                      </wps:spPr>
+                      <wps:txbx>
+                        <w:txbxContent>
+                          <w:p>
+                            <w:pPr>
+                              <w:rPr>
+                                <w:b/>
+                                <w:bCs/>
+                                <w:color w:val="808080" w:themeColor="background1" w:themeShade="80"/>
+                                <w:lang w:val="pt-BR"/>
+                              </w:rPr>
+                            </w:pPr>
+                            <w:r>
+                              <w:rPr>
+                                <w:b/>
+                                <w:bCs/>
+                                <w:color w:val="808080" w:themeColor="background1" w:themeShade="80"/>
+                                <w:lang w:val="pt-BR"/>
+                              </w:rPr>
+                              <w:t>Condiç</w:t>
+                            </w:r>
+                            <w:r>
+                              <w:rPr>
+                                <w:b/>
+                                <w:bCs/>
+                                <w:color w:val="808080" w:themeColor="background1" w:themeShade="80"/>
+                                <w:lang w:val="pt-BR"/>
+                              </w:rPr>
+                              <w:t xml:space="preserve">ões </w:t>
+                            </w:r>
+                            <w:r>
+                              <w:rPr>
+                                <w:b/>
+                                <w:bCs/>
+                                <w:color w:val="808080" w:themeColor="background1" w:themeShade="80"/>
+                                <w:lang w:val="pt-BR"/>
+                              </w:rPr>
+                              <w:t xml:space="preserve">da </w:t>
+                            </w:r>
+                            <w:r>
+                              <w:rPr>
+                                <w:b/>
+                                <w:bCs/>
+                                <w:color w:val="808080" w:themeColor="background1" w:themeShade="80"/>
+                                <w:lang w:val="pt-BR"/>
+                              </w:rPr>
+                              <w:t xml:space="preserve">Transação </w:t>
+                            </w:r>
+                          </w:p>
+                        </w:txbxContent>
+                      </wps:txbx>
+                      <wps:bodyPr rot="0" spcFirstLastPara="0" vertOverflow="overflow" horzOverflow="overflow" vert="horz" wrap="square" lIns="91440" tIns="45720" rIns="91440" bIns="45720" numCol="1" spcCol="0" rtlCol="0" fromWordArt="0" anchor="t" anchorCtr="0" forceAA="0" compatLnSpc="1">
+                        <a:prstTxWarp prst="textNoShape">
+                          <a:avLst/>
+                        </a:prstTxWarp>
+                        <a:noAutofit/>
+                      </wps:bodyPr>
+                    </wps:wsp>
+                  </a:graphicData>
+                </a:graphic>
+                <wp14:sizeRelH relativeFrom="margin">
+                  <wp14:pctWidth>0</wp14:pctWidth>
+                </wp14:sizeRelH>
+                <wp14:sizeRelV relativeFrom="margin">
+                  <wp14:pctHeight>0</wp14:pctHeight>
+                </wp14:sizeRelV>
+              </wp:anchor>
+            </w:drawing>
+          </mc:Choice>
+          <mc:Fallback>
+            <w:pict>
+              <v:shape w14:anchorId="06FEA610" id="_x0000_s1028" type="#_x0000_t202" style="position:absolute;margin-left:4.05pt;margin-top:16.85pt;width:135.35pt;height:19.55pt;z-index:251668480;visibility:visible;mso-wrap-style:square;mso-width-percent:0;mso-height-percent:0;mso-wrap-distance-left:9pt;mso-wrap-distance-top:0;mso-wrap-distance-right:9pt;mso-wrap-distance-bottom:0;mso-position-horizontal:absolute;mso-position-horizontal-relative:text;mso-position-vertical:absolute;mso-position-vertical-relative:text;mso-width-percent:0;mso-height-percent:0;mso-width-relative:margin;mso-height-relative:margin;v-text-anchor:top" o:gfxdata="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" fillcolor="white [3201]" stroked="f" strokeweight=".5pt">
+                <v:textbox>
+                  <w:txbxContent>
+                    <w:p>
+                      <w:pPr>
+                        <w:rPr>
+                          <w:b/>
+                          <w:bCs/>
+                          <w:color w:val="808080" w:themeColor="background1" w:themeShade="80"/>
+                          <w:lang w:val="pt-BR"/>
+                        </w:rPr>
+                      </w:pPr>
+                      <w:r>
+                        <w:rPr>
+                          <w:b/>
+                          <w:bCs/>
+                          <w:color w:val="808080" w:themeColor="background1" w:themeShade="80"/>
+                          <w:lang w:val="pt-BR"/>
+                        </w:rPr>
+                        <w:t>Condiç</w:t>
+                      </w:r>
+                      <w:r>
+                        <w:rPr>
+                          <w:b/>
+                          <w:bCs/>
+                          <w:color w:val="808080" w:themeColor="background1" w:themeShade="80"/>
+                          <w:lang w:val="pt-BR"/>
+                        </w:rPr>
+                        <w:t xml:space="preserve">ões </w:t>
+                      </w:r>
+                      <w:r>
+                        <w:rPr>
+                          <w:b/>
+                          <w:bCs/>
+                          <w:color w:val="808080" w:themeColor="background1" w:themeShade="80"/>
+                          <w:lang w:val="pt-BR"/>
+                        </w:rPr>
+                        <w:t xml:space="preserve">da </w:t>
+                      </w:r>
+                      <w:r>
+                        <w:rPr>
+                          <w:b/>
+                          <w:bCs/>
+                          <w:color w:val="808080" w:themeColor="background1" w:themeShade="80"/>
+                          <w:lang w:val="pt-BR"/>
+                        </w:rPr>
+                        <w:t xml:space="preserve">Transação </w:t>
+                      </w:r>
+                    </w:p>
+                  </w:txbxContent>
+                </v:textbox>
+              </v:shape>
+            </w:pict>
+          </mc:Fallback>
+        </mc:AlternateContent>
+      </w:r>
+    </w:p>
+    <w:p>
+      <w:pPr>
+        <w:spacing w:after="0" w:line="240" w:lineRule="auto"/>
+        <w:rPr>
+          <w:rFonts w:asciiTheme="majorHAnsi" w:hAnsiTheme="majorHAnsi" w:cstheme="majorHAnsi"/>
+          <w:szCs w:val="20"/>
+          <w:lang w:val="pt-BR"/>
+        </w:rPr>
+      </w:pPr>
+    </w:p>
+    <w:p>
+      <w:pPr>
+        <w:spacing w:after="0" w:line="240" w:lineRule="auto"/>
+        <w:rPr>
+          <w:rFonts w:asciiTheme="majorHAnsi" w:hAnsiTheme="majorHAnsi" w:cstheme="majorHAnsi"/>
+          <w:szCs w:val="20"/>
+          <w:lang w:val="pt-BR"/>
+        </w:rPr>
+      </w:pPr>
+      <w:r>
+        <w:rPr>
+          <w:noProof/>
+          <w:color w:val="FFFFFF" w:themeColor="background1"/>
+          <w:sz w:val="24"/>
+          <w:szCs w:val="24"/>
+          <w:lang w:val="pt-BR"/>
+        </w:rPr>
+        <mc:AlternateContent>
+          <mc:Choice Requires="wps">
+            <w:drawing>
+              <wp:anchor distT="0" distB="0" distL="114300" distR="114300" simplePos="0" relativeHeight="251667456" behindDoc="0" locked="0" layoutInCell="1" allowOverlap="1" wp14:anchorId="1788E6E1" wp14:editId="2AE1750B">
+                <wp:simplePos x="0" y="0"/>
+                <wp:positionH relativeFrom="column">
+                  <wp:posOffset>-73152</wp:posOffset>
+                </wp:positionH>
+                <wp:positionV relativeFrom="paragraph">
+                  <wp:posOffset>35993</wp:posOffset>
+                </wp:positionV>
+                <wp:extent cx="6385560" cy="548640"/>
+                <wp:effectExtent l="0" t="0" r="15240" b="22860"/>
+                <wp:wrapNone/>
+                <wp:docPr id="1624956887" name="Retângulo 1"/>
+                <wp:cNvGraphicFramePr/>
+                <a:graphic xmlns:a="http://schemas.openxmlformats.org/drawingml/2006/main">
+                  <a:graphicData uri="http://schemas.microsoft.com/office/word/2010/wordprocessingShape">
+                    <wps:wsp>
+                      <wps:cNvSpPr/>
+                      <wps:spPr>
+                        <a:xfrm>
+                          <a:off x="0" y="0"/>
+                          <a:ext cx="6385560" cy="548640"/>
+                        </a:xfrm>
+                        <a:prstGeom prst="rect">
+                          <a:avLst/>
+                        </a:prstGeom>
+                        <a:noFill/>
+                        <a:ln w="9525" cap="flat" cmpd="sng" algn="ctr">
+                          <a:solidFill>
+                            <a:schemeClr val="dk1"/>
+                          </a:solidFill>
+                          <a:prstDash val="solid"/>
+                          <a:round/>
+                          <a:headEnd type="none" w="med" len="med"/>
+                          <a:tailEnd type="none" w="med" len="med"/>
+                        </a:ln>
+                      </wps:spPr>
+                      <wps:style>
+                        <a:lnRef idx="0">
+                          <a:scrgbClr r="0" g="0" b="0"/>
+                        </a:lnRef>
+                        <a:fillRef idx="0">
+                          <a:scrgbClr r="0" g="0" b="0"/>
+                        </a:fillRef>
+                        <a:effectRef idx="0">
+                          <a:scrgbClr r="0" g="0" b="0"/>
+                        </a:effectRef>
+                        <a:fontRef idx="minor">
+                          <a:schemeClr val="dk1"/>
+                        </a:fontRef>
+                      </wps:style>
+                      <wps:bodyPr rot="0" spcFirstLastPara="0" vertOverflow="overflow" horzOverflow="overflow" vert="horz" wrap="square" lIns="91440" tIns="45720" rIns="91440" bIns="45720" numCol="1" spcCol="0" rtlCol="0" fromWordArt="0" anchor="ctr" anchorCtr="0" forceAA="0" compatLnSpc="1">
+                        <a:prstTxWarp prst="textNoShape">
+                          <a:avLst/>
+                        </a:prstTxWarp>
+                        <a:noAutofit/>
+                      </wps:bodyPr>
+                    </wps:wsp>
+                  </a:graphicData>
+                </a:graphic>
+                <wp14:sizeRelH relativeFrom="margin">
+                  <wp14:pctWidth>0</wp14:pctWidth>
+                </wp14:sizeRelH>
+                <wp14:sizeRelV relativeFrom="margin">
+                  <wp14:pctHeight>0</wp14:pctHeight>
+                </wp14:sizeRelV>
+              </wp:anchor>
+            </w:drawing>
+          </mc:Choice>
+          <mc:Fallback>
+            <w:pict>
+              <v:rect w14:anchorId="5428BBBC" id="Retângulo 1" o:spid="_x0000_s1026" style="position:absolute;margin-left:-5.75pt;margin-top:2.85pt;width:502.8pt;height:43.2pt;z-index:251667456;visibility:visible;mso-wrap-style:square;mso-width-percent:0;mso-height-percent:0;mso-wrap-distance-left:9pt;mso-wrap-distance-top:0;mso-wrap-distance-right:9pt;mso-wrap-distance-bottom:0;mso-position-horizontal:absolute;mso-position-horizontal-relative:text;mso-position-vertical:absolute;mso-position-vertical-relative:text;mso-width-percent:0;mso-height-percent:0;mso-width-relative:margin;mso-height-relative:margin;v-text-anchor:middle" o:gfxdata="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" filled="f" strokecolor="black [3200]">
+                <v:stroke joinstyle="round"/>
+              </v:rect>
+            </w:pict>
+          </mc:Fallback>
+        </mc:AlternateContent>
+      </w:r>
+    </w:p>
+    <w:p>
+      <w:pPr>
+        <w:spacing w:after="0" w:line="240" w:lineRule="auto"/>
+        <w:rPr>
+          <w:rFonts w:asciiTheme="majorHAnsi" w:hAnsiTheme="majorHAnsi" w:cstheme="majorHAnsi"/>
+          <w:szCs w:val="20"/>
+          <w:lang w:val="pt-BR"/>
+        </w:rPr>
+      </w:pPr>
+      <w:r>
+        <w:rPr>
+          <w:rFonts w:asciiTheme="majorHAnsi" w:hAnsiTheme="majorHAnsi" w:cstheme="majorHAnsi"/>
+          <w:szCs w:val="20"/>
+          <w:lang w:val="pt-BR"/>
+        </w:rPr>
+        <w:t>Eu, {</w:t>
+      </w:r>
+      <w:r>
+        <w:rPr>
+          <w:rFonts w:asciiTheme="majorHAnsi" w:hAnsiTheme="majorHAnsi" w:cstheme="majorHAnsi"/>
+          <w:szCs w:val="20"/>
+          <w:lang w:val="pt-BR"/>
+        </w:rPr>
+        <w:t>Nome do Cliente}</w:t>
+      </w:r>
+      <w:r>
+        <w:rPr>
+          <w:rFonts w:asciiTheme="majorHAnsi" w:hAnsiTheme="majorHAnsi" w:cstheme="majorHAnsi"/>
+          <w:szCs w:val="20"/>
+          <w:lang w:val="pt-BR"/>
+        </w:rPr>
+        <w:t>, afirmo ter pago a JTS INTERMEDIAÇÕES E NEGOCIOS LTDA pela compra do veiculo citado, a quantia de</w:t>
+      </w:r>
+      <w:r>
+        <w:rPr>
+          <w:rFonts w:asciiTheme="majorHAnsi" w:hAnsiTheme="majorHAnsi" w:cstheme="majorHAnsi"/>
+          <w:szCs w:val="20"/>
+          <w:lang w:val="pt-BR"/>
+        </w:rPr>
+        <w:t>: {Valor da Venda}</w:t>
+      </w:r>
+      <w:r>
+        <w:rPr>
+          <w:rFonts w:asciiTheme="majorHAnsi" w:hAnsiTheme="majorHAnsi" w:cstheme="majorHAnsi"/>
+          <w:szCs w:val="20"/>
+          <w:lang w:val="pt-BR"/>
+        </w:rPr>
+        <w:t xml:space="preserve"> ( </w:t>
+      </w:r>
+      <w:r>
+        <w:rPr>
+          <w:rFonts w:asciiTheme="majorHAnsi" w:hAnsiTheme="majorHAnsi" w:cstheme="majorHAnsi"/>
+          <w:szCs w:val="20"/>
+          <w:lang w:val="pt-BR"/>
+        </w:rPr>
+        <w:t>Valor por extenso</w:t>
+      </w:r>
+      <w:r>
+        <w:rPr>
+          <w:rFonts w:asciiTheme="majorHAnsi" w:hAnsiTheme="majorHAnsi" w:cstheme="majorHAnsi"/>
+          <w:szCs w:val="20"/>
+          <w:lang w:val="pt-BR"/>
+        </w:rPr>
+        <w:t>),</w:t>
+      </w:r>
+      <w:r>
+        <w:rPr>
+          <w:rFonts w:asciiTheme="majorHAnsi" w:hAnsiTheme="majorHAnsi" w:cstheme="majorHAnsi"/>
+          <w:szCs w:val="20"/>
+          <w:lang w:val="pt-BR"/>
+        </w:rPr>
+        <w:t xml:space="preserve"> a ser pago da forma</w:t>
+      </w:r>
+      <w:r>
+        <w:rPr>
+          <w:rFonts w:asciiTheme="majorHAnsi" w:hAnsiTheme="majorHAnsi" w:cstheme="majorHAnsi"/>
+          <w:szCs w:val="20"/>
+          <w:lang w:val="pt-BR"/>
+        </w:rPr>
+        <w:t xml:space="preserve"> descrita abaixo:</w:t>
+      </w:r>
+    </w:p>
+    <w:p>
+      <w:pPr>
+        <w:spacing w:after="0" w:line="240" w:lineRule="auto"/>
+        <w:rPr>
+          <w:rFonts w:asciiTheme="majorHAnsi" w:hAnsiTheme="majorHAnsi" w:cstheme="majorHAnsi"/>
+          <w:b/>
+          <w:bCs/>
+          <w:szCs w:val="20"/>
+          <w:lang w:val="pt-BR"/>
+        </w:rPr>
+      </w:pPr>
+    </w:p>
+    <w:p>
+      <w:pPr>
+        <w:spacing w:after="0" w:line="240" w:lineRule="auto"/>
+        <w:rPr>
+          <w:rFonts w:asciiTheme="majorHAnsi" w:hAnsiTheme="majorHAnsi" w:cstheme="majorHAnsi"/>
+          <w:b/>
+          <w:bCs/>
+          <w:szCs w:val="20"/>
+          <w:lang w:val="pt-BR"/>
+        </w:rPr>
+      </w:pPr>
+      <w:r>
+        <w:rPr>
+          <w:noProof/>
+          <w:color w:val="555555"/>
+          <w:sz w:val="18"/>
+          <w:szCs w:val="18"/>
+          <w:lang w:val="pt-BR"/>
+        </w:rPr>
+        <mc:AlternateContent>
+          <mc:Choice Requires="wps">
+            <w:drawing>
+              <wp:anchor distT="0" distB="0" distL="114300" distR="114300" simplePos="0" relativeHeight="251671552" behindDoc="0" locked="0" layoutInCell="1" allowOverlap="1" wp14:anchorId="4B60A431" wp14:editId="781A1018">
+                <wp:simplePos x="0" y="0"/>
+                <wp:positionH relativeFrom="column">
+                  <wp:posOffset>70790</wp:posOffset>
+                </wp:positionH>
+                <wp:positionV relativeFrom="paragraph">
+                  <wp:posOffset>131445</wp:posOffset>
+                </wp:positionV>
+                <wp:extent cx="1791970" cy="248285"/>
+                <wp:effectExtent l="0" t="0" r="0" b="0"/>
+                <wp:wrapNone/>
+                <wp:docPr id="1531168136" name="Caixa de Texto 3"/>
+                <wp:cNvGraphicFramePr/>
+                <a:graphic xmlns:a="http://schemas.openxmlformats.org/drawingml/2006/main">
+                  <a:graphicData uri="http://schemas.microsoft.com/office/word/2010/wordprocessingShape">
+                    <wps:wsp>
+                      <wps:cNvSpPr txBox="1"/>
+                      <wps:spPr>
+                        <a:xfrm>
+                          <a:off x="0" y="0"/>
+                          <a:ext cx="1791970" cy="248285"/>
+                        </a:xfrm>
+                        <a:prstGeom prst="rect">
+                          <a:avLst/>
+                        </a:prstGeom>
+                        <a:solidFill>
+                          <a:schemeClr val="lt1"/>
+                        </a:solidFill>
+                        <a:ln w="6350">
+                          <a:noFill/>
+                        </a:ln>
+                      </wps:spPr>
+                      <wps:txbx>
+                        <w:txbxContent>
+                          <w:p>
+                            <w:pPr>
+                              <w:rPr>
+                                <w:b/>
+                                <w:bCs/>
+                                <w:color w:val="808080" w:themeColor="background1" w:themeShade="80"/>
+                                <w:lang w:val="pt-BR"/>
+                              </w:rPr>
+                            </w:pPr>
+                            <w:r>
+                              <w:rPr>
+                                <w:b/>
+                                <w:bCs/>
+                                <w:color w:val="808080" w:themeColor="background1" w:themeShade="80"/>
+                                <w:lang w:val="pt-BR"/>
+                              </w:rPr>
+                              <w:t>Condiç</w:t>
+                            </w:r>
+                            <w:r>
+                              <w:rPr>
+                                <w:b/>
+                                <w:bCs/>
+                                <w:color w:val="808080" w:themeColor="background1" w:themeShade="80"/>
+                                <w:lang w:val="pt-BR"/>
+                              </w:rPr>
+                              <w:t xml:space="preserve">ões </w:t>
+                            </w:r>
+                            <w:r>
+                              <w:rPr>
+                                <w:b/>
+                                <w:bCs/>
+                                <w:color w:val="808080" w:themeColor="background1" w:themeShade="80"/>
+                                <w:lang w:val="pt-BR"/>
+                              </w:rPr>
+                              <w:t>d</w:t>
+                            </w:r>
+                            <w:r>
+                              <w:rPr>
+                                <w:b/>
+                                <w:bCs/>
+                                <w:color w:val="808080" w:themeColor="background1" w:themeShade="80"/>
+                                <w:lang w:val="pt-BR"/>
+                              </w:rPr>
+                              <w:t xml:space="preserve">o </w:t>
+                            </w:r>
+                            <w:r>
+                              <w:rPr>
+                                <w:b/>
+                                <w:bCs/>
+                                <w:color w:val="808080" w:themeColor="background1" w:themeShade="80"/>
+                                <w:lang w:val="pt-BR"/>
+                              </w:rPr>
+                              <w:t>Pagamento</w:t>
+                            </w:r>
+                          </w:p>
+                        </w:txbxContent>
+                      </wps:txbx>
+                      <wps:bodyPr rot="0" spcFirstLastPara="0" vertOverflow="overflow" horzOverflow="overflow" vert="horz" wrap="square" lIns="91440" tIns="45720" rIns="91440" bIns="45720" numCol="1" spcCol="0" rtlCol="0" fromWordArt="0" anchor="t" anchorCtr="0" forceAA="0" compatLnSpc="1">
+                        <a:prstTxWarp prst="textNoShape">
+                          <a:avLst/>
+                        </a:prstTxWarp>
+                        <a:noAutofit/>
+                      </wps:bodyPr>
+                    </wps:wsp>
+                  </a:graphicData>
+                </a:graphic>
+                <wp14:sizeRelH relativeFrom="margin">
+                  <wp14:pctWidth>0</wp14:pctWidth>
+                </wp14:sizeRelH>
+                <wp14:sizeRelV relativeFrom="margin">
+                  <wp14:pctHeight>0</wp14:pctHeight>
+                </wp14:sizeRelV>
+              </wp:anchor>
+            </w:drawing>
+          </mc:Choice>
+          <mc:Fallback>
+            <w:pict>
+              <v:shape w14:anchorId="4B60A431" id="_x0000_s1029" type="#_x0000_t202" style="position:absolute;margin-left:5.55pt;margin-top:10.35pt;width:141.1pt;height:19.55pt;z-index:251671552;visibility:visible;mso-wrap-style:square;mso-width-percent:0;mso-height-percent:0;mso-wrap-distance-left:9pt;mso-wrap-distance-top:0;mso-wrap-distance-right:9pt;mso-wrap-distance-bottom:0;mso-position-horizontal:absolute;mso-position-horizontal-relative:text;mso-position-vertical:absolute;mso-position-vertical-relative:text;mso-width-percent:0;mso-height-percent:0;mso-width-relative:margin;mso-height-relative:margin;v-text-anchor:top" o:gfxdata="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" fillcolor="white [3201]" stroked="f" strokeweight=".5pt">
+                <v:textbox>
+                  <w:txbxContent>
+                    <w:p>
+                      <w:pPr>
+                        <w:rPr>
+                          <w:b/>
+                          <w:bCs/>
+                          <w:color w:val="808080" w:themeColor="background1" w:themeShade="80"/>
+                          <w:lang w:val="pt-BR"/>
+                        </w:rPr>
+                      </w:pPr>
+                      <w:r>
+                        <w:rPr>
+                          <w:b/>
+                          <w:bCs/>
+                          <w:color w:val="808080" w:themeColor="background1" w:themeShade="80"/>
+                          <w:lang w:val="pt-BR"/>
+                        </w:rPr>
+                        <w:t>Condiç</w:t>
+                      </w:r>
+                      <w:r>
+                        <w:rPr>
+                          <w:b/>
+                          <w:bCs/>
+                          <w:color w:val="808080" w:themeColor="background1" w:themeShade="80"/>
+                          <w:lang w:val="pt-BR"/>
+                        </w:rPr>
+                        <w:t xml:space="preserve">ões </w:t>
+                      </w:r>
+                      <w:r>
+                        <w:rPr>
+                          <w:b/>
+                          <w:bCs/>
+                          <w:color w:val="808080" w:themeColor="background1" w:themeShade="80"/>
+                          <w:lang w:val="pt-BR"/>
+                        </w:rPr>
+                        <w:t>d</w:t>
+                      </w:r>
+                      <w:r>
+                        <w:rPr>
+                          <w:b/>
+                          <w:bCs/>
+                          <w:color w:val="808080" w:themeColor="background1" w:themeShade="80"/>
+                          <w:lang w:val="pt-BR"/>
+                        </w:rPr>
+                        <w:t xml:space="preserve">o </w:t>
+                      </w:r>
+                      <w:r>
+                        <w:rPr>
+                          <w:b/>
+                          <w:bCs/>
+                          <w:color w:val="808080" w:themeColor="background1" w:themeShade="80"/>
+                          <w:lang w:val="pt-BR"/>
+                        </w:rPr>
+                        <w:t>Pagamento</w:t>
+                      </w:r>
+                    </w:p>
+                  </w:txbxContent>
+                </v:textbox>
+              </v:shape>
+            </w:pict>
+          </mc:Fallback>
+        </mc:AlternateContent>
+      </w:r>
+    </w:p>
+    <w:p>
+      <w:pPr>
+        <w:spacing w:after="0" w:line="240" w:lineRule="auto"/>
+        <w:rPr>
+          <w:rFonts w:asciiTheme="majorHAnsi" w:hAnsiTheme="majorHAnsi" w:cstheme="majorHAnsi"/>
+          <w:b/>
+          <w:bCs/>
+          <w:szCs w:val="20"/>
+          <w:lang w:val="pt-BR"/>
+        </w:rPr>
+      </w:pPr>
+      <w:r>
+        <w:rPr>
+          <w:noProof/>
+          <w:color w:val="FFFFFF" w:themeColor="background1"/>
+          <w:sz w:val="24"/>
+          <w:szCs w:val="24"/>
+          <w:lang w:val="pt-BR"/>
+        </w:rPr>
+        <mc:AlternateContent>
+          <mc:Choice Requires="wps">
+            <w:drawing>
+              <wp:anchor distT="0" distB="0" distL="114300" distR="114300" simplePos="0" relativeHeight="251670528" behindDoc="0" locked="0" layoutInCell="1" allowOverlap="1" wp14:anchorId="29611BA2" wp14:editId="2140EFAC">
+                <wp:simplePos x="0" y="0"/>
+                <wp:positionH relativeFrom="column">
+                  <wp:posOffset>-63195</wp:posOffset>
+                </wp:positionH>
+                <wp:positionV relativeFrom="paragraph">
+                  <wp:posOffset>109855</wp:posOffset>
+                </wp:positionV>
+                <wp:extent cx="6385560" cy="3095625"/>
+                <wp:effectExtent l="0" t="0" r="15240" b="28575"/>
+                <wp:wrapNone/>
+                <wp:docPr id="966023408" name="Retângulo 1"/>
+                <wp:cNvGraphicFramePr/>
+                <a:graphic xmlns:a="http://schemas.openxmlformats.org/drawingml/2006/main">
+                  <a:graphicData uri="http://schemas.microsoft.com/office/word/2010/wordprocessingShape">
+                    <wps:wsp>
+                      <wps:cNvSpPr/>
+                      <wps:spPr>
+                        <a:xfrm>
+                          <a:off x="0" y="0"/>
+                          <a:ext cx="6385560" cy="3095625"/>
+                        </a:xfrm>
+                        <a:prstGeom prst="rect">
+                          <a:avLst/>
+                        </a:prstGeom>
+                        <a:noFill/>
+                        <a:ln w="9525" cap="flat" cmpd="sng" algn="ctr">
+                          <a:solidFill>
+                            <a:schemeClr val="dk1"/>
+                          </a:solidFill>
+                          <a:prstDash val="solid"/>
+                          <a:round/>
+                          <a:headEnd type="none" w="med" len="med"/>
+                          <a:tailEnd type="none" w="med" len="med"/>
+                        </a:ln>
+                      </wps:spPr>
+                      <wps:style>
+                        <a:lnRef idx="0">
+                          <a:scrgbClr r="0" g="0" b="0"/>
+                        </a:lnRef>
+                        <a:fillRef idx="0">
+                          <a:scrgbClr r="0" g="0" b="0"/>
+                        </a:fillRef>
+                        <a:effectRef idx="0">
+                          <a:scrgbClr r="0" g="0" b="0"/>
+                        </a:effectRef>
+                        <a:fontRef idx="minor">
+                          <a:schemeClr val="dk1"/>
+                        </a:fontRef>
+                      </wps:style>
+                      <wps:bodyPr rot="0" spcFirstLastPara="0" vertOverflow="overflow" horzOverflow="overflow" vert="horz" wrap="square" lIns="91440" tIns="45720" rIns="91440" bIns="45720" numCol="1" spcCol="0" rtlCol="0" fromWordArt="0" anchor="ctr" anchorCtr="0" forceAA="0" compatLnSpc="1">
+                        <a:prstTxWarp prst="textNoShape">
+                          <a:avLst/>
+                        </a:prstTxWarp>
+                        <a:noAutofit/>
+                      </wps:bodyPr>
+                    </wps:wsp>
+                  </a:graphicData>
+                </a:graphic>
+                <wp14:sizeRelH relativeFrom="margin">
+                  <wp14:pctWidth>0</wp14:pctWidth>
+                </wp14:sizeRelH>
+                <wp14:sizeRelV relativeFrom="margin">
+                  <wp14:pctHeight>0</wp14:pctHeight>
+                </wp14:sizeRelV>
+              </wp:anchor>
+            </w:drawing>
+          </mc:Choice>
+          <mc:Fallback>
+            <w:pict>
+              <v:rect w14:anchorId="61ADDDEF" id="Retângulo 1" o:spid="_x0000_s1026" style="position:absolute;margin-left:-5pt;margin-top:8.65pt;width:502.8pt;height:243.75pt;z-index:251670528;visibility:visible;mso-wrap-style:square;mso-width-percent:0;mso-height-percent:0;mso-wrap-distance-left:9pt;mso-wrap-distance-top:0;mso-wrap-distance-right:9pt;mso-wrap-distance-bottom:0;mso-position-horizontal:absolute;mso-position-horizontal-relative:text;mso-position-vertical:absolute;mso-position-vertical-relative:text;mso-width-percent:0;mso-height-percent:0;mso-width-relative:margin;mso-height-relative:margin;v-text-anchor:middle" o:gfxdata="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" filled="f" strokecolor="black [3200]">
+                <v:stroke joinstyle="round"/>
+              </v:rect>
+            </w:pict>
+          </mc:Fallback>
+        </mc:AlternateContent>
+      </w:r>
+    </w:p>
+    <w:p>
+      <w:pPr>
+        <w:spacing w:after="0" w:line="240" w:lineRule="auto"/>
+        <w:rPr>
+          <w:rFonts w:asciiTheme="majorHAnsi" w:hAnsiTheme="majorHAnsi" w:cstheme="majorHAnsi"/>
+          <w:b/>
+          <w:bCs/>
+          <w:szCs w:val="20"/>
+          <w:lang w:val="pt-BR"/>
+        </w:rPr>
+      </w:pPr>
+    </w:p>
+    <w:p>
+      <w:pPr>
+        <w:spacing w:after="0" w:line="240" w:lineRule="auto"/>
+        <w:rPr>
+          <w:rFonts w:asciiTheme="majorHAnsi" w:hAnsiTheme="majorHAnsi" w:cstheme="majorHAnsi"/>
+          <w:b/>
+          <w:bCs/>
+          <w:szCs w:val="20"/>
+          <w:lang w:val="pt-BR"/>
+        </w:rPr>
+      </w:pPr>
+      <w:r>
+        <w:rPr>
+          <w:rFonts w:asciiTheme="majorHAnsi" w:hAnsiTheme="majorHAnsi" w:cstheme="majorHAnsi"/>
+          <w:b/>
+          <w:bCs/>
+          <w:szCs w:val="20"/>
+          <w:lang w:val="pt-BR"/>
+        </w:rPr>
+        <w:t xml:space="preserve">Data da </w:t>
+      </w:r>
+      <w:r>
+        <w:rPr>
+          <w:rFonts w:asciiTheme="majorHAnsi" w:hAnsiTheme="majorHAnsi" w:cstheme="majorHAnsi"/>
+          <w:b/>
+          <w:bCs/>
+          <w:szCs w:val="20"/>
+          <w:lang w:val="pt-BR"/>
+        </w:rPr>
+        <w:t xml:space="preserve">Venda: </w:t>
+      </w:r>
+      <w:r>
+        <w:rPr>
+          <w:rFonts w:asciiTheme="majorHAnsi" w:hAnsiTheme="majorHAnsi" w:cstheme="majorHAnsi"/>
+          <w:szCs w:val="20"/>
+          <w:lang w:val="pt-BR"/>
+        </w:rPr>
+        <w:t>{Data da Venda</w:t>
+      </w:r>
+      <w:r>
+        <w:rPr>
+          <w:rFonts w:asciiTheme="majorHAnsi" w:hAnsiTheme="majorHAnsi" w:cstheme="majorHAnsi"/>
+          <w:szCs w:val="20"/>
+          <w:lang w:val="pt-BR"/>
+        </w:rPr>
+        <w:t>}</w:t>
+      </w:r>
+      <w:r>
+        <w:rPr>
+          <w:rFonts w:asciiTheme="majorHAnsi" w:hAnsiTheme="majorHAnsi" w:cstheme="majorHAnsi"/>
+          <w:b/>
+          <w:bCs/>
+          <w:szCs w:val="20"/>
+          <w:lang w:val="pt-BR"/>
+        </w:rPr>
+        <w:t xml:space="preserve"> </w:t>
+      </w:r>
+      <w:r>
+        <w:rPr>
+          <w:rFonts w:asciiTheme="majorHAnsi" w:hAnsiTheme="majorHAnsi" w:cstheme="majorHAnsi"/>
+          <w:b/>
+          <w:bCs/>
+          <w:szCs w:val="20"/>
+          <w:lang w:val="pt-BR"/>
+        </w:rPr>
+        <w:t xml:space="preserve">                Valor d</w:t>
+      </w:r>
+      <w:r>
+        <w:rPr>
+          <w:rFonts w:asciiTheme="majorHAnsi" w:hAnsiTheme="majorHAnsi" w:cstheme="majorHAnsi"/>
+          <w:b/>
+          <w:bCs/>
+          <w:szCs w:val="20"/>
+          <w:lang w:val="pt-BR"/>
+        </w:rPr>
+        <w:t>e Venda</w:t>
+      </w:r>
+      <w:r>
+        <w:rPr>
+          <w:rFonts w:asciiTheme="majorHAnsi" w:hAnsiTheme="majorHAnsi" w:cstheme="majorHAnsi"/>
+          <w:b/>
+          <w:bCs/>
+          <w:szCs w:val="20"/>
+          <w:lang w:val="pt-BR"/>
+        </w:rPr>
+        <w:t>:</w:t>
+      </w:r>
+      <w:r>
+        <w:rPr>
+          <w:rFonts w:asciiTheme="majorHAnsi" w:hAnsiTheme="majorHAnsi" w:cstheme="majorHAnsi"/>
+          <w:b/>
+          <w:bCs/>
+          <w:szCs w:val="20"/>
+          <w:lang w:val="pt-BR"/>
+        </w:rPr>
+        <w:t xml:space="preserve"> </w:t>
+      </w:r>
+      <w:r>
+        <w:rPr>
+          <w:rFonts w:asciiTheme="majorHAnsi" w:hAnsiTheme="majorHAnsi" w:cstheme="majorHAnsi"/>
+          <w:szCs w:val="20"/>
+          <w:lang w:val="pt-BR"/>
+        </w:rPr>
+        <w:t>{Valor da Venda}</w:t>
+      </w:r>
+      <w:r>
+        <w:rPr>
+          <w:rFonts w:asciiTheme="majorHAnsi" w:hAnsiTheme="majorHAnsi" w:cstheme="majorHAnsi"/>
+          <w:szCs w:val="20"/>
+          <w:lang w:val="pt-BR"/>
+        </w:rPr>
+        <w:t xml:space="preserve"> </w:t>
+      </w:r>
+    </w:p>
+    <w:p>
+      <w:pPr>
+        <w:spacing w:after="0" w:line="240" w:lineRule="auto"/>
+        <w:rPr>
+          <w:rFonts w:asciiTheme="majorHAnsi" w:hAnsiTheme="majorHAnsi" w:cstheme="majorHAnsi"/>
+          <w:b/>
+          <w:bCs/>
+          <w:szCs w:val="20"/>
+          <w:lang w:val="pt-BR"/>
+        </w:rPr>
+      </w:pPr>
+    </w:p>
+    <w:p>
+      <w:pPr>
+        <w:spacing w:after="0" w:line="240" w:lineRule="auto"/>
+        <w:rPr>
+          <w:rFonts w:asciiTheme="majorHAnsi" w:hAnsiTheme="majorHAnsi" w:cstheme="majorHAnsi"/>
+          <w:color w:val="auto"/>
+          <w:szCs w:val="20"/>
+          <w:lang w:val="pt-BR"/>
+        </w:rPr>
+      </w:pPr>
+      <w:r>
+        <w:rPr>
+          <w:rFonts w:asciiTheme="majorHAnsi" w:hAnsiTheme="majorHAnsi" w:cstheme="majorHAnsi"/>
+          <w:b/>
+          <w:bCs/>
+          <w:color w:val="auto"/>
+          <w:szCs w:val="20"/>
+          <w:lang w:val="pt-BR"/>
+        </w:rPr>
+        <w:t xml:space="preserve">Forma de Pagamento: </w:t>
+      </w:r>
+      <w:r>
+        <w:rPr>
+          <w:rFonts w:asciiTheme="majorHAnsi" w:hAnsiTheme="majorHAnsi" w:cstheme="majorHAnsi"/>
+          <w:color w:val="auto"/>
+          <w:szCs w:val="20"/>
+          <w:lang w:val="pt-BR"/>
+        </w:rPr>
+        <w:t>{Forma de Pagamento</w:t>
+      </w:r>
+      <w:r>
+        <w:rPr>
+          <w:rFonts w:asciiTheme="majorHAnsi" w:hAnsiTheme="majorHAnsi" w:cstheme="majorHAnsi"/>
+          <w:color w:val="auto"/>
+          <w:szCs w:val="20"/>
+          <w:lang w:val="pt-BR"/>
+        </w:rPr>
+        <w:t>}</w:t>
+      </w:r>
+    </w:p>
+    <w:p>
+      <w:pPr>
+        <w:spacing w:after="0" w:line="240" w:lineRule="auto"/>
+        <w:rPr>
+          <w:rFonts w:asciiTheme="majorHAnsi" w:hAnsiTheme="majorHAnsi" w:cstheme="majorHAnsi"/>
+          <w:b/>
+          <w:bCs/>
+          <w:color w:val="auto"/>
+          <w:szCs w:val="20"/>
+          <w:lang w:val="pt-BR"/>
+        </w:rPr>
+      </w:pPr>
+      <w:r>
+        <w:rPr>
+          <w:rFonts w:asciiTheme="majorHAnsi" w:hAnsiTheme="majorHAnsi" w:cstheme="majorHAnsi"/>
+          <w:b/>
+          <w:bCs/>
+          <w:color w:val="auto"/>
+          <w:szCs w:val="20"/>
+          <w:lang w:val="pt-BR"/>
+        </w:rPr>
+        <w:t>Entrada:</w:t>
+      </w:r>
+      <w:r>
+        <w:rPr>
+          <w:rFonts w:asciiTheme="majorHAnsi" w:hAnsiTheme="majorHAnsi" w:cstheme="majorHAnsi"/>
+          <w:b/>
+          <w:bCs/>
+          <w:color w:val="EE0000"/>
+          <w:szCs w:val="20"/>
+          <w:lang w:val="pt-BR"/>
+        </w:rPr>
+        <w:t xml:space="preserve"> </w:t>
+      </w:r>
+      <w:r>
+        <w:rPr>
+          <w:rFonts w:asciiTheme="majorHAnsi" w:hAnsiTheme="majorHAnsi" w:cstheme="majorHAnsi"/>
+          <w:color w:val="auto"/>
+          <w:szCs w:val="20"/>
+          <w:lang w:val="pt-BR"/>
+        </w:rPr>
+        <w:t>{</w:t>
+      </w:r>
+      <w:r>
+        <w:rPr>
+          <w:rFonts w:asciiTheme="majorHAnsi" w:hAnsiTheme="majorHAnsi" w:cstheme="majorHAnsi"/>
+          <w:color w:val="auto"/>
+          <w:szCs w:val="20"/>
+          <w:lang w:val="pt-BR"/>
+        </w:rPr>
+        <w:t xml:space="preserve">Valor da Entrada </w:t>
+      </w:r>
+      <w:r>
+        <w:rPr>
+          <w:rFonts w:asciiTheme="majorHAnsi" w:hAnsiTheme="majorHAnsi" w:cstheme="majorHAnsi"/>
+          <w:color w:val="auto"/>
+          <w:szCs w:val="20"/>
+          <w:lang w:val="pt-BR"/>
+        </w:rPr>
+        <w:t>Financiamento</w:t>
+      </w:r>
+      <w:r>
+        <w:rPr>
+          <w:rFonts w:asciiTheme="majorHAnsi" w:hAnsiTheme="majorHAnsi" w:cstheme="majorHAnsi"/>
+          <w:color w:val="auto"/>
+          <w:szCs w:val="20"/>
+          <w:lang w:val="pt-BR"/>
+        </w:rPr>
+        <w:t>}</w:t>
+      </w:r>
+    </w:p>
+    <w:p>
+      <w:pPr>
+        <w:spacing w:after="0" w:line="240" w:lineRule="auto"/>
+        <w:rPr>
+          <w:rFonts w:asciiTheme="majorHAnsi" w:hAnsiTheme="majorHAnsi" w:cstheme="majorHAnsi"/>
+          <w:b/>
+          <w:bCs/>
+          <w:color w:val="auto"/>
+          <w:szCs w:val="20"/>
+          <w:lang w:val="pt-BR"/>
+        </w:rPr>
+      </w:pPr>
+      <w:r>
+        <w:rPr>
+          <w:rFonts w:asciiTheme="majorHAnsi" w:hAnsiTheme="majorHAnsi" w:cstheme="majorHAnsi"/>
+          <w:b/>
+          <w:bCs/>
+          <w:color w:val="auto"/>
+          <w:szCs w:val="20"/>
+          <w:lang w:val="pt-BR"/>
+        </w:rPr>
+        <w:t xml:space="preserve">Financeira: </w:t>
+      </w:r>
+      <w:r>
+        <w:rPr>
+          <w:rFonts w:asciiTheme="majorHAnsi" w:hAnsiTheme="majorHAnsi" w:cstheme="majorHAnsi"/>
+          <w:color w:val="auto"/>
+          <w:szCs w:val="20"/>
+          <w:lang w:val="pt-BR"/>
+        </w:rPr>
+        <w:t>{Financeira}</w:t>
+      </w:r>
+      <w:r>
+        <w:rPr>
+          <w:rFonts w:asciiTheme="majorHAnsi" w:hAnsiTheme="majorHAnsi" w:cstheme="majorHAnsi"/>
+          <w:color w:val="auto"/>
+          <w:szCs w:val="20"/>
+          <w:lang w:val="pt-BR"/>
+        </w:rPr>
+        <w:t xml:space="preserve">     </w:t>
+      </w:r>
+      <w:r>
+        <w:rPr>
+          <w:rFonts w:asciiTheme="majorHAnsi" w:hAnsiTheme="majorHAnsi" w:cstheme="majorHAnsi"/>
+          <w:color w:val="auto"/>
+          <w:szCs w:val="20"/>
+          <w:lang w:val="pt-BR"/>
+        </w:rPr>
+        <w:t xml:space="preserve">                     </w:t>
+      </w:r>
+      <w:r>
+        <w:rPr>
+          <w:rFonts w:asciiTheme="majorHAnsi" w:hAnsiTheme="majorHAnsi" w:cstheme="majorHAnsi"/>
+          <w:b/>
+          <w:bCs/>
+          <w:color w:val="auto"/>
+          <w:szCs w:val="20"/>
+          <w:lang w:val="pt-BR"/>
+        </w:rPr>
+        <w:t>Data do Financiamento:</w:t>
+      </w:r>
+      <w:r>
+        <w:rPr>
+          <w:rFonts w:asciiTheme="majorHAnsi" w:hAnsiTheme="majorHAnsi" w:cstheme="majorHAnsi"/>
+          <w:color w:val="auto"/>
+          <w:szCs w:val="20"/>
+          <w:lang w:val="pt-BR"/>
+        </w:rPr>
+        <w:t xml:space="preserve"> </w:t>
+      </w:r>
+      <w:r>
+        <w:rPr>
+          <w:rFonts w:asciiTheme="majorHAnsi" w:hAnsiTheme="majorHAnsi" w:cstheme="majorHAnsi"/>
+          <w:color w:val="auto"/>
+          <w:szCs w:val="20"/>
+          <w:lang w:val="pt-BR"/>
+        </w:rPr>
+        <w:t>{</w:t>
+      </w:r>
+      <w:r>
+        <w:rPr>
+          <w:rFonts w:asciiTheme="majorHAnsi" w:hAnsiTheme="majorHAnsi" w:cstheme="majorHAnsi"/>
+          <w:color w:val="auto"/>
+          <w:szCs w:val="20"/>
+          <w:lang w:val="pt-BR"/>
+        </w:rPr>
+        <w:t>Data do Finan</w:t>
+      </w:r>
+      <w:r>
+        <w:rPr>
+          <w:rFonts w:asciiTheme="majorHAnsi" w:hAnsiTheme="majorHAnsi" w:cstheme="majorHAnsi"/>
+          <w:color w:val="auto"/>
+          <w:szCs w:val="20"/>
+          <w:lang w:val="pt-BR"/>
+        </w:rPr>
+        <w:t>ciamento</w:t>
+      </w:r>
+      <w:r>
+        <w:rPr>
+          <w:rFonts w:asciiTheme="majorHAnsi" w:hAnsiTheme="majorHAnsi" w:cstheme="majorHAnsi"/>
+          <w:color w:val="auto"/>
+          <w:szCs w:val="20"/>
+          <w:lang w:val="pt-BR"/>
+        </w:rPr>
+        <w:t>}</w:t>
+      </w:r>
+    </w:p>
+    <w:p>
+      <w:pPr>
+        <w:spacing w:after="0" w:line="240" w:lineRule="auto"/>
+        <w:rPr>
+          <w:rFonts w:asciiTheme="majorHAnsi" w:hAnsiTheme="majorHAnsi" w:cstheme="majorHAnsi"/>
+          <w:b/>
+          <w:bCs/>
+          <w:color w:val="auto"/>
+          <w:szCs w:val="20"/>
+          <w:lang w:val="pt-BR"/>
+        </w:rPr>
+      </w:pPr>
+      <w:r>
+        <w:rPr>
+          <w:rFonts w:asciiTheme="majorHAnsi" w:hAnsiTheme="majorHAnsi" w:cstheme="majorHAnsi"/>
+          <w:b/>
+          <w:bCs/>
+          <w:color w:val="auto"/>
+          <w:szCs w:val="20"/>
+          <w:lang w:val="pt-BR"/>
+        </w:rPr>
+        <w:t>Valor Financiado:</w:t>
+      </w:r>
+      <w:r>
+        <w:rPr>
+          <w:rFonts w:asciiTheme="majorHAnsi" w:hAnsiTheme="majorHAnsi" w:cstheme="majorHAnsi"/>
+          <w:b/>
+          <w:bCs/>
+          <w:color w:val="auto"/>
+          <w:szCs w:val="20"/>
+          <w:lang w:val="pt-BR"/>
+        </w:rPr>
+        <w:t xml:space="preserve"> </w:t>
+      </w:r>
+      <w:r>
+        <w:rPr>
+          <w:rFonts w:asciiTheme="majorHAnsi" w:hAnsiTheme="majorHAnsi" w:cstheme="majorHAnsi"/>
+          <w:color w:val="auto"/>
+          <w:szCs w:val="20"/>
+          <w:lang w:val="pt-BR"/>
+        </w:rPr>
+        <w:t>{Valor Financiado}</w:t>
+      </w:r>
+      <w:r>
+        <w:rPr>
+          <w:rFonts w:asciiTheme="majorHAnsi" w:hAnsiTheme="majorHAnsi" w:cstheme="majorHAnsi"/>
+          <w:b/>
+          <w:bCs/>
+          <w:color w:val="auto"/>
+          <w:szCs w:val="20"/>
+          <w:lang w:val="pt-BR"/>
+        </w:rPr>
+        <w:t xml:space="preserve"> </w:t>
+      </w:r>
+      <w:r>
+        <w:rPr>
+          <w:rFonts w:asciiTheme="majorHAnsi" w:hAnsiTheme="majorHAnsi" w:cstheme="majorHAnsi"/>
+          <w:b/>
+          <w:bCs/>
+          <w:color w:val="auto"/>
+          <w:szCs w:val="20"/>
+          <w:lang w:val="pt-BR"/>
+        </w:rPr>
+        <w:t xml:space="preserve">  </w:t>
+      </w:r>
+      <w:r>
+        <w:rPr>
+          <w:rFonts w:asciiTheme="majorHAnsi" w:hAnsiTheme="majorHAnsi" w:cstheme="majorHAnsi"/>
+          <w:b/>
+          <w:bCs/>
+          <w:color w:val="auto"/>
+          <w:szCs w:val="20"/>
+          <w:lang w:val="pt-BR"/>
+        </w:rPr>
+        <w:t xml:space="preserve">Nº de Parcelas: </w:t>
+      </w:r>
+      <w:r>
+        <w:rPr>
+          <w:rFonts w:asciiTheme="majorHAnsi" w:hAnsiTheme="majorHAnsi" w:cstheme="majorHAnsi"/>
+          <w:color w:val="auto"/>
+          <w:szCs w:val="20"/>
+          <w:lang w:val="pt-BR"/>
+        </w:rPr>
+        <w:t>{N</w:t>
+      </w:r>
+      <w:r>
+        <w:rPr>
+          <w:rFonts w:asciiTheme="majorHAnsi" w:hAnsiTheme="majorHAnsi" w:cstheme="majorHAnsi"/>
+          <w:color w:val="auto"/>
+          <w:szCs w:val="20"/>
+          <w:lang w:val="pt-BR"/>
+        </w:rPr>
+        <w:t xml:space="preserve">° de Parcelas} </w:t>
+      </w:r>
+      <w:r>
+        <w:rPr>
+          <w:rFonts w:asciiTheme="majorHAnsi" w:hAnsiTheme="majorHAnsi" w:cstheme="majorHAnsi"/>
+          <w:b/>
+          <w:bCs/>
+          <w:color w:val="auto"/>
+          <w:szCs w:val="20"/>
+          <w:lang w:val="pt-BR"/>
+        </w:rPr>
+        <w:t xml:space="preserve">  Valor das Parcelas</w:t>
+      </w:r>
+      <w:r>
+        <w:rPr>
+          <w:rFonts w:asciiTheme="majorHAnsi" w:hAnsiTheme="majorHAnsi" w:cstheme="majorHAnsi"/>
+          <w:b/>
+          <w:bCs/>
+          <w:color w:val="auto"/>
+          <w:szCs w:val="20"/>
+          <w:lang w:val="pt-BR"/>
+        </w:rPr>
+        <w:t xml:space="preserve">: </w:t>
+      </w:r>
+      <w:r>
+        <w:rPr>
+          <w:rFonts w:asciiTheme="majorHAnsi" w:hAnsiTheme="majorHAnsi" w:cstheme="majorHAnsi"/>
+          <w:color w:val="auto"/>
+          <w:szCs w:val="20"/>
+          <w:lang w:val="pt-BR"/>
+        </w:rPr>
+        <w:t>{Valor das Parcelas</w:t>
+      </w:r>
+      <w:r>
+        <w:rPr>
+          <w:rFonts w:asciiTheme="majorHAnsi" w:hAnsiTheme="majorHAnsi" w:cstheme="majorHAnsi"/>
+          <w:color w:val="auto"/>
+          <w:szCs w:val="20"/>
+          <w:lang w:val="pt-BR"/>
+        </w:rPr>
+        <w:t>}</w:t>
+      </w:r>
+    </w:p>
+    <w:p>
+      <w:pPr>
+        <w:spacing w:after="0" w:line="240" w:lineRule="auto"/>
+        <w:rPr>
+          <w:rFonts w:asciiTheme="majorHAnsi" w:hAnsiTheme="majorHAnsi" w:cstheme="majorHAnsi"/>
+          <w:b/>
+          <w:bCs/>
+          <w:color w:val="auto"/>
+          <w:szCs w:val="20"/>
+          <w:lang w:val="pt-BR"/>
+        </w:rPr>
+      </w:pPr>
+    </w:p>
+    <w:p>
+      <w:pPr>
+        <w:spacing w:after="0" w:line="240" w:lineRule="auto"/>
+        <w:rPr>
+          <w:rFonts w:asciiTheme="majorHAnsi" w:hAnsiTheme="majorHAnsi" w:cstheme="majorHAnsi"/>
+          <w:b/>
+          <w:bCs/>
+          <w:color w:val="auto"/>
+          <w:szCs w:val="20"/>
+          <w:lang w:val="pt-BR"/>
+        </w:rPr>
+      </w:pPr>
+      <w:r>
+        <w:rPr>
+          <w:rFonts w:asciiTheme="majorHAnsi" w:hAnsiTheme="majorHAnsi" w:cstheme="majorHAnsi"/>
+          <w:b/>
+          <w:bCs/>
+          <w:color w:val="auto"/>
+          <w:szCs w:val="20"/>
+          <w:lang w:val="pt-BR"/>
+        </w:rPr>
+        <w:t xml:space="preserve">Veiculo na Troca: </w:t>
+      </w:r>
+      <w:r>
+        <w:rPr>
+          <w:rFonts w:asciiTheme="majorHAnsi" w:hAnsiTheme="majorHAnsi" w:cstheme="majorHAnsi"/>
+          <w:b/>
+          <w:bCs/>
+          <w:color w:val="auto"/>
+          <w:szCs w:val="20"/>
+          <w:lang w:val="pt-BR"/>
+        </w:rPr>
+        <w:t>{Veículo na Troca</w:t>
+      </w:r>
+      <w:r>
+        <w:rPr>
+          <w:rFonts w:asciiTheme="majorHAnsi" w:hAnsiTheme="majorHAnsi" w:cstheme="majorHAnsi"/>
+          <w:b/>
+          <w:bCs/>
+          <w:color w:val="auto"/>
+          <w:szCs w:val="20"/>
+          <w:lang w:val="pt-BR"/>
+        </w:rPr>
+        <w:t>}</w:t>
+      </w:r>
+    </w:p>
+    <w:p>
+      <w:pPr>
+        <w:spacing w:after="0" w:line="240" w:lineRule="auto"/>
+        <w:rPr>
+          <w:rFonts w:asciiTheme="majorHAnsi" w:hAnsiTheme="majorHAnsi" w:cstheme="majorHAnsi"/>
+          <w:lang w:val="pt-BR"/>
+        </w:rPr>
+      </w:pPr>
+      <w:r>
+        <w:rPr>
+          <w:rFonts w:asciiTheme="majorHAnsi" w:hAnsiTheme="majorHAnsi" w:cstheme="majorHAnsi"/>
+          <w:b/>
+          <w:bCs/>
+          <w:lang w:val="pt-BR"/>
+        </w:rPr>
+        <w:t>Marca:</w:t>
+      </w:r>
+      <w:r>
+        <w:rPr>
+          <w:rFonts w:asciiTheme="majorHAnsi" w:hAnsiTheme="majorHAnsi" w:cstheme="majorHAnsi"/>
+          <w:lang w:val="pt-BR"/>
+        </w:rPr>
+        <w:t xml:space="preserve"> </w:t>
+      </w:r>
+      <w:r>
+        <w:rPr>
+          <w:rFonts w:asciiTheme="majorHAnsi" w:hAnsiTheme="majorHAnsi" w:cstheme="majorHAnsi"/>
+          <w:lang w:val="pt-BR"/>
+        </w:rPr>
+        <w:t>{Marca</w:t>
+      </w:r>
+      <w:r>
+        <w:rPr>
+          <w:rFonts w:asciiTheme="majorHAnsi" w:hAnsiTheme="majorHAnsi" w:cstheme="majorHAnsi"/>
+          <w:lang w:val="pt-BR"/>
+        </w:rPr>
+        <w:t xml:space="preserve"> Troca</w:t>
+      </w:r>
+      <w:r>
+        <w:rPr>
+          <w:rFonts w:asciiTheme="majorHAnsi" w:hAnsiTheme="majorHAnsi" w:cstheme="majorHAnsi"/>
+          <w:lang w:val="pt-BR"/>
+        </w:rPr>
+        <w:t>}</w:t>
+      </w:r>
+    </w:p>
+    <w:p>
+      <w:pPr>
+        <w:spacing w:after="0" w:line="240" w:lineRule="auto"/>
+        <w:rPr>
+          <w:rFonts w:asciiTheme="majorHAnsi" w:hAnsiTheme="majorHAnsi" w:cstheme="majorHAnsi"/>
+          <w:lang w:val="pt-BR"/>
+        </w:rPr>
+      </w:pPr>
+      <w:r>
+        <w:rPr>
+          <w:rFonts w:asciiTheme="majorHAnsi" w:hAnsiTheme="majorHAnsi" w:cstheme="majorHAnsi"/>
+          <w:b/>
+          <w:bCs/>
+          <w:lang w:val="pt-BR"/>
+        </w:rPr>
+        <w:t>Modelo:</w:t>
+      </w:r>
+      <w:r>
+        <w:rPr>
+          <w:rFonts w:asciiTheme="majorHAnsi" w:hAnsiTheme="majorHAnsi" w:cstheme="majorHAnsi"/>
+          <w:lang w:val="pt-BR"/>
+        </w:rPr>
+        <w:t xml:space="preserve"> </w:t>
+      </w:r>
+      <w:r>
+        <w:rPr>
+          <w:rFonts w:asciiTheme="majorHAnsi" w:hAnsiTheme="majorHAnsi" w:cstheme="majorHAnsi"/>
+          <w:lang w:val="pt-BR"/>
+        </w:rPr>
+        <w:t>{Modelo</w:t>
+      </w:r>
+      <w:r>
+        <w:rPr>
+          <w:rFonts w:asciiTheme="majorHAnsi" w:hAnsiTheme="majorHAnsi" w:cstheme="majorHAnsi"/>
+          <w:lang w:val="pt-BR"/>
+        </w:rPr>
+        <w:t xml:space="preserve"> </w:t>
+      </w:r>
+      <w:r>
+        <w:rPr>
+          <w:rFonts w:asciiTheme="majorHAnsi" w:hAnsiTheme="majorHAnsi" w:cstheme="majorHAnsi"/>
+          <w:lang w:val="pt-BR"/>
+        </w:rPr>
+        <w:t>Troca</w:t>
+      </w:r>
+      <w:r>
+        <w:rPr>
+          <w:rFonts w:asciiTheme="majorHAnsi" w:hAnsiTheme="majorHAnsi" w:cstheme="majorHAnsi"/>
+          <w:lang w:val="pt-BR"/>
+        </w:rPr>
+        <w:t xml:space="preserve">}             </w:t>
+      </w:r>
+      <w:r>
+        <w:rPr>
+          <w:rFonts w:asciiTheme="majorHAnsi" w:hAnsiTheme="majorHAnsi" w:cstheme="majorHAnsi"/>
+          <w:b/>
+          <w:bCs/>
+          <w:lang w:val="pt-BR"/>
+        </w:rPr>
+        <w:t>Versão</w:t>
+      </w:r>
+      <w:r>
+        <w:rPr>
+          <w:rFonts w:asciiTheme="majorHAnsi" w:hAnsiTheme="majorHAnsi" w:cstheme="majorHAnsi"/>
+          <w:lang w:val="pt-BR"/>
+        </w:rPr>
+        <w:t xml:space="preserve">: </w:t>
+      </w:r>
+      <w:r>
+        <w:rPr>
+          <w:rFonts w:asciiTheme="majorHAnsi" w:hAnsiTheme="majorHAnsi" w:cstheme="majorHAnsi"/>
+          <w:lang w:val="pt-BR"/>
+        </w:rPr>
+        <w:t>{</w:t>
+      </w:r>
+      <w:r>
+        <w:rPr>
+          <w:rFonts w:asciiTheme="majorHAnsi" w:hAnsiTheme="majorHAnsi" w:cstheme="majorHAnsi"/>
+          <w:lang w:val="pt-BR"/>
+        </w:rPr>
+        <w:t>Versão</w:t>
+      </w:r>
+      <w:r>
+        <w:rPr>
+          <w:rFonts w:asciiTheme="majorHAnsi" w:hAnsiTheme="majorHAnsi" w:cstheme="majorHAnsi"/>
+          <w:lang w:val="pt-BR"/>
+        </w:rPr>
+        <w:t xml:space="preserve"> </w:t>
+      </w:r>
+      <w:r>
+        <w:rPr>
+          <w:rFonts w:asciiTheme="majorHAnsi" w:hAnsiTheme="majorHAnsi" w:cstheme="majorHAnsi"/>
+          <w:lang w:val="pt-BR"/>
+        </w:rPr>
+        <w:t>Troca</w:t>
+      </w:r>
+      <w:r>
+        <w:rPr>
+          <w:rFonts w:asciiTheme="majorHAnsi" w:hAnsiTheme="majorHAnsi" w:cstheme="majorHAnsi"/>
+          <w:lang w:val="pt-BR"/>
+        </w:rPr>
+        <w:t>}</w:t>
+      </w:r>
+    </w:p>
+    <w:p>
+      <w:pPr>
+        <w:spacing w:after="0" w:line="240" w:lineRule="auto"/>
+        <w:rPr>
+          <w:rFonts w:asciiTheme="majorHAnsi" w:hAnsiTheme="majorHAnsi" w:cstheme="majorHAnsi"/>
+          <w:lang w:val="pt-BR"/>
+        </w:rPr>
+      </w:pPr>
+      <w:r>
+        <w:rPr>
+          <w:rFonts w:asciiTheme="majorHAnsi" w:hAnsiTheme="majorHAnsi" w:cstheme="majorHAnsi"/>
+          <w:b/>
+          <w:bCs/>
+          <w:lang w:val="pt-BR"/>
+        </w:rPr>
+        <w:t>Ano</w:t>
+      </w:r>
+      <w:r>
+        <w:rPr>
+          <w:rFonts w:asciiTheme="majorHAnsi" w:hAnsiTheme="majorHAnsi" w:cstheme="majorHAnsi"/>
+          <w:b/>
+          <w:bCs/>
+          <w:lang w:val="pt-BR"/>
+        </w:rPr>
+        <w:t xml:space="preserve"> Fabricação</w:t>
+      </w:r>
+      <w:r>
+        <w:rPr>
+          <w:rFonts w:asciiTheme="majorHAnsi" w:hAnsiTheme="majorHAnsi" w:cstheme="majorHAnsi"/>
+          <w:b/>
+          <w:bCs/>
+          <w:lang w:val="pt-BR"/>
+        </w:rPr>
+        <w:t>:</w:t>
+      </w:r>
+      <w:r>
+        <w:rPr>
+          <w:rFonts w:asciiTheme="majorHAnsi" w:hAnsiTheme="majorHAnsi" w:cstheme="majorHAnsi"/>
+          <w:lang w:val="pt-BR"/>
+        </w:rPr>
+        <w:t xml:space="preserve"> </w:t>
+      </w:r>
+      <w:r>
+        <w:rPr>
+          <w:rFonts w:asciiTheme="majorHAnsi" w:hAnsiTheme="majorHAnsi" w:cstheme="majorHAnsi"/>
+          <w:lang w:val="pt-BR"/>
+        </w:rPr>
+        <w:t>{Ano</w:t>
+      </w:r>
+      <w:r>
+        <w:rPr>
+          <w:rFonts w:asciiTheme="majorHAnsi" w:hAnsiTheme="majorHAnsi" w:cstheme="majorHAnsi"/>
+          <w:lang w:val="pt-BR"/>
+        </w:rPr>
+        <w:t xml:space="preserve"> </w:t>
+      </w:r>
+      <w:r>
+        <w:rPr>
+          <w:rFonts w:asciiTheme="majorHAnsi" w:hAnsiTheme="majorHAnsi" w:cstheme="majorHAnsi"/>
+          <w:lang w:val="pt-BR"/>
+        </w:rPr>
+        <w:t>Troca</w:t>
+      </w:r>
+      <w:r>
+        <w:rPr>
+          <w:rFonts w:asciiTheme="majorHAnsi" w:hAnsiTheme="majorHAnsi" w:cstheme="majorHAnsi"/>
+          <w:lang w:val="pt-BR"/>
+        </w:rPr>
+        <w:t xml:space="preserve">}      </w:t>
+      </w:r>
+      <w:r>
+        <w:rPr>
+          <w:rFonts w:asciiTheme="majorHAnsi" w:hAnsiTheme="majorHAnsi" w:cstheme="majorHAnsi"/>
+          <w:b/>
+          <w:bCs/>
+          <w:lang w:val="pt-BR"/>
+        </w:rPr>
+        <w:t>Cor:</w:t>
+      </w:r>
+      <w:r>
+        <w:rPr>
+          <w:rFonts w:asciiTheme="majorHAnsi" w:hAnsiTheme="majorHAnsi" w:cstheme="majorHAnsi"/>
+          <w:b/>
+          <w:bCs/>
+          <w:lang w:val="pt-BR"/>
+        </w:rPr>
+        <w:t xml:space="preserve"> </w:t>
+      </w:r>
+      <w:r>
+        <w:rPr>
+          <w:rFonts w:asciiTheme="majorHAnsi" w:hAnsiTheme="majorHAnsi" w:cstheme="majorHAnsi"/>
+          <w:lang w:val="pt-BR"/>
+        </w:rPr>
+        <w:t>{Cor</w:t>
+      </w:r>
+      <w:r>
+        <w:rPr>
+          <w:rFonts w:asciiTheme="majorHAnsi" w:hAnsiTheme="majorHAnsi" w:cstheme="majorHAnsi"/>
+          <w:lang w:val="pt-BR"/>
+        </w:rPr>
+        <w:t xml:space="preserve"> Troca</w:t>
+      </w:r>
+      <w:r>
+        <w:rPr>
+          <w:rFonts w:asciiTheme="majorHAnsi" w:hAnsiTheme="majorHAnsi" w:cstheme="majorHAnsi"/>
+          <w:lang w:val="pt-BR"/>
+        </w:rPr>
+        <w:t>}</w:t>
+      </w:r>
+    </w:p>
+    <w:p>
+      <w:pPr>
+        <w:spacing w:after="0" w:line="240" w:lineRule="auto"/>
+        <w:rPr>
+          <w:rFonts w:asciiTheme="majorHAnsi" w:hAnsiTheme="majorHAnsi" w:cstheme="majorHAnsi"/>
+          <w:lang w:val="pt-BR"/>
+        </w:rPr>
+      </w:pPr>
+      <w:r>
+        <w:rPr>
+          <w:rFonts w:asciiTheme="majorHAnsi" w:hAnsiTheme="majorHAnsi" w:cstheme="majorHAnsi"/>
+          <w:b/>
+          <w:bCs/>
+          <w:lang w:val="pt-BR"/>
+        </w:rPr>
+        <w:t>Placa:</w:t>
+      </w:r>
+      <w:r>
+        <w:rPr>
+          <w:rFonts w:asciiTheme="majorHAnsi" w:hAnsiTheme="majorHAnsi" w:cstheme="majorHAnsi"/>
+          <w:lang w:val="pt-BR"/>
+        </w:rPr>
+        <w:t xml:space="preserve"> </w:t>
+      </w:r>
+      <w:r>
+        <w:rPr>
+          <w:rFonts w:asciiTheme="majorHAnsi" w:hAnsiTheme="majorHAnsi" w:cstheme="majorHAnsi"/>
+          <w:lang w:val="pt-BR"/>
+        </w:rPr>
+        <w:t>{Placa</w:t>
+      </w:r>
+      <w:r>
+        <w:rPr>
+          <w:rFonts w:asciiTheme="majorHAnsi" w:hAnsiTheme="majorHAnsi" w:cstheme="majorHAnsi"/>
+          <w:lang w:val="pt-BR"/>
+        </w:rPr>
+        <w:t xml:space="preserve"> </w:t>
+      </w:r>
+      <w:r>
+        <w:rPr>
+          <w:rFonts w:asciiTheme="majorHAnsi" w:hAnsiTheme="majorHAnsi" w:cstheme="majorHAnsi"/>
+          <w:lang w:val="pt-BR"/>
+        </w:rPr>
+        <w:t>Troca</w:t>
+      </w:r>
+      <w:r>
+        <w:rPr>
+          <w:rFonts w:asciiTheme="majorHAnsi" w:hAnsiTheme="majorHAnsi" w:cstheme="majorHAnsi"/>
+          <w:lang w:val="pt-BR"/>
+        </w:rPr>
+        <w:t xml:space="preserve">}     </w:t>
+      </w:r>
+      <w:r>
+        <w:rPr>
+          <w:rFonts w:asciiTheme="majorHAnsi" w:hAnsiTheme="majorHAnsi" w:cstheme="majorHAnsi"/>
+          <w:lang w:val="pt-BR"/>
+        </w:rPr>
+        <w:t xml:space="preserve"> </w:t>
+      </w:r>
+      <w:r>
+        <w:rPr>
+          <w:rFonts w:asciiTheme="majorHAnsi" w:hAnsiTheme="majorHAnsi" w:cstheme="majorHAnsi"/>
+          <w:lang w:val="pt-BR"/>
+        </w:rPr>
+        <w:t xml:space="preserve">                </w:t>
+      </w:r>
+      <w:r>
+        <w:rPr>
+          <w:rFonts w:asciiTheme="majorHAnsi" w:hAnsiTheme="majorHAnsi" w:cstheme="majorHAnsi"/>
+          <w:b/>
+          <w:bCs/>
+          <w:lang w:val="pt-BR"/>
+        </w:rPr>
+        <w:t>Renavan:</w:t>
+      </w:r>
+      <w:r>
+        <w:rPr>
+          <w:rFonts w:asciiTheme="majorHAnsi" w:hAnsiTheme="majorHAnsi" w:cstheme="majorHAnsi"/>
+          <w:lang w:val="pt-BR"/>
+        </w:rPr>
+        <w:t xml:space="preserve"> </w:t>
+      </w:r>
+      <w:r>
+        <w:rPr>
+          <w:rFonts w:asciiTheme="majorHAnsi" w:hAnsiTheme="majorHAnsi" w:cstheme="majorHAnsi"/>
+          <w:lang w:val="pt-BR"/>
+        </w:rPr>
+        <w:t>{Renavam</w:t>
+      </w:r>
+      <w:r>
+        <w:rPr>
+          <w:rFonts w:asciiTheme="majorHAnsi" w:hAnsiTheme="majorHAnsi" w:cstheme="majorHAnsi"/>
+          <w:lang w:val="pt-BR"/>
+        </w:rPr>
+        <w:t xml:space="preserve"> </w:t>
+      </w:r>
+      <w:r>
+        <w:rPr>
+          <w:rFonts w:asciiTheme="majorHAnsi" w:hAnsiTheme="majorHAnsi" w:cstheme="majorHAnsi"/>
+          <w:lang w:val="pt-BR"/>
+        </w:rPr>
+        <w:t>Troca</w:t>
+      </w:r>
+      <w:r>
+        <w:rPr>
+          <w:rFonts w:asciiTheme="majorHAnsi" w:hAnsiTheme="majorHAnsi" w:cstheme="majorHAnsi"/>
+          <w:lang w:val="pt-BR"/>
+        </w:rPr>
+        <w:t>}</w:t>
+      </w:r>
+      <w:r>
+        <w:rPr>
+          <w:rFonts w:asciiTheme="majorHAnsi" w:hAnsiTheme="majorHAnsi" w:cstheme="majorHAnsi"/>
+          <w:lang w:val="pt-BR"/>
+        </w:rPr>
+        <w:t xml:space="preserve"> </w:t>
+      </w:r>
+    </w:p>
+    <w:p>
+      <w:pPr>
+        <w:spacing w:after="0" w:line="240" w:lineRule="auto"/>
+        <w:rPr>
+          <w:rFonts w:asciiTheme="majorHAnsi" w:hAnsiTheme="majorHAnsi" w:cstheme="majorHAnsi"/>
+          <w:lang w:val="pt-BR"/>
+        </w:rPr>
+      </w:pPr>
+      <w:r>
+        <w:rPr>
+          <w:rFonts w:asciiTheme="majorHAnsi" w:hAnsiTheme="majorHAnsi" w:cstheme="majorHAnsi"/>
+          <w:b/>
+          <w:bCs/>
+          <w:lang w:val="pt-BR"/>
+        </w:rPr>
+        <w:t xml:space="preserve">Combustível: </w:t>
+      </w:r>
+      <w:r>
+        <w:rPr>
+          <w:rFonts w:asciiTheme="majorHAnsi" w:hAnsiTheme="majorHAnsi" w:cstheme="majorHAnsi"/>
+          <w:lang w:val="pt-BR"/>
+        </w:rPr>
+        <w:t>{Combustível</w:t>
+      </w:r>
+      <w:r>
+        <w:rPr>
+          <w:rFonts w:asciiTheme="majorHAnsi" w:hAnsiTheme="majorHAnsi" w:cstheme="majorHAnsi"/>
+          <w:lang w:val="pt-BR"/>
+        </w:rPr>
+        <w:t xml:space="preserve"> </w:t>
+      </w:r>
+      <w:r>
+        <w:rPr>
+          <w:rFonts w:asciiTheme="majorHAnsi" w:hAnsiTheme="majorHAnsi" w:cstheme="majorHAnsi"/>
+          <w:lang w:val="pt-BR"/>
+        </w:rPr>
+        <w:t>Troca</w:t>
+      </w:r>
+      <w:r>
+        <w:rPr>
+          <w:rFonts w:asciiTheme="majorHAnsi" w:hAnsiTheme="majorHAnsi" w:cstheme="majorHAnsi"/>
+          <w:lang w:val="pt-BR"/>
+        </w:rPr>
+        <w:t>}</w:t>
+      </w:r>
+      <w:r>
+        <w:rPr>
+          <w:rFonts w:asciiTheme="majorHAnsi" w:hAnsiTheme="majorHAnsi" w:cstheme="majorHAnsi"/>
+          <w:b/>
+          <w:bCs/>
+          <w:lang w:val="pt-BR"/>
+        </w:rPr>
+        <w:t xml:space="preserve">                                                     </w:t>
+      </w:r>
+      <w:r>
+        <w:rPr>
+          <w:rFonts w:asciiTheme="majorHAnsi" w:hAnsiTheme="majorHAnsi" w:cstheme="majorHAnsi"/>
+          <w:b/>
+          <w:bCs/>
+          <w:lang w:val="pt-BR"/>
+        </w:rPr>
+        <w:t>Km Atual:</w:t>
+      </w:r>
+      <w:r>
+        <w:rPr>
+          <w:rFonts w:asciiTheme="majorHAnsi" w:hAnsiTheme="majorHAnsi" w:cstheme="majorHAnsi"/>
+          <w:lang w:val="pt-BR"/>
+        </w:rPr>
+        <w:t xml:space="preserve"> {KM</w:t>
+      </w:r>
+      <w:r>
+        <w:rPr>
+          <w:rFonts w:asciiTheme="majorHAnsi" w:hAnsiTheme="majorHAnsi" w:cstheme="majorHAnsi"/>
+          <w:lang w:val="pt-BR"/>
+        </w:rPr>
+        <w:t xml:space="preserve"> Troca</w:t>
+      </w:r>
+      <w:r>
+        <w:rPr>
+          <w:rFonts w:asciiTheme="majorHAnsi" w:hAnsiTheme="majorHAnsi" w:cstheme="majorHAnsi"/>
+          <w:lang w:val="pt-BR"/>
+        </w:rPr>
+        <w:t>}</w:t>
+      </w:r>
+    </w:p>
+    <w:p>
+      <w:pPr>
+        <w:spacing w:after="0" w:line="240" w:lineRule="auto"/>
+        <w:rPr>
+          <w:rFonts w:asciiTheme="majorHAnsi" w:hAnsiTheme="majorHAnsi" w:cstheme="majorHAnsi"/>
+          <w:lang w:val="pt-BR"/>
+        </w:rPr>
+      </w:pPr>
+      <w:r>
+        <w:rPr>
+          <w:rFonts w:asciiTheme="majorHAnsi" w:hAnsiTheme="majorHAnsi" w:cstheme="majorHAnsi"/>
+          <w:b/>
+          <w:bCs/>
+          <w:lang w:val="pt-BR"/>
+        </w:rPr>
+        <w:t xml:space="preserve">Valor da </w:t>
+      </w:r>
+      <w:r>
+        <w:rPr>
+          <w:rFonts w:asciiTheme="majorHAnsi" w:hAnsiTheme="majorHAnsi" w:cstheme="majorHAnsi"/>
+          <w:b/>
+          <w:bCs/>
+          <w:lang w:val="pt-BR"/>
+        </w:rPr>
+        <w:t>Compra:</w:t>
+      </w:r>
+      <w:r>
+        <w:rPr>
+          <w:rFonts w:asciiTheme="majorHAnsi" w:hAnsiTheme="majorHAnsi" w:cstheme="majorHAnsi"/>
+          <w:lang w:val="pt-BR"/>
+        </w:rPr>
+        <w:t xml:space="preserve"> {Valor da </w:t>
+      </w:r>
+      <w:r>
+        <w:rPr>
+          <w:rFonts w:asciiTheme="majorHAnsi" w:hAnsiTheme="majorHAnsi" w:cstheme="majorHAnsi"/>
+          <w:lang w:val="pt-BR"/>
+        </w:rPr>
+        <w:t>Compra</w:t>
+      </w:r>
+      <w:r>
+        <w:rPr>
+          <w:rFonts w:asciiTheme="majorHAnsi" w:hAnsiTheme="majorHAnsi" w:cstheme="majorHAnsi"/>
+          <w:lang w:val="pt-BR"/>
+        </w:rPr>
+        <w:t>}</w:t>
+      </w:r>
+    </w:p>
+    <w:p>
+      <w:pPr>
+        <w:spacing w:after="0" w:line="240" w:lineRule="auto"/>
+        <w:rPr>
+          <w:rFonts w:asciiTheme="majorHAnsi" w:hAnsiTheme="majorHAnsi" w:cstheme="majorHAnsi"/>
+          <w:lang w:val="pt-BR"/>
+        </w:rPr>
+      </w:pPr>
+      <w:r>
+        <w:rPr>
+          <w:rFonts w:asciiTheme="majorHAnsi" w:hAnsiTheme="majorHAnsi" w:cstheme="majorHAnsi"/>
+          <w:b/>
+          <w:bCs/>
+          <w:lang w:val="pt-BR"/>
+        </w:rPr>
+        <w:t>Débitos:</w:t>
+      </w:r>
+      <w:r>
+        <w:rPr>
+          <w:rFonts w:asciiTheme="majorHAnsi" w:hAnsiTheme="majorHAnsi" w:cstheme="majorHAnsi"/>
+          <w:lang w:val="pt-BR"/>
+        </w:rPr>
+        <w:t xml:space="preserve"> {Débitos}</w:t>
+      </w:r>
+    </w:p>
+    <w:p>
+      <w:pPr>
+        <w:spacing w:after="0" w:line="240" w:lineRule="auto"/>
+        <w:rPr>
+          <w:rFonts w:asciiTheme="majorHAnsi" w:hAnsiTheme="majorHAnsi" w:cstheme="majorHAnsi"/>
+          <w:lang w:val="pt-BR"/>
+        </w:rPr>
+      </w:pPr>
+      <w:r>
+        <w:rPr>
+          <w:rFonts w:asciiTheme="majorHAnsi" w:hAnsiTheme="majorHAnsi" w:cstheme="majorHAnsi"/>
+          <w:b/>
+          <w:bCs/>
+          <w:lang w:val="pt-BR"/>
+        </w:rPr>
+        <w:t>Detalhe dos débitos:</w:t>
+      </w:r>
+      <w:r>
+        <w:rPr>
+          <w:rFonts w:asciiTheme="majorHAnsi" w:hAnsiTheme="majorHAnsi" w:cstheme="majorHAnsi"/>
+          <w:lang w:val="pt-BR"/>
+        </w:rPr>
+        <w:t xml:space="preserve"> {Observação </w:t>
+      </w:r>
+      <w:r>
+        <w:rPr>
+          <w:rFonts w:asciiTheme="majorHAnsi" w:hAnsiTheme="majorHAnsi" w:cstheme="majorHAnsi"/>
+          <w:lang w:val="pt-BR"/>
+        </w:rPr>
+        <w:t>sobre Débitos}</w:t>
+      </w:r>
+    </w:p>
+    <w:p>
+      <w:pPr>
+        <w:spacing w:after="0" w:line="240" w:lineRule="auto"/>
+        <w:rPr>
+          <w:rFonts w:asciiTheme="majorHAnsi" w:hAnsiTheme="majorHAnsi" w:cstheme="majorHAnsi"/>
+          <w:lang w:val="pt-BR"/>
+        </w:rPr>
+      </w:pPr>
+      <w:r>
+        <w:rPr>
+          <w:rFonts w:asciiTheme="majorHAnsi" w:hAnsiTheme="majorHAnsi" w:cstheme="majorHAnsi"/>
+          <w:b/>
+          <w:bCs/>
+          <w:lang w:val="pt-BR"/>
+        </w:rPr>
+        <w:t>Valor de Entrada (Valor da Compra – Débitos):</w:t>
+      </w:r>
+      <w:r>
+        <w:rPr>
+          <w:rFonts w:asciiTheme="majorHAnsi" w:hAnsiTheme="majorHAnsi" w:cstheme="majorHAnsi"/>
+          <w:lang w:val="pt-BR"/>
+        </w:rPr>
+        <w:t xml:space="preserve"> {Valor da Entrada</w:t>
+      </w:r>
+      <w:r>
+        <w:rPr>
+          <w:rFonts w:asciiTheme="majorHAnsi" w:hAnsiTheme="majorHAnsi" w:cstheme="majorHAnsi"/>
+          <w:lang w:val="pt-BR"/>
+        </w:rPr>
+        <w:t xml:space="preserve"> Veículo Troca</w:t>
+      </w:r>
+      <w:r>
+        <w:rPr>
+          <w:rFonts w:asciiTheme="majorHAnsi" w:hAnsiTheme="majorHAnsi" w:cstheme="majorHAnsi"/>
+          <w:lang w:val="pt-BR"/>
+        </w:rPr>
+        <w:t>}</w:t>
+      </w:r>
+    </w:p>
+    <w:p>
+      <w:pPr>
+        <w:spacing w:after="0" w:line="240" w:lineRule="auto"/>
+        <w:rPr>
+          <w:rFonts w:asciiTheme="majorHAnsi" w:hAnsiTheme="majorHAnsi" w:cstheme="majorHAnsi"/>
+          <w:lang w:val="pt-BR"/>
+        </w:rPr>
+      </w:pPr>
+    </w:p>
+    <w:p>
+      <w:pPr>
+        <w:spacing w:after="0" w:line="240" w:lineRule="auto"/>
+        <w:rPr>
+          <w:rFonts w:asciiTheme="majorHAnsi" w:hAnsiTheme="majorHAnsi" w:cstheme="majorHAnsi"/>
+          <w:lang w:val="pt-BR"/>
+        </w:rPr>
+      </w:pPr>
+    </w:p>
+    <w:p>
+      <w:pPr>
+        <w:spacing w:after="0" w:line="240" w:lineRule="auto"/>
+        <w:rPr>
+          <w:rFonts w:asciiTheme="majorHAnsi" w:hAnsiTheme="majorHAnsi" w:cstheme="majorHAnsi"/>
+          <w:lang w:val="pt-BR"/>
+        </w:rPr>
+      </w:pPr>
+      <w:r>
+        <w:rPr>
+          <w:noProof/>
+          <w:color w:val="555555"/>
+          <w:sz w:val="18"/>
+          <w:szCs w:val="18"/>
+          <w:lang w:val="pt-BR"/>
+        </w:rPr>
+        <mc:AlternateContent>
+          <mc:Choice Requires="wps">
+            <w:drawing>
+              <wp:anchor distT="0" distB="0" distL="114300" distR="114300" simplePos="0" relativeHeight="251674624" behindDoc="0" locked="0" layoutInCell="1" allowOverlap="1" wp14:anchorId="145F6907" wp14:editId="28043652">
+                <wp:simplePos x="0" y="0"/>
+                <wp:positionH relativeFrom="column">
+                  <wp:posOffset>73152</wp:posOffset>
+                </wp:positionH>
+                <wp:positionV relativeFrom="paragraph">
+                  <wp:posOffset>50317</wp:posOffset>
+                </wp:positionV>
+                <wp:extent cx="1250899" cy="248285"/>
+                <wp:effectExtent l="0" t="0" r="6985" b="0"/>
+                <wp:wrapNone/>
+                <wp:docPr id="903896546" name="Caixa de Texto 3"/>
+                <wp:cNvGraphicFramePr/>
+                <a:graphic xmlns:a="http://schemas.openxmlformats.org/drawingml/2006/main">
+                  <a:graphicData uri="http://schemas.microsoft.com/office/word/2010/wordprocessingShape">
+                    <wps:wsp>
+                      <wps:cNvSpPr txBox="1"/>
+                      <wps:spPr>
+                        <a:xfrm>
+                          <a:off x="0" y="0"/>
+                          <a:ext cx="1250899" cy="248285"/>
+                        </a:xfrm>
+                        <a:prstGeom prst="rect">
+                          <a:avLst/>
+                        </a:prstGeom>
+                        <a:solidFill>
+                          <a:schemeClr val="lt1"/>
+                        </a:solidFill>
+                        <a:ln w="6350">
+                          <a:noFill/>
+                        </a:ln>
+                      </wps:spPr>
+                      <wps:txbx>
+                        <w:txbxContent>
+                          <w:p>
+                            <w:pPr>
+                              <w:rPr>
+                                <w:b/>
+                                <w:bCs/>
+                                <w:color w:val="808080" w:themeColor="background1" w:themeShade="80"/>
+                                <w:lang w:val="pt-BR"/>
+                              </w:rPr>
+                            </w:pPr>
+                            <w:r>
+                              <w:rPr>
+                                <w:b/>
+                                <w:bCs/>
+                                <w:color w:val="808080" w:themeColor="background1" w:themeShade="80"/>
+                                <w:lang w:val="pt-BR"/>
+                              </w:rPr>
+                              <w:t>Documentação</w:t>
+                            </w:r>
+                          </w:p>
+                        </w:txbxContent>
+                      </wps:txbx>
+                      <wps:bodyPr rot="0" spcFirstLastPara="0" vertOverflow="overflow" horzOverflow="overflow" vert="horz" wrap="square" lIns="91440" tIns="45720" rIns="91440" bIns="45720" numCol="1" spcCol="0" rtlCol="0" fromWordArt="0" anchor="t" anchorCtr="0" forceAA="0" compatLnSpc="1">
+                        <a:prstTxWarp prst="textNoShape">
+                          <a:avLst/>
+                        </a:prstTxWarp>
+                        <a:noAutofit/>
+                      </wps:bodyPr>
+                    </wps:wsp>
+                  </a:graphicData>
+                </a:graphic>
+                <wp14:sizeRelH relativeFrom="margin">
+                  <wp14:pctWidth>0</wp14:pctWidth>
+                </wp14:sizeRelH>
+                <wp14:sizeRelV relativeFrom="margin">
+                  <wp14:pctHeight>0</wp14:pctHeight>
+                </wp14:sizeRelV>
+              </wp:anchor>
+            </w:drawing>
+          </mc:Choice>
+          <mc:Fallback>
+            <w:pict>
+              <v:shape w14:anchorId="145F6907" id="_x0000_s1030" type="#_x0000_t202" style="position:absolute;margin-left:5.75pt;margin-top:3.95pt;width:98.5pt;height:19.55pt;z-index:251674624;visibility:visible;mso-wrap-style:square;mso-width-percent:0;mso-height-percent:0;mso-wrap-distance-left:9pt;mso-wrap-distance-top:0;mso-wrap-distance-right:9pt;mso-wrap-distance-bottom:0;mso-position-horizontal:absolute;mso-position-horizontal-relative:text;mso-position-vertical:absolute;mso-position-vertical-relative:text;mso-width-percent:0;mso-height-percent:0;mso-width-relative:margin;mso-height-relative:margin;v-text-anchor:top" o:gfxdata="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" fillcolor="white [3201]" stroked="f" strokeweight=".5pt">
+                <v:textbox>
+                  <w:txbxContent>
+                    <w:p>
+                      <w:pPr>
+                        <w:rPr>
+                          <w:b/>
+                          <w:bCs/>
+                          <w:color w:val="808080" w:themeColor="background1" w:themeShade="80"/>
+                          <w:lang w:val="pt-BR"/>
+                        </w:rPr>
+                      </w:pPr>
+                      <w:r>
+                        <w:rPr>
+                          <w:b/>
+                          <w:bCs/>
+                          <w:color w:val="808080" w:themeColor="background1" w:themeShade="80"/>
+                          <w:lang w:val="pt-BR"/>
+                        </w:rPr>
+                        <w:t>Documentação</w:t>
+                      </w:r>
+                    </w:p>
+                  </w:txbxContent>
+                </v:textbox>
+              </v:shape>
+            </w:pict>
+          </mc:Fallback>
+        </mc:AlternateContent>
+      </w:r>
+      <w:r>
+        <w:rPr>
+          <w:rFonts w:asciiTheme="majorHAnsi" w:hAnsiTheme="majorHAnsi" w:cstheme="majorHAnsi"/>
+          <w:noProof/>
+          <w:lang w:val="pt-BR"/>
+        </w:rPr>
+        <mc:AlternateContent>
+          <mc:Choice Requires="wps">
+            <w:drawing>
+              <wp:anchor distT="0" distB="0" distL="114300" distR="114300" simplePos="0" relativeHeight="251672576" behindDoc="0" locked="0" layoutInCell="1" allowOverlap="1" wp14:anchorId="22FA0A02" wp14:editId="3A2326B8">
+                <wp:simplePos x="0" y="0"/>
+                <wp:positionH relativeFrom="column">
+                  <wp:posOffset>-58522</wp:posOffset>
+                </wp:positionH>
+                <wp:positionV relativeFrom="paragraph">
+                  <wp:posOffset>174677</wp:posOffset>
+                </wp:positionV>
+                <wp:extent cx="6379210" cy="438912"/>
+                <wp:effectExtent l="0" t="0" r="21590" b="18415"/>
+                <wp:wrapNone/>
+                <wp:docPr id="831407363" name="Retângulo 5"/>
+                <wp:cNvGraphicFramePr/>
+                <a:graphic xmlns:a="http://schemas.openxmlformats.org/drawingml/2006/main">
+                  <a:graphicData uri="http://schemas.microsoft.com/office/word/2010/wordprocessingShape">
+                    <wps:wsp>
+                      <wps:cNvSpPr/>
+                      <wps:spPr>
+                        <a:xfrm>
+                          <a:off x="0" y="0"/>
+                          <a:ext cx="6379210" cy="438912"/>
+                        </a:xfrm>
+                        <a:prstGeom prst="rect">
+                          <a:avLst/>
+                        </a:prstGeom>
+                        <a:noFill/>
+                        <a:ln w="9525" cap="flat" cmpd="sng" algn="ctr">
+                          <a:solidFill>
+                            <a:schemeClr val="dk1"/>
+                          </a:solidFill>
+                          <a:prstDash val="solid"/>
+                          <a:round/>
+                          <a:headEnd type="none" w="med" len="med"/>
+                          <a:tailEnd type="none" w="med" len="med"/>
+                        </a:ln>
+                      </wps:spPr>
+                      <wps:style>
+                        <a:lnRef idx="0">
+                          <a:scrgbClr r="0" g="0" b="0"/>
+                        </a:lnRef>
+                        <a:fillRef idx="0">
+                          <a:scrgbClr r="0" g="0" b="0"/>
+                        </a:fillRef>
+                        <a:effectRef idx="0">
+                          <a:scrgbClr r="0" g="0" b="0"/>
+                        </a:effectRef>
+                        <a:fontRef idx="minor">
+                          <a:schemeClr val="dk1"/>
+                        </a:fontRef>
+                      </wps:style>
+                      <wps:bodyPr rot="0" spcFirstLastPara="0" vertOverflow="overflow" horzOverflow="overflow" vert="horz" wrap="square" lIns="91440" tIns="45720" rIns="91440" bIns="45720" numCol="1" spcCol="0" rtlCol="0" fromWordArt="0" anchor="ctr" anchorCtr="0" forceAA="0" compatLnSpc="1">
+                        <a:prstTxWarp prst="textNoShape">
+                          <a:avLst/>
+                        </a:prstTxWarp>
+                        <a:noAutofit/>
+                      </wps:bodyPr>
+                    </wps:wsp>
+                  </a:graphicData>
+                </a:graphic>
+                <wp14:sizeRelH relativeFrom="margin">
+                  <wp14:pctWidth>0</wp14:pctWidth>
+                </wp14:sizeRelH>
+                <wp14:sizeRelV relativeFrom="margin">
+                  <wp14:pctHeight>0</wp14:pctHeight>
+                </wp14:sizeRelV>
+              </wp:anchor>
+            </w:drawing>
+          </mc:Choice>
+          <mc:Fallback>
+            <w:pict>
+              <v:rect w14:anchorId="50609028" id="Retângulo 5" o:spid="_x0000_s1026" style="position:absolute;margin-left:-4.6pt;margin-top:13.75pt;width:502.3pt;height:34.55pt;z-index:251672576;visibility:visible;mso-wrap-style:square;mso-width-percent:0;mso-height-percent:0;mso-wrap-distance-left:9pt;mso-wrap-distance-top:0;mso-wrap-distance-right:9pt;mso-wrap-distance-bottom:0;mso-position-horizontal:absolute;mso-position-horizontal-relative:text;mso-position-vertical:absolute;mso-position-vertical-relative:text;mso-width-percent:0;mso-height-percent:0;mso-width-relative:margin;mso-height-relative:margin;v-text-anchor:middle" o:gfxdata="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" filled="f" strokecolor="black [3200]">
+                <v:stroke joinstyle="round"/>
+              </v:rect>
+            </w:pict>
+          </mc:Fallback>
+        </mc:AlternateContent>
+      </w:r>
+    </w:p>
+    <w:p>
+      <w:pPr>
+        <w:spacing w:after="0" w:line="240" w:lineRule="auto"/>
+        <w:rPr>
+          <w:rFonts w:asciiTheme="majorHAnsi" w:hAnsiTheme="majorHAnsi" w:cstheme="majorHAnsi"/>
+          <w:lang w:val="pt-BR"/>
+        </w:rPr>
+      </w:pPr>
+    </w:p>
+    <w:p>
+      <w:pPr>
+        <w:spacing w:after="0" w:line="240" w:lineRule="auto"/>
+        <w:rPr>
+          <w:rFonts w:asciiTheme="majorHAnsi" w:hAnsiTheme="majorHAnsi" w:cstheme="majorHAnsi"/>
+          <w:color w:val="auto"/>
+          <w:lang w:val="pt-BR"/>
+        </w:rPr>
+      </w:pPr>
+      <w:r>
+        <w:rPr>
+          <w:rFonts w:asciiTheme="majorHAnsi" w:hAnsiTheme="majorHAnsi" w:cstheme="majorHAnsi"/>
+          <w:color w:val="auto"/>
+          <w:lang w:val="pt-BR"/>
+        </w:rPr>
+        <w:t>{Documentação Veículo</w:t>
+      </w:r>
+      <w:r>
+        <w:rPr>
+          <w:rFonts w:asciiTheme="majorHAnsi" w:hAnsiTheme="majorHAnsi" w:cstheme="majorHAnsi"/>
+          <w:color w:val="auto"/>
+          <w:lang w:val="pt-BR"/>
+        </w:rPr>
+        <w:t>}</w:t>
+      </w:r>
+    </w:p>
+    <w:p>
+      <w:pPr>
+        <w:spacing w:after="0" w:line="240" w:lineRule="auto"/>
+        <w:rPr>
+          <w:rFonts w:asciiTheme="majorHAnsi" w:hAnsiTheme="majorHAnsi" w:cstheme="majorHAnsi"/>
+          <w:lang w:val="pt-BR"/>
+        </w:rPr>
+      </w:pPr>
+      <w:r>
+        <w:rPr>
+          <w:noProof/>
+          <w:color w:val="555555"/>
+          <w:sz w:val="18"/>
+          <w:szCs w:val="18"/>
+          <w:lang w:val="pt-BR"/>
+        </w:rPr>
+        <w:lastRenderedPageBreak/>
+        <mc:AlternateContent>
+          <mc:Choice Requires="wps">
+            <w:drawing>
+              <wp:anchor distT="0" distB="0" distL="114300" distR="114300" simplePos="0" relativeHeight="251680768" behindDoc="0" locked="0" layoutInCell="1" allowOverlap="1" wp14:anchorId="2EA83F9D" wp14:editId="1879DC18">
+                <wp:simplePos x="0" y="0"/>
+                <wp:positionH relativeFrom="column">
+                  <wp:posOffset>131674</wp:posOffset>
+                </wp:positionH>
+                <wp:positionV relativeFrom="paragraph">
+                  <wp:posOffset>-131674</wp:posOffset>
+                </wp:positionV>
+                <wp:extent cx="1543507" cy="248285"/>
+                <wp:effectExtent l="0" t="0" r="0" b="0"/>
+                <wp:wrapNone/>
+                <wp:docPr id="61563809" name="Caixa de Texto 3"/>
+                <wp:cNvGraphicFramePr/>
+                <a:graphic xmlns:a="http://schemas.openxmlformats.org/drawingml/2006/main">
+                  <a:graphicData uri="http://schemas.microsoft.com/office/word/2010/wordprocessingShape">
+                    <wps:wsp>
+                      <wps:cNvSpPr txBox="1"/>
+                      <wps:spPr>
+                        <a:xfrm>
+                          <a:off x="0" y="0"/>
+                          <a:ext cx="1543507" cy="248285"/>
+                        </a:xfrm>
+                        <a:prstGeom prst="rect">
+                          <a:avLst/>
+                        </a:prstGeom>
+                        <a:solidFill>
+                          <a:schemeClr val="lt1"/>
+                        </a:solidFill>
+                        <a:ln w="6350">
+                          <a:noFill/>
+                        </a:ln>
+                      </wps:spPr>
+                      <wps:txbx>
+                        <w:txbxContent>
+                          <w:p>
+                            <w:pPr>
+                              <w:rPr>
+                                <w:b/>
+                                <w:bCs/>
+                                <w:color w:val="808080" w:themeColor="background1" w:themeShade="80"/>
+                                <w:lang w:val="pt-BR"/>
+                              </w:rPr>
+                            </w:pPr>
+                            <w:r>
+                              <w:rPr>
+                                <w:b/>
+                                <w:bCs/>
+                                <w:color w:val="808080" w:themeColor="background1" w:themeShade="80"/>
+                                <w:lang w:val="pt-BR"/>
+                              </w:rPr>
+                              <w:t xml:space="preserve">Retirada do </w:t>
+                            </w:r>
+                            <w:r>
+                              <w:rPr>
+                                <w:b/>
+                                <w:bCs/>
+                                <w:color w:val="808080" w:themeColor="background1" w:themeShade="80"/>
+                                <w:lang w:val="pt-BR"/>
+                              </w:rPr>
+                              <w:t>Veículo</w:t>
+                            </w:r>
+                          </w:p>
+                        </w:txbxContent>
+                      </wps:txbx>
+                      <wps:bodyPr rot="0" spcFirstLastPara="0" vertOverflow="overflow" horzOverflow="overflow" vert="horz" wrap="square" lIns="91440" tIns="45720" rIns="91440" bIns="45720" numCol="1" spcCol="0" rtlCol="0" fromWordArt="0" anchor="t" anchorCtr="0" forceAA="0" compatLnSpc="1">
+                        <a:prstTxWarp prst="textNoShape">
+                          <a:avLst/>
+                        </a:prstTxWarp>
+                        <a:noAutofit/>
+                      </wps:bodyPr>
+                    </wps:wsp>
+                  </a:graphicData>
+                </a:graphic>
+                <wp14:sizeRelH relativeFrom="margin">
+                  <wp14:pctWidth>0</wp14:pctWidth>
+                </wp14:sizeRelH>
+                <wp14:sizeRelV relativeFrom="margin">
+                  <wp14:pctHeight>0</wp14:pctHeight>
+                </wp14:sizeRelV>
+              </wp:anchor>
+            </w:drawing>
+          </mc:Choice>
+          <mc:Fallback>
+            <w:pict>
+              <v:shape w14:anchorId="2EA83F9D" id="_x0000_s1031" type="#_x0000_t202" style="position:absolute;margin-left:10.35pt;margin-top:-10.35pt;width:121.55pt;height:19.55pt;z-index:251680768;visibility:visible;mso-wrap-style:square;mso-width-percent:0;mso-height-percent:0;mso-wrap-distance-left:9pt;mso-wrap-distance-top:0;mso-wrap-distance-right:9pt;mso-wrap-distance-bottom:0;mso-position-horizontal:absolute;mso-position-horizontal-relative:text;mso-position-vertical:absolute;mso-position-vertical-relative:text;mso-width-percent:0;mso-height-percent:0;mso-width-relative:margin;mso-height-relative:margin;v-text-anchor:top" o:gfxdata="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" fillcolor="white [3201]" stroked="f" strokeweight=".5pt">
+                <v:textbox>
+                  <w:txbxContent>
+                    <w:p>
+                      <w:pPr>
+                        <w:rPr>
+                          <w:b/>
+                          <w:bCs/>
+                          <w:color w:val="808080" w:themeColor="background1" w:themeShade="80"/>
+                          <w:lang w:val="pt-BR"/>
+                        </w:rPr>
+                      </w:pPr>
+                      <w:r>
+                        <w:rPr>
+                          <w:b/>
+                          <w:bCs/>
+                          <w:color w:val="808080" w:themeColor="background1" w:themeShade="80"/>
+                          <w:lang w:val="pt-BR"/>
+                        </w:rPr>
+                        <w:t xml:space="preserve">Retirada do </w:t>
+                      </w:r>
+                      <w:r>
+                        <w:rPr>
+                          <w:b/>
+                          <w:bCs/>
+                          <w:color w:val="808080" w:themeColor="background1" w:themeShade="80"/>
+                          <w:lang w:val="pt-BR"/>
+                        </w:rPr>
+                        <w:t>Veículo</w:t>
+                      </w:r>
+                    </w:p>
+                  </w:txbxContent>
+                </v:textbox>
+              </v:shape>
+            </w:pict>
+          </mc:Fallback>
+        </mc:AlternateContent>
+      </w:r>
+      <w:r>
+        <w:rPr>
+          <w:rFonts w:asciiTheme="majorHAnsi" w:hAnsiTheme="majorHAnsi" w:cstheme="majorHAnsi"/>
+          <w:noProof/>
+          <w:lang w:val="pt-BR"/>
+        </w:rPr>
+        <mc:AlternateContent>
+          <mc:Choice Requires="wps">
+            <w:drawing>
+              <wp:anchor distT="0" distB="0" distL="114300" distR="114300" simplePos="0" relativeHeight="251679744" behindDoc="0" locked="0" layoutInCell="1" allowOverlap="1" wp14:anchorId="74EAEBD4" wp14:editId="248F0758">
+                <wp:simplePos x="0" y="0"/>
+                <wp:positionH relativeFrom="column">
+                  <wp:posOffset>0</wp:posOffset>
+                </wp:positionH>
+                <wp:positionV relativeFrom="paragraph">
+                  <wp:posOffset>-6985</wp:posOffset>
+                </wp:positionV>
+                <wp:extent cx="6379210" cy="438785"/>
+                <wp:effectExtent l="0" t="0" r="21590" b="18415"/>
+                <wp:wrapNone/>
+                <wp:docPr id="251581415" name="Retângulo 5"/>
+                <wp:cNvGraphicFramePr/>
+                <a:graphic xmlns:a="http://schemas.openxmlformats.org/drawingml/2006/main">
+                  <a:graphicData uri="http://schemas.microsoft.com/office/word/2010/wordprocessingShape">
+                    <wps:wsp>
+                      <wps:cNvSpPr/>
+                      <wps:spPr>
+                        <a:xfrm>
+                          <a:off x="0" y="0"/>
+                          <a:ext cx="6379210" cy="438785"/>
+                        </a:xfrm>
+                        <a:prstGeom prst="rect">
+                          <a:avLst/>
+                        </a:prstGeom>
+                        <a:noFill/>
+                        <a:ln w="9525" cap="flat" cmpd="sng" algn="ctr">
+                          <a:solidFill>
+                            <a:schemeClr val="dk1"/>
+                          </a:solidFill>
+                          <a:prstDash val="solid"/>
+                          <a:round/>
+                          <a:headEnd type="none" w="med" len="med"/>
+                          <a:tailEnd type="none" w="med" len="med"/>
+                        </a:ln>
+                      </wps:spPr>
+                      <wps:style>
+                        <a:lnRef idx="0">
+                          <a:scrgbClr r="0" g="0" b="0"/>
+                        </a:lnRef>
+                        <a:fillRef idx="0">
+                          <a:scrgbClr r="0" g="0" b="0"/>
+                        </a:fillRef>
+                        <a:effectRef idx="0">
+                          <a:scrgbClr r="0" g="0" b="0"/>
+                        </a:effectRef>
+                        <a:fontRef idx="minor">
+                          <a:schemeClr val="dk1"/>
+                        </a:fontRef>
+                      </wps:style>
+                      <wps:bodyPr rot="0" spcFirstLastPara="0" vertOverflow="overflow" horzOverflow="overflow" vert="horz" wrap="square" lIns="91440" tIns="45720" rIns="91440" bIns="45720" numCol="1" spcCol="0" rtlCol="0" fromWordArt="0" anchor="ctr" anchorCtr="0" forceAA="0" compatLnSpc="1">
+                        <a:prstTxWarp prst="textNoShape">
+                          <a:avLst/>
+                        </a:prstTxWarp>
+                        <a:noAutofit/>
+                      </wps:bodyPr>
+                    </wps:wsp>
+                  </a:graphicData>
+                </a:graphic>
+                <wp14:sizeRelH relativeFrom="margin">
+                  <wp14:pctWidth>0</wp14:pctWidth>
+                </wp14:sizeRelH>
+                <wp14:sizeRelV relativeFrom="margin">
+                  <wp14:pctHeight>0</wp14:pctHeight>
+                </wp14:sizeRelV>
+              </wp:anchor>
+            </w:drawing>
+          </mc:Choice>
+          <mc:Fallback>
+            <w:pict>
+              <v:rect w14:anchorId="490DDC60" id="Retângulo 5" o:spid="_x0000_s1026" style="position:absolute;margin-left:0;margin-top:-.55pt;width:502.3pt;height:34.55pt;z-index:251679744;visibility:visible;mso-wrap-style:square;mso-width-percent:0;mso-height-percent:0;mso-wrap-distance-left:9pt;mso-wrap-distance-top:0;mso-wrap-distance-right:9pt;mso-wrap-distance-bottom:0;mso-position-horizontal:absolute;mso-position-horizontal-relative:text;mso-position-vertical:absolute;mso-position-vertical-relative:text;mso-width-percent:0;mso-height-percent:0;mso-width-relative:margin;mso-height-relative:margin;v-text-anchor:middle" o:gfxdata="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" filled="f" strokecolor="black [3200]">
+                <v:stroke joinstyle="round"/>
+              </v:rect>
+            </w:pict>
+          </mc:Fallback>
+        </mc:AlternateContent>
+      </w:r>
+      <w:r>
+        <w:rPr>
+          <w:rFonts w:asciiTheme="majorHAnsi" w:hAnsiTheme="majorHAnsi" w:cstheme="majorHAnsi"/>
+          <w:noProof/>
+          <w:lang w:val="pt-BR"/>
+        </w:rPr>
+        <mc:AlternateContent>
+          <mc:Choice Requires="wps">
+            <w:drawing>
+              <wp:anchor distT="0" distB="0" distL="114300" distR="114300" simplePos="0" relativeHeight="251676672" behindDoc="0" locked="0" layoutInCell="1" allowOverlap="1" wp14:anchorId="45FFBD53" wp14:editId="75B855EB">
+                <wp:simplePos x="0" y="0"/>
+                <wp:positionH relativeFrom="column">
+                  <wp:posOffset>58420</wp:posOffset>
+                </wp:positionH>
+                <wp:positionV relativeFrom="paragraph">
+                  <wp:posOffset>-8009992</wp:posOffset>
+                </wp:positionV>
+                <wp:extent cx="6379210" cy="438912"/>
+                <wp:effectExtent l="0" t="0" r="21590" b="18415"/>
+                <wp:wrapNone/>
+                <wp:docPr id="1169075387" name="Retângulo 5"/>
+                <wp:cNvGraphicFramePr/>
+                <a:graphic xmlns:a="http://schemas.openxmlformats.org/drawingml/2006/main">
+                  <a:graphicData uri="http://schemas.microsoft.com/office/word/2010/wordprocessingShape">
+                    <wps:wsp>
+                      <wps:cNvSpPr/>
+                      <wps:spPr>
+                        <a:xfrm>
+                          <a:off x="0" y="0"/>
+                          <a:ext cx="6379210" cy="438912"/>
+                        </a:xfrm>
+                        <a:prstGeom prst="rect">
+                          <a:avLst/>
+                        </a:prstGeom>
+                        <a:noFill/>
+                        <a:ln w="9525" cap="flat" cmpd="sng" algn="ctr">
+                          <a:solidFill>
+                            <a:schemeClr val="dk1"/>
+                          </a:solidFill>
+                          <a:prstDash val="solid"/>
+                          <a:round/>
+                          <a:headEnd type="none" w="med" len="med"/>
+                          <a:tailEnd type="none" w="med" len="med"/>
+                        </a:ln>
+                      </wps:spPr>
+                      <wps:style>
+                        <a:lnRef idx="0">
+                          <a:scrgbClr r="0" g="0" b="0"/>
+                        </a:lnRef>
+                        <a:fillRef idx="0">
+                          <a:scrgbClr r="0" g="0" b="0"/>
+                        </a:fillRef>
+                        <a:effectRef idx="0">
+                          <a:scrgbClr r="0" g="0" b="0"/>
+                        </a:effectRef>
+                        <a:fontRef idx="minor">
+                          <a:schemeClr val="dk1"/>
+                        </a:fontRef>
+                      </wps:style>
+                      <wps:bodyPr rot="0" spcFirstLastPara="0" vertOverflow="overflow" horzOverflow="overflow" vert="horz" wrap="square" lIns="91440" tIns="45720" rIns="91440" bIns="45720" numCol="1" spcCol="0" rtlCol="0" fromWordArt="0" anchor="ctr" anchorCtr="0" forceAA="0" compatLnSpc="1">
+                        <a:prstTxWarp prst="textNoShape">
+                          <a:avLst/>
+                        </a:prstTxWarp>
+                        <a:noAutofit/>
+                      </wps:bodyPr>
+                    </wps:wsp>
+                  </a:graphicData>
+                </a:graphic>
+                <wp14:sizeRelH relativeFrom="margin">
+                  <wp14:pctWidth>0</wp14:pctWidth>
+                </wp14:sizeRelH>
+                <wp14:sizeRelV relativeFrom="margin">
+                  <wp14:pctHeight>0</wp14:pctHeight>
+                </wp14:sizeRelV>
+              </wp:anchor>
+            </w:drawing>
+          </mc:Choice>
+          <mc:Fallback>
+            <w:pict>
+              <v:rect w14:anchorId="27A27FCF" id="Retângulo 5" o:spid="_x0000_s1026" style="position:absolute;margin-left:4.6pt;margin-top:-630.7pt;width:502.3pt;height:34.55pt;z-index:251676672;visibility:visible;mso-wrap-style:square;mso-width-percent:0;mso-height-percent:0;mso-wrap-distance-left:9pt;mso-wrap-distance-top:0;mso-wrap-distance-right:9pt;mso-wrap-distance-bottom:0;mso-position-horizontal:absolute;mso-position-horizontal-relative:text;mso-position-vertical:absolute;mso-position-vertical-relative:text;mso-width-percent:0;mso-height-percent:0;mso-width-relative:margin;mso-height-relative:margin;v-text-anchor:middle" o:gfxdata="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" filled="f" strokecolor="black [3200]">
+                <v:stroke joinstyle="round"/>
+              </v:rect>
+            </w:pict>
+          </mc:Fallback>
+        </mc:AlternateContent>
+      </w:r>
+      <w:r>
+        <w:rPr>
+          <w:noProof/>
+          <w:color w:val="555555"/>
+          <w:sz w:val="18"/>
+          <w:szCs w:val="18"/>
+          <w:lang w:val="pt-BR"/>
+        </w:rPr>
+        <mc:AlternateContent>
+          <mc:Choice Requires="wps">
+            <w:drawing>
+              <wp:anchor distT="0" distB="0" distL="114300" distR="114300" simplePos="0" relativeHeight="251677696" behindDoc="0" locked="0" layoutInCell="1" allowOverlap="1" wp14:anchorId="7D0B1ABE" wp14:editId="3BC50F5C">
+                <wp:simplePos x="0" y="0"/>
+                <wp:positionH relativeFrom="column">
+                  <wp:posOffset>190094</wp:posOffset>
+                </wp:positionH>
+                <wp:positionV relativeFrom="paragraph">
+                  <wp:posOffset>-8134350</wp:posOffset>
+                </wp:positionV>
+                <wp:extent cx="1250899" cy="248285"/>
+                <wp:effectExtent l="0" t="0" r="6985" b="0"/>
+                <wp:wrapNone/>
+                <wp:docPr id="516805717" name="Caixa de Texto 3"/>
+                <wp:cNvGraphicFramePr/>
+                <a:graphic xmlns:a="http://schemas.openxmlformats.org/drawingml/2006/main">
+                  <a:graphicData uri="http://schemas.microsoft.com/office/word/2010/wordprocessingShape">
+                    <wps:wsp>
+                      <wps:cNvSpPr txBox="1"/>
+                      <wps:spPr>
+                        <a:xfrm>
+                          <a:off x="0" y="0"/>
+                          <a:ext cx="1250899" cy="248285"/>
+                        </a:xfrm>
+                        <a:prstGeom prst="rect">
+                          <a:avLst/>
+                        </a:prstGeom>
+                        <a:solidFill>
+                          <a:schemeClr val="lt1"/>
+                        </a:solidFill>
+                        <a:ln w="6350">
+                          <a:noFill/>
+                        </a:ln>
+                      </wps:spPr>
+                      <wps:txbx>
+                        <w:txbxContent>
+                          <w:p>
+                            <w:pPr>
+                              <w:rPr>
+                                <w:b/>
+                                <w:bCs/>
+                                <w:color w:val="808080" w:themeColor="background1" w:themeShade="80"/>
+                                <w:lang w:val="pt-BR"/>
+                              </w:rPr>
+                            </w:pPr>
+                            <w:r>
+                              <w:rPr>
+                                <w:b/>
+                                <w:bCs/>
+                                <w:color w:val="808080" w:themeColor="background1" w:themeShade="80"/>
+                                <w:lang w:val="pt-BR"/>
+                              </w:rPr>
+                              <w:t>Documentação</w:t>
+                            </w:r>
+                          </w:p>
+                        </w:txbxContent>
+                      </wps:txbx>
+                      <wps:bodyPr rot="0" spcFirstLastPara="0" vertOverflow="overflow" horzOverflow="overflow" vert="horz" wrap="square" lIns="91440" tIns="45720" rIns="91440" bIns="45720" numCol="1" spcCol="0" rtlCol="0" fromWordArt="0" anchor="t" anchorCtr="0" forceAA="0" compatLnSpc="1">
+                        <a:prstTxWarp prst="textNoShape">
+                          <a:avLst/>
+                        </a:prstTxWarp>
+                        <a:noAutofit/>
+                      </wps:bodyPr>
+                    </wps:wsp>
+                  </a:graphicData>
+                </a:graphic>
+                <wp14:sizeRelH relativeFrom="margin">
+                  <wp14:pctWidth>0</wp14:pctWidth>
+                </wp14:sizeRelH>
+                <wp14:sizeRelV relativeFrom="margin">
+                  <wp14:pctHeight>0</wp14:pctHeight>
+                </wp14:sizeRelV>
+              </wp:anchor>
+            </w:drawing>
+          </mc:Choice>
+          <mc:Fallback>
+            <w:pict>
+              <v:shape w14:anchorId="7D0B1ABE" id="_x0000_s1032" type="#_x0000_t202" style="position:absolute;margin-left:14.95pt;margin-top:-640.5pt;width:98.5pt;height:19.55pt;z-index:251677696;visibility:visible;mso-wrap-style:square;mso-width-percent:0;mso-height-percent:0;mso-wrap-distance-left:9pt;mso-wrap-distance-top:0;mso-wrap-distance-right:9pt;mso-wrap-distance-bottom:0;mso-position-horizontal:absolute;mso-position-horizontal-relative:text;mso-position-vertical:absolute;mso-position-vertical-relative:text;mso-width-percent:0;mso-height-percent:0;mso-width-relative:margin;mso-height-relative:margin;v-text-anchor:top" o:gfxdata="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" fillcolor="white [3201]" stroked="f" strokeweight=".5pt">
+                <v:textbox>
+                  <w:txbxContent>
+                    <w:p>
+                      <w:pPr>
+                        <w:rPr>
+                          <w:b/>
+                          <w:bCs/>
+                          <w:color w:val="808080" w:themeColor="background1" w:themeShade="80"/>
+                          <w:lang w:val="pt-BR"/>
+                        </w:rPr>
+                      </w:pPr>
+                      <w:r>
+                        <w:rPr>
+                          <w:b/>
+                          <w:bCs/>
+                          <w:color w:val="808080" w:themeColor="background1" w:themeShade="80"/>
+                          <w:lang w:val="pt-BR"/>
+                        </w:rPr>
+                        <w:t>Documentação</w:t>
+                      </w:r>
+                    </w:p>
+                  </w:txbxContent>
+                </v:textbox>
+              </v:shape>
+            </w:pict>
+          </mc:Fallback>
+        </mc:AlternateContent>
+      </w:r>
+    </w:p>
+    <w:p>
+      <w:pPr>
+        <w:spacing w:after="0" w:line="240" w:lineRule="auto"/>
+        <w:rPr>
+          <w:rFonts w:asciiTheme="majorHAnsi" w:hAnsiTheme="majorHAnsi" w:cstheme="majorHAnsi"/>
+          <w:lang w:val="pt-BR"/>
+        </w:rPr>
+      </w:pPr>
+      <w:r>
+        <w:rPr>
+          <w:rFonts w:asciiTheme="majorHAnsi" w:hAnsiTheme="majorHAnsi" w:cstheme="majorHAnsi"/>
+          <w:lang w:val="pt-BR"/>
+        </w:rPr>
+        <w:t xml:space="preserve">   Data: _____/_____/__________ Hora: _____:_____ KM: {KM}</w:t>
+      </w:r>
+    </w:p>
+    <w:p>
+      <w:pPr>
+        <w:spacing w:after="0" w:line="240" w:lineRule="auto"/>
+        <w:rPr>
+          <w:rFonts w:asciiTheme="majorHAnsi" w:hAnsiTheme="majorHAnsi" w:cstheme="majorHAnsi"/>
+          <w:lang w:val="pt-BR"/>
+        </w:rPr>
+      </w:pPr>
+    </w:p>
+    <w:p>
+      <w:pPr>
+        <w:spacing w:after="0" w:line="240" w:lineRule="auto"/>
+        <w:rPr>
+          <w:rFonts w:asciiTheme="majorHAnsi" w:hAnsiTheme="majorHAnsi" w:cstheme="majorHAnsi"/>
+          <w:lang w:val="pt-BR"/>
+        </w:rPr>
+      </w:pPr>
+    </w:p>
+    <w:p>
+      <w:pPr>
+        <w:spacing w:after="0" w:line="240" w:lineRule="auto"/>
+        <w:rPr>
+          <w:rFonts w:asciiTheme="majorHAnsi" w:hAnsiTheme="majorHAnsi" w:cstheme="majorHAnsi"/>
+          <w:b/>
+          <w:bCs/>
+          <w:lang w:val="pt-BR"/>
+        </w:rPr>
+      </w:pPr>
+      <w:r>
+        <w:rPr>
+          <w:rFonts w:asciiTheme="majorHAnsi" w:hAnsiTheme="majorHAnsi" w:cstheme="majorHAnsi"/>
+          <w:b/>
+          <w:bCs/>
+          <w:lang w:val="pt-BR"/>
+        </w:rPr>
+        <w:t>TERMO DE CONSENTIMENTO</w:t>
+      </w:r>
+    </w:p>
+    <w:p>
+      <w:pPr>
+        <w:spacing w:after="0" w:line="240" w:lineRule="auto"/>
+        <w:rPr>
+          <w:rFonts w:asciiTheme="majorHAnsi" w:hAnsiTheme="majorHAnsi" w:cstheme="majorHAnsi"/>
+          <w:lang w:val="pt-BR"/>
+        </w:rPr>
+      </w:pPr>
+      <w:r>
+        <w:rPr>
+          <w:rFonts w:asciiTheme="majorHAnsi" w:hAnsiTheme="majorHAnsi" w:cstheme="majorHAnsi"/>
+          <w:lang w:val="pt-BR"/>
+        </w:rPr>
+        <w:t>Termo de consentimento para armazenamento e tratamento de dados pessoais em conformidade com a LGPD. O proprietário, na condição de titular dos dados pessoais, manifesta livre, informada e inequívoca concordância com o tratamento de seus dados pessoais pela (BROTHERS MULTIMARCAS) para finalidade específica, em conformidade com a Lei nº 13.709 – Lei Geral de Proteção de Dados Pessoais (LGPD), tendo assegurado seu direito de acesso, retificação e eliminação dos mesmos, devendo, para tanto, solicitar à (BROTHERS MULTIMARCAS). O presente termo isenta a (INTERMEDIADORA) (BROTHERS MULTIMARCAS), das responsabilidades e obrigações inerentes a infrações de trânsito e eventuais IMPOSTOS E/OU TAXAS (IPVA/SEGURO OBRIGATÓRIO/ LICENCIAMENTO) que ocorrerem a partir desta data, já o Comprador (CLIENTE) se responsabiliza por infrações de trânsito e eventuais IMPOSTOS E/OU TAXAS (IPVA/SEGURO OBRIGATÓRIO/ LICENCIAMENTO) que ocorrerem a partir desta data. O comprador (a) declara neste recibo, haver examinado o veículo acima descrito. Este veículo possui garantia em conformidade com o Art.26 II C.D.C. Prevalecerá o que ocorrer primeiro. No caso da venda do veículo pela INTERMEDIADORA e o COMPRADOR (CLIENTE) desistir da venda em questão dentro do prazo legal, fica estipulado a cobrança no valor da comissão de 6% (Seis) deste contrato, para que a INTERMEDIADORA pague todas as despesas em decorrência da venda. Fica acordado entre as partes que a negociação está sendo realizada através de intermediação entre o (VENDEDOR (PROPRIETÁRIO)) e o (COMPRADOR (CLIENTE)), deste modo a loja se dispõe de todos os recursos administrativos para viabilizar a operação de COMPRA/VENDA.E por estar de pleno acordo com o aqui descrito, assina o comprador o presente.</w:t>
+      </w:r>
+    </w:p>
+    <w:p>
+      <w:pPr>
+        <w:spacing w:after="0" w:line="240" w:lineRule="auto"/>
+        <w:rPr>
+          <w:rFonts w:asciiTheme="majorHAnsi" w:hAnsiTheme="majorHAnsi" w:cstheme="majorHAnsi"/>
+          <w:lang w:val="pt-BR"/>
+        </w:rPr>
+      </w:pPr>
+    </w:p>
+    <w:p>
+      <w:pPr>
+        <w:rPr>
+          <w:rFonts w:asciiTheme="majorHAnsi" w:hAnsiTheme="majorHAnsi" w:cstheme="majorHAnsi"/>
+          <w:lang w:val="pt-BR"/>
+        </w:rPr>
+      </w:pPr>
+    </w:p>
+    <w:p>
+      <w:pPr>
+        <w:rPr>
+          <w:lang w:val="pt-BR"/>
+        </w:rPr>
+      </w:pPr>
+      <w:r>
+        <w:rPr>
+          <w:b/>
+          <w:bCs/>
+          <w:lang w:val="pt-BR"/>
+        </w:rPr>
+        <w:t xml:space="preserve">Guarulhos, </w:t>
+      </w:r>
+      <w:r>
+        <w:rPr>
+          <w:b/>
+          <w:bCs/>
+          <w:lang w:val="pt-BR"/>
+        </w:rPr>
+        <w:t>{Data da Venda}</w:t>
+      </w:r>
+      <w:r>
+        <w:rPr>
+          <w:b/>
+          <w:bCs/>
+          <w:lang w:val="pt-BR"/>
+        </w:rPr>
+        <w:t>.</w:t>
+      </w:r>
+    </w:p>
+    <w:p>
+      <w:pPr>
+        <w:spacing w:after="0" w:line="240" w:lineRule="auto"/>
+        <w:rPr>
+          <w:b/>
+          <w:bCs/>
+          <w:lang w:val="pt-BR"/>
+        </w:rPr>
+      </w:pPr>
+    </w:p>
+    <w:p>
+      <w:pPr>
+        <w:spacing w:after="0" w:line="240" w:lineRule="auto"/>
+        <w:rPr>
+          <w:b/>
+          <w:bCs/>
+          <w:lang w:val="pt-BR"/>
+        </w:rPr>
+      </w:pPr>
+    </w:p>
+    <w:p>
+      <w:pPr>
+        <w:spacing w:after="0" w:line="240" w:lineRule="auto"/>
+        <w:rPr>
+          <w:b/>
+          <w:bCs/>
+          <w:lang w:val="pt-BR"/>
+        </w:rPr>
+      </w:pPr>
+      <w:r>
+        <w:rPr>
+          <w:b/>
+          <w:bCs/>
+          <w:lang w:val="pt-BR"/>
+        </w:rPr>
+        <w:t>_____________________________________________________________</w:t>
+      </w:r>
+    </w:p>
+    <w:p>
+      <w:pPr>
+        <w:spacing w:after="0" w:line="240" w:lineRule="auto"/>
+        <w:rPr>
+          <w:lang w:val="pt-BR"/>
+        </w:rPr>
+      </w:pPr>
+      <w:r>
+        <w:rPr>
+          <w:b/>
+          <w:bCs/>
+          <w:lang w:val="pt-BR"/>
+        </w:rPr>
+        <w:t>Cliente:</w:t>
+      </w:r>
+      <w:r>
+        <w:rPr>
+          <w:lang w:val="pt-BR"/>
+        </w:rPr>
+        <w:t> </w:t>
+      </w:r>
+      <w:r>
+        <w:rPr>
+          <w:lang w:val="pt-BR"/>
+        </w:rPr>
+        <w:t>{Nome do Cliente}</w:t>
+      </w:r>
+      <w:r>
+        <w:rPr>
+          <w:lang w:val="pt-BR"/>
+        </w:rPr>
+        <w:br/>
+      </w:r>
+      <w:r>
+        <w:rPr>
+          <w:b/>
+          <w:bCs/>
+          <w:lang w:val="pt-BR"/>
+        </w:rPr>
+        <w:t xml:space="preserve">CPF: </w:t>
+      </w:r>
+      <w:r>
+        <w:rPr>
+          <w:lang w:val="pt-BR"/>
+        </w:rPr>
+        <w:t>{CPF}</w:t>
+      </w:r>
+    </w:p>
+    <w:p>
+      <w:pPr>
+        <w:spacing w:after="0" w:line="240" w:lineRule="auto"/>
+        <w:rPr>
+          <w:lang w:val="pt-BR"/>
+        </w:rPr>
+      </w:pPr>
+    </w:p>
+    <w:p>
+      <w:pPr>
+        <w:spacing w:after="0" w:line="240" w:lineRule="auto"/>
+        <w:rPr>
+          <w:lang w:val="pt-BR"/>
+        </w:rPr>
+      </w:pPr>
+    </w:p>
+    <w:p>
+      <w:pPr>
+        <w:spacing w:after="0" w:line="240" w:lineRule="auto"/>
+        <w:rPr>
+          <w:b/>
+          <w:bCs/>
+          <w:lang w:val="pt-BR"/>
+        </w:rPr>
+      </w:pPr>
+    </w:p>
+    <w:p>
+      <w:pPr>
+        <w:spacing w:after="0" w:line="240" w:lineRule="auto"/>
+        <w:rPr>
+          <w:b/>
+          <w:bCs/>
+          <w:lang w:val="pt-BR"/>
+        </w:rPr>
+      </w:pPr>
+    </w:p>
+    <w:p>
+      <w:pPr>
+        <w:spacing w:after="0" w:line="240" w:lineRule="auto"/>
+        <w:rPr>
+          <w:b/>
+          <w:bCs/>
+          <w:lang w:val="pt-BR"/>
+        </w:rPr>
+      </w:pPr>
+    </w:p>
+    <w:p>
+      <w:pPr>
+        <w:spacing w:after="0" w:line="240" w:lineRule="auto"/>
+        <w:rPr>
+          <w:b/>
+          <w:bCs/>
+          <w:lang w:val="pt-BR"/>
+        </w:rPr>
+      </w:pPr>
+      <w:r>
+        <w:rPr>
+          <w:b/>
+          <w:bCs/>
+          <w:lang w:val="pt-BR"/>
+        </w:rPr>
+        <w:t>_____________________________________________________________</w:t>
+      </w:r>
+    </w:p>
+    <w:p>
+      <w:pPr>
+        <w:spacing w:after="0" w:line="240" w:lineRule="auto"/>
+        <w:rPr>
+          <w:b/>
+          <w:bCs/>
+          <w:lang w:val="pt-BR"/>
+        </w:rPr>
+      </w:pPr>
+      <w:r>
+        <w:rPr>
+          <w:b/>
+          <w:bCs/>
+          <w:lang w:val="pt-BR"/>
+        </w:rPr>
+        <w:t>JTS INTERMEDIAÇÕES E NEGOCIOS LTDA</w:t>
+      </w:r>
+    </w:p>
+    <w:p>
+      <w:pPr>
+        <w:spacing w:after="0" w:line="240" w:lineRule="auto"/>
+        <w:rPr>
+          <w:b/>
+          <w:bCs/>
+          <w:lang w:val="pt-BR"/>
+        </w:rPr>
+      </w:pPr>
+    </w:p>
+    <w:p>
+      <w:pPr>
+        <w:spacing w:after="0" w:line="240" w:lineRule="auto"/>
+        <w:rPr>
+          <w:b/>
+          <w:bCs/>
+          <w:lang w:val="pt-BR"/>
+        </w:rPr>
+      </w:pPr>
+    </w:p>
+    <w:p>
+      <w:pPr>
+        <w:spacing w:after="0" w:line="240" w:lineRule="auto"/>
+        <w:rPr>
+          <w:b/>
+          <w:bCs/>
+          <w:lang w:val="pt-BR"/>
+        </w:rPr>
+      </w:pPr>
+    </w:p>
+    <w:p>
+      <w:pPr>
+        <w:spacing w:after="0" w:line="240" w:lineRule="auto"/>
+        <w:rPr>
+          <w:b/>
+          <w:bCs/>
+          <w:lang w:val="pt-BR"/>
+        </w:rPr>
+      </w:pPr>
+      <w:r>
+        <w:rPr>
+          <w:b/>
+          <w:bCs/>
+          <w:lang w:val="pt-BR"/>
+        </w:rPr>
+        <w:t>_____________________________________________________________</w:t>
+      </w:r>
+    </w:p>
+    <w:p>
+      <w:pPr>
+        <w:spacing w:after="0" w:line="240" w:lineRule="auto"/>
+        <w:rPr>
+          <w:b/>
+          <w:bCs/>
+          <w:lang w:val="pt-BR"/>
+        </w:rPr>
+      </w:pPr>
+      <w:r>
+        <w:rPr>
+          <w:b/>
+          <w:bCs/>
+          <w:lang w:val="pt-BR"/>
+        </w:rPr>
+        <w:t>V</w:t>
+      </w:r>
+      <w:r>
+        <w:rPr>
+          <w:b/>
+          <w:bCs/>
+          <w:lang w:val="pt-BR"/>
+        </w:rPr>
+        <w:t>endedor: {Vendedor}</w:t>
+      </w:r>
+    </w:p>
+    <w:p>
+      <w:pPr>
+        <w:spacing w:after="0" w:line="240" w:lineRule="auto"/>
+        <w:rPr>
+          <w:b/>
+          <w:bCs/>
+          <w:lang w:val="pt-BR"/>
+        </w:rPr>
+      </w:pPr>
+    </w:p>
+    <w:p>
+      <w:pPr>
+        <w:spacing w:after="0" w:line="240" w:lineRule="auto"/>
+        <w:rPr>
+          <w:b/>
+          <w:bCs/>
+          <w:lang w:val="pt-BR"/>
+        </w:rPr>
+      </w:pPr>
+    </w:p>
+    <w:p>
+      <w:pPr>
+        <w:spacing w:after="0" w:line="240" w:lineRule="auto"/>
+        <w:rPr>
+          <w:b/>
+          <w:bCs/>
+          <w:lang w:val="pt-BR"/>
+        </w:rPr>
+      </w:pPr>
+    </w:p>
+    <w:p>
+      <w:pPr>
+        <w:spacing w:after="0" w:line="240" w:lineRule="auto"/>
+        <w:rPr>
+          <w:b/>
+          <w:bCs/>
+          <w:lang w:val="pt-BR"/>
+        </w:rPr>
+      </w:pPr>
+    </w:p>
+    <w:p>
+      <w:pPr>
+        <w:spacing w:after="0" w:line="240" w:lineRule="auto"/>
+        <w:rPr>
+          <w:b/>
+          <w:bCs/>
+          <w:lang w:val="pt-BR"/>
+        </w:rPr>
+      </w:pPr>
+    </w:p>
+    <w:p>
+      <w:pPr>
+        <w:spacing w:after="0" w:line="240" w:lineRule="auto"/>
+        <w:rPr>
+          <w:b/>
+          <w:bCs/>
+          <w:lang w:val="pt-BR"/>
+        </w:rPr>
+      </w:pPr>
+    </w:p>
+    <w:p>
+      <w:pPr>
+        <w:rPr>
+          <w:lang w:val="pt-BR"/>
+        </w:rPr>
+      </w:pPr>
+      <w:r>
+        <w:rPr>
+          <w:b/>
+          <w:bCs/>
+          <w:lang w:val="pt-BR"/>
+        </w:rPr>
+        <w:t>Testemunhas:</w:t>
+      </w:r>
+    </w:p>
+    <w:p>
+      <w:pPr>
+        <w:numPr>
+          <w:ilvl w:val="0"/>
+          <w:numId w:val="15"/>
+        </w:numPr>
+        <w:rPr>
+          <w:lang w:val="pt-BR"/>
+        </w:rPr>
+      </w:pPr>
+      <w:r>
+        <w:rPr>
+          <w:lang w:val="pt-BR"/>
+        </w:rPr>
+        <w:t>___________</w:t>
+      </w:r>
+      <w:r>
+        <w:rPr>
+          <w:lang w:val="pt-BR"/>
+        </w:rPr>
+        <w:t>______________</w:t>
+      </w:r>
+      <w:r>
+        <w:rPr>
+          <w:lang w:val="pt-BR"/>
+        </w:rPr>
+        <w:t>__________ - CPF: ________</w:t>
+      </w:r>
+      <w:r>
+        <w:rPr>
+          <w:lang w:val="pt-BR"/>
+        </w:rPr>
+        <w:t>______</w:t>
+      </w:r>
+    </w:p>
+    <w:p>
+      <w:pPr>
+        <w:numPr>
+          <w:ilvl w:val="0"/>
+          <w:numId w:val="15"/>
+        </w:numPr>
+        <w:rPr>
+          <w:lang w:val="pt-BR"/>
+        </w:rPr>
+      </w:pPr>
+      <w:r>
+        <w:rPr>
+          <w:lang w:val="pt-BR"/>
+        </w:rPr>
+        <w:t>____________________</w:t>
+      </w:r>
+      <w:r>
+        <w:rPr>
+          <w:lang w:val="pt-BR"/>
+        </w:rPr>
+        <w:t>______________</w:t>
+      </w:r>
+      <w:r>
+        <w:rPr>
+          <w:lang w:val="pt-BR"/>
+        </w:rPr>
+        <w:t>_ - CPF: _______</w:t>
+      </w:r>
+      <w:r>
+        <w:rPr>
+          <w:lang w:val="pt-BR"/>
+        </w:rPr>
+        <w:t>______</w:t>
+      </w:r>
+      <w:r>
+        <w:rPr>
+          <w:lang w:val="pt-BR"/>
+        </w:rPr>
+        <w:t>_</w:t>
+      </w:r>
+    </w:p>
+    <w:p>
+      <w:pPr>
+        <w:rPr>
+          <w:lang w:val="pt-BR"/>
+        </w:rPr>
+      </w:pPr>
+    </w:p>
+    <w:sectPr>
+      <w:pgSz w:w="12240" w:h="15840"/>
+      <w:pgMar w:top="1152" w:right="1152" w:bottom="1152" w:left="1152" w:header="720" w:footer="720" w:gutter="0"/>
+      <w:cols w:space="720"/>
+      <w:docGrid w:linePitch="360"/>
+    </w:sectPr>
+  </w:body>
+</w:document>
 </file>
 
 <file path=word/numbering.xml><?xml version="1.0" encoding="utf-8"?>

</xml_diff>

<commit_message>
fix: corrige delimitadores docx para {{ }} em todos os templates e remove deteccao automatica quebrada
</commit_message>
<xml_diff>
--- a/backend/templates/contrato_venda.docx
+++ b/backend/templates/contrato_venda.docx
@@ -359,7 +359,7 @@
           <w:szCs w:val="20"/>
           <w:lang w:val="pt-BR"/>
         </w:rPr>
-        <w:t>{Nome do Cliente}</w:t>
+        <w:t>{{Nome do Cliente}}</w:t>
       </w:r>
     </w:p>
     <w:p>
@@ -410,7 +410,7 @@
           <w:szCs w:val="20"/>
           <w:lang w:val="pt-BR"/>
         </w:rPr>
-        <w:t>{RG}</w:t>
+        <w:t>{{RG}}</w:t>
       </w:r>
       <w:r>
         <w:rPr>
@@ -477,7 +477,7 @@
           <w:szCs w:val="20"/>
           <w:lang w:val="pt-BR"/>
         </w:rPr>
-        <w:t>{CPF}</w:t>
+        <w:t>{{CPF}}</w:t>
       </w:r>
     </w:p>
     <w:p>
@@ -517,7 +517,7 @@
           <w:szCs w:val="20"/>
           <w:lang w:val="pt-BR"/>
         </w:rPr>
-        <w:t xml:space="preserve">{Rua/Av}, {Número} </w:t>
+        <w:t xml:space="preserve">{{Rua/Av}}, {{Número}} </w:t>
       </w:r>
       <w:r>
         <w:rPr>
@@ -564,7 +564,7 @@
           <w:szCs w:val="20"/>
           <w:lang w:val="pt-BR"/>
         </w:rPr>
-        <w:t>{Bairro}</w:t>
+        <w:t>{{Bairro}}</w:t>
       </w:r>
     </w:p>
     <w:p>
@@ -595,7 +595,7 @@
           <w:szCs w:val="20"/>
           <w:lang w:val="pt-BR"/>
         </w:rPr>
-        <w:t xml:space="preserve"> {Cidade}</w:t>
+        <w:t xml:space="preserve"> {{Cidade}}</w:t>
       </w:r>
       <w:r>
         <w:rPr>
@@ -633,7 +633,7 @@
           <w:szCs w:val="20"/>
           <w:lang w:val="pt-BR"/>
         </w:rPr>
-        <w:t xml:space="preserve">{Estado} </w:t>
+        <w:t xml:space="preserve">{{Estado}} </w:t>
       </w:r>
       <w:r>
         <w:rPr>
@@ -662,7 +662,7 @@
           <w:szCs w:val="20"/>
           <w:lang w:val="pt-BR"/>
         </w:rPr>
-        <w:t>{Cep}</w:t>
+        <w:t>{{Cep}}</w:t>
       </w:r>
       <w:r>
         <w:rPr>
@@ -711,7 +711,7 @@
           <w:szCs w:val="20"/>
           <w:lang w:val="pt-BR"/>
         </w:rPr>
-        <w:t>{Celu</w:t>
+        <w:t>{{Celu</w:t>
       </w:r>
       <w:r>
         <w:rPr>
@@ -720,7 +720,7 @@
           <w:szCs w:val="20"/>
           <w:lang w:val="pt-BR"/>
         </w:rPr>
-        <w:t>lar}</w:t>
+        <w:t>lar}}</w:t>
       </w:r>
       <w:r>
         <w:rPr>
@@ -767,7 +767,7 @@
           <w:szCs w:val="20"/>
           <w:lang w:val="pt-BR"/>
         </w:rPr>
-        <w:t>: {</w:t>
+        <w:t>: {{</w:t>
       </w:r>
       <w:r>
         <w:rPr>
@@ -776,7 +776,7 @@
           <w:szCs w:val="20"/>
           <w:lang w:val="pt-BR"/>
         </w:rPr>
-        <w:t>Email}</w:t>
+        <w:t>Email}}</w:t>
       </w:r>
     </w:p>
     <w:p>
@@ -1023,7 +1023,7 @@
           <w:rFonts w:asciiTheme="majorHAnsi" w:hAnsiTheme="majorHAnsi" w:cstheme="majorHAnsi"/>
           <w:lang w:val="pt-BR"/>
         </w:rPr>
-        <w:t>{Marca}</w:t>
+        <w:t>{{Marca}}</w:t>
       </w:r>
     </w:p>
     <w:p>
@@ -1055,7 +1055,7 @@
           <w:rFonts w:asciiTheme="majorHAnsi" w:hAnsiTheme="majorHAnsi" w:cstheme="majorHAnsi"/>
           <w:lang w:val="pt-BR"/>
         </w:rPr>
-        <w:t xml:space="preserve">{Modelo}             </w:t>
+        <w:t xml:space="preserve">{{Modelo}}             </w:t>
       </w:r>
       <w:r>
         <w:rPr>
@@ -1078,7 +1078,7 @@
           <w:rFonts w:asciiTheme="majorHAnsi" w:hAnsiTheme="majorHAnsi" w:cstheme="majorHAnsi"/>
           <w:lang w:val="pt-BR"/>
         </w:rPr>
-        <w:t>{</w:t>
+        <w:t>{{</w:t>
       </w:r>
       <w:r>
         <w:rPr>
@@ -1092,7 +1092,7 @@
           <w:rFonts w:asciiTheme="majorHAnsi" w:hAnsiTheme="majorHAnsi" w:cstheme="majorHAnsi"/>
           <w:lang w:val="pt-BR"/>
         </w:rPr>
-        <w:t>}</w:t>
+        <w:t>}}</w:t>
       </w:r>
     </w:p>
     <w:p>
@@ -1142,7 +1142,7 @@
           <w:rFonts w:asciiTheme="majorHAnsi" w:hAnsiTheme="majorHAnsi" w:cstheme="majorHAnsi"/>
           <w:lang w:val="pt-BR"/>
         </w:rPr>
-        <w:t>{Ano</w:t>
+        <w:t>{{Ano</w:t>
       </w:r>
       <w:r>
         <w:rPr>
@@ -1156,7 +1156,7 @@
           <w:rFonts w:asciiTheme="majorHAnsi" w:hAnsiTheme="majorHAnsi" w:cstheme="majorHAnsi"/>
           <w:lang w:val="pt-BR"/>
         </w:rPr>
-        <w:t xml:space="preserve">}      </w:t>
+        <w:t xml:space="preserve">}}      </w:t>
       </w:r>
       <w:r>
         <w:rPr>
@@ -1172,7 +1172,7 @@
           <w:rFonts w:asciiTheme="majorHAnsi" w:hAnsiTheme="majorHAnsi" w:cstheme="majorHAnsi"/>
           <w:lang w:val="pt-BR"/>
         </w:rPr>
-        <w:t xml:space="preserve"> {Ano Modelo}     </w:t>
+        <w:t xml:space="preserve"> {{Ano Modelo}}     </w:t>
       </w:r>
       <w:r>
         <w:rPr>
@@ -1197,7 +1197,7 @@
           <w:rFonts w:asciiTheme="majorHAnsi" w:hAnsiTheme="majorHAnsi" w:cstheme="majorHAnsi"/>
           <w:lang w:val="pt-BR"/>
         </w:rPr>
-        <w:t>{Cor}</w:t>
+        <w:t>{{Cor}}</w:t>
       </w:r>
     </w:p>
     <w:p>
@@ -1229,7 +1229,7 @@
           <w:rFonts w:asciiTheme="majorHAnsi" w:hAnsiTheme="majorHAnsi" w:cstheme="majorHAnsi"/>
           <w:lang w:val="pt-BR"/>
         </w:rPr>
-        <w:t xml:space="preserve">{Placa}     </w:t>
+        <w:t xml:space="preserve">{{Placa}}     </w:t>
       </w:r>
       <w:r>
         <w:rPr>
@@ -1273,7 +1273,7 @@
           <w:rFonts w:asciiTheme="majorHAnsi" w:hAnsiTheme="majorHAnsi" w:cstheme="majorHAnsi"/>
           <w:lang w:val="pt-BR"/>
         </w:rPr>
-        <w:t xml:space="preserve">{Chassi}                           </w:t>
+        <w:t xml:space="preserve">{{Chassi}}                           </w:t>
       </w:r>
       <w:r>
         <w:rPr>
@@ -1296,7 +1296,7 @@
           <w:rFonts w:asciiTheme="majorHAnsi" w:hAnsiTheme="majorHAnsi" w:cstheme="majorHAnsi"/>
           <w:lang w:val="pt-BR"/>
         </w:rPr>
-        <w:t>{Renavam}</w:t>
+        <w:t>{{Renavam}}</w:t>
       </w:r>
       <w:r>
         <w:rPr>
@@ -1346,7 +1346,7 @@
           <w:rFonts w:asciiTheme="majorHAnsi" w:hAnsiTheme="majorHAnsi" w:cstheme="majorHAnsi"/>
           <w:lang w:val="pt-BR"/>
         </w:rPr>
-        <w:t>{Combustível}</w:t>
+        <w:t>{{Combustível}}</w:t>
       </w:r>
       <w:r>
         <w:rPr>
@@ -1380,7 +1380,7 @@
           <w:rFonts w:asciiTheme="majorHAnsi" w:hAnsiTheme="majorHAnsi" w:cstheme="majorHAnsi"/>
           <w:lang w:val="pt-BR"/>
         </w:rPr>
-        <w:t xml:space="preserve"> {KM}</w:t>
+        <w:t xml:space="preserve"> {{KM}}</w:t>
       </w:r>
     </w:p>
     <w:p>
@@ -1405,14 +1405,14 @@
           <w:rFonts w:asciiTheme="majorHAnsi" w:hAnsiTheme="majorHAnsi" w:cstheme="majorHAnsi"/>
           <w:lang w:val="pt-BR"/>
         </w:rPr>
-        <w:t xml:space="preserve"> {</w:t>
-      </w:r>
-      <w:r>
-        <w:rPr>
-          <w:rFonts w:asciiTheme="majorHAnsi" w:hAnsiTheme="majorHAnsi" w:cstheme="majorHAnsi"/>
-          <w:lang w:val="pt-BR"/>
-        </w:rPr>
-        <w:t>Valor da Venda}</w:t>
+        <w:t xml:space="preserve"> {{</w:t>
+      </w:r>
+      <w:r>
+        <w:rPr>
+          <w:rFonts w:asciiTheme="majorHAnsi" w:hAnsiTheme="majorHAnsi" w:cstheme="majorHAnsi"/>
+          <w:lang w:val="pt-BR"/>
+        </w:rPr>
+        <w:t>Valor da Venda}}</w:t>
       </w:r>
     </w:p>
     <w:p>
@@ -1719,7 +1719,7 @@
           <w:szCs w:val="20"/>
           <w:lang w:val="pt-BR"/>
         </w:rPr>
-        <w:t>Eu, {</w:t>
+        <w:t>Eu, {{</w:t>
       </w:r>
       <w:r>
         <w:rPr>
@@ -1727,7 +1727,7 @@
           <w:szCs w:val="20"/>
           <w:lang w:val="pt-BR"/>
         </w:rPr>
-        <w:t>Nome do Cliente}</w:t>
+        <w:t>Nome do Cliente}}</w:t>
       </w:r>
       <w:r>
         <w:rPr>
@@ -1743,7 +1743,7 @@
           <w:szCs w:val="20"/>
           <w:lang w:val="pt-BR"/>
         </w:rPr>
-        <w:t>: {Valor da Venda}</w:t>
+        <w:t>: {{Valor da Venda}}</w:t>
       </w:r>
       <w:r>
         <w:rPr>
@@ -2146,7 +2146,7 @@
           <w:szCs w:val="20"/>
           <w:lang w:val="pt-BR"/>
         </w:rPr>
-        <w:t>{Data da Venda</w:t>
+        <w:t>{{Data da Venda</w:t>
       </w:r>
       <w:r>
         <w:rPr>
@@ -2154,7 +2154,7 @@
           <w:szCs w:val="20"/>
           <w:lang w:val="pt-BR"/>
         </w:rPr>
-        <w:t>}</w:t>
+        <w:t>}}</w:t>
       </w:r>
       <w:r>
         <w:rPr>
@@ -2212,7 +2212,7 @@
           <w:szCs w:val="20"/>
           <w:lang w:val="pt-BR"/>
         </w:rPr>
-        <w:t>{Valor da Venda}</w:t>
+        <w:t>{{Valor da Venda}}</w:t>
       </w:r>
       <w:r>
         <w:rPr>
@@ -2263,7 +2263,7 @@
           <w:szCs w:val="20"/>
           <w:lang w:val="pt-BR"/>
         </w:rPr>
-        <w:t>{Forma de Pagamento</w:t>
+        <w:t>{{Forma de Pagamento</w:t>
       </w:r>
       <w:r>
         <w:rPr>
@@ -2272,7 +2272,7 @@
           <w:szCs w:val="20"/>
           <w:lang w:val="pt-BR"/>
         </w:rPr>
-        <w:t>}</w:t>
+        <w:t>}}</w:t>
       </w:r>
     </w:p>
     <w:p>
@@ -2316,7 +2316,7 @@
           <w:szCs w:val="20"/>
           <w:lang w:val="pt-BR"/>
         </w:rPr>
-        <w:t>{</w:t>
+        <w:t>{{</w:t>
       </w:r>
       <w:r>
         <w:rPr>
@@ -2343,7 +2343,7 @@
           <w:szCs w:val="20"/>
           <w:lang w:val="pt-BR"/>
         </w:rPr>
-        <w:t>}</w:t>
+        <w:t>}}</w:t>
       </w:r>
     </w:p>
     <w:p>
@@ -2376,7 +2376,7 @@
           <w:szCs w:val="20"/>
           <w:lang w:val="pt-BR"/>
         </w:rPr>
-        <w:t>{Financeira}</w:t>
+        <w:t>{{Financeira}}</w:t>
       </w:r>
       <w:r>
         <w:rPr>
@@ -2423,7 +2423,7 @@
           <w:szCs w:val="20"/>
           <w:lang w:val="pt-BR"/>
         </w:rPr>
-        <w:t>{</w:t>
+        <w:t>{{</w:t>
       </w:r>
       <w:r>
         <w:rPr>
@@ -2450,7 +2450,7 @@
           <w:szCs w:val="20"/>
           <w:lang w:val="pt-BR"/>
         </w:rPr>
-        <w:t>}</w:t>
+        <w:t>}}</w:t>
       </w:r>
     </w:p>
     <w:p>
@@ -2494,7 +2494,7 @@
           <w:szCs w:val="20"/>
           <w:lang w:val="pt-BR"/>
         </w:rPr>
-        <w:t>{Valor Financiado}</w:t>
+        <w:t>{{Valor Financiado}}</w:t>
       </w:r>
       <w:r>
         <w:rPr>
@@ -2536,7 +2536,7 @@
           <w:szCs w:val="20"/>
           <w:lang w:val="pt-BR"/>
         </w:rPr>
-        <w:t>{N</w:t>
+        <w:t>{{N</w:t>
       </w:r>
       <w:r>
         <w:rPr>
@@ -2545,7 +2545,7 @@
           <w:szCs w:val="20"/>
           <w:lang w:val="pt-BR"/>
         </w:rPr>
-        <w:t xml:space="preserve">° de Parcelas} </w:t>
+        <w:t xml:space="preserve">° de Parcelas}} </w:t>
       </w:r>
       <w:r>
         <w:rPr>
@@ -2576,7 +2576,7 @@
           <w:szCs w:val="20"/>
           <w:lang w:val="pt-BR"/>
         </w:rPr>
-        <w:t>{Valor das Parcelas</w:t>
+        <w:t>{{Valor das Parcelas</w:t>
       </w:r>
       <w:r>
         <w:rPr>
@@ -2585,7 +2585,7 @@
           <w:szCs w:val="20"/>
           <w:lang w:val="pt-BR"/>
         </w:rPr>
-        <w:t>}</w:t>
+        <w:t>}}</w:t>
       </w:r>
     </w:p>
     <w:p>
@@ -2633,7 +2633,7 @@
           <w:szCs w:val="20"/>
           <w:lang w:val="pt-BR"/>
         </w:rPr>
-        <w:t>{Veículo na Troca</w:t>
+        <w:t>{{Veículo na Troca</w:t>
       </w:r>
       <w:r>
         <w:rPr>
@@ -2644,7 +2644,7 @@
           <w:szCs w:val="20"/>
           <w:lang w:val="pt-BR"/>
         </w:rPr>
-        <w:t>}</w:t>
+        <w:t>}}</w:t>
       </w:r>
     </w:p>
     <w:p>
@@ -2676,7 +2676,7 @@
           <w:rFonts w:asciiTheme="majorHAnsi" w:hAnsiTheme="majorHAnsi" w:cstheme="majorHAnsi"/>
           <w:lang w:val="pt-BR"/>
         </w:rPr>
-        <w:t>{Marca</w:t>
+        <w:t>{{Marca</w:t>
       </w:r>
       <w:r>
         <w:rPr>
@@ -2690,7 +2690,7 @@
           <w:rFonts w:asciiTheme="majorHAnsi" w:hAnsiTheme="majorHAnsi" w:cstheme="majorHAnsi"/>
           <w:lang w:val="pt-BR"/>
         </w:rPr>
-        <w:t>}</w:t>
+        <w:t>}}</w:t>
       </w:r>
     </w:p>
     <w:p>
@@ -2722,7 +2722,7 @@
           <w:rFonts w:asciiTheme="majorHAnsi" w:hAnsiTheme="majorHAnsi" w:cstheme="majorHAnsi"/>
           <w:lang w:val="pt-BR"/>
         </w:rPr>
-        <w:t>{Modelo</w:t>
+        <w:t>{{Modelo</w:t>
       </w:r>
       <w:r>
         <w:rPr>
@@ -2743,7 +2743,7 @@
           <w:rFonts w:asciiTheme="majorHAnsi" w:hAnsiTheme="majorHAnsi" w:cstheme="majorHAnsi"/>
           <w:lang w:val="pt-BR"/>
         </w:rPr>
-        <w:t xml:space="preserve">}             </w:t>
+        <w:t xml:space="preserve">}}             </w:t>
       </w:r>
       <w:r>
         <w:rPr>
@@ -2766,7 +2766,7 @@
           <w:rFonts w:asciiTheme="majorHAnsi" w:hAnsiTheme="majorHAnsi" w:cstheme="majorHAnsi"/>
           <w:lang w:val="pt-BR"/>
         </w:rPr>
-        <w:t>{</w:t>
+        <w:t>{{</w:t>
       </w:r>
       <w:r>
         <w:rPr>
@@ -2794,7 +2794,7 @@
           <w:rFonts w:asciiTheme="majorHAnsi" w:hAnsiTheme="majorHAnsi" w:cstheme="majorHAnsi"/>
           <w:lang w:val="pt-BR"/>
         </w:rPr>
-        <w:t>}</w:t>
+        <w:t>}}</w:t>
       </w:r>
     </w:p>
     <w:p>
@@ -2844,7 +2844,7 @@
           <w:rFonts w:asciiTheme="majorHAnsi" w:hAnsiTheme="majorHAnsi" w:cstheme="majorHAnsi"/>
           <w:lang w:val="pt-BR"/>
         </w:rPr>
-        <w:t>{Ano</w:t>
+        <w:t>{{Ano</w:t>
       </w:r>
       <w:r>
         <w:rPr>
@@ -2865,7 +2865,7 @@
           <w:rFonts w:asciiTheme="majorHAnsi" w:hAnsiTheme="majorHAnsi" w:cstheme="majorHAnsi"/>
           <w:lang w:val="pt-BR"/>
         </w:rPr>
-        <w:t xml:space="preserve">}      </w:t>
+        <w:t xml:space="preserve">}}      </w:t>
       </w:r>
       <w:r>
         <w:rPr>
@@ -2890,7 +2890,7 @@
           <w:rFonts w:asciiTheme="majorHAnsi" w:hAnsiTheme="majorHAnsi" w:cstheme="majorHAnsi"/>
           <w:lang w:val="pt-BR"/>
         </w:rPr>
-        <w:t>{Cor</w:t>
+        <w:t>{{Cor</w:t>
       </w:r>
       <w:r>
         <w:rPr>
@@ -2904,7 +2904,7 @@
           <w:rFonts w:asciiTheme="majorHAnsi" w:hAnsiTheme="majorHAnsi" w:cstheme="majorHAnsi"/>
           <w:lang w:val="pt-BR"/>
         </w:rPr>
-        <w:t>}</w:t>
+        <w:t>}}</w:t>
       </w:r>
     </w:p>
     <w:p>
@@ -2936,7 +2936,7 @@
           <w:rFonts w:asciiTheme="majorHAnsi" w:hAnsiTheme="majorHAnsi" w:cstheme="majorHAnsi"/>
           <w:lang w:val="pt-BR"/>
         </w:rPr>
-        <w:t>{Placa</w:t>
+        <w:t>{{Placa</w:t>
       </w:r>
       <w:r>
         <w:rPr>
@@ -2957,7 +2957,7 @@
           <w:rFonts w:asciiTheme="majorHAnsi" w:hAnsiTheme="majorHAnsi" w:cstheme="majorHAnsi"/>
           <w:lang w:val="pt-BR"/>
         </w:rPr>
-        <w:t xml:space="preserve">}     </w:t>
+        <w:t xml:space="preserve">}}     </w:t>
       </w:r>
       <w:r>
         <w:rPr>
@@ -2994,7 +2994,7 @@
           <w:rFonts w:asciiTheme="majorHAnsi" w:hAnsiTheme="majorHAnsi" w:cstheme="majorHAnsi"/>
           <w:lang w:val="pt-BR"/>
         </w:rPr>
-        <w:t>{Renavam</w:t>
+        <w:t>{{Renavam</w:t>
       </w:r>
       <w:r>
         <w:rPr>
@@ -3015,7 +3015,7 @@
           <w:rFonts w:asciiTheme="majorHAnsi" w:hAnsiTheme="majorHAnsi" w:cstheme="majorHAnsi"/>
           <w:lang w:val="pt-BR"/>
         </w:rPr>
-        <w:t>}</w:t>
+        <w:t>}}</w:t>
       </w:r>
       <w:r>
         <w:rPr>
@@ -3047,7 +3047,7 @@
           <w:rFonts w:asciiTheme="majorHAnsi" w:hAnsiTheme="majorHAnsi" w:cstheme="majorHAnsi"/>
           <w:lang w:val="pt-BR"/>
         </w:rPr>
-        <w:t>{Combustível</w:t>
+        <w:t>{{Combustível</w:t>
       </w:r>
       <w:r>
         <w:rPr>
@@ -3068,7 +3068,7 @@
           <w:rFonts w:asciiTheme="majorHAnsi" w:hAnsiTheme="majorHAnsi" w:cstheme="majorHAnsi"/>
           <w:lang w:val="pt-BR"/>
         </w:rPr>
-        <w:t>}</w:t>
+        <w:t>}}</w:t>
       </w:r>
       <w:r>
         <w:rPr>
@@ -3093,7 +3093,7 @@
           <w:rFonts w:asciiTheme="majorHAnsi" w:hAnsiTheme="majorHAnsi" w:cstheme="majorHAnsi"/>
           <w:lang w:val="pt-BR"/>
         </w:rPr>
-        <w:t xml:space="preserve"> {KM</w:t>
+        <w:t xml:space="preserve"> {{KM</w:t>
       </w:r>
       <w:r>
         <w:rPr>
@@ -3107,7 +3107,7 @@
           <w:rFonts w:asciiTheme="majorHAnsi" w:hAnsiTheme="majorHAnsi" w:cstheme="majorHAnsi"/>
           <w:lang w:val="pt-BR"/>
         </w:rPr>
-        <w:t>}</w:t>
+        <w:t>}}</w:t>
       </w:r>
     </w:p>
     <w:p>
@@ -3141,7 +3141,7 @@
           <w:rFonts w:asciiTheme="majorHAnsi" w:hAnsiTheme="majorHAnsi" w:cstheme="majorHAnsi"/>
           <w:lang w:val="pt-BR"/>
         </w:rPr>
-        <w:t xml:space="preserve"> {Valor da </w:t>
+        <w:t xml:space="preserve"> {{Valor da </w:t>
       </w:r>
       <w:r>
         <w:rPr>
@@ -3155,7 +3155,7 @@
           <w:rFonts w:asciiTheme="majorHAnsi" w:hAnsiTheme="majorHAnsi" w:cstheme="majorHAnsi"/>
           <w:lang w:val="pt-BR"/>
         </w:rPr>
-        <w:t>}</w:t>
+        <w:t>}}</w:t>
       </w:r>
     </w:p>
     <w:p>
@@ -3180,7 +3180,7 @@
           <w:rFonts w:asciiTheme="majorHAnsi" w:hAnsiTheme="majorHAnsi" w:cstheme="majorHAnsi"/>
           <w:lang w:val="pt-BR"/>
         </w:rPr>
-        <w:t xml:space="preserve"> {Débitos}</w:t>
+        <w:t xml:space="preserve"> {{Débitos}}</w:t>
       </w:r>
     </w:p>
     <w:p>
@@ -3205,14 +3205,14 @@
           <w:rFonts w:asciiTheme="majorHAnsi" w:hAnsiTheme="majorHAnsi" w:cstheme="majorHAnsi"/>
           <w:lang w:val="pt-BR"/>
         </w:rPr>
-        <w:t xml:space="preserve"> {Observação </w:t>
-      </w:r>
-      <w:r>
-        <w:rPr>
-          <w:rFonts w:asciiTheme="majorHAnsi" w:hAnsiTheme="majorHAnsi" w:cstheme="majorHAnsi"/>
-          <w:lang w:val="pt-BR"/>
-        </w:rPr>
-        <w:t>sobre Débitos}</w:t>
+        <w:t xml:space="preserve"> {{Observação </w:t>
+      </w:r>
+      <w:r>
+        <w:rPr>
+          <w:rFonts w:asciiTheme="majorHAnsi" w:hAnsiTheme="majorHAnsi" w:cstheme="majorHAnsi"/>
+          <w:lang w:val="pt-BR"/>
+        </w:rPr>
+        <w:t>sobre Débitos}}</w:t>
       </w:r>
     </w:p>
     <w:p>
@@ -3237,7 +3237,7 @@
           <w:rFonts w:asciiTheme="majorHAnsi" w:hAnsiTheme="majorHAnsi" w:cstheme="majorHAnsi"/>
           <w:lang w:val="pt-BR"/>
         </w:rPr>
-        <w:t xml:space="preserve"> {Valor da Entrada</w:t>
+        <w:t xml:space="preserve"> {{Valor da Entrada</w:t>
       </w:r>
       <w:r>
         <w:rPr>
@@ -3251,7 +3251,7 @@
           <w:rFonts w:asciiTheme="majorHAnsi" w:hAnsiTheme="majorHAnsi" w:cstheme="majorHAnsi"/>
           <w:lang w:val="pt-BR"/>
         </w:rPr>
-        <w:t>}</w:t>
+        <w:t>}}</w:t>
       </w:r>
     </w:p>
     <w:p>
@@ -3506,7 +3506,7 @@
           <w:color w:val="auto"/>
           <w:lang w:val="pt-BR"/>
         </w:rPr>
-        <w:t>{Documentação Veículo</w:t>
+        <w:t>{{Documentação Veículo</w:t>
       </w:r>
       <w:r>
         <w:rPr>
@@ -3514,7 +3514,7 @@
           <w:color w:val="auto"/>
           <w:lang w:val="pt-BR"/>
         </w:rPr>
-        <w:t>}</w:t>
+        <w:t>}}</w:t>
       </w:r>
     </w:p>
     <w:p>
@@ -3960,7 +3960,7 @@
           <w:rFonts w:asciiTheme="majorHAnsi" w:hAnsiTheme="majorHAnsi" w:cstheme="majorHAnsi"/>
           <w:lang w:val="pt-BR"/>
         </w:rPr>
-        <w:t xml:space="preserve">   Data: _____/_____/__________ Hora: _____:_____ KM: {KM}</w:t>
+        <w:t xml:space="preserve">   Data: _____/_____/__________ Hora: _____:_____ KM: {{KM}}</w:t>
       </w:r>
     </w:p>
     <w:p>
@@ -4054,7 +4054,7 @@
           <w:bCs/>
           <w:lang w:val="pt-BR"/>
         </w:rPr>
-        <w:t>{Data da Venda}</w:t>
+        <w:t>{{Data da Venda}}</w:t>
       </w:r>
       <w:r>
         <w:rPr>
@@ -4128,7 +4128,7 @@
         <w:rPr>
           <w:lang w:val="pt-BR"/>
         </w:rPr>
-        <w:t>{Nome do Cliente}</w:t>
+        <w:t>{{Nome do Cliente}}</w:t>
       </w:r>
       <w:r>
         <w:rPr>
@@ -4148,7 +4148,7 @@
         <w:rPr>
           <w:lang w:val="pt-BR"/>
         </w:rPr>
-        <w:t>{CPF}</w:t>
+        <w:t>{{CPF}}</w:t>
       </w:r>
     </w:p>
     <w:p>
@@ -4304,7 +4304,7 @@
           <w:bCs/>
           <w:lang w:val="pt-BR"/>
         </w:rPr>
-        <w:t>endedor: {Vendedor}</w:t>
+        <w:t>endedor: {{Vendedor}}</w:t>
       </w:r>
     </w:p>
     <w:p>

</xml_diff>